<commit_message>
getting complex with foundry, learned tests
</commit_message>
<xml_diff>
--- a/3 - Foundry.docx
+++ b/3 - Foundry.docx
@@ -168,10 +168,7 @@
         <w:pStyle w:val="bashsnippet"/>
       </w:pPr>
       <w:r>
-        <w:t xml:space="preserve">forge </w:t>
-      </w:r>
-      <w:r>
-        <w:t>build</w:t>
+        <w:t>forge build</w:t>
       </w:r>
     </w:p>
     <w:p>
@@ -192,10 +189,7 @@
         <w:pStyle w:val="bashsnippet"/>
       </w:pPr>
       <w:r>
-        <w:t xml:space="preserve">forge </w:t>
-      </w:r>
-      <w:r>
-        <w:t>compile</w:t>
+        <w:t>forge compile</w:t>
       </w:r>
     </w:p>
     <w:p>
@@ -825,7 +819,7 @@
                 <wp:cNvGraphicFramePr/>
                 <a:graphic xmlns:a="http://schemas.openxmlformats.org/drawingml/2006/main">
                   <a:graphicData uri="http://schemas.microsoft.com/office/word/2010/wordprocessingInk">
-                    <w14:contentPart bwMode="auto" r:id="rId5">
+                    <w14:contentPart bwMode="auto" r:id="rId7">
                       <w14:nvContentPartPr>
                         <w14:cNvContentPartPr/>
                       </w14:nvContentPartPr>
@@ -861,7 +855,7 @@
                 <o:lock v:ext="edit" aspectratio="t"/>
               </v:shapetype>
               <v:shape id="Ink 3" o:spid="_x0000_s1026" type="#_x0000_t75" style="position:absolute;margin-left:137.9pt;margin-top:249.1pt;width:50.35pt;height:17.9pt;z-index:251661312;visibility:visible;mso-wrap-style:square;mso-wrap-distance-left:9pt;mso-wrap-distance-top:0;mso-wrap-distance-right:9pt;mso-wrap-distance-bottom:0;mso-position-horizontal:absolute;mso-position-horizontal-relative:text;mso-position-vertical:absolute;mso-position-vertical-relative:text" o:gfxdata="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">
-                <v:imagedata r:id="rId6" o:title=""/>
+                <v:imagedata r:id="rId8" o:title=""/>
               </v:shape>
             </w:pict>
           </mc:Fallback>
@@ -886,7 +880,7 @@
                 <wp:cNvGraphicFramePr/>
                 <a:graphic xmlns:a="http://schemas.openxmlformats.org/drawingml/2006/main">
                   <a:graphicData uri="http://schemas.microsoft.com/office/word/2010/wordprocessingInk">
-                    <w14:contentPart bwMode="auto" r:id="rId7">
+                    <w14:contentPart bwMode="auto" r:id="rId9">
                       <w14:nvContentPartPr>
                         <w14:cNvContentPartPr/>
                       </w14:nvContentPartPr>
@@ -903,7 +897,7 @@
           <mc:Fallback>
             <w:pict>
               <v:shape w14:anchorId="3C1B4EF4" id="Ink 2" o:spid="_x0000_s1026" type="#_x0000_t75" style="position:absolute;margin-left:129.5pt;margin-top:61.65pt;width:66.65pt;height:26.85pt;z-index:251660288;visibility:visible;mso-wrap-style:square;mso-wrap-distance-left:9pt;mso-wrap-distance-top:0;mso-wrap-distance-right:9pt;mso-wrap-distance-bottom:0;mso-position-horizontal:absolute;mso-position-horizontal-relative:text;mso-position-vertical:absolute;mso-position-vertical-relative:text" o:gfxdata="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">
-                <v:imagedata r:id="rId8" o:title=""/>
+                <v:imagedata r:id="rId10" o:title=""/>
               </v:shape>
             </w:pict>
           </mc:Fallback>
@@ -928,7 +922,7 @@
                 <wp:cNvGraphicFramePr/>
                 <a:graphic xmlns:a="http://schemas.openxmlformats.org/drawingml/2006/main">
                   <a:graphicData uri="http://schemas.microsoft.com/office/word/2010/wordprocessingInk">
-                    <w14:contentPart bwMode="auto" r:id="rId9">
+                    <w14:contentPart bwMode="auto" r:id="rId11">
                       <w14:nvContentPartPr>
                         <w14:cNvContentPartPr/>
                       </w14:nvContentPartPr>
@@ -945,7 +939,7 @@
           <mc:Fallback>
             <w:pict>
               <v:shape w14:anchorId="6928675C" id="Ink 1" o:spid="_x0000_s1026" type="#_x0000_t75" style="position:absolute;margin-left:125.8pt;margin-top:147.65pt;width:99.95pt;height:26.55pt;z-index:251659264;visibility:visible;mso-wrap-style:square;mso-wrap-distance-left:9pt;mso-wrap-distance-top:0;mso-wrap-distance-right:9pt;mso-wrap-distance-bottom:0;mso-position-horizontal:absolute;mso-position-horizontal-relative:text;mso-position-vertical:absolute;mso-position-vertical-relative:text" o:gfxdata="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">
-                <v:imagedata r:id="rId10" o:title=""/>
+                <v:imagedata r:id="rId12" o:title=""/>
               </v:shape>
             </w:pict>
           </mc:Fallback>
@@ -968,7 +962,7 @@
                     <pic:cNvPicPr/>
                   </pic:nvPicPr>
                   <pic:blipFill>
-                    <a:blip r:embed="rId11"/>
+                    <a:blip r:embed="rId13"/>
                     <a:stretch>
                       <a:fillRect/>
                     </a:stretch>
@@ -1040,10 +1034,7 @@
         <w:t xml:space="preserve">create </w:t>
       </w:r>
       <w:r>
-        <w:t>contract_name</w:t>
-      </w:r>
-      <w:r>
-        <w:t xml:space="preserve"> </w:t>
+        <w:t xml:space="preserve">contract_name </w:t>
       </w:r>
       <w:r>
         <w:t>--</w:t>
@@ -1054,13 +1045,7 @@
     </w:p>
     <w:p>
       <w:r>
-        <w:t xml:space="preserve">it prompts and asks for a private key, </w:t>
-      </w:r>
-      <w:r>
-        <w:t>Copy one of the private keys from the anvil terminal</w:t>
-      </w:r>
-      <w:r>
-        <w:t xml:space="preserve"> and paste.</w:t>
+        <w:t>it prompts and asks for a private key, Copy one of the private keys from the anvil terminal and paste.</w:t>
       </w:r>
       <w:r>
         <w:t xml:space="preserve"> And valla!</w:t>
@@ -1096,7 +1081,15 @@
         <w:pStyle w:val="bashsnippet"/>
       </w:pPr>
       <w:r>
-        <w:t>Warning: Dry run enabled, not broadcasting transaction</w:t>
+        <w:t xml:space="preserve">Warning: </w:t>
+      </w:r>
+      <w:r>
+        <w:rPr>
+          <w:b/>
+          <w:bCs/>
+          <w:color w:val="EE0000"/>
+        </w:rPr>
+        <w:t>Dry run enabled, not broadcasting transaction</w:t>
       </w:r>
     </w:p>
     <w:p>
@@ -1136,7 +1129,7 @@
                 <wp:cNvGraphicFramePr/>
                 <a:graphic xmlns:a="http://schemas.openxmlformats.org/drawingml/2006/main">
                   <a:graphicData uri="http://schemas.microsoft.com/office/word/2010/wordprocessingInk">
-                    <w14:contentPart bwMode="auto" r:id="rId12">
+                    <w14:contentPart bwMode="auto" r:id="rId14">
                       <w14:nvContentPartPr>
                         <w14:cNvContentPartPr/>
                       </w14:nvContentPartPr>
@@ -1153,7 +1146,7 @@
           <mc:Fallback>
             <w:pict>
               <v:shape w14:anchorId="026C69FD" id="Ink 37" o:spid="_x0000_s1026" type="#_x0000_t75" style="position:absolute;margin-left:85.4pt;margin-top:-42.5pt;width:89.1pt;height:24.25pt;z-index:251696128;visibility:visible;mso-wrap-style:square;mso-wrap-distance-left:9pt;mso-wrap-distance-top:0;mso-wrap-distance-right:9pt;mso-wrap-distance-bottom:0;mso-position-horizontal:absolute;mso-position-horizontal-relative:text;mso-position-vertical:absolute;mso-position-vertical-relative:text" o:gfxdata="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">
-                <v:imagedata r:id="rId13" o:title=""/>
+                <v:imagedata r:id="rId15" o:title=""/>
               </v:shape>
             </w:pict>
           </mc:Fallback>
@@ -1178,7 +1171,7 @@
                 <wp:cNvGraphicFramePr/>
                 <a:graphic xmlns:a="http://schemas.openxmlformats.org/drawingml/2006/main">
                   <a:graphicData uri="http://schemas.microsoft.com/office/word/2010/wordprocessingInk">
-                    <w14:contentPart bwMode="auto" r:id="rId14">
+                    <w14:contentPart bwMode="auto" r:id="rId16">
                       <w14:nvContentPartPr>
                         <w14:cNvContentPartPr/>
                       </w14:nvContentPartPr>
@@ -1201,7 +1194,7 @@
           <mc:Fallback>
             <w:pict>
               <v:shape w14:anchorId="15DED2EE" id="Ink 6" o:spid="_x0000_s1026" type="#_x0000_t75" style="position:absolute;margin-left:103.4pt;margin-top:-3.3pt;width:9.6pt;height:22.25pt;z-index:251664384;visibility:visible;mso-wrap-style:square;mso-width-percent:0;mso-height-percent:0;mso-wrap-distance-left:9pt;mso-wrap-distance-top:0;mso-wrap-distance-right:9pt;mso-wrap-distance-bottom:0;mso-position-horizontal:absolute;mso-position-horizontal-relative:text;mso-position-vertical:absolute;mso-position-vertical-relative:text;mso-width-percent:0;mso-height-percent:0;mso-width-relative:margin;mso-height-relative:margin" o:gfxdata="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">
-                <v:imagedata r:id="rId15" o:title=""/>
+                <v:imagedata r:id="rId17" o:title=""/>
               </v:shape>
             </w:pict>
           </mc:Fallback>
@@ -1234,7 +1227,7 @@
                 <wp:cNvGraphicFramePr/>
                 <a:graphic xmlns:a="http://schemas.openxmlformats.org/drawingml/2006/main">
                   <a:graphicData uri="http://schemas.microsoft.com/office/word/2010/wordprocessingInk">
-                    <w14:contentPart bwMode="auto" r:id="rId16">
+                    <w14:contentPart bwMode="auto" r:id="rId18">
                       <w14:nvContentPartPr>
                         <w14:cNvContentPartPr/>
                       </w14:nvContentPartPr>
@@ -1251,7 +1244,7 @@
           <mc:Fallback>
             <w:pict>
               <v:shape w14:anchorId="0560EDE4" id="Ink 4" o:spid="_x0000_s1026" type="#_x0000_t75" style="position:absolute;margin-left:54.65pt;margin-top:-3.45pt;width:268.2pt;height:25.7pt;z-index:251662336;visibility:visible;mso-wrap-style:square;mso-wrap-distance-left:9pt;mso-wrap-distance-top:0;mso-wrap-distance-right:9pt;mso-wrap-distance-bottom:0;mso-position-horizontal:absolute;mso-position-horizontal-relative:text;mso-position-vertical:absolute;mso-position-vertical-relative:text" o:gfxdata="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">
-                <v:imagedata r:id="rId17" o:title=""/>
+                <v:imagedata r:id="rId19" o:title=""/>
               </v:shape>
             </w:pict>
           </mc:Fallback>
@@ -1298,8 +1291,13 @@
         <w:pStyle w:val="bashsnippet"/>
       </w:pPr>
       <w:r>
-        <w:t xml:space="preserve">  "input": "0x6080604052348015600e575f5ffd5b506108ec8061001c5f395ff3fe608060405234801561000f575f5ffd5b5060043610610055575f3560e01c80632e64cec1146100595780632ebce631146100775780636057361d146100a85780636f760f41</w:t>
-      </w:r>
+        <w:t xml:space="preserve">  "input": "0x6080604052348015600e575f5ffd5b506108ec8061001c5f395ff3fe608060405234801561000f575f5ffd5b5060043610610055575f3560e01c80632e64cec1146100595780632ebce631146100775780636057361d146100a85780636f760f41.</w:t>
+      </w:r>
+    </w:p>
+    <w:p>
+      <w:pPr>
+        <w:pStyle w:val="bashsnippet"/>
+      </w:pPr>
       <w:r>
         <w:t>.</w:t>
       </w:r>
@@ -1325,7 +1323,30 @@
         <w:pStyle w:val="bashsnippet"/>
       </w:pPr>
       <w:r>
-        <w:t>.</w:t>
+        <w:t>E</w:t>
+      </w:r>
+      <w:r>
+        <w:t>tc</w:t>
+      </w:r>
+    </w:p>
+    <w:p>
+      <w:r>
+        <w:t>Overall</w:t>
+      </w:r>
+      <w:r>
+        <w:t>,</w:t>
+      </w:r>
+      <w:r>
+        <w:t xml:space="preserve"> to deploy your cont</w:t>
+      </w:r>
+      <w:r>
+        <w:t>ra</w:t>
+      </w:r>
+      <w:r>
+        <w:t>ct to any chain on the blockchain here is the command:</w:t>
+      </w:r>
+      <w:r>
+        <w:t xml:space="preserve"> (dry run)</w:t>
       </w:r>
     </w:p>
     <w:p>
@@ -1333,27 +1354,7 @@
         <w:pStyle w:val="bashsnippet"/>
       </w:pPr>
       <w:r>
-        <w:t>E</w:t>
-      </w:r>
-      <w:r>
-        <w:t>tc</w:t>
-      </w:r>
-    </w:p>
-    <w:p>
-      <w:r>
-        <w:t>Overall</w:t>
-      </w:r>
-      <w:r>
-        <w:t>,</w:t>
-      </w:r>
-      <w:r>
-        <w:t xml:space="preserve"> to deploy your cont</w:t>
-      </w:r>
-      <w:r>
-        <w:t>ra</w:t>
-      </w:r>
-      <w:r>
-        <w:t>ct to any chain on the blockchain here is the command:</w:t>
+        <w:t>&lt;/&gt; bash</w:t>
       </w:r>
     </w:p>
     <w:p>
@@ -1361,14 +1362,6 @@
         <w:pStyle w:val="bashsnippet"/>
       </w:pPr>
       <w:r>
-        <w:t>&lt;/&gt; bash</w:t>
-      </w:r>
-    </w:p>
-    <w:p>
-      <w:pPr>
-        <w:pStyle w:val="bashsnippet"/>
-      </w:pPr>
-      <w:r>
         <w:t xml:space="preserve">forge </w:t>
       </w:r>
       <w:r>
@@ -1384,16 +1377,7 @@
         <w:t>[</w:t>
       </w:r>
       <w:r>
-        <w:t>contract_name</w:t>
-      </w:r>
-      <w:r>
-        <w:t>]</w:t>
-      </w:r>
-      <w:r>
-        <w:t xml:space="preserve"> </w:t>
-      </w:r>
-      <w:r>
-        <w:t>--rpc-url [the_URL] --private-key [the_key_to_your_acc]</w:t>
+        <w:t>contract_name] --rpc-url [the_URL] --private-key [the_key_to_your_acc]</w:t>
       </w:r>
     </w:p>
     <w:p>
@@ -2061,7 +2045,7 @@
       <w:r>
         <w:t xml:space="preserve">forge script script/DeploySimpleStorage.s.sol --rpc-url </w:t>
       </w:r>
-      <w:hyperlink r:id="rId18" w:history="1">
+      <w:hyperlink r:id="rId20" w:history="1">
         <w:r>
           <w:rPr>
             <w:rStyle w:val="Hyperlink"/>
@@ -2323,37 +2307,71 @@
         <w:t>For a real deployment to blockchain</w:t>
       </w:r>
       <w:r>
-        <w:t>, h</w:t>
-      </w:r>
-      <w:r>
-        <w:t>it the up arrow key and add --broadcast --private-key 0xac0974bec39a17e36ba4a6b4d238ff944bacb478cbed5efcae784d7bf4f2ff80 at the end.</w:t>
+        <w:t>, hit the up arrow key and add --broadcast --private-key 0xac0974bec39a17e36ba4a6b4d238ff944bacb478cbed5efcae784d7bf4f2ff80 at the end.</w:t>
       </w:r>
     </w:p>
     <w:p>
       <w:pPr>
         <w:pStyle w:val="bashsnippet"/>
-      </w:pPr>
-      <w:r>
+        <w:rPr>
+          <w:b/>
+          <w:bCs/>
+        </w:rPr>
+      </w:pPr>
+      <w:r>
+        <w:rPr>
+          <w:b/>
+          <w:bCs/>
+        </w:rPr>
         <w:t xml:space="preserve">forge script script/DeploySimpleStorage.s.sol --rpc-url </w:t>
       </w:r>
-      <w:hyperlink r:id="rId19" w:history="1">
+      <w:hyperlink r:id="rId21" w:history="1">
         <w:r>
           <w:rPr>
             <w:rStyle w:val="Hyperlink"/>
+            <w:b/>
+            <w:bCs/>
           </w:rPr>
           <w:t>http://127.0.0.1:8545</w:t>
         </w:r>
       </w:hyperlink>
       <w:r>
-        <w:t xml:space="preserve"> </w:t>
-      </w:r>
-      <w:r>
-        <w:t>--broadcast --private-key 0xac0974bec39a17e36ba4a6b4d238ff944bacb478cbed5efcae784d7bf4f2ff80</w:t>
+        <w:rPr>
+          <w:b/>
+          <w:bCs/>
+        </w:rPr>
+        <w:t xml:space="preserve"> --broadcast --private-key 0xac0974bec39a17e36ba4a6b4d238ff944bacb478cbed5efcae784d7bf4f2ff80</w:t>
       </w:r>
     </w:p>
     <w:p>
       <w:r>
         <w:t>Our contract is now successfully deployed!</w:t>
+      </w:r>
+    </w:p>
+    <w:p>
+      <w:r>
+        <w:t xml:space="preserve">We </w:t>
+      </w:r>
+      <w:r>
+        <w:rPr>
+          <w:color w:val="EE0000"/>
+        </w:rPr>
+        <w:t xml:space="preserve">can’t use </w:t>
+      </w:r>
+      <w:r>
+        <w:rPr>
+          <w:color w:val="EE0000"/>
+        </w:rPr>
+        <w:t>--</w:t>
+      </w:r>
+      <w:r>
+        <w:rPr>
+          <w:color w:val="EE0000"/>
+        </w:rPr>
+        <w:t xml:space="preserve">interactive here </w:t>
+      </w:r>
+      <w:r>
+        <w:t>though so we need a better key preservation.</w:t>
       </w:r>
     </w:p>
     <w:p>
@@ -2374,6 +2392,7 @@
         </w:numPr>
       </w:pPr>
       <w:r>
+        <w:lastRenderedPageBreak/>
         <w:t xml:space="preserve">Anvil creates a </w:t>
       </w:r>
       <w:r>
@@ -2395,7 +2414,6 @@
         </w:numPr>
       </w:pPr>
       <w:r>
-        <w:lastRenderedPageBreak/>
         <w:t xml:space="preserve">You deploy contracts using one of the provided private keys. </w:t>
       </w:r>
     </w:p>
@@ -2588,7 +2606,7 @@
                 <wp:cNvGraphicFramePr/>
                 <a:graphic xmlns:a="http://schemas.openxmlformats.org/drawingml/2006/main">
                   <a:graphicData uri="http://schemas.microsoft.com/office/word/2010/wordprocessingInk">
-                    <w14:contentPart bwMode="auto" r:id="rId20">
+                    <w14:contentPart bwMode="auto" r:id="rId22">
                       <w14:nvContentPartPr>
                         <w14:cNvContentPartPr/>
                       </w14:nvContentPartPr>
@@ -2605,7 +2623,7 @@
           <mc:Fallback>
             <w:pict>
               <v:shape w14:anchorId="3D89B3AE" id="Ink 61" o:spid="_x0000_s1026" type="#_x0000_t75" style="position:absolute;margin-left:-7.2pt;margin-top:64pt;width:100.8pt;height:37.8pt;z-index:251720704;visibility:visible;mso-wrap-style:square;mso-wrap-distance-left:9pt;mso-wrap-distance-top:0;mso-wrap-distance-right:9pt;mso-wrap-distance-bottom:0;mso-position-horizontal:absolute;mso-position-horizontal-relative:text;mso-position-vertical:absolute;mso-position-vertical-relative:text" o:gfxdata="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">
-                <v:imagedata r:id="rId21" o:title=""/>
+                <v:imagedata r:id="rId23" o:title=""/>
               </v:shape>
             </w:pict>
           </mc:Fallback>
@@ -2630,7 +2648,7 @@
                 <wp:cNvGraphicFramePr/>
                 <a:graphic xmlns:a="http://schemas.openxmlformats.org/drawingml/2006/main">
                   <a:graphicData uri="http://schemas.microsoft.com/office/word/2010/wordprocessingInk">
-                    <w14:contentPart bwMode="auto" r:id="rId22">
+                    <w14:contentPart bwMode="auto" r:id="rId24">
                       <w14:nvContentPartPr>
                         <w14:cNvContentPartPr/>
                       </w14:nvContentPartPr>
@@ -2653,7 +2671,7 @@
           <mc:Fallback>
             <w:pict>
               <v:shape w14:anchorId="121A21CA" id="Ink 60" o:spid="_x0000_s1026" type="#_x0000_t75" style="position:absolute;margin-left:2.2pt;margin-top:71.55pt;width:72.3pt;height:20.2pt;z-index:251719680;visibility:visible;mso-wrap-style:square;mso-width-percent:0;mso-height-percent:0;mso-wrap-distance-left:9pt;mso-wrap-distance-top:0;mso-wrap-distance-right:9pt;mso-wrap-distance-bottom:0;mso-position-horizontal:absolute;mso-position-horizontal-relative:text;mso-position-vertical:absolute;mso-position-vertical-relative:text;mso-width-percent:0;mso-height-percent:0;mso-width-relative:margin;mso-height-relative:margin" o:gfxdata="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">
-                <v:imagedata r:id="rId23" o:title=""/>
+                <v:imagedata r:id="rId25" o:title=""/>
               </v:shape>
             </w:pict>
           </mc:Fallback>
@@ -2678,7 +2696,7 @@
                 <wp:cNvGraphicFramePr/>
                 <a:graphic xmlns:a="http://schemas.openxmlformats.org/drawingml/2006/main">
                   <a:graphicData uri="http://schemas.microsoft.com/office/word/2010/wordprocessingInk">
-                    <w14:contentPart bwMode="auto" r:id="rId24">
+                    <w14:contentPart bwMode="auto" r:id="rId26">
                       <w14:nvContentPartPr>
                         <w14:cNvContentPartPr/>
                       </w14:nvContentPartPr>
@@ -2701,7 +2719,7 @@
           <mc:Fallback>
             <w:pict>
               <v:shape w14:anchorId="0B0C10D7" id="Ink 44" o:spid="_x0000_s1026" type="#_x0000_t75" style="position:absolute;margin-left:100.55pt;margin-top:79.5pt;width:61.05pt;height:7.4pt;z-index:251703296;visibility:visible;mso-wrap-style:square;mso-width-percent:0;mso-height-percent:0;mso-wrap-distance-left:9pt;mso-wrap-distance-top:0;mso-wrap-distance-right:9pt;mso-wrap-distance-bottom:0;mso-position-horizontal:absolute;mso-position-horizontal-relative:text;mso-position-vertical:absolute;mso-position-vertical-relative:text;mso-width-percent:0;mso-height-percent:0;mso-width-relative:margin;mso-height-relative:margin" o:gfxdata="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">
-                <v:imagedata r:id="rId25" o:title=""/>
+                <v:imagedata r:id="rId27" o:title=""/>
               </v:shape>
             </w:pict>
           </mc:Fallback>
@@ -2726,7 +2744,7 @@
                 <wp:cNvGraphicFramePr/>
                 <a:graphic xmlns:a="http://schemas.openxmlformats.org/drawingml/2006/main">
                   <a:graphicData uri="http://schemas.microsoft.com/office/word/2010/wordprocessingInk">
-                    <w14:contentPart bwMode="auto" r:id="rId26">
+                    <w14:contentPart bwMode="auto" r:id="rId28">
                       <w14:nvContentPartPr>
                         <w14:cNvContentPartPr/>
                       </w14:nvContentPartPr>
@@ -2743,7 +2761,7 @@
           <mc:Fallback>
             <w:pict>
               <v:shape w14:anchorId="02B11259" id="Ink 42" o:spid="_x0000_s1026" type="#_x0000_t75" style="position:absolute;margin-left:163.4pt;margin-top:52.35pt;width:10.6pt;height:55.9pt;z-index:251701248;visibility:visible;mso-wrap-style:square;mso-wrap-distance-left:9pt;mso-wrap-distance-top:0;mso-wrap-distance-right:9pt;mso-wrap-distance-bottom:0;mso-position-horizontal:absolute;mso-position-horizontal-relative:text;mso-position-vertical:absolute;mso-position-vertical-relative:text" o:gfxdata="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">
-                <v:imagedata r:id="rId27" o:title=""/>
+                <v:imagedata r:id="rId29" o:title=""/>
               </v:shape>
             </w:pict>
           </mc:Fallback>
@@ -2766,7 +2784,7 @@
                     <pic:cNvPicPr/>
                   </pic:nvPicPr>
                   <pic:blipFill>
-                    <a:blip r:embed="rId28"/>
+                    <a:blip r:embed="rId30"/>
                     <a:stretch>
                       <a:fillRect/>
                     </a:stretch>
@@ -2804,6 +2822,7 @@
     </w:p>
     <w:p>
       <w:r>
+        <w:lastRenderedPageBreak/>
         <w:t>The first run Tx in broadcast:</w:t>
       </w:r>
     </w:p>
@@ -2812,7 +2831,6 @@
         <w:jc w:val="center"/>
       </w:pPr>
       <w:r>
-        <w:lastRenderedPageBreak/>
         <mc:AlternateContent>
           <mc:Choice Requires="wpi">
             <w:drawing>
@@ -2831,7 +2849,7 @@
                 <wp:cNvGraphicFramePr/>
                 <a:graphic xmlns:a="http://schemas.openxmlformats.org/drawingml/2006/main">
                   <a:graphicData uri="http://schemas.microsoft.com/office/word/2010/wordprocessingInk">
-                    <w14:contentPart bwMode="auto" r:id="rId29">
+                    <w14:contentPart bwMode="auto" r:id="rId31">
                       <w14:nvContentPartPr>
                         <w14:cNvContentPartPr/>
                       </w14:nvContentPartPr>
@@ -2848,7 +2866,7 @@
           <mc:Fallback>
             <w:pict>
               <v:shape w14:anchorId="7C255D90" id="Ink 38" o:spid="_x0000_s1026" type="#_x0000_t75" style="position:absolute;margin-left:154.4pt;margin-top:80.75pt;width:50.1pt;height:13.85pt;z-index:251697152;visibility:visible;mso-wrap-style:square;mso-wrap-distance-left:9pt;mso-wrap-distance-top:0;mso-wrap-distance-right:9pt;mso-wrap-distance-bottom:0;mso-position-horizontal:absolute;mso-position-horizontal-relative:text;mso-position-vertical:absolute;mso-position-vertical-relative:text" o:gfxdata="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">
-                <v:imagedata r:id="rId30" o:title=""/>
+                <v:imagedata r:id="rId32" o:title=""/>
               </v:shape>
             </w:pict>
           </mc:Fallback>
@@ -2871,7 +2889,7 @@
                     <pic:cNvPicPr/>
                   </pic:nvPicPr>
                   <pic:blipFill>
-                    <a:blip r:embed="rId31"/>
+                    <a:blip r:embed="rId33"/>
                     <a:stretch>
                       <a:fillRect/>
                     </a:stretch>
@@ -2920,7 +2938,7 @@
                 <wp:cNvGraphicFramePr/>
                 <a:graphic xmlns:a="http://schemas.openxmlformats.org/drawingml/2006/main">
                   <a:graphicData uri="http://schemas.microsoft.com/office/word/2010/wordprocessingInk">
-                    <w14:contentPart bwMode="auto" r:id="rId32">
+                    <w14:contentPart bwMode="auto" r:id="rId34">
                       <w14:nvContentPartPr>
                         <w14:cNvContentPartPr/>
                       </w14:nvContentPartPr>
@@ -2937,7 +2955,7 @@
           <mc:Fallback>
             <w:pict>
               <v:shape w14:anchorId="29B06F70" id="Ink 40" o:spid="_x0000_s1026" type="#_x0000_t75" style="position:absolute;margin-left:207pt;margin-top:-70.4pt;width:44.05pt;height:174.7pt;z-index:251699200;visibility:visible;mso-wrap-style:square;mso-wrap-distance-left:9pt;mso-wrap-distance-top:0;mso-wrap-distance-right:9pt;mso-wrap-distance-bottom:0;mso-position-horizontal:absolute;mso-position-horizontal-relative:text;mso-position-vertical:absolute;mso-position-vertical-relative:text" o:gfxdata="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">
-                <v:imagedata r:id="rId33" o:title=""/>
+                <v:imagedata r:id="rId35" o:title=""/>
               </v:shape>
             </w:pict>
           </mc:Fallback>
@@ -2962,7 +2980,7 @@
                 <wp:cNvGraphicFramePr/>
                 <a:graphic xmlns:a="http://schemas.openxmlformats.org/drawingml/2006/main">
                   <a:graphicData uri="http://schemas.microsoft.com/office/word/2010/wordprocessingInk">
-                    <w14:contentPart bwMode="auto" r:id="rId34">
+                    <w14:contentPart bwMode="auto" r:id="rId36">
                       <w14:nvContentPartPr>
                         <w14:cNvContentPartPr/>
                       </w14:nvContentPartPr>
@@ -2979,7 +2997,7 @@
           <mc:Fallback>
             <w:pict>
               <v:shape w14:anchorId="7AD71277" id="Ink 39" o:spid="_x0000_s1026" type="#_x0000_t75" style="position:absolute;margin-left:157.1pt;margin-top:91.5pt;width:40.8pt;height:16.45pt;z-index:251698176;visibility:visible;mso-wrap-style:square;mso-wrap-distance-left:9pt;mso-wrap-distance-top:0;mso-wrap-distance-right:9pt;mso-wrap-distance-bottom:0;mso-position-horizontal:absolute;mso-position-horizontal-relative:text;mso-position-vertical:absolute;mso-position-vertical-relative:text" o:gfxdata="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">
-                <v:imagedata r:id="rId35" o:title=""/>
+                <v:imagedata r:id="rId37" o:title=""/>
               </v:shape>
             </w:pict>
           </mc:Fallback>
@@ -3002,7 +3020,7 @@
                     <pic:cNvPicPr/>
                   </pic:nvPicPr>
                   <pic:blipFill>
-                    <a:blip r:embed="rId31"/>
+                    <a:blip r:embed="rId33"/>
                     <a:stretch>
                       <a:fillRect/>
                     </a:stretch>
@@ -3069,7 +3087,7 @@
                 <wp:cNvGraphicFramePr/>
                 <a:graphic xmlns:a="http://schemas.openxmlformats.org/drawingml/2006/main">
                   <a:graphicData uri="http://schemas.microsoft.com/office/word/2010/wordprocessingInk">
-                    <w14:contentPart bwMode="auto" r:id="rId36">
+                    <w14:contentPart bwMode="auto" r:id="rId38">
                       <w14:nvContentPartPr>
                         <w14:cNvContentPartPr/>
                       </w14:nvContentPartPr>
@@ -3086,7 +3104,7 @@
           <mc:Fallback>
             <w:pict>
               <v:shape w14:anchorId="77C4FF6F" id="Ink 41" o:spid="_x0000_s1026" type="#_x0000_t75" style="position:absolute;margin-left:228.6pt;margin-top:97.85pt;width:44.4pt;height:15.8pt;z-index:251700224;visibility:visible;mso-wrap-style:square;mso-wrap-distance-left:9pt;mso-wrap-distance-top:0;mso-wrap-distance-right:9pt;mso-wrap-distance-bottom:0;mso-position-horizontal:absolute;mso-position-horizontal-relative:text;mso-position-vertical:absolute;mso-position-vertical-relative:text" o:gfxdata="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">
-                <v:imagedata r:id="rId37" o:title=""/>
+                <v:imagedata r:id="rId39" o:title=""/>
               </v:shape>
             </w:pict>
           </mc:Fallback>
@@ -3109,7 +3127,7 @@
                     <pic:cNvPicPr/>
                   </pic:nvPicPr>
                   <pic:blipFill>
-                    <a:blip r:embed="rId38"/>
+                    <a:blip r:embed="rId40"/>
                     <a:stretch>
                       <a:fillRect/>
                     </a:stretch>
@@ -3142,7 +3160,13 @@
     </w:p>
     <w:p>
       <w:r>
-        <w:t>you can use the cast command to cat hex to dec like this:</w:t>
+        <w:t>you can use the cast command to ca</w:t>
+      </w:r>
+      <w:r>
+        <w:t>s</w:t>
+      </w:r>
+      <w:r>
+        <w:t>t hex to dec like this:</w:t>
       </w:r>
     </w:p>
     <w:p>
@@ -3156,14 +3180,3427 @@
     <w:p>
       <w:pPr>
         <w:pStyle w:val="bashsnippet"/>
-        <w:rPr>
-          <w:color w:val="auto"/>
-        </w:rPr>
       </w:pPr>
       <w:r>
         <w:t>cast --to-base 0x714e1 dec</w:t>
       </w:r>
     </w:p>
+    <w:p/>
+    <w:p>
+      <w:pPr>
+        <w:pStyle w:val="Heading2"/>
+        <w:rPr>
+          <w:color w:val="EE0000"/>
+        </w:rPr>
+      </w:pPr>
+      <w:r>
+        <w:rPr>
+          <w:color w:val="EE0000"/>
+        </w:rPr>
+        <w:lastRenderedPageBreak/>
+        <w:t>Interact with the deployed contract</w:t>
+      </w:r>
+    </w:p>
+    <w:p>
+      <w:pPr>
+        <w:pStyle w:val="Heading3"/>
+      </w:pPr>
+      <w:r>
+        <w:t>Using cast</w:t>
+      </w:r>
+    </w:p>
+    <w:p>
+      <w:r>
+        <mc:AlternateContent>
+          <mc:Choice Requires="wpi">
+            <w:drawing>
+              <wp:anchor distT="0" distB="0" distL="114300" distR="114300" simplePos="0" relativeHeight="251767808" behindDoc="0" locked="0" layoutInCell="1" allowOverlap="1" wp14:anchorId="02B30865" wp14:editId="3FF9DC74">
+                <wp:simplePos x="0" y="0"/>
+                <wp:positionH relativeFrom="column">
+                  <wp:posOffset>3767455</wp:posOffset>
+                </wp:positionH>
+                <wp:positionV relativeFrom="paragraph">
+                  <wp:posOffset>-5715</wp:posOffset>
+                </wp:positionV>
+                <wp:extent cx="1708785" cy="551815"/>
+                <wp:effectExtent l="38100" t="38100" r="43815" b="38735"/>
+                <wp:wrapNone/>
+                <wp:docPr id="1440759109" name="Ink 46"/>
+                <wp:cNvGraphicFramePr/>
+                <a:graphic xmlns:a="http://schemas.openxmlformats.org/drawingml/2006/main">
+                  <a:graphicData uri="http://schemas.microsoft.com/office/word/2010/wordprocessingInk">
+                    <w14:contentPart bwMode="auto" r:id="rId41">
+                      <w14:nvContentPartPr>
+                        <w14:cNvContentPartPr/>
+                      </w14:nvContentPartPr>
+                      <w14:xfrm>
+                        <a:off x="0" y="0"/>
+                        <a:ext cx="1708785" cy="551815"/>
+                      </w14:xfrm>
+                    </w14:contentPart>
+                  </a:graphicData>
+                </a:graphic>
+              </wp:anchor>
+            </w:drawing>
+          </mc:Choice>
+          <mc:Fallback>
+            <w:pict>
+              <v:shapetype w14:anchorId="0D2A09D6" id="_x0000_t75" coordsize="21600,21600" o:spt="75" o:preferrelative="t" path="m@4@5l@4@11@9@11@9@5xe" filled="f" stroked="f">
+                <v:stroke joinstyle="miter"/>
+                <v:formulas>
+                  <v:f eqn="if lineDrawn pixelLineWidth 0"/>
+                  <v:f eqn="sum @0 1 0"/>
+                  <v:f eqn="sum 0 0 @1"/>
+                  <v:f eqn="prod @2 1 2"/>
+                  <v:f eqn="prod @3 21600 pixelWidth"/>
+                  <v:f eqn="prod @3 21600 pixelHeight"/>
+                  <v:f eqn="sum @0 0 1"/>
+                  <v:f eqn="prod @6 1 2"/>
+                  <v:f eqn="prod @7 21600 pixelWidth"/>
+                  <v:f eqn="sum @8 21600 0"/>
+                  <v:f eqn="prod @7 21600 pixelHeight"/>
+                  <v:f eqn="sum @10 21600 0"/>
+                </v:formulas>
+                <v:path o:extrusionok="f" gradientshapeok="t" o:connecttype="rect"/>
+                <o:lock v:ext="edit" aspectratio="t"/>
+              </v:shapetype>
+              <v:shape id="Ink 46" o:spid="_x0000_s1026" type="#_x0000_t75" style="position:absolute;margin-left:296.3pt;margin-top:-.8pt;width:135.25pt;height:44.15pt;z-index:251767808;visibility:visible;mso-wrap-style:square;mso-wrap-distance-left:9pt;mso-wrap-distance-top:0;mso-wrap-distance-right:9pt;mso-wrap-distance-bottom:0;mso-position-horizontal:absolute;mso-position-horizontal-relative:text;mso-position-vertical:absolute;mso-position-vertical-relative:text" o:gfxdata="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">
+                <v:imagedata r:id="rId42" o:title=""/>
+              </v:shape>
+            </w:pict>
+          </mc:Fallback>
+        </mc:AlternateContent>
+      </w:r>
+      <w:r>
+        <w:t>for sending a Tx w</w:t>
+      </w:r>
+      <w:r>
+        <w:t>e do something like this:</w:t>
+      </w:r>
+    </w:p>
+    <w:p>
+      <w:pPr>
+        <w:pStyle w:val="bashsnippet"/>
+      </w:pPr>
+      <w:r>
+        <w:t>&lt;/&gt; bash</w:t>
+      </w:r>
+    </w:p>
+    <w:p>
+      <w:pPr>
+        <w:pStyle w:val="bashsnippet"/>
+      </w:pPr>
+      <w:r>
+        <w:t xml:space="preserve">cast </w:t>
+      </w:r>
+      <w:r>
+        <w:rPr>
+          <w:color w:val="EE0000"/>
+        </w:rPr>
+        <w:t xml:space="preserve">send </w:t>
+      </w:r>
+      <w:r>
+        <w:t>0x5FbDB2315678afecb367f032d93F642f64180aa3 "store(uint256)" 1337 --rpc-url $RPC_URL --private-key $PRIVATE_KEY</w:t>
+      </w:r>
+    </w:p>
+    <w:p>
+      <w:r>
+        <w:t>which 0x5fb.. is the deployed contratc address.</w:t>
+      </w:r>
+    </w:p>
+    <w:p>
+      <w:r>
+        <w:t>For calling a method (that doesn’t change the state of the blockchain) we do this:</w:t>
+      </w:r>
+    </w:p>
+    <w:p>
+      <w:pPr>
+        <w:pStyle w:val="bashsnippet"/>
+      </w:pPr>
+      <w:r>
+        <w:t>&lt;/&gt; bash</w:t>
+      </w:r>
+    </w:p>
+    <w:p>
+      <w:pPr>
+        <w:pStyle w:val="bashsnippet"/>
+      </w:pPr>
+      <w:r>
+        <w:t xml:space="preserve">cast </w:t>
+      </w:r>
+      <w:r>
+        <w:rPr>
+          <w:color w:val="EE0000"/>
+        </w:rPr>
+        <w:t>call</w:t>
+      </w:r>
+      <w:r>
+        <w:rPr>
+          <w:color w:val="EE0000"/>
+        </w:rPr>
+        <w:t xml:space="preserve"> </w:t>
+      </w:r>
+      <w:r>
+        <w:t>0x5FbDB2315678afecb367f032d93F642f64180aa3 "</w:t>
+      </w:r>
+      <w:r>
+        <w:t>retrieve(</w:t>
+      </w:r>
+      <w:r>
+        <w:t>)"</w:t>
+      </w:r>
+      <w:r>
+        <w:t xml:space="preserve"> </w:t>
+      </w:r>
+      <w:r>
+        <w:t>--rpc-url $RPC_URL --private-key $PRIVATE_KEY</w:t>
+      </w:r>
+    </w:p>
+    <w:p>
+      <w:r>
+        <w:t>it returns in 0x hex though, then convert to decimal using cast –to-base:</w:t>
+      </w:r>
+    </w:p>
+    <w:p>
+      <w:pPr>
+        <w:pStyle w:val="bashsnippet"/>
+      </w:pPr>
+      <w:r>
+        <w:t>cast --to-base 0x00000000000000000000000000000000000000000000000000000000000007ea dec</w:t>
+      </w:r>
+    </w:p>
+    <w:p>
+      <w:r>
+        <w:t>and we get the value.</w:t>
+      </w:r>
+    </w:p>
+    <w:p>
+      <w:pPr>
+        <w:jc w:val="center"/>
+        <w:rPr>
+          <w:i/>
+          <w:iCs/>
+          <w:color w:val="EE0000"/>
+          <w:u w:val="single"/>
+        </w:rPr>
+      </w:pPr>
+      <w:r>
+        <w:rPr>
+          <w:i/>
+          <w:iCs/>
+          <w:color w:val="EE0000"/>
+          <w:u w:val="single"/>
+        </w:rPr>
+        <w:t>To deal with a real tetsnet or mainnnet, we just put the real rpc_url of the network (we can use alchemy to get one</w:t>
+      </w:r>
+      <w:r>
+        <w:rPr>
+          <w:i/>
+          <w:iCs/>
+          <w:color w:val="EE0000"/>
+          <w:u w:val="single"/>
+        </w:rPr>
+        <w:t xml:space="preserve"> -&gt; create new app -&gt; on Sepolia network -&gt; copy the HTTP URL as rpc_url and we’re good!</w:t>
+      </w:r>
+      <w:r>
+        <w:rPr>
+          <w:i/>
+          <w:iCs/>
+          <w:color w:val="EE0000"/>
+          <w:u w:val="single"/>
+        </w:rPr>
+        <w:t xml:space="preserve">) and </w:t>
+      </w:r>
+      <w:r>
+        <w:rPr>
+          <w:i/>
+          <w:iCs/>
+          <w:color w:val="EE0000"/>
+          <w:u w:val="single"/>
+        </w:rPr>
+        <w:t>a real private key from meta mask.</w:t>
+      </w:r>
+    </w:p>
+    <w:p>
+      <w:r>
+        <w:t>Use this command to clean up the code</w:t>
+      </w:r>
+      <w:r>
+        <w:t xml:space="preserve"> (format)</w:t>
+      </w:r>
+      <w:r>
+        <w:t>:</w:t>
+      </w:r>
+    </w:p>
+    <w:p>
+      <w:pPr>
+        <w:pStyle w:val="bashsnippet"/>
+      </w:pPr>
+      <w:r>
+        <w:t xml:space="preserve"> </w:t>
+      </w:r>
+      <w:r>
+        <w:t>&lt;/&gt; bash</w:t>
+      </w:r>
+    </w:p>
+    <w:p>
+      <w:pPr>
+        <w:pStyle w:val="bashsnippet"/>
+      </w:pPr>
+      <w:r>
+        <w:t>Forge fmt</w:t>
+      </w:r>
+    </w:p>
+    <w:p>
+      <w:r>
+        <w:t>A quick summary:</w:t>
+      </w:r>
+    </w:p>
+    <w:p>
+      <w:pPr>
+        <w:pStyle w:val="codesnippet"/>
+        <w:framePr w:wrap="notBeside"/>
+      </w:pPr>
+      <w:r>
+        <w:rPr>
+          <w:color w:val="00B050"/>
+        </w:rPr>
+        <w:t xml:space="preserve">Forge </w:t>
+      </w:r>
+      <w:r>
+        <w:t xml:space="preserve">-&gt; creating and </w:t>
+      </w:r>
+      <w:r>
+        <w:t>deploying</w:t>
+      </w:r>
+      <w:r>
+        <w:t xml:space="preserve"> the contract</w:t>
+      </w:r>
+    </w:p>
+    <w:p>
+      <w:pPr>
+        <w:pStyle w:val="codesnippet"/>
+        <w:framePr w:wrap="notBeside"/>
+      </w:pPr>
+      <w:r>
+        <w:rPr>
+          <w:color w:val="ED7D31" w:themeColor="accent2"/>
+        </w:rPr>
+        <w:t xml:space="preserve">Anvil </w:t>
+      </w:r>
+      <w:r>
+        <w:t>-&gt; running a parallel local blockchain in-memory</w:t>
+      </w:r>
+    </w:p>
+    <w:p>
+      <w:pPr>
+        <w:pStyle w:val="codesnippet"/>
+        <w:framePr w:wrap="notBeside"/>
+      </w:pPr>
+      <w:r>
+        <w:rPr>
+          <w:color w:val="00B0F0"/>
+        </w:rPr>
+        <w:t xml:space="preserve">Cast </w:t>
+      </w:r>
+      <w:r>
+        <w:t>-&gt; work with deployed contracts call and send Txs.</w:t>
+      </w:r>
+    </w:p>
+    <w:p/>
+    <w:p>
+      <w:pPr>
+        <w:pStyle w:val="Heading1"/>
+        <w:rPr>
+          <w:color w:val="EE0000"/>
+        </w:rPr>
+      </w:pPr>
+      <w:r>
+        <w:rPr>
+          <w:color w:val="EE0000"/>
+        </w:rPr>
+        <w:t>Test</w:t>
+      </w:r>
+    </w:p>
+    <w:p>
+      <w:r>
+        <w:t>Prbably the most important thing in foundry!</w:t>
+      </w:r>
+    </w:p>
+    <w:p>
+      <w:r>
+        <w:t>The template:</w:t>
+      </w:r>
+    </w:p>
+    <w:p>
+      <w:pPr>
+        <w:shd w:val="clear" w:color="auto" w:fill="0E1016"/>
+        <w:spacing w:after="0" w:line="360" w:lineRule="atLeast"/>
+        <w:rPr>
+          <w:rFonts w:ascii="Ubuntu Mono" w:eastAsia="Times New Roman" w:hAnsi="Ubuntu Mono" w:cs="Times New Roman"/>
+          <w:color w:val="FD8BFF"/>
+          <w:kern w:val="0"/>
+          <w:sz w:val="20"/>
+          <w:szCs w:val="20"/>
+          <w14:ligatures w14:val="none"/>
+        </w:rPr>
+      </w:pPr>
+      <w:r>
+        <w:rPr>
+          <w:rFonts w:ascii="Ubuntu Mono" w:eastAsia="Times New Roman" w:hAnsi="Ubuntu Mono" w:cs="Times New Roman"/>
+          <w:color w:val="FD8BFF"/>
+          <w:kern w:val="0"/>
+          <w:sz w:val="20"/>
+          <w:szCs w:val="20"/>
+          <w14:ligatures w14:val="none"/>
+        </w:rPr>
+        <w:t>// SPDX-License-Identifier: MIT</w:t>
+      </w:r>
+    </w:p>
+    <w:p>
+      <w:pPr>
+        <w:shd w:val="clear" w:color="auto" w:fill="0E1016"/>
+        <w:spacing w:after="0" w:line="360" w:lineRule="atLeast"/>
+        <w:rPr>
+          <w:rFonts w:ascii="Ubuntu Mono" w:eastAsia="Times New Roman" w:hAnsi="Ubuntu Mono" w:cs="Times New Roman"/>
+          <w:color w:val="BFBDB6"/>
+          <w:kern w:val="0"/>
+          <w:sz w:val="20"/>
+          <w:szCs w:val="20"/>
+          <w14:ligatures w14:val="none"/>
+        </w:rPr>
+      </w:pPr>
+      <w:r>
+        <w:rPr>
+          <w:rFonts w:ascii="Ubuntu Mono" w:eastAsia="Times New Roman" w:hAnsi="Ubuntu Mono" w:cs="Times New Roman"/>
+          <w:color w:val="FD8BFF"/>
+          <w:kern w:val="0"/>
+          <w:sz w:val="20"/>
+          <w:szCs w:val="20"/>
+          <w14:ligatures w14:val="none"/>
+        </w:rPr>
+        <w:t>pragma</w:t>
+      </w:r>
+      <w:r>
+        <w:rPr>
+          <w:rFonts w:ascii="Ubuntu Mono" w:eastAsia="Times New Roman" w:hAnsi="Ubuntu Mono" w:cs="Times New Roman"/>
+          <w:color w:val="BFBDB6"/>
+          <w:kern w:val="0"/>
+          <w:sz w:val="20"/>
+          <w:szCs w:val="20"/>
+          <w14:ligatures w14:val="none"/>
+        </w:rPr>
+        <w:t xml:space="preserve"> </w:t>
+      </w:r>
+      <w:r>
+        <w:rPr>
+          <w:rFonts w:ascii="Ubuntu Mono" w:eastAsia="Times New Roman" w:hAnsi="Ubuntu Mono" w:cs="Times New Roman"/>
+          <w:color w:val="39BAE6"/>
+          <w:kern w:val="0"/>
+          <w:sz w:val="20"/>
+          <w:szCs w:val="20"/>
+          <w14:ligatures w14:val="none"/>
+        </w:rPr>
+        <w:t>solidity</w:t>
+      </w:r>
+      <w:r>
+        <w:rPr>
+          <w:rFonts w:ascii="Ubuntu Mono" w:eastAsia="Times New Roman" w:hAnsi="Ubuntu Mono" w:cs="Times New Roman"/>
+          <w:color w:val="BFBDB6"/>
+          <w:kern w:val="0"/>
+          <w:sz w:val="20"/>
+          <w:szCs w:val="20"/>
+          <w14:ligatures w14:val="none"/>
+        </w:rPr>
+        <w:t xml:space="preserve"> </w:t>
+      </w:r>
+      <w:r>
+        <w:rPr>
+          <w:rFonts w:ascii="Ubuntu Mono" w:eastAsia="Times New Roman" w:hAnsi="Ubuntu Mono" w:cs="Times New Roman"/>
+          <w:color w:val="95E6CB"/>
+          <w:kern w:val="0"/>
+          <w:sz w:val="20"/>
+          <w:szCs w:val="20"/>
+          <w14:ligatures w14:val="none"/>
+        </w:rPr>
+        <w:t>&gt;=0.8.2</w:t>
+      </w:r>
+      <w:r>
+        <w:rPr>
+          <w:rFonts w:ascii="Ubuntu Mono" w:eastAsia="Times New Roman" w:hAnsi="Ubuntu Mono" w:cs="Times New Roman"/>
+          <w:color w:val="BFBDB6"/>
+          <w:kern w:val="0"/>
+          <w:sz w:val="20"/>
+          <w:szCs w:val="20"/>
+          <w14:ligatures w14:val="none"/>
+        </w:rPr>
+        <w:t xml:space="preserve"> </w:t>
+      </w:r>
+      <w:r>
+        <w:rPr>
+          <w:rFonts w:ascii="Ubuntu Mono" w:eastAsia="Times New Roman" w:hAnsi="Ubuntu Mono" w:cs="Times New Roman"/>
+          <w:color w:val="03BBF5"/>
+          <w:kern w:val="0"/>
+          <w:sz w:val="20"/>
+          <w:szCs w:val="20"/>
+          <w14:ligatures w14:val="none"/>
+        </w:rPr>
+        <w:t>&lt;</w:t>
+      </w:r>
+      <w:r>
+        <w:rPr>
+          <w:rFonts w:ascii="Ubuntu Mono" w:eastAsia="Times New Roman" w:hAnsi="Ubuntu Mono" w:cs="Times New Roman"/>
+          <w:color w:val="4DFFCC"/>
+          <w:kern w:val="0"/>
+          <w:sz w:val="20"/>
+          <w:szCs w:val="20"/>
+          <w14:ligatures w14:val="none"/>
+        </w:rPr>
+        <w:t>0.9</w:t>
+      </w:r>
+      <w:r>
+        <w:rPr>
+          <w:rFonts w:ascii="Ubuntu Mono" w:eastAsia="Times New Roman" w:hAnsi="Ubuntu Mono" w:cs="Times New Roman"/>
+          <w:color w:val="CCF5FF"/>
+          <w:kern w:val="0"/>
+          <w:sz w:val="20"/>
+          <w:szCs w:val="20"/>
+          <w14:ligatures w14:val="none"/>
+        </w:rPr>
+        <w:t>.</w:t>
+      </w:r>
+      <w:r>
+        <w:rPr>
+          <w:rFonts w:ascii="Ubuntu Mono" w:eastAsia="Times New Roman" w:hAnsi="Ubuntu Mono" w:cs="Times New Roman"/>
+          <w:color w:val="4DFFCC"/>
+          <w:kern w:val="0"/>
+          <w:sz w:val="20"/>
+          <w:szCs w:val="20"/>
+          <w14:ligatures w14:val="none"/>
+        </w:rPr>
+        <w:t>2</w:t>
+      </w:r>
+      <w:r>
+        <w:rPr>
+          <w:rFonts w:ascii="Ubuntu Mono" w:eastAsia="Times New Roman" w:hAnsi="Ubuntu Mono" w:cs="Times New Roman"/>
+          <w:color w:val="BFBDB6"/>
+          <w:kern w:val="0"/>
+          <w:sz w:val="20"/>
+          <w:szCs w:val="20"/>
+          <w14:ligatures w14:val="none"/>
+        </w:rPr>
+        <w:t>;</w:t>
+      </w:r>
+    </w:p>
+    <w:p>
+      <w:pPr>
+        <w:shd w:val="clear" w:color="auto" w:fill="0E1016"/>
+        <w:spacing w:after="0" w:line="360" w:lineRule="atLeast"/>
+        <w:rPr>
+          <w:rFonts w:ascii="Ubuntu Mono" w:eastAsia="Times New Roman" w:hAnsi="Ubuntu Mono" w:cs="Times New Roman"/>
+          <w:color w:val="BFBDB6"/>
+          <w:kern w:val="0"/>
+          <w:sz w:val="20"/>
+          <w:szCs w:val="20"/>
+          <w14:ligatures w14:val="none"/>
+        </w:rPr>
+      </w:pPr>
+    </w:p>
+    <w:p>
+      <w:pPr>
+        <w:shd w:val="clear" w:color="auto" w:fill="0E1016"/>
+        <w:spacing w:after="0" w:line="360" w:lineRule="atLeast"/>
+        <w:rPr>
+          <w:rFonts w:ascii="Ubuntu Mono" w:eastAsia="Times New Roman" w:hAnsi="Ubuntu Mono" w:cs="Times New Roman"/>
+          <w:color w:val="BFBDB6"/>
+          <w:kern w:val="0"/>
+          <w:sz w:val="20"/>
+          <w:szCs w:val="20"/>
+          <w14:ligatures w14:val="none"/>
+        </w:rPr>
+      </w:pPr>
+      <w:r>
+        <w:rPr>
+          <w:rFonts w:ascii="Ubuntu Mono" w:eastAsia="Times New Roman" w:hAnsi="Ubuntu Mono" w:cs="Times New Roman"/>
+          <w:color w:val="87CFFF"/>
+          <w:kern w:val="0"/>
+          <w:sz w:val="20"/>
+          <w:szCs w:val="20"/>
+          <w14:ligatures w14:val="none"/>
+        </w:rPr>
+        <w:t>import</w:t>
+      </w:r>
+      <w:r>
+        <w:rPr>
+          <w:rFonts w:ascii="Ubuntu Mono" w:eastAsia="Times New Roman" w:hAnsi="Ubuntu Mono" w:cs="Times New Roman"/>
+          <w:color w:val="BFBDB6"/>
+          <w:kern w:val="0"/>
+          <w:sz w:val="20"/>
+          <w:szCs w:val="20"/>
+          <w14:ligatures w14:val="none"/>
+        </w:rPr>
+        <w:t xml:space="preserve"> {</w:t>
+      </w:r>
+      <w:r>
+        <w:rPr>
+          <w:rFonts w:ascii="Ubuntu Mono" w:eastAsia="Times New Roman" w:hAnsi="Ubuntu Mono" w:cs="Times New Roman"/>
+          <w:color w:val="FFFFC6"/>
+          <w:kern w:val="0"/>
+          <w:sz w:val="20"/>
+          <w:szCs w:val="20"/>
+          <w14:ligatures w14:val="none"/>
+        </w:rPr>
+        <w:t>Test</w:t>
+      </w:r>
+      <w:r>
+        <w:rPr>
+          <w:rFonts w:ascii="Ubuntu Mono" w:eastAsia="Times New Roman" w:hAnsi="Ubuntu Mono" w:cs="Times New Roman"/>
+          <w:color w:val="BFBDB6"/>
+          <w:kern w:val="0"/>
+          <w:sz w:val="20"/>
+          <w:szCs w:val="20"/>
+          <w14:ligatures w14:val="none"/>
+        </w:rPr>
+        <w:t xml:space="preserve">, </w:t>
+      </w:r>
+      <w:r>
+        <w:rPr>
+          <w:rFonts w:ascii="Ubuntu Mono" w:eastAsia="Times New Roman" w:hAnsi="Ubuntu Mono" w:cs="Times New Roman"/>
+          <w:color w:val="FFFFC6"/>
+          <w:kern w:val="0"/>
+          <w:sz w:val="20"/>
+          <w:szCs w:val="20"/>
+          <w14:ligatures w14:val="none"/>
+        </w:rPr>
+        <w:t>console</w:t>
+      </w:r>
+      <w:r>
+        <w:rPr>
+          <w:rFonts w:ascii="Ubuntu Mono" w:eastAsia="Times New Roman" w:hAnsi="Ubuntu Mono" w:cs="Times New Roman"/>
+          <w:color w:val="BFBDB6"/>
+          <w:kern w:val="0"/>
+          <w:sz w:val="20"/>
+          <w:szCs w:val="20"/>
+          <w14:ligatures w14:val="none"/>
+        </w:rPr>
+        <w:t xml:space="preserve">} </w:t>
+      </w:r>
+      <w:r>
+        <w:rPr>
+          <w:rFonts w:ascii="Ubuntu Mono" w:eastAsia="Times New Roman" w:hAnsi="Ubuntu Mono" w:cs="Times New Roman"/>
+          <w:color w:val="87CFFF"/>
+          <w:kern w:val="0"/>
+          <w:sz w:val="20"/>
+          <w:szCs w:val="20"/>
+          <w14:ligatures w14:val="none"/>
+        </w:rPr>
+        <w:t>from</w:t>
+      </w:r>
+      <w:r>
+        <w:rPr>
+          <w:rFonts w:ascii="Ubuntu Mono" w:eastAsia="Times New Roman" w:hAnsi="Ubuntu Mono" w:cs="Times New Roman"/>
+          <w:color w:val="BFBDB6"/>
+          <w:kern w:val="0"/>
+          <w:sz w:val="20"/>
+          <w:szCs w:val="20"/>
+          <w14:ligatures w14:val="none"/>
+        </w:rPr>
+        <w:t xml:space="preserve"> </w:t>
+      </w:r>
+      <w:r>
+        <w:rPr>
+          <w:rFonts w:ascii="Ubuntu Mono" w:eastAsia="Times New Roman" w:hAnsi="Ubuntu Mono" w:cs="Times New Roman"/>
+          <w:color w:val="5FEF3B"/>
+          <w:kern w:val="0"/>
+          <w:sz w:val="20"/>
+          <w:szCs w:val="20"/>
+          <w14:ligatures w14:val="none"/>
+        </w:rPr>
+        <w:t>"forge-std/Test.sol"</w:t>
+      </w:r>
+      <w:r>
+        <w:rPr>
+          <w:rFonts w:ascii="Ubuntu Mono" w:eastAsia="Times New Roman" w:hAnsi="Ubuntu Mono" w:cs="Times New Roman"/>
+          <w:color w:val="BFBDB6"/>
+          <w:kern w:val="0"/>
+          <w:sz w:val="20"/>
+          <w:szCs w:val="20"/>
+          <w14:ligatures w14:val="none"/>
+        </w:rPr>
+        <w:t>;</w:t>
+      </w:r>
+    </w:p>
+    <w:p>
+      <w:pPr>
+        <w:shd w:val="clear" w:color="auto" w:fill="0E1016"/>
+        <w:spacing w:after="0" w:line="360" w:lineRule="atLeast"/>
+        <w:rPr>
+          <w:rFonts w:ascii="Ubuntu Mono" w:eastAsia="Times New Roman" w:hAnsi="Ubuntu Mono" w:cs="Times New Roman"/>
+          <w:color w:val="BFBDB6"/>
+          <w:kern w:val="0"/>
+          <w:sz w:val="20"/>
+          <w:szCs w:val="20"/>
+          <w14:ligatures w14:val="none"/>
+        </w:rPr>
+      </w:pPr>
+      <w:r>
+        <w:rPr>
+          <w:rFonts w:ascii="Ubuntu Mono" w:eastAsia="Times New Roman" w:hAnsi="Ubuntu Mono" w:cs="Times New Roman"/>
+          <w:color w:val="87CFFF"/>
+          <w:kern w:val="0"/>
+          <w:sz w:val="20"/>
+          <w:szCs w:val="20"/>
+          <w14:ligatures w14:val="none"/>
+        </w:rPr>
+        <w:t>import</w:t>
+      </w:r>
+      <w:r>
+        <w:rPr>
+          <w:rFonts w:ascii="Ubuntu Mono" w:eastAsia="Times New Roman" w:hAnsi="Ubuntu Mono" w:cs="Times New Roman"/>
+          <w:color w:val="BFBDB6"/>
+          <w:kern w:val="0"/>
+          <w:sz w:val="20"/>
+          <w:szCs w:val="20"/>
+          <w14:ligatures w14:val="none"/>
+        </w:rPr>
+        <w:t xml:space="preserve"> </w:t>
+      </w:r>
+      <w:r>
+        <w:rPr>
+          <w:rFonts w:ascii="Ubuntu Mono" w:eastAsia="Times New Roman" w:hAnsi="Ubuntu Mono" w:cs="Times New Roman"/>
+          <w:color w:val="5FEF3B"/>
+          <w:kern w:val="0"/>
+          <w:sz w:val="20"/>
+          <w:szCs w:val="20"/>
+          <w14:ligatures w14:val="none"/>
+        </w:rPr>
+        <w:t>"../src/CrowdFund.sol"</w:t>
+      </w:r>
+      <w:r>
+        <w:rPr>
+          <w:rFonts w:ascii="Ubuntu Mono" w:eastAsia="Times New Roman" w:hAnsi="Ubuntu Mono" w:cs="Times New Roman"/>
+          <w:color w:val="BFBDB6"/>
+          <w:kern w:val="0"/>
+          <w:sz w:val="20"/>
+          <w:szCs w:val="20"/>
+          <w14:ligatures w14:val="none"/>
+        </w:rPr>
+        <w:t>;</w:t>
+      </w:r>
+    </w:p>
+    <w:p>
+      <w:pPr>
+        <w:shd w:val="clear" w:color="auto" w:fill="0E1016"/>
+        <w:spacing w:after="0" w:line="360" w:lineRule="atLeast"/>
+        <w:rPr>
+          <w:rFonts w:ascii="Ubuntu Mono" w:eastAsia="Times New Roman" w:hAnsi="Ubuntu Mono" w:cs="Times New Roman"/>
+          <w:color w:val="BFBDB6"/>
+          <w:kern w:val="0"/>
+          <w:sz w:val="20"/>
+          <w:szCs w:val="20"/>
+          <w14:ligatures w14:val="none"/>
+        </w:rPr>
+      </w:pPr>
+    </w:p>
+    <w:p>
+      <w:pPr>
+        <w:shd w:val="clear" w:color="auto" w:fill="0E1016"/>
+        <w:spacing w:after="0" w:line="360" w:lineRule="atLeast"/>
+        <w:rPr>
+          <w:rFonts w:ascii="Ubuntu Mono" w:eastAsia="Times New Roman" w:hAnsi="Ubuntu Mono" w:cs="Times New Roman"/>
+          <w:color w:val="BFBDB6"/>
+          <w:kern w:val="0"/>
+          <w:sz w:val="20"/>
+          <w:szCs w:val="20"/>
+          <w14:ligatures w14:val="none"/>
+        </w:rPr>
+      </w:pPr>
+      <w:r>
+        <w:rPr>
+          <w:rFonts w:ascii="Ubuntu Mono" w:eastAsia="Times New Roman" w:hAnsi="Ubuntu Mono" w:cs="Times New Roman"/>
+          <w:color w:val="FFB289"/>
+          <w:kern w:val="0"/>
+          <w:sz w:val="20"/>
+          <w:szCs w:val="20"/>
+          <w14:ligatures w14:val="none"/>
+        </w:rPr>
+        <w:t>contract</w:t>
+      </w:r>
+      <w:r>
+        <w:rPr>
+          <w:rFonts w:ascii="Ubuntu Mono" w:eastAsia="Times New Roman" w:hAnsi="Ubuntu Mono" w:cs="Times New Roman"/>
+          <w:color w:val="BFBDB6"/>
+          <w:kern w:val="0"/>
+          <w:sz w:val="20"/>
+          <w:szCs w:val="20"/>
+          <w14:ligatures w14:val="none"/>
+        </w:rPr>
+        <w:t xml:space="preserve"> </w:t>
+      </w:r>
+      <w:r>
+        <w:rPr>
+          <w:rFonts w:ascii="Ubuntu Mono" w:eastAsia="Times New Roman" w:hAnsi="Ubuntu Mono" w:cs="Times New Roman"/>
+          <w:color w:val="FFD664"/>
+          <w:kern w:val="0"/>
+          <w:sz w:val="20"/>
+          <w:szCs w:val="20"/>
+          <w14:ligatures w14:val="none"/>
+        </w:rPr>
+        <w:t>CrowdFundTest</w:t>
+      </w:r>
+      <w:r>
+        <w:rPr>
+          <w:rFonts w:ascii="Ubuntu Mono" w:eastAsia="Times New Roman" w:hAnsi="Ubuntu Mono" w:cs="Times New Roman"/>
+          <w:color w:val="BFBDB6"/>
+          <w:kern w:val="0"/>
+          <w:sz w:val="20"/>
+          <w:szCs w:val="20"/>
+          <w14:ligatures w14:val="none"/>
+        </w:rPr>
+        <w:t xml:space="preserve"> </w:t>
+      </w:r>
+      <w:r>
+        <w:rPr>
+          <w:rFonts w:ascii="Ubuntu Mono" w:eastAsia="Times New Roman" w:hAnsi="Ubuntu Mono" w:cs="Times New Roman"/>
+          <w:color w:val="FFB289"/>
+          <w:kern w:val="0"/>
+          <w:sz w:val="20"/>
+          <w:szCs w:val="20"/>
+          <w14:ligatures w14:val="none"/>
+        </w:rPr>
+        <w:t>is</w:t>
+      </w:r>
+      <w:r>
+        <w:rPr>
+          <w:rFonts w:ascii="Ubuntu Mono" w:eastAsia="Times New Roman" w:hAnsi="Ubuntu Mono" w:cs="Times New Roman"/>
+          <w:color w:val="BFBDB6"/>
+          <w:kern w:val="0"/>
+          <w:sz w:val="20"/>
+          <w:szCs w:val="20"/>
+          <w14:ligatures w14:val="none"/>
+        </w:rPr>
+        <w:t xml:space="preserve"> </w:t>
+      </w:r>
+      <w:r>
+        <w:rPr>
+          <w:rFonts w:ascii="Ubuntu Mono" w:eastAsia="Times New Roman" w:hAnsi="Ubuntu Mono" w:cs="Times New Roman"/>
+          <w:color w:val="FFD664"/>
+          <w:kern w:val="0"/>
+          <w:sz w:val="20"/>
+          <w:szCs w:val="20"/>
+          <w14:ligatures w14:val="none"/>
+        </w:rPr>
+        <w:t>Test</w:t>
+      </w:r>
+      <w:r>
+        <w:rPr>
+          <w:rFonts w:ascii="Ubuntu Mono" w:eastAsia="Times New Roman" w:hAnsi="Ubuntu Mono" w:cs="Times New Roman"/>
+          <w:color w:val="BFBDB6"/>
+          <w:kern w:val="0"/>
+          <w:sz w:val="20"/>
+          <w:szCs w:val="20"/>
+          <w14:ligatures w14:val="none"/>
+        </w:rPr>
+        <w:t xml:space="preserve"> {</w:t>
+      </w:r>
+    </w:p>
+    <w:p>
+      <w:pPr>
+        <w:shd w:val="clear" w:color="auto" w:fill="0E1016"/>
+        <w:spacing w:after="0" w:line="360" w:lineRule="atLeast"/>
+        <w:rPr>
+          <w:rFonts w:ascii="Ubuntu Mono" w:eastAsia="Times New Roman" w:hAnsi="Ubuntu Mono" w:cs="Times New Roman"/>
+          <w:color w:val="BFBDB6"/>
+          <w:kern w:val="0"/>
+          <w:sz w:val="20"/>
+          <w:szCs w:val="20"/>
+          <w14:ligatures w14:val="none"/>
+        </w:rPr>
+      </w:pPr>
+      <w:r>
+        <w:rPr>
+          <w:rFonts w:ascii="Ubuntu Mono" w:eastAsia="Times New Roman" w:hAnsi="Ubuntu Mono" w:cs="Times New Roman"/>
+          <w:color w:val="BFBDB6"/>
+          <w:kern w:val="0"/>
+          <w:sz w:val="20"/>
+          <w:szCs w:val="20"/>
+          <w14:ligatures w14:val="none"/>
+        </w:rPr>
+        <w:t>    CrowdFund crowdFund;</w:t>
+      </w:r>
+    </w:p>
+    <w:p>
+      <w:pPr>
+        <w:shd w:val="clear" w:color="auto" w:fill="0E1016"/>
+        <w:spacing w:after="0" w:line="360" w:lineRule="atLeast"/>
+        <w:rPr>
+          <w:rFonts w:ascii="Ubuntu Mono" w:eastAsia="Times New Roman" w:hAnsi="Ubuntu Mono" w:cs="Times New Roman"/>
+          <w:color w:val="BFBDB6"/>
+          <w:kern w:val="0"/>
+          <w:sz w:val="20"/>
+          <w:szCs w:val="20"/>
+          <w14:ligatures w14:val="none"/>
+        </w:rPr>
+      </w:pPr>
+      <w:r>
+        <w:rPr>
+          <w:rFonts w:ascii="Ubuntu Mono" w:eastAsia="Times New Roman" w:hAnsi="Ubuntu Mono" w:cs="Times New Roman"/>
+          <w:color w:val="BFBDB6"/>
+          <w:kern w:val="0"/>
+          <w:sz w:val="20"/>
+          <w:szCs w:val="20"/>
+          <w14:ligatures w14:val="none"/>
+        </w:rPr>
+        <w:t xml:space="preserve">    </w:t>
+      </w:r>
+      <w:r>
+        <w:rPr>
+          <w:rFonts w:ascii="Ubuntu Mono" w:eastAsia="Times New Roman" w:hAnsi="Ubuntu Mono" w:cs="Times New Roman"/>
+          <w:color w:val="FFB289"/>
+          <w:kern w:val="0"/>
+          <w:sz w:val="20"/>
+          <w:szCs w:val="20"/>
+          <w14:ligatures w14:val="none"/>
+        </w:rPr>
+        <w:t>function</w:t>
+      </w:r>
+      <w:r>
+        <w:rPr>
+          <w:rFonts w:ascii="Ubuntu Mono" w:eastAsia="Times New Roman" w:hAnsi="Ubuntu Mono" w:cs="Times New Roman"/>
+          <w:color w:val="BFBDB6"/>
+          <w:kern w:val="0"/>
+          <w:sz w:val="20"/>
+          <w:szCs w:val="20"/>
+          <w14:ligatures w14:val="none"/>
+        </w:rPr>
+        <w:t xml:space="preserve"> </w:t>
+      </w:r>
+      <w:r>
+        <w:rPr>
+          <w:rFonts w:ascii="Ubuntu Mono" w:eastAsia="Times New Roman" w:hAnsi="Ubuntu Mono" w:cs="Times New Roman"/>
+          <w:color w:val="44FC88"/>
+          <w:kern w:val="0"/>
+          <w:sz w:val="20"/>
+          <w:szCs w:val="20"/>
+          <w14:ligatures w14:val="none"/>
+        </w:rPr>
+        <w:t>setUp</w:t>
+      </w:r>
+      <w:r>
+        <w:rPr>
+          <w:rFonts w:ascii="Ubuntu Mono" w:eastAsia="Times New Roman" w:hAnsi="Ubuntu Mono" w:cs="Times New Roman"/>
+          <w:color w:val="BFBDB6"/>
+          <w:kern w:val="0"/>
+          <w:sz w:val="20"/>
+          <w:szCs w:val="20"/>
+          <w14:ligatures w14:val="none"/>
+        </w:rPr>
+        <w:t xml:space="preserve">() </w:t>
+      </w:r>
+      <w:r>
+        <w:rPr>
+          <w:rFonts w:ascii="Ubuntu Mono" w:eastAsia="Times New Roman" w:hAnsi="Ubuntu Mono" w:cs="Times New Roman"/>
+          <w:color w:val="FFB289"/>
+          <w:kern w:val="0"/>
+          <w:sz w:val="20"/>
+          <w:szCs w:val="20"/>
+          <w14:ligatures w14:val="none"/>
+        </w:rPr>
+        <w:t>public</w:t>
+      </w:r>
+      <w:r>
+        <w:rPr>
+          <w:rFonts w:ascii="Ubuntu Mono" w:eastAsia="Times New Roman" w:hAnsi="Ubuntu Mono" w:cs="Times New Roman"/>
+          <w:color w:val="BFBDB6"/>
+          <w:kern w:val="0"/>
+          <w:sz w:val="20"/>
+          <w:szCs w:val="20"/>
+          <w14:ligatures w14:val="none"/>
+        </w:rPr>
+        <w:t xml:space="preserve"> {</w:t>
+      </w:r>
+    </w:p>
+    <w:p>
+      <w:pPr>
+        <w:shd w:val="clear" w:color="auto" w:fill="0E1016"/>
+        <w:spacing w:after="0" w:line="360" w:lineRule="atLeast"/>
+        <w:rPr>
+          <w:rFonts w:ascii="Ubuntu Mono" w:eastAsia="Times New Roman" w:hAnsi="Ubuntu Mono" w:cs="Times New Roman"/>
+          <w:color w:val="BFBDB6"/>
+          <w:kern w:val="0"/>
+          <w:sz w:val="20"/>
+          <w:szCs w:val="20"/>
+          <w14:ligatures w14:val="none"/>
+        </w:rPr>
+      </w:pPr>
+      <w:r>
+        <w:rPr>
+          <w:rFonts w:ascii="Ubuntu Mono" w:eastAsia="Times New Roman" w:hAnsi="Ubuntu Mono" w:cs="Times New Roman"/>
+          <w:color w:val="BFBDB6"/>
+          <w:kern w:val="0"/>
+          <w:sz w:val="20"/>
+          <w:szCs w:val="20"/>
+          <w14:ligatures w14:val="none"/>
+        </w:rPr>
+        <w:t xml:space="preserve">        crowdFund </w:t>
+      </w:r>
+      <w:r>
+        <w:rPr>
+          <w:rFonts w:ascii="Ubuntu Mono" w:eastAsia="Times New Roman" w:hAnsi="Ubuntu Mono" w:cs="Times New Roman"/>
+          <w:color w:val="03BBF5"/>
+          <w:kern w:val="0"/>
+          <w:sz w:val="20"/>
+          <w:szCs w:val="20"/>
+          <w14:ligatures w14:val="none"/>
+        </w:rPr>
+        <w:t>=</w:t>
+      </w:r>
+      <w:r>
+        <w:rPr>
+          <w:rFonts w:ascii="Ubuntu Mono" w:eastAsia="Times New Roman" w:hAnsi="Ubuntu Mono" w:cs="Times New Roman"/>
+          <w:color w:val="BFBDB6"/>
+          <w:kern w:val="0"/>
+          <w:sz w:val="20"/>
+          <w:szCs w:val="20"/>
+          <w14:ligatures w14:val="none"/>
+        </w:rPr>
+        <w:t xml:space="preserve"> </w:t>
+      </w:r>
+      <w:r>
+        <w:rPr>
+          <w:rFonts w:ascii="Ubuntu Mono" w:eastAsia="Times New Roman" w:hAnsi="Ubuntu Mono" w:cs="Times New Roman"/>
+          <w:color w:val="FD8BFF"/>
+          <w:kern w:val="0"/>
+          <w:sz w:val="20"/>
+          <w:szCs w:val="20"/>
+          <w14:ligatures w14:val="none"/>
+        </w:rPr>
+        <w:t>new</w:t>
+      </w:r>
+      <w:r>
+        <w:rPr>
+          <w:rFonts w:ascii="Ubuntu Mono" w:eastAsia="Times New Roman" w:hAnsi="Ubuntu Mono" w:cs="Times New Roman"/>
+          <w:color w:val="BFBDB6"/>
+          <w:kern w:val="0"/>
+          <w:sz w:val="20"/>
+          <w:szCs w:val="20"/>
+          <w14:ligatures w14:val="none"/>
+        </w:rPr>
+        <w:t xml:space="preserve"> </w:t>
+      </w:r>
+      <w:r>
+        <w:rPr>
+          <w:rFonts w:ascii="Ubuntu Mono" w:eastAsia="Times New Roman" w:hAnsi="Ubuntu Mono" w:cs="Times New Roman"/>
+          <w:color w:val="44FC88"/>
+          <w:kern w:val="0"/>
+          <w:sz w:val="20"/>
+          <w:szCs w:val="20"/>
+          <w14:ligatures w14:val="none"/>
+        </w:rPr>
+        <w:t>CrowdFund</w:t>
+      </w:r>
+      <w:r>
+        <w:rPr>
+          <w:rFonts w:ascii="Ubuntu Mono" w:eastAsia="Times New Roman" w:hAnsi="Ubuntu Mono" w:cs="Times New Roman"/>
+          <w:color w:val="BFBDB6"/>
+          <w:kern w:val="0"/>
+          <w:sz w:val="20"/>
+          <w:szCs w:val="20"/>
+          <w14:ligatures w14:val="none"/>
+        </w:rPr>
+        <w:t>();</w:t>
+      </w:r>
+    </w:p>
+    <w:p>
+      <w:pPr>
+        <w:shd w:val="clear" w:color="auto" w:fill="0E1016"/>
+        <w:spacing w:after="0" w:line="360" w:lineRule="atLeast"/>
+        <w:rPr>
+          <w:rFonts w:ascii="Ubuntu Mono" w:eastAsia="Times New Roman" w:hAnsi="Ubuntu Mono" w:cs="Times New Roman"/>
+          <w:color w:val="BFBDB6"/>
+          <w:kern w:val="0"/>
+          <w:sz w:val="20"/>
+          <w:szCs w:val="20"/>
+          <w14:ligatures w14:val="none"/>
+        </w:rPr>
+      </w:pPr>
+      <w:r>
+        <w:rPr>
+          <w:rFonts w:ascii="Ubuntu Mono" w:eastAsia="Times New Roman" w:hAnsi="Ubuntu Mono" w:cs="Times New Roman"/>
+          <w:color w:val="BFBDB6"/>
+          <w:kern w:val="0"/>
+          <w:sz w:val="20"/>
+          <w:szCs w:val="20"/>
+          <w14:ligatures w14:val="none"/>
+        </w:rPr>
+        <w:t>    }</w:t>
+      </w:r>
+    </w:p>
+    <w:p>
+      <w:pPr>
+        <w:shd w:val="clear" w:color="auto" w:fill="0E1016"/>
+        <w:spacing w:after="0" w:line="360" w:lineRule="atLeast"/>
+        <w:rPr>
+          <w:rFonts w:ascii="Ubuntu Mono" w:eastAsia="Times New Roman" w:hAnsi="Ubuntu Mono" w:cs="Times New Roman"/>
+          <w:color w:val="BFBDB6"/>
+          <w:kern w:val="0"/>
+          <w:sz w:val="20"/>
+          <w:szCs w:val="20"/>
+          <w14:ligatures w14:val="none"/>
+        </w:rPr>
+      </w:pPr>
+      <w:r>
+        <w:rPr>
+          <w:rFonts w:ascii="Ubuntu Mono" w:eastAsia="Times New Roman" w:hAnsi="Ubuntu Mono" w:cs="Times New Roman"/>
+          <w:color w:val="BFBDB6"/>
+          <w:kern w:val="0"/>
+          <w:sz w:val="20"/>
+          <w:szCs w:val="20"/>
+          <w14:ligatures w14:val="none"/>
+        </w:rPr>
+        <w:t xml:space="preserve">    </w:t>
+      </w:r>
+      <w:r>
+        <w:rPr>
+          <w:rFonts w:ascii="Ubuntu Mono" w:eastAsia="Times New Roman" w:hAnsi="Ubuntu Mono" w:cs="Times New Roman"/>
+          <w:color w:val="FFB289"/>
+          <w:kern w:val="0"/>
+          <w:sz w:val="20"/>
+          <w:szCs w:val="20"/>
+          <w14:ligatures w14:val="none"/>
+        </w:rPr>
+        <w:t>function</w:t>
+      </w:r>
+      <w:r>
+        <w:rPr>
+          <w:rFonts w:ascii="Ubuntu Mono" w:eastAsia="Times New Roman" w:hAnsi="Ubuntu Mono" w:cs="Times New Roman"/>
+          <w:color w:val="BFBDB6"/>
+          <w:kern w:val="0"/>
+          <w:sz w:val="20"/>
+          <w:szCs w:val="20"/>
+          <w14:ligatures w14:val="none"/>
+        </w:rPr>
+        <w:t xml:space="preserve"> </w:t>
+      </w:r>
+      <w:r>
+        <w:rPr>
+          <w:rFonts w:ascii="Ubuntu Mono" w:eastAsia="Times New Roman" w:hAnsi="Ubuntu Mono" w:cs="Times New Roman"/>
+          <w:color w:val="44FC88"/>
+          <w:kern w:val="0"/>
+          <w:sz w:val="20"/>
+          <w:szCs w:val="20"/>
+          <w14:ligatures w14:val="none"/>
+        </w:rPr>
+        <w:t>testDeploy</w:t>
+      </w:r>
+      <w:r>
+        <w:rPr>
+          <w:rFonts w:ascii="Ubuntu Mono" w:eastAsia="Times New Roman" w:hAnsi="Ubuntu Mono" w:cs="Times New Roman"/>
+          <w:color w:val="BFBDB6"/>
+          <w:kern w:val="0"/>
+          <w:sz w:val="20"/>
+          <w:szCs w:val="20"/>
+          <w14:ligatures w14:val="none"/>
+        </w:rPr>
+        <w:t xml:space="preserve">() </w:t>
+      </w:r>
+      <w:r>
+        <w:rPr>
+          <w:rFonts w:ascii="Ubuntu Mono" w:eastAsia="Times New Roman" w:hAnsi="Ubuntu Mono" w:cs="Times New Roman"/>
+          <w:color w:val="FFB289"/>
+          <w:kern w:val="0"/>
+          <w:sz w:val="20"/>
+          <w:szCs w:val="20"/>
+          <w14:ligatures w14:val="none"/>
+        </w:rPr>
+        <w:t>public</w:t>
+      </w:r>
+      <w:r>
+        <w:rPr>
+          <w:rFonts w:ascii="Ubuntu Mono" w:eastAsia="Times New Roman" w:hAnsi="Ubuntu Mono" w:cs="Times New Roman"/>
+          <w:color w:val="BFBDB6"/>
+          <w:kern w:val="0"/>
+          <w:sz w:val="20"/>
+          <w:szCs w:val="20"/>
+          <w14:ligatures w14:val="none"/>
+        </w:rPr>
+        <w:t xml:space="preserve"> </w:t>
+      </w:r>
+      <w:r>
+        <w:rPr>
+          <w:rFonts w:ascii="Ubuntu Mono" w:eastAsia="Times New Roman" w:hAnsi="Ubuntu Mono" w:cs="Times New Roman"/>
+          <w:color w:val="FFB289"/>
+          <w:kern w:val="0"/>
+          <w:sz w:val="20"/>
+          <w:szCs w:val="20"/>
+          <w14:ligatures w14:val="none"/>
+        </w:rPr>
+        <w:t>view</w:t>
+      </w:r>
+      <w:r>
+        <w:rPr>
+          <w:rFonts w:ascii="Ubuntu Mono" w:eastAsia="Times New Roman" w:hAnsi="Ubuntu Mono" w:cs="Times New Roman"/>
+          <w:color w:val="BFBDB6"/>
+          <w:kern w:val="0"/>
+          <w:sz w:val="20"/>
+          <w:szCs w:val="20"/>
+          <w14:ligatures w14:val="none"/>
+        </w:rPr>
+        <w:t xml:space="preserve"> {</w:t>
+      </w:r>
+    </w:p>
+    <w:p>
+      <w:pPr>
+        <w:shd w:val="clear" w:color="auto" w:fill="0E1016"/>
+        <w:spacing w:after="0" w:line="360" w:lineRule="atLeast"/>
+        <w:rPr>
+          <w:rFonts w:ascii="Ubuntu Mono" w:eastAsia="Times New Roman" w:hAnsi="Ubuntu Mono" w:cs="Times New Roman"/>
+          <w:color w:val="BFBDB6"/>
+          <w:kern w:val="0"/>
+          <w:sz w:val="20"/>
+          <w:szCs w:val="20"/>
+          <w14:ligatures w14:val="none"/>
+        </w:rPr>
+      </w:pPr>
+      <w:r>
+        <w:rPr>
+          <w:rFonts w:ascii="Ubuntu Mono" w:eastAsia="Times New Roman" w:hAnsi="Ubuntu Mono" w:cs="Times New Roman"/>
+          <w:color w:val="BFBDB6"/>
+          <w:kern w:val="0"/>
+          <w:sz w:val="20"/>
+          <w:szCs w:val="20"/>
+          <w14:ligatures w14:val="none"/>
+        </w:rPr>
+        <w:t xml:space="preserve">        </w:t>
+      </w:r>
+      <w:r>
+        <w:rPr>
+          <w:rFonts w:ascii="Ubuntu Mono" w:eastAsia="Times New Roman" w:hAnsi="Ubuntu Mono" w:cs="Times New Roman"/>
+          <w:color w:val="44FC88"/>
+          <w:kern w:val="0"/>
+          <w:sz w:val="20"/>
+          <w:szCs w:val="20"/>
+          <w14:ligatures w14:val="none"/>
+        </w:rPr>
+        <w:t>assertEq</w:t>
+      </w:r>
+      <w:r>
+        <w:rPr>
+          <w:rFonts w:ascii="Ubuntu Mono" w:eastAsia="Times New Roman" w:hAnsi="Ubuntu Mono" w:cs="Times New Roman"/>
+          <w:color w:val="BFBDB6"/>
+          <w:kern w:val="0"/>
+          <w:sz w:val="20"/>
+          <w:szCs w:val="20"/>
+          <w14:ligatures w14:val="none"/>
+        </w:rPr>
+        <w:t>(crowdFund</w:t>
+      </w:r>
+      <w:r>
+        <w:rPr>
+          <w:rFonts w:ascii="Ubuntu Mono" w:eastAsia="Times New Roman" w:hAnsi="Ubuntu Mono" w:cs="Times New Roman"/>
+          <w:color w:val="CCF5FF"/>
+          <w:kern w:val="0"/>
+          <w:sz w:val="20"/>
+          <w:szCs w:val="20"/>
+          <w14:ligatures w14:val="none"/>
+        </w:rPr>
+        <w:t>.</w:t>
+      </w:r>
+      <w:r>
+        <w:rPr>
+          <w:rFonts w:ascii="Ubuntu Mono" w:eastAsia="Times New Roman" w:hAnsi="Ubuntu Mono" w:cs="Times New Roman"/>
+          <w:color w:val="44FC88"/>
+          <w:kern w:val="0"/>
+          <w:sz w:val="20"/>
+          <w:szCs w:val="20"/>
+          <w14:ligatures w14:val="none"/>
+        </w:rPr>
+        <w:t>i_owner</w:t>
+      </w:r>
+      <w:r>
+        <w:rPr>
+          <w:rFonts w:ascii="Ubuntu Mono" w:eastAsia="Times New Roman" w:hAnsi="Ubuntu Mono" w:cs="Times New Roman"/>
+          <w:color w:val="BFBDB6"/>
+          <w:kern w:val="0"/>
+          <w:sz w:val="20"/>
+          <w:szCs w:val="20"/>
+          <w14:ligatures w14:val="none"/>
+        </w:rPr>
+        <w:t>()</w:t>
+      </w:r>
+      <w:r>
+        <w:rPr>
+          <w:rFonts w:ascii="Ubuntu Mono" w:eastAsia="Times New Roman" w:hAnsi="Ubuntu Mono" w:cs="Times New Roman"/>
+          <w:color w:val="7FF5FC"/>
+          <w:kern w:val="0"/>
+          <w:sz w:val="20"/>
+          <w:szCs w:val="20"/>
+          <w14:ligatures w14:val="none"/>
+        </w:rPr>
+        <w:t>,</w:t>
+      </w:r>
+      <w:r>
+        <w:rPr>
+          <w:rFonts w:ascii="Ubuntu Mono" w:eastAsia="Times New Roman" w:hAnsi="Ubuntu Mono" w:cs="Times New Roman"/>
+          <w:color w:val="BFBDB6"/>
+          <w:kern w:val="0"/>
+          <w:sz w:val="20"/>
+          <w:szCs w:val="20"/>
+          <w14:ligatures w14:val="none"/>
+        </w:rPr>
+        <w:t xml:space="preserve"> </w:t>
+      </w:r>
+      <w:r>
+        <w:rPr>
+          <w:rFonts w:ascii="Ubuntu Mono" w:eastAsia="Times New Roman" w:hAnsi="Ubuntu Mono" w:cs="Times New Roman"/>
+          <w:color w:val="03BBF5"/>
+          <w:kern w:val="0"/>
+          <w:sz w:val="20"/>
+          <w:szCs w:val="20"/>
+          <w14:ligatures w14:val="none"/>
+        </w:rPr>
+        <w:t>address</w:t>
+      </w:r>
+      <w:r>
+        <w:rPr>
+          <w:rFonts w:ascii="Ubuntu Mono" w:eastAsia="Times New Roman" w:hAnsi="Ubuntu Mono" w:cs="Times New Roman"/>
+          <w:color w:val="BFBDB6"/>
+          <w:kern w:val="0"/>
+          <w:sz w:val="20"/>
+          <w:szCs w:val="20"/>
+          <w14:ligatures w14:val="none"/>
+        </w:rPr>
+        <w:t>(</w:t>
+      </w:r>
+      <w:r>
+        <w:rPr>
+          <w:rFonts w:ascii="Ubuntu Mono" w:eastAsia="Times New Roman" w:hAnsi="Ubuntu Mono" w:cs="Times New Roman"/>
+          <w:i/>
+          <w:iCs/>
+          <w:color w:val="39BAE6"/>
+          <w:kern w:val="0"/>
+          <w:sz w:val="20"/>
+          <w:szCs w:val="20"/>
+          <w14:ligatures w14:val="none"/>
+        </w:rPr>
+        <w:t>this</w:t>
+      </w:r>
+      <w:r>
+        <w:rPr>
+          <w:rFonts w:ascii="Ubuntu Mono" w:eastAsia="Times New Roman" w:hAnsi="Ubuntu Mono" w:cs="Times New Roman"/>
+          <w:color w:val="BFBDB6"/>
+          <w:kern w:val="0"/>
+          <w:sz w:val="20"/>
+          <w:szCs w:val="20"/>
+          <w14:ligatures w14:val="none"/>
+        </w:rPr>
+        <w:t>));</w:t>
+      </w:r>
+    </w:p>
+    <w:p>
+      <w:pPr>
+        <w:shd w:val="clear" w:color="auto" w:fill="0E1016"/>
+        <w:spacing w:after="0" w:line="360" w:lineRule="atLeast"/>
+        <w:rPr>
+          <w:rFonts w:ascii="Ubuntu Mono" w:eastAsia="Times New Roman" w:hAnsi="Ubuntu Mono" w:cs="Times New Roman"/>
+          <w:color w:val="BFBDB6"/>
+          <w:kern w:val="0"/>
+          <w:sz w:val="20"/>
+          <w:szCs w:val="20"/>
+          <w14:ligatures w14:val="none"/>
+        </w:rPr>
+      </w:pPr>
+      <w:r>
+        <w:rPr>
+          <w:rFonts w:ascii="Ubuntu Mono" w:eastAsia="Times New Roman" w:hAnsi="Ubuntu Mono" w:cs="Times New Roman"/>
+          <w:color w:val="BFBDB6"/>
+          <w:kern w:val="0"/>
+          <w:sz w:val="20"/>
+          <w:szCs w:val="20"/>
+          <w14:ligatures w14:val="none"/>
+        </w:rPr>
+        <w:t>    }</w:t>
+      </w:r>
+    </w:p>
+    <w:p>
+      <w:pPr>
+        <w:shd w:val="clear" w:color="auto" w:fill="0E1016"/>
+        <w:spacing w:after="0" w:line="360" w:lineRule="atLeast"/>
+        <w:rPr>
+          <w:rFonts w:ascii="Ubuntu Mono" w:eastAsia="Times New Roman" w:hAnsi="Ubuntu Mono" w:cs="Times New Roman"/>
+          <w:color w:val="BFBDB6"/>
+          <w:kern w:val="0"/>
+          <w:sz w:val="20"/>
+          <w:szCs w:val="20"/>
+          <w14:ligatures w14:val="none"/>
+        </w:rPr>
+      </w:pPr>
+      <w:r>
+        <w:rPr>
+          <w:rFonts w:ascii="Ubuntu Mono" w:eastAsia="Times New Roman" w:hAnsi="Ubuntu Mono" w:cs="Times New Roman"/>
+          <w:color w:val="BFBDB6"/>
+          <w:kern w:val="0"/>
+          <w:sz w:val="20"/>
+          <w:szCs w:val="20"/>
+          <w14:ligatures w14:val="none"/>
+        </w:rPr>
+        <w:t xml:space="preserve">    </w:t>
+      </w:r>
+      <w:r>
+        <w:rPr>
+          <w:rFonts w:ascii="Ubuntu Mono" w:eastAsia="Times New Roman" w:hAnsi="Ubuntu Mono" w:cs="Times New Roman"/>
+          <w:color w:val="FFB289"/>
+          <w:kern w:val="0"/>
+          <w:sz w:val="20"/>
+          <w:szCs w:val="20"/>
+          <w14:ligatures w14:val="none"/>
+        </w:rPr>
+        <w:t>function</w:t>
+      </w:r>
+      <w:r>
+        <w:rPr>
+          <w:rFonts w:ascii="Ubuntu Mono" w:eastAsia="Times New Roman" w:hAnsi="Ubuntu Mono" w:cs="Times New Roman"/>
+          <w:color w:val="BFBDB6"/>
+          <w:kern w:val="0"/>
+          <w:sz w:val="20"/>
+          <w:szCs w:val="20"/>
+          <w14:ligatures w14:val="none"/>
+        </w:rPr>
+        <w:t xml:space="preserve"> </w:t>
+      </w:r>
+      <w:r>
+        <w:rPr>
+          <w:rFonts w:ascii="Ubuntu Mono" w:eastAsia="Times New Roman" w:hAnsi="Ubuntu Mono" w:cs="Times New Roman"/>
+          <w:color w:val="44FC88"/>
+          <w:kern w:val="0"/>
+          <w:sz w:val="20"/>
+          <w:szCs w:val="20"/>
+          <w14:ligatures w14:val="none"/>
+        </w:rPr>
+        <w:t>testIsMinUSDFive</w:t>
+      </w:r>
+      <w:r>
+        <w:rPr>
+          <w:rFonts w:ascii="Ubuntu Mono" w:eastAsia="Times New Roman" w:hAnsi="Ubuntu Mono" w:cs="Times New Roman"/>
+          <w:color w:val="BFBDB6"/>
+          <w:kern w:val="0"/>
+          <w:sz w:val="20"/>
+          <w:szCs w:val="20"/>
+          <w14:ligatures w14:val="none"/>
+        </w:rPr>
+        <w:t xml:space="preserve">() </w:t>
+      </w:r>
+      <w:r>
+        <w:rPr>
+          <w:rFonts w:ascii="Ubuntu Mono" w:eastAsia="Times New Roman" w:hAnsi="Ubuntu Mono" w:cs="Times New Roman"/>
+          <w:color w:val="FFB289"/>
+          <w:kern w:val="0"/>
+          <w:sz w:val="20"/>
+          <w:szCs w:val="20"/>
+          <w14:ligatures w14:val="none"/>
+        </w:rPr>
+        <w:t>public</w:t>
+      </w:r>
+      <w:r>
+        <w:rPr>
+          <w:rFonts w:ascii="Ubuntu Mono" w:eastAsia="Times New Roman" w:hAnsi="Ubuntu Mono" w:cs="Times New Roman"/>
+          <w:color w:val="BFBDB6"/>
+          <w:kern w:val="0"/>
+          <w:sz w:val="20"/>
+          <w:szCs w:val="20"/>
+          <w14:ligatures w14:val="none"/>
+        </w:rPr>
+        <w:t xml:space="preserve"> </w:t>
+      </w:r>
+      <w:r>
+        <w:rPr>
+          <w:rFonts w:ascii="Ubuntu Mono" w:eastAsia="Times New Roman" w:hAnsi="Ubuntu Mono" w:cs="Times New Roman"/>
+          <w:color w:val="FFB289"/>
+          <w:kern w:val="0"/>
+          <w:sz w:val="20"/>
+          <w:szCs w:val="20"/>
+          <w14:ligatures w14:val="none"/>
+        </w:rPr>
+        <w:t>view</w:t>
+      </w:r>
+      <w:r>
+        <w:rPr>
+          <w:rFonts w:ascii="Ubuntu Mono" w:eastAsia="Times New Roman" w:hAnsi="Ubuntu Mono" w:cs="Times New Roman"/>
+          <w:color w:val="BFBDB6"/>
+          <w:kern w:val="0"/>
+          <w:sz w:val="20"/>
+          <w:szCs w:val="20"/>
+          <w14:ligatures w14:val="none"/>
+        </w:rPr>
+        <w:t xml:space="preserve"> {</w:t>
+      </w:r>
+    </w:p>
+    <w:p>
+      <w:pPr>
+        <w:shd w:val="clear" w:color="auto" w:fill="0E1016"/>
+        <w:spacing w:after="0" w:line="360" w:lineRule="atLeast"/>
+        <w:rPr>
+          <w:rFonts w:ascii="Ubuntu Mono" w:eastAsia="Times New Roman" w:hAnsi="Ubuntu Mono" w:cs="Times New Roman"/>
+          <w:color w:val="BFBDB6"/>
+          <w:kern w:val="0"/>
+          <w:sz w:val="20"/>
+          <w:szCs w:val="20"/>
+          <w14:ligatures w14:val="none"/>
+        </w:rPr>
+      </w:pPr>
+      <w:r>
+        <w:rPr>
+          <w:rFonts w:ascii="Ubuntu Mono" w:eastAsia="Times New Roman" w:hAnsi="Ubuntu Mono" w:cs="Times New Roman"/>
+          <w:color w:val="BFBDB6"/>
+          <w:kern w:val="0"/>
+          <w:sz w:val="20"/>
+          <w:szCs w:val="20"/>
+          <w14:ligatures w14:val="none"/>
+        </w:rPr>
+        <w:t xml:space="preserve">        </w:t>
+      </w:r>
+      <w:r>
+        <w:rPr>
+          <w:rFonts w:ascii="Ubuntu Mono" w:eastAsia="Times New Roman" w:hAnsi="Ubuntu Mono" w:cs="Times New Roman"/>
+          <w:color w:val="44FC88"/>
+          <w:kern w:val="0"/>
+          <w:sz w:val="20"/>
+          <w:szCs w:val="20"/>
+          <w14:ligatures w14:val="none"/>
+        </w:rPr>
+        <w:t>assertEq</w:t>
+      </w:r>
+      <w:r>
+        <w:rPr>
+          <w:rFonts w:ascii="Ubuntu Mono" w:eastAsia="Times New Roman" w:hAnsi="Ubuntu Mono" w:cs="Times New Roman"/>
+          <w:color w:val="BFBDB6"/>
+          <w:kern w:val="0"/>
+          <w:sz w:val="20"/>
+          <w:szCs w:val="20"/>
+          <w14:ligatures w14:val="none"/>
+        </w:rPr>
+        <w:t>(crowdFund</w:t>
+      </w:r>
+      <w:r>
+        <w:rPr>
+          <w:rFonts w:ascii="Ubuntu Mono" w:eastAsia="Times New Roman" w:hAnsi="Ubuntu Mono" w:cs="Times New Roman"/>
+          <w:color w:val="CCF5FF"/>
+          <w:kern w:val="0"/>
+          <w:sz w:val="20"/>
+          <w:szCs w:val="20"/>
+          <w14:ligatures w14:val="none"/>
+        </w:rPr>
+        <w:t>.</w:t>
+      </w:r>
+      <w:r>
+        <w:rPr>
+          <w:rFonts w:ascii="Ubuntu Mono" w:eastAsia="Times New Roman" w:hAnsi="Ubuntu Mono" w:cs="Times New Roman"/>
+          <w:color w:val="44FC88"/>
+          <w:kern w:val="0"/>
+          <w:sz w:val="20"/>
+          <w:szCs w:val="20"/>
+          <w14:ligatures w14:val="none"/>
+        </w:rPr>
+        <w:t>minimumUSD</w:t>
+      </w:r>
+      <w:r>
+        <w:rPr>
+          <w:rFonts w:ascii="Ubuntu Mono" w:eastAsia="Times New Roman" w:hAnsi="Ubuntu Mono" w:cs="Times New Roman"/>
+          <w:color w:val="BFBDB6"/>
+          <w:kern w:val="0"/>
+          <w:sz w:val="20"/>
+          <w:szCs w:val="20"/>
+          <w14:ligatures w14:val="none"/>
+        </w:rPr>
+        <w:t>()</w:t>
+      </w:r>
+      <w:r>
+        <w:rPr>
+          <w:rFonts w:ascii="Ubuntu Mono" w:eastAsia="Times New Roman" w:hAnsi="Ubuntu Mono" w:cs="Times New Roman"/>
+          <w:color w:val="7FF5FC"/>
+          <w:kern w:val="0"/>
+          <w:sz w:val="20"/>
+          <w:szCs w:val="20"/>
+          <w14:ligatures w14:val="none"/>
+        </w:rPr>
+        <w:t>,</w:t>
+      </w:r>
+      <w:r>
+        <w:rPr>
+          <w:rFonts w:ascii="Ubuntu Mono" w:eastAsia="Times New Roman" w:hAnsi="Ubuntu Mono" w:cs="Times New Roman"/>
+          <w:color w:val="BFBDB6"/>
+          <w:kern w:val="0"/>
+          <w:sz w:val="20"/>
+          <w:szCs w:val="20"/>
+          <w14:ligatures w14:val="none"/>
+        </w:rPr>
+        <w:t xml:space="preserve"> </w:t>
+      </w:r>
+      <w:r>
+        <w:rPr>
+          <w:rFonts w:ascii="Ubuntu Mono" w:eastAsia="Times New Roman" w:hAnsi="Ubuntu Mono" w:cs="Times New Roman"/>
+          <w:color w:val="D2A6FF"/>
+          <w:kern w:val="0"/>
+          <w:sz w:val="20"/>
+          <w:szCs w:val="20"/>
+          <w14:ligatures w14:val="none"/>
+        </w:rPr>
+        <w:t>5e18</w:t>
+      </w:r>
+      <w:r>
+        <w:rPr>
+          <w:rFonts w:ascii="Ubuntu Mono" w:eastAsia="Times New Roman" w:hAnsi="Ubuntu Mono" w:cs="Times New Roman"/>
+          <w:color w:val="BFBDB6"/>
+          <w:kern w:val="0"/>
+          <w:sz w:val="20"/>
+          <w:szCs w:val="20"/>
+          <w14:ligatures w14:val="none"/>
+        </w:rPr>
+        <w:t>);</w:t>
+      </w:r>
+    </w:p>
+    <w:p>
+      <w:pPr>
+        <w:shd w:val="clear" w:color="auto" w:fill="0E1016"/>
+        <w:spacing w:after="0" w:line="360" w:lineRule="atLeast"/>
+        <w:rPr>
+          <w:rFonts w:ascii="Ubuntu Mono" w:eastAsia="Times New Roman" w:hAnsi="Ubuntu Mono" w:cs="Times New Roman"/>
+          <w:color w:val="BFBDB6"/>
+          <w:kern w:val="0"/>
+          <w:sz w:val="20"/>
+          <w:szCs w:val="20"/>
+          <w14:ligatures w14:val="none"/>
+        </w:rPr>
+      </w:pPr>
+      <w:r>
+        <w:rPr>
+          <w:rFonts w:ascii="Ubuntu Mono" w:eastAsia="Times New Roman" w:hAnsi="Ubuntu Mono" w:cs="Times New Roman"/>
+          <w:color w:val="BFBDB6"/>
+          <w:kern w:val="0"/>
+          <w:sz w:val="20"/>
+          <w:szCs w:val="20"/>
+          <w14:ligatures w14:val="none"/>
+        </w:rPr>
+        <w:t>    }</w:t>
+      </w:r>
+    </w:p>
+    <w:p>
+      <w:pPr>
+        <w:shd w:val="clear" w:color="auto" w:fill="0E1016"/>
+        <w:spacing w:after="0" w:line="360" w:lineRule="atLeast"/>
+        <w:rPr>
+          <w:rFonts w:ascii="Ubuntu Mono" w:eastAsia="Times New Roman" w:hAnsi="Ubuntu Mono" w:cs="Times New Roman"/>
+          <w:color w:val="BFBDB6"/>
+          <w:kern w:val="0"/>
+          <w:sz w:val="20"/>
+          <w:szCs w:val="20"/>
+          <w14:ligatures w14:val="none"/>
+        </w:rPr>
+      </w:pPr>
+      <w:r>
+        <w:rPr>
+          <w:rFonts w:ascii="Ubuntu Mono" w:eastAsia="Times New Roman" w:hAnsi="Ubuntu Mono" w:cs="Times New Roman"/>
+          <w:color w:val="BFBDB6"/>
+          <w:kern w:val="0"/>
+          <w:sz w:val="20"/>
+          <w:szCs w:val="20"/>
+          <w14:ligatures w14:val="none"/>
+        </w:rPr>
+        <w:t>}</w:t>
+      </w:r>
+    </w:p>
+    <w:p>
+      <w:pPr>
+        <w:shd w:val="clear" w:color="auto" w:fill="0E1016"/>
+        <w:spacing w:after="0" w:line="360" w:lineRule="atLeast"/>
+        <w:rPr>
+          <w:rFonts w:ascii="Ubuntu Mono" w:eastAsia="Times New Roman" w:hAnsi="Ubuntu Mono" w:cs="Times New Roman"/>
+          <w:color w:val="BFBDB6"/>
+          <w:kern w:val="0"/>
+          <w:sz w:val="20"/>
+          <w:szCs w:val="20"/>
+          <w14:ligatures w14:val="none"/>
+        </w:rPr>
+      </w:pPr>
+    </w:p>
+    <w:p/>
+    <w:p>
+      <w:pPr>
+        <w:rPr>
+          <w:color w:val="EE0000"/>
+        </w:rPr>
+      </w:pPr>
+      <w:r>
+        <w:rPr>
+          <w:color w:val="EE0000"/>
+        </w:rPr>
+        <w:t xml:space="preserve">All the functions are run in a sequence. </w:t>
+      </w:r>
+      <w:r>
+        <w:rPr>
+          <w:color w:val="EE0000"/>
+        </w:rPr>
+        <w:t>And should have the test prefix.</w:t>
+      </w:r>
+    </w:p>
+    <w:p>
+      <w:pPr>
+        <w:rPr>
+          <w:i/>
+          <w:iCs/>
+          <w:color w:val="EE0000"/>
+          <w:u w:val="single"/>
+        </w:rPr>
+      </w:pPr>
+      <w:r>
+        <w:rPr>
+          <w:i/>
+          <w:iCs/>
+          <w:color w:val="EE0000"/>
+          <w:u w:val="single"/>
+        </w:rPr>
+        <w:t xml:space="preserve">A question how does the test get the ConversionRate from the chainlink real testnet? </w:t>
+      </w:r>
+    </w:p>
+    <w:p>
+      <w:r>
+        <w:t>Let’s focus on this.</w:t>
+      </w:r>
+    </w:p>
+    <w:p>
+      <w:pPr>
+        <w:rPr>
+          <w:color w:val="EE0000"/>
+        </w:rPr>
+      </w:pPr>
+      <w:r>
+        <w:rPr>
+          <w:color w:val="EE0000"/>
+        </w:rPr>
+        <w:t>4 different types of tests:</w:t>
+      </w:r>
+    </w:p>
+    <w:p>
+      <w:pPr>
+        <w:numPr>
+          <w:ilvl w:val="0"/>
+          <w:numId w:val="6"/>
+        </w:numPr>
+      </w:pPr>
+      <w:r>
+        <w:rPr>
+          <w:b/>
+          <w:bCs/>
+        </w:rPr>
+        <w:t>Unit tests</w:t>
+      </w:r>
+      <w:r>
+        <w:t>: Focus on isolating and testing individual smart contract functions or functionalities.</w:t>
+      </w:r>
+    </w:p>
+    <w:p>
+      <w:pPr>
+        <w:numPr>
+          <w:ilvl w:val="0"/>
+          <w:numId w:val="6"/>
+        </w:numPr>
+      </w:pPr>
+      <w:r>
+        <w:rPr>
+          <w:b/>
+          <w:bCs/>
+        </w:rPr>
+        <w:t>Integration tests</w:t>
+      </w:r>
+      <w:r>
+        <w:t>: Verify how a smart contract interacts with other contracts or external systems.</w:t>
+      </w:r>
+    </w:p>
+    <w:p>
+      <w:pPr>
+        <w:numPr>
+          <w:ilvl w:val="0"/>
+          <w:numId w:val="6"/>
+        </w:numPr>
+      </w:pPr>
+      <w:r>
+        <w:rPr>
+          <w:b/>
+          <w:bCs/>
+        </w:rPr>
+        <w:t>Forking tests</w:t>
+      </w:r>
+      <w:r>
+        <w:t>: Forking refers to creating a copy of a blockchain state at a specific point in time. This copy, called a fork, is then used to run tests in a simulated environment.</w:t>
+      </w:r>
+    </w:p>
+    <w:p>
+      <w:pPr>
+        <w:numPr>
+          <w:ilvl w:val="0"/>
+          <w:numId w:val="6"/>
+        </w:numPr>
+      </w:pPr>
+      <w:r>
+        <w:rPr>
+          <w:b/>
+          <w:bCs/>
+        </w:rPr>
+        <w:t>Staging tests</w:t>
+      </w:r>
+      <w:r>
+        <w:t>: Execute tests against a deployed smart contract on a staging environment before mainnet deployment.</w:t>
+      </w:r>
+      <w:r>
+        <w:t xml:space="preserve"> (when deployed and tested in a real testnet)</w:t>
+      </w:r>
+    </w:p>
+    <w:p>
+      <w:pPr>
+        <w:rPr>
+          <w:b/>
+          <w:bCs/>
+        </w:rPr>
+      </w:pPr>
+    </w:p>
+    <w:p>
+      <w:pPr>
+        <w:rPr>
+          <w:b/>
+          <w:bCs/>
+        </w:rPr>
+      </w:pPr>
+    </w:p>
+    <w:p>
+      <w:pPr>
+        <w:rPr>
+          <w:b/>
+          <w:bCs/>
+        </w:rPr>
+      </w:pPr>
+    </w:p>
+    <w:p>
+      <w:r>
+        <w:lastRenderedPageBreak/>
+        <mc:AlternateContent>
+          <mc:Choice Requires="wpi">
+            <w:drawing>
+              <wp:anchor distT="0" distB="0" distL="114300" distR="114300" simplePos="0" relativeHeight="251851776" behindDoc="0" locked="0" layoutInCell="1" allowOverlap="1" wp14:anchorId="3C4E6929" wp14:editId="4C3495B3">
+                <wp:simplePos x="0" y="0"/>
+                <wp:positionH relativeFrom="column">
+                  <wp:posOffset>5112385</wp:posOffset>
+                </wp:positionH>
+                <wp:positionV relativeFrom="paragraph">
+                  <wp:posOffset>-20955</wp:posOffset>
+                </wp:positionV>
+                <wp:extent cx="934720" cy="274805"/>
+                <wp:effectExtent l="38100" t="38100" r="36830" b="49530"/>
+                <wp:wrapNone/>
+                <wp:docPr id="658511190" name="Ink 130"/>
+                <wp:cNvGraphicFramePr/>
+                <a:graphic xmlns:a="http://schemas.openxmlformats.org/drawingml/2006/main">
+                  <a:graphicData uri="http://schemas.microsoft.com/office/word/2010/wordprocessingInk">
+                    <w14:contentPart bwMode="auto" r:id="rId43">
+                      <w14:nvContentPartPr>
+                        <w14:cNvContentPartPr/>
+                      </w14:nvContentPartPr>
+                      <w14:xfrm>
+                        <a:off x="0" y="0"/>
+                        <a:ext cx="934720" cy="274805"/>
+                      </w14:xfrm>
+                    </w14:contentPart>
+                  </a:graphicData>
+                </a:graphic>
+              </wp:anchor>
+            </w:drawing>
+          </mc:Choice>
+          <mc:Fallback>
+            <w:pict>
+              <v:shape w14:anchorId="36E5A3A5" id="Ink 130" o:spid="_x0000_s1026" type="#_x0000_t75" style="position:absolute;margin-left:402.2pt;margin-top:-2pt;width:74.3pt;height:22.35pt;z-index:251851776;visibility:visible;mso-wrap-style:square;mso-wrap-distance-left:9pt;mso-wrap-distance-top:0;mso-wrap-distance-right:9pt;mso-wrap-distance-bottom:0;mso-position-horizontal:absolute;mso-position-horizontal-relative:text;mso-position-vertical:absolute;mso-position-vertical-relative:text" o:gfxdata="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">
+                <v:imagedata r:id="rId44" o:title=""/>
+              </v:shape>
+            </w:pict>
+          </mc:Fallback>
+        </mc:AlternateContent>
+      </w:r>
+      <w:r>
+        <mc:AlternateContent>
+          <mc:Choice Requires="wpi">
+            <w:drawing>
+              <wp:anchor distT="0" distB="0" distL="114300" distR="114300" simplePos="0" relativeHeight="251826176" behindDoc="0" locked="0" layoutInCell="1" allowOverlap="1" wp14:anchorId="45948923" wp14:editId="6E3EBEE2">
+                <wp:simplePos x="0" y="0"/>
+                <wp:positionH relativeFrom="column">
+                  <wp:posOffset>3884930</wp:posOffset>
+                </wp:positionH>
+                <wp:positionV relativeFrom="paragraph">
+                  <wp:posOffset>-233045</wp:posOffset>
+                </wp:positionV>
+                <wp:extent cx="720680" cy="671520"/>
+                <wp:effectExtent l="38100" t="38100" r="41910" b="33655"/>
+                <wp:wrapNone/>
+                <wp:docPr id="76408280" name="Ink 105"/>
+                <wp:cNvGraphicFramePr/>
+                <a:graphic xmlns:a="http://schemas.openxmlformats.org/drawingml/2006/main">
+                  <a:graphicData uri="http://schemas.microsoft.com/office/word/2010/wordprocessingInk">
+                    <w14:contentPart bwMode="auto" r:id="rId45">
+                      <w14:nvContentPartPr>
+                        <w14:cNvContentPartPr/>
+                      </w14:nvContentPartPr>
+                      <w14:xfrm>
+                        <a:off x="0" y="0"/>
+                        <a:ext cx="720680" cy="671520"/>
+                      </w14:xfrm>
+                    </w14:contentPart>
+                  </a:graphicData>
+                </a:graphic>
+              </wp:anchor>
+            </w:drawing>
+          </mc:Choice>
+          <mc:Fallback>
+            <w:pict>
+              <v:shape w14:anchorId="4AADCC6B" id="Ink 105" o:spid="_x0000_s1026" type="#_x0000_t75" style="position:absolute;margin-left:305.55pt;margin-top:-18.7pt;width:57.5pt;height:53.6pt;z-index:251826176;visibility:visible;mso-wrap-style:square;mso-wrap-distance-left:9pt;mso-wrap-distance-top:0;mso-wrap-distance-right:9pt;mso-wrap-distance-bottom:0;mso-position-horizontal:absolute;mso-position-horizontal-relative:text;mso-position-vertical:absolute;mso-position-vertical-relative:text" o:gfxdata="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">
+                <v:imagedata r:id="rId46" o:title=""/>
+              </v:shape>
+            </w:pict>
+          </mc:Fallback>
+        </mc:AlternateContent>
+      </w:r>
+      <w:r>
+        <mc:AlternateContent>
+          <mc:Choice Requires="wpi">
+            <w:drawing>
+              <wp:anchor distT="0" distB="0" distL="114300" distR="114300" simplePos="0" relativeHeight="251788288" behindDoc="0" locked="0" layoutInCell="1" allowOverlap="1" wp14:anchorId="6958F368" wp14:editId="6BA5E794">
+                <wp:simplePos x="0" y="0"/>
+                <wp:positionH relativeFrom="column">
+                  <wp:posOffset>3820502</wp:posOffset>
+                </wp:positionH>
+                <wp:positionV relativeFrom="paragraph">
+                  <wp:posOffset>-147457</wp:posOffset>
+                </wp:positionV>
+                <wp:extent cx="68400" cy="64440"/>
+                <wp:effectExtent l="38100" t="38100" r="8255" b="31115"/>
+                <wp:wrapNone/>
+                <wp:docPr id="1571329717" name="Ink 68"/>
+                <wp:cNvGraphicFramePr/>
+                <a:graphic xmlns:a="http://schemas.openxmlformats.org/drawingml/2006/main">
+                  <a:graphicData uri="http://schemas.microsoft.com/office/word/2010/wordprocessingInk">
+                    <w14:contentPart bwMode="auto" r:id="rId47">
+                      <w14:nvContentPartPr>
+                        <w14:cNvContentPartPr/>
+                      </w14:nvContentPartPr>
+                      <w14:xfrm>
+                        <a:off x="0" y="0"/>
+                        <a:ext cx="68400" cy="64440"/>
+                      </w14:xfrm>
+                    </w14:contentPart>
+                  </a:graphicData>
+                </a:graphic>
+              </wp:anchor>
+            </w:drawing>
+          </mc:Choice>
+          <mc:Fallback>
+            <w:pict>
+              <v:shape w14:anchorId="6B1DF9CD" id="Ink 68" o:spid="_x0000_s1026" type="#_x0000_t75" style="position:absolute;margin-left:300.5pt;margin-top:-11.95pt;width:6.1pt;height:5.75pt;z-index:251788288;visibility:visible;mso-wrap-style:square;mso-wrap-distance-left:9pt;mso-wrap-distance-top:0;mso-wrap-distance-right:9pt;mso-wrap-distance-bottom:0;mso-position-horizontal:absolute;mso-position-horizontal-relative:text;mso-position-vertical:absolute;mso-position-vertical-relative:text" o:gfxdata="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">
+                <v:imagedata r:id="rId48" o:title=""/>
+              </v:shape>
+            </w:pict>
+          </mc:Fallback>
+        </mc:AlternateContent>
+      </w:r>
+      <w:r>
+        <mc:AlternateContent>
+          <mc:Choice Requires="wpi">
+            <w:drawing>
+              <wp:anchor distT="0" distB="0" distL="114300" distR="114300" simplePos="0" relativeHeight="251787264" behindDoc="0" locked="0" layoutInCell="1" allowOverlap="1" wp14:anchorId="1050396D" wp14:editId="7DE1F3A1">
+                <wp:simplePos x="0" y="0"/>
+                <wp:positionH relativeFrom="column">
+                  <wp:posOffset>3573780</wp:posOffset>
+                </wp:positionH>
+                <wp:positionV relativeFrom="paragraph">
+                  <wp:posOffset>-377825</wp:posOffset>
+                </wp:positionV>
+                <wp:extent cx="560835" cy="256540"/>
+                <wp:effectExtent l="38100" t="38100" r="29845" b="48260"/>
+                <wp:wrapNone/>
+                <wp:docPr id="1905276711" name="Ink 67"/>
+                <wp:cNvGraphicFramePr/>
+                <a:graphic xmlns:a="http://schemas.openxmlformats.org/drawingml/2006/main">
+                  <a:graphicData uri="http://schemas.microsoft.com/office/word/2010/wordprocessingInk">
+                    <w14:contentPart bwMode="auto" r:id="rId49">
+                      <w14:nvContentPartPr>
+                        <w14:cNvContentPartPr/>
+                      </w14:nvContentPartPr>
+                      <w14:xfrm>
+                        <a:off x="0" y="0"/>
+                        <a:ext cx="560835" cy="256540"/>
+                      </w14:xfrm>
+                    </w14:contentPart>
+                  </a:graphicData>
+                </a:graphic>
+              </wp:anchor>
+            </w:drawing>
+          </mc:Choice>
+          <mc:Fallback>
+            <w:pict>
+              <v:shape w14:anchorId="6946057A" id="Ink 67" o:spid="_x0000_s1026" type="#_x0000_t75" style="position:absolute;margin-left:281.05pt;margin-top:-30.1pt;width:44.85pt;height:20.9pt;z-index:251787264;visibility:visible;mso-wrap-style:square;mso-wrap-distance-left:9pt;mso-wrap-distance-top:0;mso-wrap-distance-right:9pt;mso-wrap-distance-bottom:0;mso-position-horizontal:absolute;mso-position-horizontal-relative:text;mso-position-vertical:absolute;mso-position-vertical-relative:text" o:gfxdata="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">
+                <v:imagedata r:id="rId50" o:title=""/>
+              </v:shape>
+            </w:pict>
+          </mc:Fallback>
+        </mc:AlternateContent>
+      </w:r>
+      <w:r>
+        <w:t>So how to get the test done? We’ll use fork-url. Like this:</w:t>
+      </w:r>
+    </w:p>
+    <w:p>
+      <w:pPr>
+        <w:pStyle w:val="bashsnippet"/>
+      </w:pPr>
+      <w:r>
+        <mc:AlternateContent>
+          <mc:Choice Requires="wpi">
+            <w:drawing>
+              <wp:anchor distT="0" distB="0" distL="114300" distR="114300" simplePos="0" relativeHeight="251829248" behindDoc="0" locked="0" layoutInCell="1" allowOverlap="1" wp14:anchorId="19B413B8" wp14:editId="7BCE9BFC">
+                <wp:simplePos x="0" y="0"/>
+                <wp:positionH relativeFrom="column">
+                  <wp:posOffset>4398645</wp:posOffset>
+                </wp:positionH>
+                <wp:positionV relativeFrom="paragraph">
+                  <wp:posOffset>-12700</wp:posOffset>
+                </wp:positionV>
+                <wp:extent cx="1425575" cy="474980"/>
+                <wp:effectExtent l="38100" t="38100" r="41275" b="39370"/>
+                <wp:wrapNone/>
+                <wp:docPr id="511020899" name="Ink 108"/>
+                <wp:cNvGraphicFramePr/>
+                <a:graphic xmlns:a="http://schemas.openxmlformats.org/drawingml/2006/main">
+                  <a:graphicData uri="http://schemas.microsoft.com/office/word/2010/wordprocessingInk">
+                    <w14:contentPart bwMode="auto" r:id="rId51">
+                      <w14:nvContentPartPr>
+                        <w14:cNvContentPartPr/>
+                      </w14:nvContentPartPr>
+                      <w14:xfrm>
+                        <a:off x="0" y="0"/>
+                        <a:ext cx="1425575" cy="474980"/>
+                      </w14:xfrm>
+                    </w14:contentPart>
+                  </a:graphicData>
+                </a:graphic>
+              </wp:anchor>
+            </w:drawing>
+          </mc:Choice>
+          <mc:Fallback>
+            <w:pict>
+              <v:shape w14:anchorId="23367ECC" id="Ink 108" o:spid="_x0000_s1026" type="#_x0000_t75" style="position:absolute;margin-left:346pt;margin-top:-1.35pt;width:112.95pt;height:38.1pt;z-index:251829248;visibility:visible;mso-wrap-style:square;mso-wrap-distance-left:9pt;mso-wrap-distance-top:0;mso-wrap-distance-right:9pt;mso-wrap-distance-bottom:0;mso-position-horizontal:absolute;mso-position-horizontal-relative:text;mso-position-vertical:absolute;mso-position-vertical-relative:text" o:gfxdata="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">
+                <v:imagedata r:id="rId52" o:title=""/>
+              </v:shape>
+            </w:pict>
+          </mc:Fallback>
+        </mc:AlternateContent>
+      </w:r>
+      <w:r>
+        <mc:AlternateContent>
+          <mc:Choice Requires="wpi">
+            <w:drawing>
+              <wp:anchor distT="0" distB="0" distL="114300" distR="114300" simplePos="0" relativeHeight="251770880" behindDoc="0" locked="0" layoutInCell="1" allowOverlap="1" wp14:anchorId="46CD8E53" wp14:editId="763CE9B4">
+                <wp:simplePos x="0" y="0"/>
+                <wp:positionH relativeFrom="column">
+                  <wp:posOffset>3175000</wp:posOffset>
+                </wp:positionH>
+                <wp:positionV relativeFrom="paragraph">
+                  <wp:posOffset>-280035</wp:posOffset>
+                </wp:positionV>
+                <wp:extent cx="584590" cy="814070"/>
+                <wp:effectExtent l="38100" t="38100" r="25400" b="43180"/>
+                <wp:wrapNone/>
+                <wp:docPr id="203081981" name="Ink 51"/>
+                <wp:cNvGraphicFramePr/>
+                <a:graphic xmlns:a="http://schemas.openxmlformats.org/drawingml/2006/main">
+                  <a:graphicData uri="http://schemas.microsoft.com/office/word/2010/wordprocessingInk">
+                    <w14:contentPart bwMode="auto" r:id="rId53">
+                      <w14:nvContentPartPr>
+                        <w14:cNvContentPartPr/>
+                      </w14:nvContentPartPr>
+                      <w14:xfrm>
+                        <a:off x="0" y="0"/>
+                        <a:ext cx="584590" cy="814070"/>
+                      </w14:xfrm>
+                    </w14:contentPart>
+                  </a:graphicData>
+                </a:graphic>
+              </wp:anchor>
+            </w:drawing>
+          </mc:Choice>
+          <mc:Fallback>
+            <w:pict>
+              <v:shape w14:anchorId="539A4064" id="Ink 51" o:spid="_x0000_s1026" type="#_x0000_t75" style="position:absolute;margin-left:249.65pt;margin-top:-22.4pt;width:46.75pt;height:64.8pt;z-index:251770880;visibility:visible;mso-wrap-style:square;mso-wrap-distance-left:9pt;mso-wrap-distance-top:0;mso-wrap-distance-right:9pt;mso-wrap-distance-bottom:0;mso-position-horizontal:absolute;mso-position-horizontal-relative:text;mso-position-vertical:absolute;mso-position-vertical-relative:text" o:gfxdata="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">
+                <v:imagedata r:id="rId54" o:title=""/>
+              </v:shape>
+            </w:pict>
+          </mc:Fallback>
+        </mc:AlternateContent>
+      </w:r>
+      <w:r>
+        <w:t>&lt;/&gt; bash</w:t>
+      </w:r>
+    </w:p>
+    <w:p>
+      <w:pPr>
+        <w:pStyle w:val="bashsnippet"/>
+      </w:pPr>
+      <w:r>
+        <w:t xml:space="preserve">forge test -m testPriceFeedVersionIsAccurate </w:t>
+      </w:r>
+      <w:r>
+        <w:t xml:space="preserve">-VVVV </w:t>
+      </w:r>
+      <w:r>
+        <w:t>--fork-url $SEPOLIA_RPC_URL</w:t>
+      </w:r>
+    </w:p>
+    <w:p>
+      <w:pPr>
+        <w:jc w:val="center"/>
+        <w:rPr>
+          <w:i/>
+          <w:iCs/>
+          <w:color w:val="EE0000"/>
+          <w:u w:val="single"/>
+        </w:rPr>
+      </w:pPr>
+      <w:r>
+        <w:rPr>
+          <w:i/>
+          <w:iCs/>
+          <w:color w:val="EE0000"/>
+          <w:u w:val="single"/>
+        </w:rPr>
+        <w:t>This will spend real testnet money, take a snapshot of the blockchain you provided through the rpc-url, and does all the tests it needs! However it uses a lot of real money so we should avoid it as muchas possible!</w:t>
+      </w:r>
+    </w:p>
+    <w:p>
+      <w:r>
+        <w:t>We can also use the coverage keyword to see how much of our code is being tested:</w:t>
+      </w:r>
+    </w:p>
+    <w:p>
+      <w:pPr>
+        <w:jc w:val="center"/>
+      </w:pPr>
+      <w:r>
+        <mc:AlternateContent>
+          <mc:Choice Requires="wpi">
+            <w:drawing>
+              <wp:anchor distT="0" distB="0" distL="114300" distR="114300" simplePos="0" relativeHeight="251852800" behindDoc="0" locked="0" layoutInCell="1" allowOverlap="1" wp14:anchorId="3D1945F8" wp14:editId="2BDE859E">
+                <wp:simplePos x="0" y="0"/>
+                <wp:positionH relativeFrom="column">
+                  <wp:posOffset>2781920</wp:posOffset>
+                </wp:positionH>
+                <wp:positionV relativeFrom="paragraph">
+                  <wp:posOffset>233790</wp:posOffset>
+                </wp:positionV>
+                <wp:extent cx="682560" cy="190800"/>
+                <wp:effectExtent l="38100" t="38100" r="22860" b="38100"/>
+                <wp:wrapNone/>
+                <wp:docPr id="1009606096" name="Ink 132"/>
+                <wp:cNvGraphicFramePr/>
+                <a:graphic xmlns:a="http://schemas.openxmlformats.org/drawingml/2006/main">
+                  <a:graphicData uri="http://schemas.microsoft.com/office/word/2010/wordprocessingInk">
+                    <w14:contentPart bwMode="auto" r:id="rId55">
+                      <w14:nvContentPartPr>
+                        <w14:cNvContentPartPr/>
+                      </w14:nvContentPartPr>
+                      <w14:xfrm>
+                        <a:off x="0" y="0"/>
+                        <a:ext cx="682560" cy="190800"/>
+                      </w14:xfrm>
+                    </w14:contentPart>
+                  </a:graphicData>
+                </a:graphic>
+              </wp:anchor>
+            </w:drawing>
+          </mc:Choice>
+          <mc:Fallback>
+            <w:pict>
+              <v:shape w14:anchorId="28CFFBE5" id="Ink 132" o:spid="_x0000_s1026" type="#_x0000_t75" style="position:absolute;margin-left:218.7pt;margin-top:18.05pt;width:54.5pt;height:15.7pt;z-index:251852800;visibility:visible;mso-wrap-style:square;mso-wrap-distance-left:9pt;mso-wrap-distance-top:0;mso-wrap-distance-right:9pt;mso-wrap-distance-bottom:0;mso-position-horizontal:absolute;mso-position-horizontal-relative:text;mso-position-vertical:absolute;mso-position-vertical-relative:text" o:gfxdata="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">
+                <v:imagedata r:id="rId56" o:title=""/>
+              </v:shape>
+            </w:pict>
+          </mc:Fallback>
+        </mc:AlternateContent>
+      </w:r>
+      <w:r>
+        <w:drawing>
+          <wp:inline distT="0" distB="0" distL="0" distR="0" wp14:anchorId="765E4002" wp14:editId="67423FDB">
+            <wp:extent cx="5943600" cy="1817370"/>
+            <wp:effectExtent l="190500" t="190500" r="190500" b="182880"/>
+            <wp:docPr id="1987354813" name="Picture 1"/>
+            <wp:cNvGraphicFramePr>
+              <a:graphicFrameLocks xmlns:a="http://schemas.openxmlformats.org/drawingml/2006/main" noChangeAspect="1"/>
+            </wp:cNvGraphicFramePr>
+            <a:graphic xmlns:a="http://schemas.openxmlformats.org/drawingml/2006/main">
+              <a:graphicData uri="http://schemas.openxmlformats.org/drawingml/2006/picture">
+                <pic:pic xmlns:pic="http://schemas.openxmlformats.org/drawingml/2006/picture">
+                  <pic:nvPicPr>
+                    <pic:cNvPr id="1987354813" name=""/>
+                    <pic:cNvPicPr/>
+                  </pic:nvPicPr>
+                  <pic:blipFill>
+                    <a:blip r:embed="rId57"/>
+                    <a:stretch>
+                      <a:fillRect/>
+                    </a:stretch>
+                  </pic:blipFill>
+                  <pic:spPr>
+                    <a:xfrm>
+                      <a:off x="0" y="0"/>
+                      <a:ext cx="5943600" cy="1817370"/>
+                    </a:xfrm>
+                    <a:prstGeom prst="rect">
+                      <a:avLst/>
+                    </a:prstGeom>
+                    <a:ln>
+                      <a:noFill/>
+                    </a:ln>
+                    <a:effectLst>
+                      <a:outerShdw blurRad="190500" algn="tl" rotWithShape="0">
+                        <a:srgbClr val="000000">
+                          <a:alpha val="70000"/>
+                        </a:srgbClr>
+                      </a:outerShdw>
+                    </a:effectLst>
+                  </pic:spPr>
+                </pic:pic>
+              </a:graphicData>
+            </a:graphic>
+          </wp:inline>
+        </w:drawing>
+      </w:r>
+    </w:p>
+    <w:p>
+      <w:pPr>
+        <w:rPr>
+          <w:color w:val="EE0000"/>
+        </w:rPr>
+      </w:pPr>
+      <w:r>
+        <w:rPr>
+          <w:color w:val="EE0000"/>
+        </w:rPr>
+        <w:t>For better modular programming and syncing between deployment script and tests we do something like this:</w:t>
+      </w:r>
+    </w:p>
+    <w:p>
+      <w:r>
+        <w:t>In deploy:</w:t>
+      </w:r>
+    </w:p>
+    <w:p>
+      <w:pPr>
+        <w:shd w:val="clear" w:color="auto" w:fill="0E1016"/>
+        <w:spacing w:after="0" w:line="360" w:lineRule="atLeast"/>
+        <w:rPr>
+          <w:rFonts w:ascii="Ubuntu Mono" w:eastAsia="Times New Roman" w:hAnsi="Ubuntu Mono" w:cs="Times New Roman"/>
+          <w:color w:val="BFBDB6"/>
+          <w:kern w:val="0"/>
+          <w:sz w:val="20"/>
+          <w:szCs w:val="20"/>
+          <w14:ligatures w14:val="none"/>
+        </w:rPr>
+      </w:pPr>
+      <w:r>
+        <w:rPr>
+          <w:rFonts w:ascii="Ubuntu Mono" w:eastAsia="Times New Roman" w:hAnsi="Ubuntu Mono" w:cs="Times New Roman"/>
+          <w:color w:val="FFB289"/>
+          <w:kern w:val="0"/>
+          <w:sz w:val="20"/>
+          <w:szCs w:val="20"/>
+          <w14:ligatures w14:val="none"/>
+        </w:rPr>
+        <w:t>contract</w:t>
+      </w:r>
+      <w:r>
+        <w:rPr>
+          <w:rFonts w:ascii="Ubuntu Mono" w:eastAsia="Times New Roman" w:hAnsi="Ubuntu Mono" w:cs="Times New Roman"/>
+          <w:color w:val="BFBDB6"/>
+          <w:kern w:val="0"/>
+          <w:sz w:val="20"/>
+          <w:szCs w:val="20"/>
+          <w14:ligatures w14:val="none"/>
+        </w:rPr>
+        <w:t xml:space="preserve"> </w:t>
+      </w:r>
+      <w:r>
+        <w:rPr>
+          <w:rFonts w:ascii="Ubuntu Mono" w:eastAsia="Times New Roman" w:hAnsi="Ubuntu Mono" w:cs="Times New Roman"/>
+          <w:color w:val="FFD664"/>
+          <w:kern w:val="0"/>
+          <w:sz w:val="20"/>
+          <w:szCs w:val="20"/>
+          <w14:ligatures w14:val="none"/>
+        </w:rPr>
+        <w:t>DeployCrowdFund</w:t>
+      </w:r>
+      <w:r>
+        <w:rPr>
+          <w:rFonts w:ascii="Ubuntu Mono" w:eastAsia="Times New Roman" w:hAnsi="Ubuntu Mono" w:cs="Times New Roman"/>
+          <w:color w:val="BFBDB6"/>
+          <w:kern w:val="0"/>
+          <w:sz w:val="20"/>
+          <w:szCs w:val="20"/>
+          <w14:ligatures w14:val="none"/>
+        </w:rPr>
+        <w:t xml:space="preserve"> </w:t>
+      </w:r>
+      <w:r>
+        <w:rPr>
+          <w:rFonts w:ascii="Ubuntu Mono" w:eastAsia="Times New Roman" w:hAnsi="Ubuntu Mono" w:cs="Times New Roman"/>
+          <w:color w:val="FFB289"/>
+          <w:kern w:val="0"/>
+          <w:sz w:val="20"/>
+          <w:szCs w:val="20"/>
+          <w14:ligatures w14:val="none"/>
+        </w:rPr>
+        <w:t>is</w:t>
+      </w:r>
+      <w:r>
+        <w:rPr>
+          <w:rFonts w:ascii="Ubuntu Mono" w:eastAsia="Times New Roman" w:hAnsi="Ubuntu Mono" w:cs="Times New Roman"/>
+          <w:color w:val="BFBDB6"/>
+          <w:kern w:val="0"/>
+          <w:sz w:val="20"/>
+          <w:szCs w:val="20"/>
+          <w14:ligatures w14:val="none"/>
+        </w:rPr>
+        <w:t xml:space="preserve"> </w:t>
+      </w:r>
+      <w:r>
+        <w:rPr>
+          <w:rFonts w:ascii="Ubuntu Mono" w:eastAsia="Times New Roman" w:hAnsi="Ubuntu Mono" w:cs="Times New Roman"/>
+          <w:color w:val="FFD664"/>
+          <w:kern w:val="0"/>
+          <w:sz w:val="20"/>
+          <w:szCs w:val="20"/>
+          <w14:ligatures w14:val="none"/>
+        </w:rPr>
+        <w:t>Script</w:t>
+      </w:r>
+      <w:r>
+        <w:rPr>
+          <w:rFonts w:ascii="Ubuntu Mono" w:eastAsia="Times New Roman" w:hAnsi="Ubuntu Mono" w:cs="Times New Roman"/>
+          <w:color w:val="BFBDB6"/>
+          <w:kern w:val="0"/>
+          <w:sz w:val="20"/>
+          <w:szCs w:val="20"/>
+          <w14:ligatures w14:val="none"/>
+        </w:rPr>
+        <w:t xml:space="preserve"> {</w:t>
+      </w:r>
+    </w:p>
+    <w:p>
+      <w:pPr>
+        <w:shd w:val="clear" w:color="auto" w:fill="0E1016"/>
+        <w:spacing w:after="0" w:line="360" w:lineRule="atLeast"/>
+        <w:rPr>
+          <w:rFonts w:ascii="Ubuntu Mono" w:eastAsia="Times New Roman" w:hAnsi="Ubuntu Mono" w:cs="Times New Roman"/>
+          <w:color w:val="BFBDB6"/>
+          <w:kern w:val="0"/>
+          <w:sz w:val="20"/>
+          <w:szCs w:val="20"/>
+          <w14:ligatures w14:val="none"/>
+        </w:rPr>
+      </w:pPr>
+      <w:r>
+        <w:rPr>
+          <w:rFonts w:ascii="Ubuntu Mono" w:eastAsia="Times New Roman" w:hAnsi="Ubuntu Mono" w:cs="Times New Roman"/>
+          <w:color w:val="BFBDB6"/>
+          <w:kern w:val="0"/>
+          <w:sz w:val="20"/>
+          <w:szCs w:val="20"/>
+          <w14:ligatures w14:val="none"/>
+        </w:rPr>
+        <w:t xml:space="preserve">    CrowdFund crowd</w:t>
+      </w:r>
+      <w:r>
+        <w:rPr>
+          <w:rFonts w:ascii="Ubuntu Mono" w:eastAsia="Times New Roman" w:hAnsi="Ubuntu Mono" w:cs="Times New Roman"/>
+          <w:color w:val="BFBDB6"/>
+          <w:kern w:val="0"/>
+          <w:sz w:val="20"/>
+          <w:szCs w:val="20"/>
+          <w14:ligatures w14:val="none"/>
+        </w:rPr>
+        <w:t>F</w:t>
+      </w:r>
+      <w:r>
+        <w:rPr>
+          <w:rFonts w:ascii="Ubuntu Mono" w:eastAsia="Times New Roman" w:hAnsi="Ubuntu Mono" w:cs="Times New Roman"/>
+          <w:color w:val="BFBDB6"/>
+          <w:kern w:val="0"/>
+          <w:sz w:val="20"/>
+          <w:szCs w:val="20"/>
+          <w14:ligatures w14:val="none"/>
+        </w:rPr>
+        <w:t>und;</w:t>
+      </w:r>
+    </w:p>
+    <w:p>
+      <w:pPr>
+        <w:shd w:val="clear" w:color="auto" w:fill="0E1016"/>
+        <w:spacing w:after="0" w:line="360" w:lineRule="atLeast"/>
+        <w:rPr>
+          <w:rFonts w:ascii="Ubuntu Mono" w:eastAsia="Times New Roman" w:hAnsi="Ubuntu Mono" w:cs="Times New Roman"/>
+          <w:color w:val="BFBDB6"/>
+          <w:kern w:val="0"/>
+          <w:sz w:val="20"/>
+          <w:szCs w:val="20"/>
+          <w14:ligatures w14:val="none"/>
+        </w:rPr>
+      </w:pPr>
+      <w:r>
+        <w:rPr>
+          <w:rFonts w:ascii="Ubuntu Mono" w:eastAsia="Times New Roman" w:hAnsi="Ubuntu Mono" w:cs="Times New Roman"/>
+          <w:color w:val="BFBDB6"/>
+          <w:kern w:val="0"/>
+          <w:sz w:val="20"/>
+          <w:szCs w:val="20"/>
+          <w14:ligatures w14:val="none"/>
+        </w:rPr>
+        <w:t xml:space="preserve">    </w:t>
+      </w:r>
+      <w:r>
+        <w:rPr>
+          <w:rFonts w:ascii="Ubuntu Mono" w:eastAsia="Times New Roman" w:hAnsi="Ubuntu Mono" w:cs="Times New Roman"/>
+          <w:color w:val="FFB289"/>
+          <w:kern w:val="0"/>
+          <w:sz w:val="20"/>
+          <w:szCs w:val="20"/>
+          <w14:ligatures w14:val="none"/>
+        </w:rPr>
+        <w:t>function</w:t>
+      </w:r>
+      <w:r>
+        <w:rPr>
+          <w:rFonts w:ascii="Ubuntu Mono" w:eastAsia="Times New Roman" w:hAnsi="Ubuntu Mono" w:cs="Times New Roman"/>
+          <w:color w:val="BFBDB6"/>
+          <w:kern w:val="0"/>
+          <w:sz w:val="20"/>
+          <w:szCs w:val="20"/>
+          <w14:ligatures w14:val="none"/>
+        </w:rPr>
+        <w:t xml:space="preserve"> </w:t>
+      </w:r>
+      <w:r>
+        <w:rPr>
+          <w:rFonts w:ascii="Ubuntu Mono" w:eastAsia="Times New Roman" w:hAnsi="Ubuntu Mono" w:cs="Times New Roman"/>
+          <w:color w:val="44FC88"/>
+          <w:kern w:val="0"/>
+          <w:sz w:val="20"/>
+          <w:szCs w:val="20"/>
+          <w14:ligatures w14:val="none"/>
+        </w:rPr>
+        <w:t>run</w:t>
+      </w:r>
+      <w:r>
+        <w:rPr>
+          <w:rFonts w:ascii="Ubuntu Mono" w:eastAsia="Times New Roman" w:hAnsi="Ubuntu Mono" w:cs="Times New Roman"/>
+          <w:color w:val="BFBDB6"/>
+          <w:kern w:val="0"/>
+          <w:sz w:val="20"/>
+          <w:szCs w:val="20"/>
+          <w14:ligatures w14:val="none"/>
+        </w:rPr>
+        <w:t xml:space="preserve">() </w:t>
+      </w:r>
+      <w:r>
+        <w:rPr>
+          <w:rFonts w:ascii="Ubuntu Mono" w:eastAsia="Times New Roman" w:hAnsi="Ubuntu Mono" w:cs="Times New Roman"/>
+          <w:color w:val="FFB289"/>
+          <w:kern w:val="0"/>
+          <w:sz w:val="20"/>
+          <w:szCs w:val="20"/>
+          <w14:ligatures w14:val="none"/>
+        </w:rPr>
+        <w:t>external</w:t>
+      </w:r>
+      <w:r>
+        <w:rPr>
+          <w:rFonts w:ascii="Ubuntu Mono" w:eastAsia="Times New Roman" w:hAnsi="Ubuntu Mono" w:cs="Times New Roman"/>
+          <w:color w:val="BFBDB6"/>
+          <w:kern w:val="0"/>
+          <w:sz w:val="20"/>
+          <w:szCs w:val="20"/>
+          <w14:ligatures w14:val="none"/>
+        </w:rPr>
+        <w:t xml:space="preserve"> </w:t>
+      </w:r>
+      <w:r>
+        <w:rPr>
+          <w:rFonts w:ascii="Ubuntu Mono" w:eastAsia="Times New Roman" w:hAnsi="Ubuntu Mono" w:cs="Times New Roman"/>
+          <w:color w:val="FF769A"/>
+          <w:kern w:val="0"/>
+          <w:sz w:val="20"/>
+          <w:szCs w:val="20"/>
+          <w14:ligatures w14:val="none"/>
+        </w:rPr>
+        <w:t>returns</w:t>
+      </w:r>
+      <w:r>
+        <w:rPr>
+          <w:rFonts w:ascii="Ubuntu Mono" w:eastAsia="Times New Roman" w:hAnsi="Ubuntu Mono" w:cs="Times New Roman"/>
+          <w:color w:val="BFBDB6"/>
+          <w:kern w:val="0"/>
+          <w:sz w:val="20"/>
+          <w:szCs w:val="20"/>
+          <w14:ligatures w14:val="none"/>
+        </w:rPr>
+        <w:t xml:space="preserve"> (</w:t>
+      </w:r>
+      <w:r>
+        <w:rPr>
+          <w:rFonts w:ascii="Ubuntu Mono" w:eastAsia="Times New Roman" w:hAnsi="Ubuntu Mono" w:cs="Times New Roman"/>
+          <w:color w:val="09EFFF"/>
+          <w:kern w:val="0"/>
+          <w:sz w:val="20"/>
+          <w:szCs w:val="20"/>
+          <w14:ligatures w14:val="none"/>
+        </w:rPr>
+        <w:t>CrowdFund</w:t>
+      </w:r>
+      <w:r>
+        <w:rPr>
+          <w:rFonts w:ascii="Ubuntu Mono" w:eastAsia="Times New Roman" w:hAnsi="Ubuntu Mono" w:cs="Times New Roman"/>
+          <w:color w:val="BFBDB6"/>
+          <w:kern w:val="0"/>
+          <w:sz w:val="20"/>
+          <w:szCs w:val="20"/>
+          <w14:ligatures w14:val="none"/>
+        </w:rPr>
+        <w:t>) {</w:t>
+      </w:r>
+    </w:p>
+    <w:p>
+      <w:pPr>
+        <w:shd w:val="clear" w:color="auto" w:fill="0E1016"/>
+        <w:spacing w:after="0" w:line="360" w:lineRule="atLeast"/>
+        <w:rPr>
+          <w:rFonts w:ascii="Ubuntu Mono" w:eastAsia="Times New Roman" w:hAnsi="Ubuntu Mono" w:cs="Times New Roman"/>
+          <w:color w:val="BFBDB6"/>
+          <w:kern w:val="0"/>
+          <w:sz w:val="20"/>
+          <w:szCs w:val="20"/>
+          <w14:ligatures w14:val="none"/>
+        </w:rPr>
+      </w:pPr>
+      <w:r>
+        <w:rPr>
+          <w:rFonts w:ascii="Ubuntu Mono" w:eastAsia="Times New Roman" w:hAnsi="Ubuntu Mono" w:cs="Times New Roman"/>
+          <w:color w:val="BFBDB6"/>
+          <w:kern w:val="0"/>
+          <w:sz w:val="20"/>
+          <w:szCs w:val="20"/>
+          <w14:ligatures w14:val="none"/>
+        </w:rPr>
+        <w:t>        vm</w:t>
+      </w:r>
+      <w:r>
+        <w:rPr>
+          <w:rFonts w:ascii="Ubuntu Mono" w:eastAsia="Times New Roman" w:hAnsi="Ubuntu Mono" w:cs="Times New Roman"/>
+          <w:color w:val="CCF5FF"/>
+          <w:kern w:val="0"/>
+          <w:sz w:val="20"/>
+          <w:szCs w:val="20"/>
+          <w14:ligatures w14:val="none"/>
+        </w:rPr>
+        <w:t>.</w:t>
+      </w:r>
+      <w:r>
+        <w:rPr>
+          <w:rFonts w:ascii="Ubuntu Mono" w:eastAsia="Times New Roman" w:hAnsi="Ubuntu Mono" w:cs="Times New Roman"/>
+          <w:color w:val="44FC88"/>
+          <w:kern w:val="0"/>
+          <w:sz w:val="20"/>
+          <w:szCs w:val="20"/>
+          <w14:ligatures w14:val="none"/>
+        </w:rPr>
+        <w:t>startBroadcast</w:t>
+      </w:r>
+      <w:r>
+        <w:rPr>
+          <w:rFonts w:ascii="Ubuntu Mono" w:eastAsia="Times New Roman" w:hAnsi="Ubuntu Mono" w:cs="Times New Roman"/>
+          <w:color w:val="BFBDB6"/>
+          <w:kern w:val="0"/>
+          <w:sz w:val="20"/>
+          <w:szCs w:val="20"/>
+          <w14:ligatures w14:val="none"/>
+        </w:rPr>
+        <w:t>();</w:t>
+      </w:r>
+    </w:p>
+    <w:p>
+      <w:pPr>
+        <w:shd w:val="clear" w:color="auto" w:fill="0E1016"/>
+        <w:spacing w:after="0" w:line="360" w:lineRule="atLeast"/>
+        <w:rPr>
+          <w:rFonts w:ascii="Ubuntu Mono" w:eastAsia="Times New Roman" w:hAnsi="Ubuntu Mono" w:cs="Times New Roman"/>
+          <w:color w:val="BFBDB6"/>
+          <w:kern w:val="0"/>
+          <w:sz w:val="20"/>
+          <w:szCs w:val="20"/>
+          <w14:ligatures w14:val="none"/>
+        </w:rPr>
+      </w:pPr>
+      <w:r>
+        <w:rPr>
+          <w:rFonts w:ascii="Ubuntu Mono" w:eastAsia="Times New Roman" w:hAnsi="Ubuntu Mono" w:cs="Times New Roman"/>
+          <w:color w:val="BFBDB6"/>
+          <w:kern w:val="0"/>
+          <w:sz w:val="20"/>
+          <w:szCs w:val="20"/>
+          <w14:ligatures w14:val="none"/>
+        </w:rPr>
+        <w:t xml:space="preserve">        crowdFund </w:t>
+      </w:r>
+      <w:r>
+        <w:rPr>
+          <w:rFonts w:ascii="Ubuntu Mono" w:eastAsia="Times New Roman" w:hAnsi="Ubuntu Mono" w:cs="Times New Roman"/>
+          <w:color w:val="03BBF5"/>
+          <w:kern w:val="0"/>
+          <w:sz w:val="20"/>
+          <w:szCs w:val="20"/>
+          <w14:ligatures w14:val="none"/>
+        </w:rPr>
+        <w:t>=</w:t>
+      </w:r>
+      <w:r>
+        <w:rPr>
+          <w:rFonts w:ascii="Ubuntu Mono" w:eastAsia="Times New Roman" w:hAnsi="Ubuntu Mono" w:cs="Times New Roman"/>
+          <w:color w:val="BFBDB6"/>
+          <w:kern w:val="0"/>
+          <w:sz w:val="20"/>
+          <w:szCs w:val="20"/>
+          <w14:ligatures w14:val="none"/>
+        </w:rPr>
+        <w:t xml:space="preserve"> </w:t>
+      </w:r>
+      <w:r>
+        <w:rPr>
+          <w:rFonts w:ascii="Ubuntu Mono" w:eastAsia="Times New Roman" w:hAnsi="Ubuntu Mono" w:cs="Times New Roman"/>
+          <w:color w:val="FD8BFF"/>
+          <w:kern w:val="0"/>
+          <w:sz w:val="20"/>
+          <w:szCs w:val="20"/>
+          <w14:ligatures w14:val="none"/>
+        </w:rPr>
+        <w:t>new</w:t>
+      </w:r>
+      <w:r>
+        <w:rPr>
+          <w:rFonts w:ascii="Ubuntu Mono" w:eastAsia="Times New Roman" w:hAnsi="Ubuntu Mono" w:cs="Times New Roman"/>
+          <w:color w:val="BFBDB6"/>
+          <w:kern w:val="0"/>
+          <w:sz w:val="20"/>
+          <w:szCs w:val="20"/>
+          <w14:ligatures w14:val="none"/>
+        </w:rPr>
+        <w:t xml:space="preserve"> </w:t>
+      </w:r>
+      <w:r>
+        <w:rPr>
+          <w:rFonts w:ascii="Ubuntu Mono" w:eastAsia="Times New Roman" w:hAnsi="Ubuntu Mono" w:cs="Times New Roman"/>
+          <w:color w:val="44FC88"/>
+          <w:kern w:val="0"/>
+          <w:sz w:val="20"/>
+          <w:szCs w:val="20"/>
+          <w14:ligatures w14:val="none"/>
+        </w:rPr>
+        <w:t>CrowdFund</w:t>
+      </w:r>
+      <w:r>
+        <w:rPr>
+          <w:rFonts w:ascii="Ubuntu Mono" w:eastAsia="Times New Roman" w:hAnsi="Ubuntu Mono" w:cs="Times New Roman"/>
+          <w:color w:val="BFBDB6"/>
+          <w:kern w:val="0"/>
+          <w:sz w:val="20"/>
+          <w:szCs w:val="20"/>
+          <w14:ligatures w14:val="none"/>
+        </w:rPr>
+        <w:t>(</w:t>
+      </w:r>
+      <w:r>
+        <w:rPr>
+          <w:rFonts w:ascii="Ubuntu Mono" w:eastAsia="Times New Roman" w:hAnsi="Ubuntu Mono" w:cs="Times New Roman"/>
+          <w:color w:val="D2A6FF"/>
+          <w:kern w:val="0"/>
+          <w:sz w:val="20"/>
+          <w:szCs w:val="20"/>
+          <w14:ligatures w14:val="none"/>
+        </w:rPr>
+        <w:t>0x694AA1769357215DE4FAC081bf1f309aDC325306</w:t>
+      </w:r>
+      <w:r>
+        <w:rPr>
+          <w:rFonts w:ascii="Ubuntu Mono" w:eastAsia="Times New Roman" w:hAnsi="Ubuntu Mono" w:cs="Times New Roman"/>
+          <w:color w:val="BFBDB6"/>
+          <w:kern w:val="0"/>
+          <w:sz w:val="20"/>
+          <w:szCs w:val="20"/>
+          <w14:ligatures w14:val="none"/>
+        </w:rPr>
+        <w:t>);</w:t>
+      </w:r>
+    </w:p>
+    <w:p>
+      <w:pPr>
+        <w:shd w:val="clear" w:color="auto" w:fill="0E1016"/>
+        <w:spacing w:after="0" w:line="360" w:lineRule="atLeast"/>
+        <w:rPr>
+          <w:rFonts w:ascii="Ubuntu Mono" w:eastAsia="Times New Roman" w:hAnsi="Ubuntu Mono" w:cs="Times New Roman"/>
+          <w:color w:val="BFBDB6"/>
+          <w:kern w:val="0"/>
+          <w:sz w:val="20"/>
+          <w:szCs w:val="20"/>
+          <w14:ligatures w14:val="none"/>
+        </w:rPr>
+      </w:pPr>
+      <w:r>
+        <w:rPr>
+          <w:rFonts w:ascii="Ubuntu Mono" w:eastAsia="Times New Roman" w:hAnsi="Ubuntu Mono" w:cs="Times New Roman"/>
+          <w:color w:val="BFBDB6"/>
+          <w:kern w:val="0"/>
+          <w:sz w:val="20"/>
+          <w:szCs w:val="20"/>
+          <w14:ligatures w14:val="none"/>
+        </w:rPr>
+        <w:t>        vm</w:t>
+      </w:r>
+      <w:r>
+        <w:rPr>
+          <w:rFonts w:ascii="Ubuntu Mono" w:eastAsia="Times New Roman" w:hAnsi="Ubuntu Mono" w:cs="Times New Roman"/>
+          <w:color w:val="CCF5FF"/>
+          <w:kern w:val="0"/>
+          <w:sz w:val="20"/>
+          <w:szCs w:val="20"/>
+          <w14:ligatures w14:val="none"/>
+        </w:rPr>
+        <w:t>.</w:t>
+      </w:r>
+      <w:r>
+        <w:rPr>
+          <w:rFonts w:ascii="Ubuntu Mono" w:eastAsia="Times New Roman" w:hAnsi="Ubuntu Mono" w:cs="Times New Roman"/>
+          <w:color w:val="44FC88"/>
+          <w:kern w:val="0"/>
+          <w:sz w:val="20"/>
+          <w:szCs w:val="20"/>
+          <w14:ligatures w14:val="none"/>
+        </w:rPr>
+        <w:t>stopBroadcast</w:t>
+      </w:r>
+      <w:r>
+        <w:rPr>
+          <w:rFonts w:ascii="Ubuntu Mono" w:eastAsia="Times New Roman" w:hAnsi="Ubuntu Mono" w:cs="Times New Roman"/>
+          <w:color w:val="BFBDB6"/>
+          <w:kern w:val="0"/>
+          <w:sz w:val="20"/>
+          <w:szCs w:val="20"/>
+          <w14:ligatures w14:val="none"/>
+        </w:rPr>
+        <w:t>();</w:t>
+      </w:r>
+    </w:p>
+    <w:p>
+      <w:pPr>
+        <w:shd w:val="clear" w:color="auto" w:fill="0E1016"/>
+        <w:spacing w:after="0" w:line="360" w:lineRule="atLeast"/>
+        <w:rPr>
+          <w:rFonts w:ascii="Ubuntu Mono" w:eastAsia="Times New Roman" w:hAnsi="Ubuntu Mono" w:cs="Times New Roman"/>
+          <w:color w:val="BFBDB6"/>
+          <w:kern w:val="0"/>
+          <w:sz w:val="20"/>
+          <w:szCs w:val="20"/>
+          <w14:ligatures w14:val="none"/>
+        </w:rPr>
+      </w:pPr>
+      <w:r>
+        <w:rPr>
+          <w:rFonts w:ascii="Ubuntu Mono" w:eastAsia="Times New Roman" w:hAnsi="Ubuntu Mono" w:cs="Times New Roman"/>
+          <w:color w:val="BFBDB6"/>
+          <w:kern w:val="0"/>
+          <w:sz w:val="20"/>
+          <w:szCs w:val="20"/>
+          <w14:ligatures w14:val="none"/>
+        </w:rPr>
+        <w:t xml:space="preserve">        </w:t>
+      </w:r>
+      <w:r>
+        <w:rPr>
+          <w:rFonts w:ascii="Ubuntu Mono" w:eastAsia="Times New Roman" w:hAnsi="Ubuntu Mono" w:cs="Times New Roman"/>
+          <w:color w:val="FF769A"/>
+          <w:kern w:val="0"/>
+          <w:sz w:val="20"/>
+          <w:szCs w:val="20"/>
+          <w14:ligatures w14:val="none"/>
+        </w:rPr>
+        <w:t>return</w:t>
+      </w:r>
+      <w:r>
+        <w:rPr>
+          <w:rFonts w:ascii="Ubuntu Mono" w:eastAsia="Times New Roman" w:hAnsi="Ubuntu Mono" w:cs="Times New Roman"/>
+          <w:color w:val="BFBDB6"/>
+          <w:kern w:val="0"/>
+          <w:sz w:val="20"/>
+          <w:szCs w:val="20"/>
+          <w14:ligatures w14:val="none"/>
+        </w:rPr>
+        <w:t xml:space="preserve"> crowdFund;</w:t>
+      </w:r>
+    </w:p>
+    <w:p>
+      <w:pPr>
+        <w:shd w:val="clear" w:color="auto" w:fill="0E1016"/>
+        <w:spacing w:after="0" w:line="360" w:lineRule="atLeast"/>
+        <w:rPr>
+          <w:rFonts w:ascii="Ubuntu Mono" w:eastAsia="Times New Roman" w:hAnsi="Ubuntu Mono" w:cs="Times New Roman"/>
+          <w:color w:val="BFBDB6"/>
+          <w:kern w:val="0"/>
+          <w:sz w:val="20"/>
+          <w:szCs w:val="20"/>
+          <w14:ligatures w14:val="none"/>
+        </w:rPr>
+      </w:pPr>
+      <w:r>
+        <w:rPr>
+          <w:rFonts w:ascii="Ubuntu Mono" w:eastAsia="Times New Roman" w:hAnsi="Ubuntu Mono" w:cs="Times New Roman"/>
+          <w:color w:val="BFBDB6"/>
+          <w:kern w:val="0"/>
+          <w:sz w:val="20"/>
+          <w:szCs w:val="20"/>
+          <w14:ligatures w14:val="none"/>
+        </w:rPr>
+        <w:t>    }</w:t>
+      </w:r>
+    </w:p>
+    <w:p>
+      <w:pPr>
+        <w:shd w:val="clear" w:color="auto" w:fill="0E1016"/>
+        <w:spacing w:after="0" w:line="360" w:lineRule="atLeast"/>
+        <w:rPr>
+          <w:rFonts w:ascii="Ubuntu Mono" w:eastAsia="Times New Roman" w:hAnsi="Ubuntu Mono" w:cs="Times New Roman"/>
+          <w:color w:val="BFBDB6"/>
+          <w:kern w:val="0"/>
+          <w:sz w:val="20"/>
+          <w:szCs w:val="20"/>
+          <w14:ligatures w14:val="none"/>
+        </w:rPr>
+      </w:pPr>
+      <w:r>
+        <w:rPr>
+          <w:rFonts w:ascii="Ubuntu Mono" w:eastAsia="Times New Roman" w:hAnsi="Ubuntu Mono" w:cs="Times New Roman"/>
+          <w:color w:val="BFBDB6"/>
+          <w:kern w:val="0"/>
+          <w:sz w:val="20"/>
+          <w:szCs w:val="20"/>
+          <w14:ligatures w14:val="none"/>
+        </w:rPr>
+        <w:t>}</w:t>
+      </w:r>
+    </w:p>
+    <w:p>
+      <w:r>
+        <w:t>In test:</w:t>
+      </w:r>
+    </w:p>
+    <w:p>
+      <w:pPr>
+        <w:shd w:val="clear" w:color="auto" w:fill="0E1016"/>
+        <w:spacing w:after="0" w:line="360" w:lineRule="atLeast"/>
+        <w:rPr>
+          <w:rFonts w:ascii="Ubuntu Mono" w:eastAsia="Times New Roman" w:hAnsi="Ubuntu Mono" w:cs="Times New Roman"/>
+          <w:color w:val="BFBDB6"/>
+          <w:kern w:val="0"/>
+          <w:sz w:val="20"/>
+          <w:szCs w:val="20"/>
+          <w14:ligatures w14:val="none"/>
+        </w:rPr>
+      </w:pPr>
+      <w:r>
+        <w:rPr>
+          <w:rFonts w:ascii="Ubuntu Mono" w:eastAsia="Times New Roman" w:hAnsi="Ubuntu Mono" w:cs="Times New Roman"/>
+          <w:color w:val="FFB289"/>
+          <w:kern w:val="0"/>
+          <w:sz w:val="20"/>
+          <w:szCs w:val="20"/>
+          <w14:ligatures w14:val="none"/>
+        </w:rPr>
+        <w:t>contract</w:t>
+      </w:r>
+      <w:r>
+        <w:rPr>
+          <w:rFonts w:ascii="Ubuntu Mono" w:eastAsia="Times New Roman" w:hAnsi="Ubuntu Mono" w:cs="Times New Roman"/>
+          <w:color w:val="BFBDB6"/>
+          <w:kern w:val="0"/>
+          <w:sz w:val="20"/>
+          <w:szCs w:val="20"/>
+          <w14:ligatures w14:val="none"/>
+        </w:rPr>
+        <w:t xml:space="preserve"> </w:t>
+      </w:r>
+      <w:r>
+        <w:rPr>
+          <w:rFonts w:ascii="Ubuntu Mono" w:eastAsia="Times New Roman" w:hAnsi="Ubuntu Mono" w:cs="Times New Roman"/>
+          <w:color w:val="FFD664"/>
+          <w:kern w:val="0"/>
+          <w:sz w:val="20"/>
+          <w:szCs w:val="20"/>
+          <w14:ligatures w14:val="none"/>
+        </w:rPr>
+        <w:t>CrowdFundTest</w:t>
+      </w:r>
+      <w:r>
+        <w:rPr>
+          <w:rFonts w:ascii="Ubuntu Mono" w:eastAsia="Times New Roman" w:hAnsi="Ubuntu Mono" w:cs="Times New Roman"/>
+          <w:color w:val="BFBDB6"/>
+          <w:kern w:val="0"/>
+          <w:sz w:val="20"/>
+          <w:szCs w:val="20"/>
+          <w14:ligatures w14:val="none"/>
+        </w:rPr>
+        <w:t xml:space="preserve"> </w:t>
+      </w:r>
+      <w:r>
+        <w:rPr>
+          <w:rFonts w:ascii="Ubuntu Mono" w:eastAsia="Times New Roman" w:hAnsi="Ubuntu Mono" w:cs="Times New Roman"/>
+          <w:color w:val="FFB289"/>
+          <w:kern w:val="0"/>
+          <w:sz w:val="20"/>
+          <w:szCs w:val="20"/>
+          <w14:ligatures w14:val="none"/>
+        </w:rPr>
+        <w:t>is</w:t>
+      </w:r>
+      <w:r>
+        <w:rPr>
+          <w:rFonts w:ascii="Ubuntu Mono" w:eastAsia="Times New Roman" w:hAnsi="Ubuntu Mono" w:cs="Times New Roman"/>
+          <w:color w:val="BFBDB6"/>
+          <w:kern w:val="0"/>
+          <w:sz w:val="20"/>
+          <w:szCs w:val="20"/>
+          <w14:ligatures w14:val="none"/>
+        </w:rPr>
+        <w:t xml:space="preserve"> </w:t>
+      </w:r>
+      <w:r>
+        <w:rPr>
+          <w:rFonts w:ascii="Ubuntu Mono" w:eastAsia="Times New Roman" w:hAnsi="Ubuntu Mono" w:cs="Times New Roman"/>
+          <w:color w:val="FFD664"/>
+          <w:kern w:val="0"/>
+          <w:sz w:val="20"/>
+          <w:szCs w:val="20"/>
+          <w14:ligatures w14:val="none"/>
+        </w:rPr>
+        <w:t>Test</w:t>
+      </w:r>
+      <w:r>
+        <w:rPr>
+          <w:rFonts w:ascii="Ubuntu Mono" w:eastAsia="Times New Roman" w:hAnsi="Ubuntu Mono" w:cs="Times New Roman"/>
+          <w:color w:val="BFBDB6"/>
+          <w:kern w:val="0"/>
+          <w:sz w:val="20"/>
+          <w:szCs w:val="20"/>
+          <w14:ligatures w14:val="none"/>
+        </w:rPr>
+        <w:t xml:space="preserve"> {</w:t>
+      </w:r>
+    </w:p>
+    <w:p>
+      <w:pPr>
+        <w:shd w:val="clear" w:color="auto" w:fill="0E1016"/>
+        <w:spacing w:after="0" w:line="360" w:lineRule="atLeast"/>
+        <w:rPr>
+          <w:rFonts w:ascii="Ubuntu Mono" w:eastAsia="Times New Roman" w:hAnsi="Ubuntu Mono" w:cs="Times New Roman"/>
+          <w:color w:val="BFBDB6"/>
+          <w:kern w:val="0"/>
+          <w:sz w:val="20"/>
+          <w:szCs w:val="20"/>
+          <w14:ligatures w14:val="none"/>
+        </w:rPr>
+      </w:pPr>
+      <w:r>
+        <w:rPr>
+          <w:rFonts w:ascii="Ubuntu Mono" w:eastAsia="Times New Roman" w:hAnsi="Ubuntu Mono" w:cs="Times New Roman"/>
+          <w:color w:val="BFBDB6"/>
+          <w:kern w:val="0"/>
+          <w:sz w:val="20"/>
+          <w:szCs w:val="20"/>
+          <w14:ligatures w14:val="none"/>
+        </w:rPr>
+        <w:t>    CrowdFund crowdFund;</w:t>
+      </w:r>
+    </w:p>
+    <w:p>
+      <w:pPr>
+        <w:shd w:val="clear" w:color="auto" w:fill="0E1016"/>
+        <w:spacing w:after="0" w:line="360" w:lineRule="atLeast"/>
+        <w:rPr>
+          <w:rFonts w:ascii="Ubuntu Mono" w:eastAsia="Times New Roman" w:hAnsi="Ubuntu Mono" w:cs="Times New Roman"/>
+          <w:color w:val="BFBDB6"/>
+          <w:kern w:val="0"/>
+          <w:sz w:val="20"/>
+          <w:szCs w:val="20"/>
+          <w14:ligatures w14:val="none"/>
+        </w:rPr>
+      </w:pPr>
+      <w:r>
+        <w:rPr>
+          <w:rFonts w:ascii="Ubuntu Mono" w:eastAsia="Times New Roman" w:hAnsi="Ubuntu Mono" w:cs="Times New Roman"/>
+          <w:color w:val="BFBDB6"/>
+          <w:kern w:val="0"/>
+          <w:sz w:val="20"/>
+          <w:szCs w:val="20"/>
+          <w14:ligatures w14:val="none"/>
+        </w:rPr>
+        <w:t xml:space="preserve">    </w:t>
+      </w:r>
+      <w:r>
+        <w:rPr>
+          <w:rFonts w:ascii="Ubuntu Mono" w:eastAsia="Times New Roman" w:hAnsi="Ubuntu Mono" w:cs="Times New Roman"/>
+          <w:color w:val="BFBDB6"/>
+          <w:kern w:val="0"/>
+          <w:sz w:val="20"/>
+          <w:szCs w:val="20"/>
+          <w14:ligatures w14:val="none"/>
+        </w:rPr>
+        <w:t>DeployCrowdFund</w:t>
+      </w:r>
+      <w:r>
+        <w:rPr>
+          <w:rFonts w:ascii="Ubuntu Mono" w:eastAsia="Times New Roman" w:hAnsi="Ubuntu Mono" w:cs="Times New Roman"/>
+          <w:color w:val="BFBDB6"/>
+          <w:kern w:val="0"/>
+          <w:sz w:val="20"/>
+          <w:szCs w:val="20"/>
+          <w14:ligatures w14:val="none"/>
+        </w:rPr>
+        <w:t xml:space="preserve"> </w:t>
+      </w:r>
+      <w:r>
+        <w:rPr>
+          <w:rFonts w:ascii="Ubuntu Mono" w:eastAsia="Times New Roman" w:hAnsi="Ubuntu Mono" w:cs="Times New Roman"/>
+          <w:color w:val="BFBDB6"/>
+          <w:kern w:val="0"/>
+          <w:sz w:val="20"/>
+          <w:szCs w:val="20"/>
+          <w14:ligatures w14:val="none"/>
+        </w:rPr>
+        <w:t>deployCrowdFund;</w:t>
+      </w:r>
+    </w:p>
+    <w:p>
+      <w:pPr>
+        <w:shd w:val="clear" w:color="auto" w:fill="0E1016"/>
+        <w:spacing w:after="0" w:line="360" w:lineRule="atLeast"/>
+        <w:rPr>
+          <w:rFonts w:ascii="Ubuntu Mono" w:eastAsia="Times New Roman" w:hAnsi="Ubuntu Mono" w:cs="Times New Roman"/>
+          <w:color w:val="BFBDB6"/>
+          <w:kern w:val="0"/>
+          <w:sz w:val="20"/>
+          <w:szCs w:val="20"/>
+          <w14:ligatures w14:val="none"/>
+        </w:rPr>
+      </w:pPr>
+      <w:r>
+        <w:rPr>
+          <w:rFonts w:ascii="Ubuntu Mono" w:eastAsia="Times New Roman" w:hAnsi="Ubuntu Mono" w:cs="Times New Roman"/>
+          <w:color w:val="BFBDB6"/>
+          <w:kern w:val="0"/>
+          <w:sz w:val="20"/>
+          <w:szCs w:val="20"/>
+          <w14:ligatures w14:val="none"/>
+        </w:rPr>
+        <w:lastRenderedPageBreak/>
+        <w:t xml:space="preserve">    </w:t>
+      </w:r>
+      <w:r>
+        <w:rPr>
+          <w:rFonts w:ascii="Ubuntu Mono" w:eastAsia="Times New Roman" w:hAnsi="Ubuntu Mono" w:cs="Times New Roman"/>
+          <w:color w:val="FFB289"/>
+          <w:kern w:val="0"/>
+          <w:sz w:val="20"/>
+          <w:szCs w:val="20"/>
+          <w14:ligatures w14:val="none"/>
+        </w:rPr>
+        <w:t>function</w:t>
+      </w:r>
+      <w:r>
+        <w:rPr>
+          <w:rFonts w:ascii="Ubuntu Mono" w:eastAsia="Times New Roman" w:hAnsi="Ubuntu Mono" w:cs="Times New Roman"/>
+          <w:color w:val="BFBDB6"/>
+          <w:kern w:val="0"/>
+          <w:sz w:val="20"/>
+          <w:szCs w:val="20"/>
+          <w14:ligatures w14:val="none"/>
+        </w:rPr>
+        <w:t xml:space="preserve"> </w:t>
+      </w:r>
+      <w:r>
+        <w:rPr>
+          <w:rFonts w:ascii="Ubuntu Mono" w:eastAsia="Times New Roman" w:hAnsi="Ubuntu Mono" w:cs="Times New Roman"/>
+          <w:color w:val="44FC88"/>
+          <w:kern w:val="0"/>
+          <w:sz w:val="20"/>
+          <w:szCs w:val="20"/>
+          <w14:ligatures w14:val="none"/>
+        </w:rPr>
+        <w:t>setUp</w:t>
+      </w:r>
+      <w:r>
+        <w:rPr>
+          <w:rFonts w:ascii="Ubuntu Mono" w:eastAsia="Times New Roman" w:hAnsi="Ubuntu Mono" w:cs="Times New Roman"/>
+          <w:color w:val="BFBDB6"/>
+          <w:kern w:val="0"/>
+          <w:sz w:val="20"/>
+          <w:szCs w:val="20"/>
+          <w14:ligatures w14:val="none"/>
+        </w:rPr>
+        <w:t xml:space="preserve">() </w:t>
+      </w:r>
+      <w:r>
+        <w:rPr>
+          <w:rFonts w:ascii="Ubuntu Mono" w:eastAsia="Times New Roman" w:hAnsi="Ubuntu Mono" w:cs="Times New Roman"/>
+          <w:color w:val="FFB289"/>
+          <w:kern w:val="0"/>
+          <w:sz w:val="20"/>
+          <w:szCs w:val="20"/>
+          <w14:ligatures w14:val="none"/>
+        </w:rPr>
+        <w:t>public</w:t>
+      </w:r>
+      <w:r>
+        <w:rPr>
+          <w:rFonts w:ascii="Ubuntu Mono" w:eastAsia="Times New Roman" w:hAnsi="Ubuntu Mono" w:cs="Times New Roman"/>
+          <w:color w:val="BFBDB6"/>
+          <w:kern w:val="0"/>
+          <w:sz w:val="20"/>
+          <w:szCs w:val="20"/>
+          <w14:ligatures w14:val="none"/>
+        </w:rPr>
+        <w:t xml:space="preserve"> {</w:t>
+      </w:r>
+    </w:p>
+    <w:p>
+      <w:pPr>
+        <w:shd w:val="clear" w:color="auto" w:fill="0E1016"/>
+        <w:spacing w:after="0" w:line="360" w:lineRule="atLeast"/>
+        <w:rPr>
+          <w:rFonts w:ascii="Ubuntu Mono" w:eastAsia="Times New Roman" w:hAnsi="Ubuntu Mono" w:cs="Times New Roman"/>
+          <w:color w:val="BFBDB6"/>
+          <w:kern w:val="0"/>
+          <w:sz w:val="20"/>
+          <w:szCs w:val="20"/>
+          <w14:ligatures w14:val="none"/>
+        </w:rPr>
+      </w:pPr>
+      <w:r>
+        <w:rPr>
+          <w:rFonts w:ascii="Ubuntu Mono" w:eastAsia="Times New Roman" w:hAnsi="Ubuntu Mono" w:cs="Times New Roman"/>
+          <w:color w:val="BFBDB6"/>
+          <w:kern w:val="0"/>
+          <w:sz w:val="20"/>
+          <w:szCs w:val="20"/>
+          <w14:ligatures w14:val="none"/>
+        </w:rPr>
+        <w:t xml:space="preserve">        deployCrowdFund </w:t>
+      </w:r>
+      <w:r>
+        <w:rPr>
+          <w:rFonts w:ascii="Ubuntu Mono" w:eastAsia="Times New Roman" w:hAnsi="Ubuntu Mono" w:cs="Times New Roman"/>
+          <w:color w:val="03BBF5"/>
+          <w:kern w:val="0"/>
+          <w:sz w:val="20"/>
+          <w:szCs w:val="20"/>
+          <w14:ligatures w14:val="none"/>
+        </w:rPr>
+        <w:t>=</w:t>
+      </w:r>
+      <w:r>
+        <w:rPr>
+          <w:rFonts w:ascii="Ubuntu Mono" w:eastAsia="Times New Roman" w:hAnsi="Ubuntu Mono" w:cs="Times New Roman"/>
+          <w:color w:val="BFBDB6"/>
+          <w:kern w:val="0"/>
+          <w:sz w:val="20"/>
+          <w:szCs w:val="20"/>
+          <w14:ligatures w14:val="none"/>
+        </w:rPr>
+        <w:t xml:space="preserve"> </w:t>
+      </w:r>
+      <w:r>
+        <w:rPr>
+          <w:rFonts w:ascii="Ubuntu Mono" w:eastAsia="Times New Roman" w:hAnsi="Ubuntu Mono" w:cs="Times New Roman"/>
+          <w:color w:val="FD8BFF"/>
+          <w:kern w:val="0"/>
+          <w:sz w:val="20"/>
+          <w:szCs w:val="20"/>
+          <w14:ligatures w14:val="none"/>
+        </w:rPr>
+        <w:t>new</w:t>
+      </w:r>
+      <w:r>
+        <w:rPr>
+          <w:rFonts w:ascii="Ubuntu Mono" w:eastAsia="Times New Roman" w:hAnsi="Ubuntu Mono" w:cs="Times New Roman"/>
+          <w:color w:val="BFBDB6"/>
+          <w:kern w:val="0"/>
+          <w:sz w:val="20"/>
+          <w:szCs w:val="20"/>
+          <w14:ligatures w14:val="none"/>
+        </w:rPr>
+        <w:t xml:space="preserve"> </w:t>
+      </w:r>
+      <w:r>
+        <w:rPr>
+          <w:rFonts w:ascii="Ubuntu Mono" w:eastAsia="Times New Roman" w:hAnsi="Ubuntu Mono" w:cs="Times New Roman"/>
+          <w:color w:val="44FC88"/>
+          <w:kern w:val="0"/>
+          <w:sz w:val="20"/>
+          <w:szCs w:val="20"/>
+          <w14:ligatures w14:val="none"/>
+        </w:rPr>
+        <w:t>DeployCrowdFund</w:t>
+      </w:r>
+      <w:r>
+        <w:rPr>
+          <w:rFonts w:ascii="Ubuntu Mono" w:eastAsia="Times New Roman" w:hAnsi="Ubuntu Mono" w:cs="Times New Roman"/>
+          <w:color w:val="BFBDB6"/>
+          <w:kern w:val="0"/>
+          <w:sz w:val="20"/>
+          <w:szCs w:val="20"/>
+          <w14:ligatures w14:val="none"/>
+        </w:rPr>
+        <w:t>();</w:t>
+      </w:r>
+    </w:p>
+    <w:p>
+      <w:pPr>
+        <w:shd w:val="clear" w:color="auto" w:fill="0E1016"/>
+        <w:spacing w:after="0" w:line="360" w:lineRule="atLeast"/>
+        <w:rPr>
+          <w:rFonts w:ascii="Ubuntu Mono" w:eastAsia="Times New Roman" w:hAnsi="Ubuntu Mono" w:cs="Times New Roman"/>
+          <w:color w:val="BFBDB6"/>
+          <w:kern w:val="0"/>
+          <w:sz w:val="20"/>
+          <w:szCs w:val="20"/>
+          <w14:ligatures w14:val="none"/>
+        </w:rPr>
+      </w:pPr>
+      <w:r>
+        <w:rPr>
+          <w:rFonts w:ascii="Ubuntu Mono" w:eastAsia="Times New Roman" w:hAnsi="Ubuntu Mono" w:cs="Times New Roman"/>
+          <w:color w:val="BFBDB6"/>
+          <w:kern w:val="0"/>
+          <w:sz w:val="20"/>
+          <w:szCs w:val="20"/>
+          <w14:ligatures w14:val="none"/>
+        </w:rPr>
+        <w:t xml:space="preserve">        crowdFund </w:t>
+      </w:r>
+      <w:r>
+        <w:rPr>
+          <w:rFonts w:ascii="Ubuntu Mono" w:eastAsia="Times New Roman" w:hAnsi="Ubuntu Mono" w:cs="Times New Roman"/>
+          <w:color w:val="03BBF5"/>
+          <w:kern w:val="0"/>
+          <w:sz w:val="20"/>
+          <w:szCs w:val="20"/>
+          <w14:ligatures w14:val="none"/>
+        </w:rPr>
+        <w:t>=</w:t>
+      </w:r>
+      <w:r>
+        <w:rPr>
+          <w:rFonts w:ascii="Ubuntu Mono" w:eastAsia="Times New Roman" w:hAnsi="Ubuntu Mono" w:cs="Times New Roman"/>
+          <w:color w:val="BFBDB6"/>
+          <w:kern w:val="0"/>
+          <w:sz w:val="20"/>
+          <w:szCs w:val="20"/>
+          <w14:ligatures w14:val="none"/>
+        </w:rPr>
+        <w:t xml:space="preserve"> deployCrowdFund</w:t>
+      </w:r>
+      <w:r>
+        <w:rPr>
+          <w:rFonts w:ascii="Ubuntu Mono" w:eastAsia="Times New Roman" w:hAnsi="Ubuntu Mono" w:cs="Times New Roman"/>
+          <w:color w:val="CCF5FF"/>
+          <w:kern w:val="0"/>
+          <w:sz w:val="20"/>
+          <w:szCs w:val="20"/>
+          <w14:ligatures w14:val="none"/>
+        </w:rPr>
+        <w:t>.</w:t>
+      </w:r>
+      <w:r>
+        <w:rPr>
+          <w:rFonts w:ascii="Ubuntu Mono" w:eastAsia="Times New Roman" w:hAnsi="Ubuntu Mono" w:cs="Times New Roman"/>
+          <w:color w:val="44FC88"/>
+          <w:kern w:val="0"/>
+          <w:sz w:val="20"/>
+          <w:szCs w:val="20"/>
+          <w14:ligatures w14:val="none"/>
+        </w:rPr>
+        <w:t>run</w:t>
+      </w:r>
+      <w:r>
+        <w:rPr>
+          <w:rFonts w:ascii="Ubuntu Mono" w:eastAsia="Times New Roman" w:hAnsi="Ubuntu Mono" w:cs="Times New Roman"/>
+          <w:color w:val="BFBDB6"/>
+          <w:kern w:val="0"/>
+          <w:sz w:val="20"/>
+          <w:szCs w:val="20"/>
+          <w14:ligatures w14:val="none"/>
+        </w:rPr>
+        <w:t>();</w:t>
+      </w:r>
+    </w:p>
+    <w:p>
+      <w:pPr>
+        <w:shd w:val="clear" w:color="auto" w:fill="0E1016"/>
+        <w:spacing w:after="0" w:line="360" w:lineRule="atLeast"/>
+        <w:rPr>
+          <w:rFonts w:ascii="Ubuntu Mono" w:eastAsia="Times New Roman" w:hAnsi="Ubuntu Mono" w:cs="Times New Roman"/>
+          <w:color w:val="BFBDB6"/>
+          <w:kern w:val="0"/>
+          <w:sz w:val="20"/>
+          <w:szCs w:val="20"/>
+          <w14:ligatures w14:val="none"/>
+        </w:rPr>
+      </w:pPr>
+      <w:r>
+        <w:rPr>
+          <w:rFonts w:ascii="Ubuntu Mono" w:eastAsia="Times New Roman" w:hAnsi="Ubuntu Mono" w:cs="Times New Roman"/>
+          <w:color w:val="BFBDB6"/>
+          <w:kern w:val="0"/>
+          <w:sz w:val="20"/>
+          <w:szCs w:val="20"/>
+          <w14:ligatures w14:val="none"/>
+        </w:rPr>
+        <w:t>    }</w:t>
+      </w:r>
+    </w:p>
+    <w:p>
+      <w:pPr>
+        <w:shd w:val="clear" w:color="auto" w:fill="0E1016"/>
+        <w:spacing w:after="0" w:line="360" w:lineRule="atLeast"/>
+        <w:rPr>
+          <w:rFonts w:ascii="Ubuntu Mono" w:eastAsia="Times New Roman" w:hAnsi="Ubuntu Mono" w:cs="Times New Roman"/>
+          <w:color w:val="BFBDB6"/>
+          <w:kern w:val="0"/>
+          <w:sz w:val="20"/>
+          <w:szCs w:val="20"/>
+          <w14:ligatures w14:val="none"/>
+        </w:rPr>
+      </w:pPr>
+      <w:r>
+        <w:rPr>
+          <w:rFonts w:ascii="Ubuntu Mono" w:eastAsia="Times New Roman" w:hAnsi="Ubuntu Mono" w:cs="Times New Roman"/>
+          <w:color w:val="BFBDB6"/>
+          <w:kern w:val="0"/>
+          <w:sz w:val="20"/>
+          <w:szCs w:val="20"/>
+          <w14:ligatures w14:val="none"/>
+        </w:rPr>
+        <w:t>.</w:t>
+      </w:r>
+    </w:p>
+    <w:p>
+      <w:pPr>
+        <w:shd w:val="clear" w:color="auto" w:fill="0E1016"/>
+        <w:spacing w:after="0" w:line="360" w:lineRule="atLeast"/>
+        <w:rPr>
+          <w:rFonts w:ascii="Ubuntu Mono" w:eastAsia="Times New Roman" w:hAnsi="Ubuntu Mono" w:cs="Times New Roman"/>
+          <w:color w:val="BFBDB6"/>
+          <w:kern w:val="0"/>
+          <w:sz w:val="20"/>
+          <w:szCs w:val="20"/>
+          <w14:ligatures w14:val="none"/>
+        </w:rPr>
+      </w:pPr>
+      <w:r>
+        <w:rPr>
+          <w:rFonts w:ascii="Ubuntu Mono" w:eastAsia="Times New Roman" w:hAnsi="Ubuntu Mono" w:cs="Times New Roman"/>
+          <w:color w:val="BFBDB6"/>
+          <w:kern w:val="0"/>
+          <w:sz w:val="20"/>
+          <w:szCs w:val="20"/>
+          <w14:ligatures w14:val="none"/>
+        </w:rPr>
+        <w:t>.</w:t>
+      </w:r>
+    </w:p>
+    <w:p>
+      <w:pPr>
+        <w:shd w:val="clear" w:color="auto" w:fill="0E1016"/>
+        <w:spacing w:after="0" w:line="360" w:lineRule="atLeast"/>
+        <w:rPr>
+          <w:rFonts w:ascii="Ubuntu Mono" w:eastAsia="Times New Roman" w:hAnsi="Ubuntu Mono" w:cs="Times New Roman"/>
+          <w:color w:val="BFBDB6"/>
+          <w:kern w:val="0"/>
+          <w:sz w:val="20"/>
+          <w:szCs w:val="20"/>
+          <w14:ligatures w14:val="none"/>
+        </w:rPr>
+      </w:pPr>
+      <w:r>
+        <w:rPr>
+          <w:rFonts w:ascii="Ubuntu Mono" w:eastAsia="Times New Roman" w:hAnsi="Ubuntu Mono" w:cs="Times New Roman"/>
+          <w:color w:val="BFBDB6"/>
+          <w:kern w:val="0"/>
+          <w:sz w:val="20"/>
+          <w:szCs w:val="20"/>
+          <w14:ligatures w14:val="none"/>
+        </w:rPr>
+        <w:t>.</w:t>
+      </w:r>
+    </w:p>
+    <w:p>
+      <w:pPr>
+        <w:shd w:val="clear" w:color="auto" w:fill="0E1016"/>
+        <w:spacing w:after="0" w:line="360" w:lineRule="atLeast"/>
+        <w:rPr>
+          <w:rFonts w:ascii="Ubuntu Mono" w:eastAsia="Times New Roman" w:hAnsi="Ubuntu Mono" w:cs="Times New Roman"/>
+          <w:color w:val="BFBDB6"/>
+          <w:kern w:val="0"/>
+          <w:sz w:val="20"/>
+          <w:szCs w:val="20"/>
+          <w14:ligatures w14:val="none"/>
+        </w:rPr>
+      </w:pPr>
+      <w:r>
+        <w:rPr>
+          <w:rFonts w:ascii="Ubuntu Mono" w:eastAsia="Times New Roman" w:hAnsi="Ubuntu Mono" w:cs="Times New Roman"/>
+          <w:color w:val="BFBDB6"/>
+          <w:kern w:val="0"/>
+          <w:sz w:val="20"/>
+          <w:szCs w:val="20"/>
+          <w14:ligatures w14:val="none"/>
+        </w:rPr>
+        <w:t>}</w:t>
+      </w:r>
+    </w:p>
+    <w:p>
+      <w:r>
+        <w:t>Now each time we change deploy</w:t>
+      </w:r>
+      <w:r>
+        <w:t>,</w:t>
+      </w:r>
+      <w:r>
+        <w:t xml:space="preserve"> the test changes accordingly.</w:t>
+      </w:r>
+      <w:r>
+        <w:t xml:space="preserve"> Much more professional.</w:t>
+      </w:r>
+    </w:p>
+    <w:p/>
+    <w:p/>
+    <w:p/>
     <w:sectPr>
       <w:pgSz w:w="12240" w:h="15840"/>
       <w:pgMar w:top="1440" w:right="1440" w:bottom="1440" w:left="1440" w:header="720" w:footer="720" w:gutter="0"/>
@@ -3172,6 +6609,56 @@
     </w:sectPr>
   </w:body>
 </w:document>
+</file>
+
+<file path=word/endnotes.xml><?xml version="1.0" encoding="utf-8"?>
+<w:endnotes xmlns:wpc="http://schemas.microsoft.com/office/word/2010/wordprocessingCanvas" xmlns:cx="http://schemas.microsoft.com/office/drawing/2014/chartex" xmlns:cx1="http://schemas.microsoft.com/office/drawing/2015/9/8/chartex" xmlns:cx2="http://schemas.microsoft.com/office/drawing/2015/10/21/chartex" xmlns:cx3="http://schemas.microsoft.com/office/drawing/2016/5/9/chartex" xmlns:cx4="http://schemas.microsoft.com/office/drawing/2016/5/10/chartex" xmlns:cx5="http://schemas.microsoft.com/office/drawing/2016/5/11/chartex" xmlns:cx6="http://schemas.microsoft.com/office/drawing/2016/5/12/chartex" xmlns:cx7="http://schemas.microsoft.com/office/drawing/2016/5/13/chartex" xmlns:cx8="http://schemas.microsoft.com/office/drawing/2016/5/14/chartex" xmlns:mc="http://schemas.openxmlformats.org/markup-compatibility/2006" xmlns:aink="http://schemas.microsoft.com/office/drawing/2016/ink" xmlns:am3d="http://schemas.microsoft.com/office/drawing/2017/model3d" xmlns:o="urn:schemas-microsoft-com:office:office" xmlns:oel="http://schemas.microsoft.com/office/2019/extlst" xmlns:r="http://schemas.openxmlformats.org/officeDocument/2006/relationships" xmlns:m="http://schemas.openxmlformats.org/officeDocument/2006/math" xmlns:v="urn:schemas-microsoft-com:vml" xmlns:wp14="http://schemas.microsoft.com/office/word/2010/wordprocessingDrawing" xmlns:wp="http://schemas.openxmlformats.org/drawingml/2006/wordprocessingDrawing" xmlns:w10="urn:schemas-microsoft-com:office:word" xmlns:w="http://schemas.openxmlformats.org/wordprocessingml/2006/main" xmlns:w14="http://schemas.microsoft.com/office/word/2010/wordml" xmlns:w15="http://schemas.microsoft.com/office/word/2012/wordml" xmlns:w16cex="http://schemas.microsoft.com/office/word/2018/wordml/cex" xmlns:w16cid="http://schemas.microsoft.com/office/word/2016/wordml/cid" xmlns:w16="http://schemas.microsoft.com/office/word/2018/wordml" xmlns:w16du="http://schemas.microsoft.com/office/word/2023/wordml/word16du" xmlns:w16sdtdh="http://schemas.microsoft.com/office/word/2020/wordml/sdtdatahash" xmlns:w16sdtfl="http://schemas.microsoft.com/office/word/2024/wordml/sdtformatlock" xmlns:w16se="http://schemas.microsoft.com/office/word/2015/wordml/symex" xmlns:wpg="http://schemas.microsoft.com/office/word/2010/wordprocessingGroup" xmlns:wpi="http://schemas.microsoft.com/office/word/2010/wordprocessingInk" xmlns:wne="http://schemas.microsoft.com/office/word/2006/wordml" xmlns:wps="http://schemas.microsoft.com/office/word/2010/wordprocessingShape" mc:Ignorable="w14 w15 w16se w16cid w16 w16cex w16sdtdh w16sdtfl w16du wp14">
+  <w:endnote w:type="separator" w:id="-1">
+    <w:p>
+      <w:pPr>
+        <w:spacing w:after="0" w:line="240" w:lineRule="auto"/>
+      </w:pPr>
+      <w:r>
+        <w:separator/>
+      </w:r>
+    </w:p>
+  </w:endnote>
+  <w:endnote w:type="continuationSeparator" w:id="0">
+    <w:p>
+      <w:pPr>
+        <w:spacing w:after="0" w:line="240" w:lineRule="auto"/>
+      </w:pPr>
+      <w:r>
+        <w:continuationSeparator/>
+      </w:r>
+    </w:p>
+  </w:endnote>
+</w:endnotes>
+</file>
+
+<file path=word/footnotes.xml><?xml version="1.0" encoding="utf-8"?>
+<w:footnotes xmlns:wpc="http://schemas.microsoft.com/office/word/2010/wordprocessingCanvas" xmlns:cx="http://schemas.microsoft.com/office/drawing/2014/chartex" xmlns:cx1="http://schemas.microsoft.com/office/drawing/2015/9/8/chartex" xmlns:cx2="http://schemas.microsoft.com/office/drawing/2015/10/21/chartex" xmlns:cx3="http://schemas.microsoft.com/office/drawing/2016/5/9/chartex" xmlns:cx4="http://schemas.microsoft.com/office/drawing/2016/5/10/chartex" xmlns:cx5="http://schemas.microsoft.com/office/drawing/2016/5/11/chartex" xmlns:cx6="http://schemas.microsoft.com/office/drawing/2016/5/12/chartex" xmlns:cx7="http://schemas.microsoft.com/office/drawing/2016/5/13/chartex" xmlns:cx8="http://schemas.microsoft.com/office/drawing/2016/5/14/chartex" xmlns:mc="http://schemas.openxmlformats.org/markup-compatibility/2006" xmlns:aink="http://schemas.microsoft.com/office/drawing/2016/ink" xmlns:am3d="http://schemas.microsoft.com/office/drawing/2017/model3d" xmlns:o="urn:schemas-microsoft-com:office:office" xmlns:oel="http://schemas.microsoft.com/office/2019/extlst" xmlns:r="http://schemas.openxmlformats.org/officeDocument/2006/relationships" xmlns:m="http://schemas.openxmlformats.org/officeDocument/2006/math" xmlns:v="urn:schemas-microsoft-com:vml" xmlns:wp14="http://schemas.microsoft.com/office/word/2010/wordprocessingDrawing" xmlns:wp="http://schemas.openxmlformats.org/drawingml/2006/wordprocessingDrawing" xmlns:w10="urn:schemas-microsoft-com:office:word" xmlns:w="http://schemas.openxmlformats.org/wordprocessingml/2006/main" xmlns:w14="http://schemas.microsoft.com/office/word/2010/wordml" xmlns:w15="http://schemas.microsoft.com/office/word/2012/wordml" xmlns:w16cex="http://schemas.microsoft.com/office/word/2018/wordml/cex" xmlns:w16cid="http://schemas.microsoft.com/office/word/2016/wordml/cid" xmlns:w16="http://schemas.microsoft.com/office/word/2018/wordml" xmlns:w16du="http://schemas.microsoft.com/office/word/2023/wordml/word16du" xmlns:w16sdtdh="http://schemas.microsoft.com/office/word/2020/wordml/sdtdatahash" xmlns:w16sdtfl="http://schemas.microsoft.com/office/word/2024/wordml/sdtformatlock" xmlns:w16se="http://schemas.microsoft.com/office/word/2015/wordml/symex" xmlns:wpg="http://schemas.microsoft.com/office/word/2010/wordprocessingGroup" xmlns:wpi="http://schemas.microsoft.com/office/word/2010/wordprocessingInk" xmlns:wne="http://schemas.microsoft.com/office/word/2006/wordml" xmlns:wps="http://schemas.microsoft.com/office/word/2010/wordprocessingShape" mc:Ignorable="w14 w15 w16se w16cid w16 w16cex w16sdtdh w16sdtfl w16du wp14">
+  <w:footnote w:type="separator" w:id="-1">
+    <w:p>
+      <w:pPr>
+        <w:spacing w:after="0" w:line="240" w:lineRule="auto"/>
+      </w:pPr>
+      <w:r>
+        <w:separator/>
+      </w:r>
+    </w:p>
+  </w:footnote>
+  <w:footnote w:type="continuationSeparator" w:id="0">
+    <w:p>
+      <w:pPr>
+        <w:spacing w:after="0" w:line="240" w:lineRule="auto"/>
+      </w:pPr>
+      <w:r>
+        <w:continuationSeparator/>
+      </w:r>
+    </w:p>
+  </w:footnote>
+</w:footnotes>
 </file>
 
 <file path=word/numbering.xml><?xml version="1.0" encoding="utf-8"?>
@@ -3551,6 +7038,155 @@
     </w:lvl>
   </w:abstractNum>
   <w:abstractNum w:abstractNumId="3" w15:restartNumberingAfterBreak="0">
+    <w:nsid w:val="47F70B09"/>
+    <w:multiLevelType w:val="multilevel"/>
+    <w:tmpl w:val="0F0EFFFA"/>
+    <w:lvl w:ilvl="0">
+      <w:start w:val="1"/>
+      <w:numFmt w:val="bullet"/>
+      <w:lvlText w:val=""/>
+      <w:lvlJc w:val="left"/>
+      <w:pPr>
+        <w:tabs>
+          <w:tab w:val="num" w:pos="720"/>
+        </w:tabs>
+        <w:ind w:left="720" w:hanging="360"/>
+      </w:pPr>
+      <w:rPr>
+        <w:rFonts w:ascii="Symbol" w:hAnsi="Symbol" w:hint="default"/>
+        <w:sz w:val="20"/>
+      </w:rPr>
+    </w:lvl>
+    <w:lvl w:ilvl="1" w:tentative="1">
+      <w:start w:val="1"/>
+      <w:numFmt w:val="bullet"/>
+      <w:lvlText w:val="o"/>
+      <w:lvlJc w:val="left"/>
+      <w:pPr>
+        <w:tabs>
+          <w:tab w:val="num" w:pos="1440"/>
+        </w:tabs>
+        <w:ind w:left="1440" w:hanging="360"/>
+      </w:pPr>
+      <w:rPr>
+        <w:rFonts w:ascii="Courier New" w:hAnsi="Courier New" w:hint="default"/>
+        <w:sz w:val="20"/>
+      </w:rPr>
+    </w:lvl>
+    <w:lvl w:ilvl="2" w:tentative="1">
+      <w:start w:val="1"/>
+      <w:numFmt w:val="bullet"/>
+      <w:lvlText w:val=""/>
+      <w:lvlJc w:val="left"/>
+      <w:pPr>
+        <w:tabs>
+          <w:tab w:val="num" w:pos="2160"/>
+        </w:tabs>
+        <w:ind w:left="2160" w:hanging="360"/>
+      </w:pPr>
+      <w:rPr>
+        <w:rFonts w:ascii="Wingdings" w:hAnsi="Wingdings" w:hint="default"/>
+        <w:sz w:val="20"/>
+      </w:rPr>
+    </w:lvl>
+    <w:lvl w:ilvl="3" w:tentative="1">
+      <w:start w:val="1"/>
+      <w:numFmt w:val="bullet"/>
+      <w:lvlText w:val=""/>
+      <w:lvlJc w:val="left"/>
+      <w:pPr>
+        <w:tabs>
+          <w:tab w:val="num" w:pos="2880"/>
+        </w:tabs>
+        <w:ind w:left="2880" w:hanging="360"/>
+      </w:pPr>
+      <w:rPr>
+        <w:rFonts w:ascii="Wingdings" w:hAnsi="Wingdings" w:hint="default"/>
+        <w:sz w:val="20"/>
+      </w:rPr>
+    </w:lvl>
+    <w:lvl w:ilvl="4" w:tentative="1">
+      <w:start w:val="1"/>
+      <w:numFmt w:val="bullet"/>
+      <w:lvlText w:val=""/>
+      <w:lvlJc w:val="left"/>
+      <w:pPr>
+        <w:tabs>
+          <w:tab w:val="num" w:pos="3600"/>
+        </w:tabs>
+        <w:ind w:left="3600" w:hanging="360"/>
+      </w:pPr>
+      <w:rPr>
+        <w:rFonts w:ascii="Wingdings" w:hAnsi="Wingdings" w:hint="default"/>
+        <w:sz w:val="20"/>
+      </w:rPr>
+    </w:lvl>
+    <w:lvl w:ilvl="5" w:tentative="1">
+      <w:start w:val="1"/>
+      <w:numFmt w:val="bullet"/>
+      <w:lvlText w:val=""/>
+      <w:lvlJc w:val="left"/>
+      <w:pPr>
+        <w:tabs>
+          <w:tab w:val="num" w:pos="4320"/>
+        </w:tabs>
+        <w:ind w:left="4320" w:hanging="360"/>
+      </w:pPr>
+      <w:rPr>
+        <w:rFonts w:ascii="Wingdings" w:hAnsi="Wingdings" w:hint="default"/>
+        <w:sz w:val="20"/>
+      </w:rPr>
+    </w:lvl>
+    <w:lvl w:ilvl="6" w:tentative="1">
+      <w:start w:val="1"/>
+      <w:numFmt w:val="bullet"/>
+      <w:lvlText w:val=""/>
+      <w:lvlJc w:val="left"/>
+      <w:pPr>
+        <w:tabs>
+          <w:tab w:val="num" w:pos="5040"/>
+        </w:tabs>
+        <w:ind w:left="5040" w:hanging="360"/>
+      </w:pPr>
+      <w:rPr>
+        <w:rFonts w:ascii="Wingdings" w:hAnsi="Wingdings" w:hint="default"/>
+        <w:sz w:val="20"/>
+      </w:rPr>
+    </w:lvl>
+    <w:lvl w:ilvl="7" w:tentative="1">
+      <w:start w:val="1"/>
+      <w:numFmt w:val="bullet"/>
+      <w:lvlText w:val=""/>
+      <w:lvlJc w:val="left"/>
+      <w:pPr>
+        <w:tabs>
+          <w:tab w:val="num" w:pos="5760"/>
+        </w:tabs>
+        <w:ind w:left="5760" w:hanging="360"/>
+      </w:pPr>
+      <w:rPr>
+        <w:rFonts w:ascii="Wingdings" w:hAnsi="Wingdings" w:hint="default"/>
+        <w:sz w:val="20"/>
+      </w:rPr>
+    </w:lvl>
+    <w:lvl w:ilvl="8" w:tentative="1">
+      <w:start w:val="1"/>
+      <w:numFmt w:val="bullet"/>
+      <w:lvlText w:val=""/>
+      <w:lvlJc w:val="left"/>
+      <w:pPr>
+        <w:tabs>
+          <w:tab w:val="num" w:pos="6480"/>
+        </w:tabs>
+        <w:ind w:left="6480" w:hanging="360"/>
+      </w:pPr>
+      <w:rPr>
+        <w:rFonts w:ascii="Wingdings" w:hAnsi="Wingdings" w:hint="default"/>
+        <w:sz w:val="20"/>
+      </w:rPr>
+    </w:lvl>
+  </w:abstractNum>
+  <w:abstractNum w:abstractNumId="4" w15:restartNumberingAfterBreak="0">
     <w:nsid w:val="50922595"/>
     <w:multiLevelType w:val="multilevel"/>
     <w:tmpl w:val="E1949F10"/>
@@ -3712,6 +7348,9 @@
     <w:abstractNumId w:val="1"/>
   </w:num>
   <w:num w:numId="5" w16cid:durableId="1820610177">
+    <w:abstractNumId w:val="4"/>
+  </w:num>
+  <w:num w:numId="6" w16cid:durableId="1812088439">
     <w:abstractNumId w:val="3"/>
   </w:num>
 </w:numbering>
@@ -4168,7 +7807,6 @@
     <w:next w:val="Normal"/>
     <w:link w:val="Heading3Char"/>
     <w:uiPriority w:val="9"/>
-    <w:semiHidden/>
     <w:unhideWhenUsed/>
     <w:qFormat/>
     <w:rsid w:val="00C73B91"/>
@@ -4433,7 +8071,6 @@
     <w:basedOn w:val="DefaultParagraphFont"/>
     <w:link w:val="Heading3"/>
     <w:uiPriority w:val="9"/>
-    <w:semiHidden/>
     <w:rsid w:val="00C73B91"/>
     <w:rPr>
       <w:rFonts w:asciiTheme="majorBidi" w:eastAsiaTheme="majorEastAsia" w:hAnsiTheme="majorBidi"/>
@@ -4746,6 +8383,56 @@
       <w:shd w:val="clear" w:color="auto" w:fill="E1DFDD"/>
     </w:rPr>
   </w:style>
+  <w:style w:type="paragraph" w:styleId="Header">
+    <w:name w:val="header"/>
+    <w:basedOn w:val="Normal"/>
+    <w:link w:val="HeaderChar"/>
+    <w:uiPriority w:val="99"/>
+    <w:unhideWhenUsed/>
+    <w:rsid w:val="002E3980"/>
+    <w:pPr>
+      <w:tabs>
+        <w:tab w:val="center" w:pos="4680"/>
+        <w:tab w:val="right" w:pos="9360"/>
+      </w:tabs>
+      <w:spacing w:after="0" w:line="240" w:lineRule="auto"/>
+    </w:pPr>
+  </w:style>
+  <w:style w:type="character" w:customStyle="1" w:styleId="HeaderChar">
+    <w:name w:val="Header Char"/>
+    <w:basedOn w:val="DefaultParagraphFont"/>
+    <w:link w:val="Header"/>
+    <w:uiPriority w:val="99"/>
+    <w:rsid w:val="002E3980"/>
+    <w:rPr>
+      <w:noProof/>
+    </w:rPr>
+  </w:style>
+  <w:style w:type="paragraph" w:styleId="Footer">
+    <w:name w:val="footer"/>
+    <w:basedOn w:val="Normal"/>
+    <w:link w:val="FooterChar"/>
+    <w:uiPriority w:val="99"/>
+    <w:unhideWhenUsed/>
+    <w:rsid w:val="002E3980"/>
+    <w:pPr>
+      <w:tabs>
+        <w:tab w:val="center" w:pos="4680"/>
+        <w:tab w:val="right" w:pos="9360"/>
+      </w:tabs>
+      <w:spacing w:after="0" w:line="240" w:lineRule="auto"/>
+    </w:pPr>
+  </w:style>
+  <w:style w:type="character" w:customStyle="1" w:styleId="FooterChar">
+    <w:name w:val="Footer Char"/>
+    <w:basedOn w:val="DefaultParagraphFont"/>
+    <w:link w:val="Footer"/>
+    <w:uiPriority w:val="99"/>
+    <w:rsid w:val="002E3980"/>
+    <w:rPr>
+      <w:noProof/>
+    </w:rPr>
+  </w:style>
 </w:styles>
 </file>
 
@@ -4917,6 +8604,255 @@
 </inkml:ink>
 </file>
 
+<file path=word/ink/ink15.xml><?xml version="1.0" encoding="utf-8"?>
+<inkml:ink xmlns:inkml="http://www.w3.org/2003/InkML">
+  <inkml:definitions>
+    <inkml:context xml:id="ctx0">
+      <inkml:inkSource xml:id="inkSrc0">
+        <inkml:traceFormat>
+          <inkml:channel name="X" type="integer" min="-2.14748E9" max="2.14748E9" units="cm"/>
+          <inkml:channel name="Y" type="integer" min="-2.14748E9" max="2.14748E9" units="cm"/>
+          <inkml:channel name="F" type="integer" max="32767" units="dev"/>
+        </inkml:traceFormat>
+        <inkml:channelProperties>
+          <inkml:channelProperty channel="X" name="resolution" value="1000" units="1/cm"/>
+          <inkml:channelProperty channel="Y" name="resolution" value="1000" units="1/cm"/>
+          <inkml:channelProperty channel="F" name="resolution" value="0" units="1/dev"/>
+        </inkml:channelProperties>
+      </inkml:inkSource>
+      <inkml:timestamp xml:id="ts0" timeString="2026-07-22T14:45:15.678"/>
+    </inkml:context>
+    <inkml:brush xml:id="br0">
+      <inkml:brushProperty name="width" value="0.025" units="cm"/>
+      <inkml:brushProperty name="height" value="0.025" units="cm"/>
+      <inkml:brushProperty name="color" value="#FFC114"/>
+    </inkml:brush>
+    <inkml:brush xml:id="br1">
+      <inkml:brushProperty name="width" value="0.025" units="cm"/>
+      <inkml:brushProperty name="height" value="0.025" units="cm"/>
+      <inkml:brushProperty name="color" value="#FFC114"/>
+    </inkml:brush>
+  </inkml:definitions>
+  <inkml:trace contextRef="#ctx0" brushRef="#br0">0 1534 24575,'1'-3'0,"-1"0"0,1 0 0,0 1 0,0-1 0,0 0 0,1 1 0,-1-1 0,1 1 0,-1-1 0,1 1 0,0 0 0,0-1 0,0 1 0,0 0 0,3-2 0,36-27 0,-27 23 0,-1 1 0,2 1 0,-1 0 0,1 1 0,-1 0 0,2 1 0,-1 1 0,0 0 0,28 0 0,13 2 0,78 10 0,-44-2 0,-88-7 0,223 7 0,-166-8 0,105-15 0,-7-24 0,-17 3 0,-123 35 0,-1-2 0,0 1 0,0-2 0,0 0 0,-1-1 0,1-1 0,-2 0 0,20-12 0,-30 16 0,0 1 0,1-1 0,-1 1 0,1 0 0,0 1 0,-1-1 0,1 1 0,0 0 0,0 0 0,0 0 0,0 1 0,0 0 0,7 0 0,9 2 0,41 9 0,10 1 0,396-9 0,-233-6 0,248 3 0,-478 1 0,0-1 0,0 1 0,0 0 0,0 0 0,0 1 0,0 0 0,-1-1 0,1 2 0,-1-1 0,1 0 0,-1 1 0,6 5 0,6 5 0,25 26 0,-32-29 0,-3-5-124,-1 1 0,-1 0 0,1 1 0,-1-1 0,0 1 0,-1-1-1,1 1 1,-1 0 0,-1 0 0,3 9 0,-1 2-6702</inkml:trace>
+  <inkml:trace contextRef="#ctx0" brushRef="#br0" timeOffset="2445.53">3680 1523 24575,'2'1'0,"0"0"0,1-1 0,-1 1 0,1-1 0,-1 0 0,1 1 0,-1-1 0,1-1 0,-1 1 0,1 0 0,-1 0 0,0-1 0,1 0 0,-1 1 0,1-1 0,-1 0 0,0 0 0,0 0 0,1 0 0,-1-1 0,0 1 0,0-1 0,0 1 0,0-1 0,-1 0 0,3-2 0,7-7 0,-1 0 0,18-25 0,-23 28 0,14-20 0,-2 0 0,-1-2 0,-1 0 0,-2 0 0,-1-1 0,9-34 0,34-201 0,-36 160 0,-15 87 0,4-38 0,-32 102 0,21-36 0,-20 37 0,22-44 0,-1 0 0,1 1 0,-1-1 0,1 0 0,-1 0 0,0 0 0,0 0 0,0 0 0,0 0 0,0 0 0,0-1 0,-1 1 0,1-1 0,-4 2 0,6-3 0,-1 0 0,1 0 0,-1 0 0,1 0 0,-1 0 0,1 0 0,-1 0 0,1 0 0,-1 0 0,1-1 0,-1 1 0,1 0 0,-1 0 0,1 0 0,0-1 0,-1 1 0,1 0 0,-1-1 0,1 1 0,0 0 0,-1-1 0,1 1 0,0-1 0,0 1 0,-1 0 0,1-1 0,0 1 0,0-1 0,-1 1 0,1-1 0,0 1 0,0-1 0,0 1 0,0-1 0,0 1 0,0-1 0,0 1 0,0-1 0,0 1 0,0-1 0,0 1 0,0-1 0,0 1 0,0-1 0,0 1 0,1-1 0,-1 1 0,0-1 0,6-27 0,-3 18 0,1-1 0,0 1 0,0 0 0,1 0 0,1 0 0,-1 1 0,2 0 0,11-15 0,-17 24 0,0-1 0,0 1 0,0-1 0,0 1 0,0-1 0,0 1 0,0 0 0,0 0 0,0 0 0,1-1 0,-1 1 0,0 0 0,0 0 0,0 0 0,0 1 0,0-1 0,0 0 0,0 0 0,0 1 0,0-1 0,0 0 0,0 1 0,0-1 0,0 1 0,0-1 0,0 1 0,0 0 0,0-1 0,0 1 0,-1 0 0,1 0 0,0-1 0,-1 1 0,1 0 0,0 0 0,0 2 0,26 40 0,-23-37 0,6 15-682,13 34-1,-15-35-6143</inkml:trace>
+  <inkml:trace contextRef="#ctx0" brushRef="#br1" timeOffset="9317.2">204 504 24575,'-1'63'0,"3"66"0,-2-128 4,0 1 1,0-1-1,0 0 0,0 0 0,1 1 0,-1-1 0,0 0 0,1 0 0,-1 1 1,1-1-1,0 0 0,-1 0 0,1 0 0,0 0 0,0 0 0,-1 0 0,1 0 1,0 0-1,0 0 0,0 0 0,0-1 0,0 1 0,0 0 0,0-1 0,1 1 1,-1-1-1,0 1 0,2 0 0,0-1-128,0 1 0,0-1 1,0 0-1,0 0 0,0 0 0,0 0 1,0 0-1,0-1 0,0 1 0,0-1 1,4-1-1,1-2-6702</inkml:trace>
+  <inkml:trace contextRef="#ctx0" brushRef="#br1" timeOffset="9619.12">298 590 24575,'-2'1'0,"-4"1"0,-8 1 0,-1 1 0,-3 0 0,1-2 0,1 0 0,4-1-8191</inkml:trace>
+  <inkml:trace contextRef="#ctx0" brushRef="#br1" timeOffset="10618.77">349 342 24575,'2'5'0,"0"0"0,0 0 0,0 0 0,-1 0 0,0 0 0,0 1 0,0-1 0,0 0 0,-1 1 0,0-1 0,0 0 0,-1 6 0,1 4 0,0 293 0,1-314 0,-1-1 0,2 1 0,-1-1 0,1 1 0,0-1 0,0 1 0,1 0 0,-1 0 0,8-11 0,-9 14 0,1 0 0,0 0 0,0 0 0,1 0 0,-1 0 0,1 0 0,-1 1 0,1-1 0,0 1 0,0 0 0,0 0 0,0 0 0,0 0 0,0 0 0,1 1 0,-1-1 0,1 1 0,-1 0 0,6-1 0,-8 2 0,1 0 0,0 0 0,0 1 0,-1-1 0,1 0 0,0 1 0,0-1 0,-1 1 0,1 0 0,-1-1 0,1 1 0,-1 0 0,1 0 0,-1 0 0,1 0 0,-1 0 0,0 0 0,1 0 0,-1 1 0,0-1 0,0 0 0,0 1 0,0-1 0,0 1 0,0-1 0,0 1 0,-1 0 0,2 2 0,1 6 0,0 0 0,-1 1 0,3 19 0,1 3 0,-6-33 2,0 1 0,0 0 0,0-1 0,0 1 0,0 0 0,0-1 0,0 1-1,0 0 1,0-1 0,1 1 0,-1 0 0,0-1 0,1 1 0,-1-1 0,0 1 0,1-1 0,-1 1-1,1-1 1,-1 1 0,1-1 0,-1 1 0,1-1 0,-1 1 0,1-1 0,-1 0 0,1 1 0,0-1-1,-1 0 1,1 1 0,-1-1 0,1 0 0,0 0 0,-1 0 0,1 0 0,0 0 0,-1 1 0,1-1-1,0 0 1,0-1 0,-1 1 0,1 0 0,0 0 0,-1 0 0,1 0 0,-1 0 0,1-1 0,0 1-1,-1 0 1,1-1 0,0 1 0,-1 0 0,1-1 0,-1 1 0,1-1 0,-1 1 0,1-1 0,-1 1-1,1-1 1,-1 1 0,0-1 0,1 1 0,-1-2 0,5-3-299,-1-1 0,0 0 0,0-1 0,4-8 0,-1-1-6529</inkml:trace>
+  <inkml:trace contextRef="#ctx0" brushRef="#br1" timeOffset="11173.87">578 654 24575,'13'0'0,"-4"0"0,-1 0 0,1 0 0,-1-1 0,1 0 0,16-4 0,-23 5 0,0-1 0,0 0 0,-1 0 0,1 0 0,0 0 0,0-1 0,-1 1 0,1 0 0,0-1 0,-1 1 0,1-1 0,-1 1 0,0-1 0,1 0 0,-1 0 0,0 1 0,0-1 0,0 0 0,-1 0 0,1 0 0,0 0 0,-1 0 0,1 0 0,-1 0 0,0-1 0,1 1 0,-1 0 0,0 0 0,-1-3 0,2 4 0,-1 1 0,0-1 0,0 0 0,0 1 0,0-1 0,0 0 0,0 1 0,0-1 0,0 0 0,0 1 0,0-1 0,-1 0 0,1 0 0,0 1 0,0-1 0,-1 1 0,1-1 0,0 0 0,-1 1 0,1-1 0,0 1 0,-1-1 0,1 0 0,-1 1 0,1-1 0,-1 1 0,1 0 0,-1-1 0,0 1 0,1-1 0,-1 1 0,-1-1 0,1 1 0,-1 1 0,1-1 0,-1 0 0,1 1 0,0-1 0,-1 1 0,1-1 0,-1 1 0,1 0 0,0 0 0,-1 0 0,1-1 0,0 1 0,-1 1 0,-5 5 0,0-1 0,1 1 0,0-1 0,-5 9 0,8-11 0,1 0 0,0 0 0,0 0 0,1 0 0,-1 1 0,1-1 0,0 1 0,0-1 0,0 0 0,1 1 0,0 0 0,-1-1 0,2 1 0,-1-1 0,0 1 0,1-1 0,0 1 0,0-1 0,0 0 0,1 1 0,-1-1 0,1 0 0,0 0 0,0 0 0,1 0 0,-1 0 0,6 5 0,-7-8 0,1 0 0,-1 0 0,1-1 0,-1 1 0,1 0 0,-1-1 0,1 1 0,0-1 0,-1 0 0,1 1 0,0-1 0,-1 0 0,1 0 0,0 0 0,-1 0 0,1-1 0,0 1 0,-1 0 0,1-1 0,-1 1 0,1-1 0,0 1 0,-1-1 0,1 0 0,-1 1 0,1-1 0,-1 0 0,0 0 0,1 0 0,-1-1 0,1 0 0,7-5 0,-1-1 0,0 0 0,9-12 0,-15 18 0,17-22-1365,-2 2-5461</inkml:trace>
+  <inkml:trace contextRef="#ctx0" brushRef="#br1" timeOffset="12031.5">1126 442 24575,'1'0'0,"1"-1"0,0 1 0,-1-1 0,1 0 0,-1 1 0,1-1 0,-1 0 0,0 0 0,1 0 0,-1 0 0,0 0 0,1 0 0,-1 0 0,0 0 0,0-1 0,0 1 0,0 0 0,1-3 0,18-31 0,-15 25 0,2-4 0,1 2 0,-1-2 0,0 1 0,-1-1 0,0 0 0,-1-1 0,4-22 0,-8 37 0,-1-1 0,0 0 0,0 1 0,1-1 0,-1 0 0,0 1 0,0-1 0,0 0 0,0 0 0,0 1 0,0-1 0,0 0 0,0 0 0,0 1 0,0-1 0,0 0 0,-1 1 0,1-1 0,0 0 0,0 1 0,-1-1 0,1 0 0,0 1 0,-1-1 0,1 0 0,-1 1 0,1-1 0,-1 1 0,1-1 0,-1 1 0,1-1 0,-1 1 0,1-1 0,-1 1 0,0 0 0,1-1 0,-1 1 0,0 0 0,1 0 0,-1-1 0,0 1 0,0 0 0,1 0 0,-1 0 0,0 0 0,1 0 0,-1 0 0,0 0 0,0 0 0,1 0 0,-1 0 0,0 0 0,1 1 0,-1-1 0,0 0 0,0 0 0,1 1 0,-1-1 0,1 0 0,-2 1 0,-3 2 0,0-1 0,0 1 0,1 0 0,-1 0 0,1 0 0,-8 7 0,6-2 4,0-1 1,0 1-1,1 0 0,0 0 0,1 1 0,0-1 1,0 1-1,1 0 0,0 0 0,0 0 1,1 1-1,-1 11 0,0 12-113,2 0 1,3 41-1,0-11-985,-2-49-5732</inkml:trace>
+  <inkml:trace contextRef="#ctx0" brushRef="#br1" timeOffset="12444.85">1070 536 24575,'1'0'0,"1"0"0,6-1 0,5-2 0,3-1 0,3 0 0,2-1 0,-1-1 0,-4 1-8191</inkml:trace>
+  <inkml:trace contextRef="#ctx0" brushRef="#br1" timeOffset="13127.86">1276 480 24575,'1'0'0,"0"1"0,-1-1 0,1 0 0,0 1 0,-1-1 0,1 0 0,0 1 0,-1-1 0,1 0 0,0 1 0,-1-1 0,1 1 0,-1 0 0,1-1 0,-1 1 0,1-1 0,-1 1 0,0 0 0,1-1 0,-1 1 0,0 0 0,1-1 0,-1 1 0,0 0 0,0-1 0,1 2 0,4 27 0,-2-14 0,-2-13 0,-1 0 0,1 0 0,0 0 0,0 0 0,0-1 0,0 1 0,0 0 0,0-1 0,1 1 0,-1-1 0,0 1 0,1-1 0,-1 1 0,1-1 0,2 2 0,-3-3 0,0 1 0,1-1 0,-1 0 0,0 1 0,0-1 0,1 0 0,-1 0 0,0 0 0,1 0 0,-1 0 0,0 0 0,1 0 0,-1 0 0,0 0 0,0-1 0,1 1 0,-1 0 0,1-1 0,2-1 0,0-1 0,-1 1 0,1 0 0,-1-1 0,0 0 0,1 0 0,-2 0 0,1 0 0,0 0 0,0 0 0,-1-1 0,4-6 0,-5 8 0,0 0 0,-1 0 0,2 1 0,-1-1 0,0 0 0,0 0 0,1 1 0,-1-1 0,1 1 0,-1-1 0,3-1 0,2 6 0,-2 15 0,-4-16-65,0-1 0,0 1 0,0-1 0,0 1 0,0-1 0,1 0 0,-1 1 0,1-1 0,-1 1 0,1-1 0,-1 1 0,1-1 0,0 0 0,0 0 0,0 1 0,0-1 0,0 0 0,0 0 0,0 0 0,1 1 0,8 4-6761</inkml:trace>
+  <inkml:trace contextRef="#ctx0" brushRef="#br1" timeOffset="13635.22">1488 473 24575,'1'3'0,"1"-1"0,-1 1 0,1-1 0,-1 1 0,0 0 0,0 0 0,0 0 0,-1 0 0,1 0 0,-1 0 0,1 0 0,-1 4 0,5 19 0,-5-26 0,0 1 0,1-1 0,-1 0 0,0 1 0,0-1 0,1 0 0,-1 1 0,0-1 0,1 0 0,-1 1 0,0-1 0,1 0 0,-1 0 0,1 0 0,-1 1 0,0-1 0,1 0 0,-1 0 0,1 0 0,-1 0 0,1 0 0,-1 0 0,0 0 0,1 0 0,-1 0 0,1 0 0,-1 0 0,1 0 0,-1 0 0,1 0 0,-1 0 0,0 0 0,1 0 0,-1 0 0,1-1 0,-1 1 0,0 0 0,1 0 0,-1-1 0,0 1 0,1 0 0,-1-1 0,0 1 0,1 0 0,-1-1 0,0 1 0,0 0 0,1-1 0,-1 0 0,19-22 0,-17 20 0,10-14 0,-8 11 0,-1 0 0,1 1 0,0 0 0,0-1 0,1 2 0,0-1 0,0 0 0,5-3 0,-9 7 0,-1 1 0,1 0 0,-1 0 0,0-1 0,1 1 0,-1 0 0,1 0 0,-1 0 0,1 0 0,-1 0 0,1 0 0,-1 0 0,1 0 0,-1 0 0,1 0 0,-1 0 0,1 0 0,-1 0 0,1 0 0,-1 0 0,1 0 0,-1 0 0,1 1 0,-1-1 0,1 0 0,-1 0 0,1 0 0,-1 1 0,0-1 0,1 0 0,0 1 0,7 18 0,-5 25 0,-3-41 0,0 11 0,-1-8 0,1 0 0,0 0 0,1 1 0,0-1 0,1 8 0,-2-13-23,0-1 1,0 0-1,0 0 0,0 0 0,0 0 1,0 0-1,0 1 0,0-1 0,0 0 1,0 0-1,0 0 0,0 0 0,0 0 1,0 0-1,0 1 0,0-1 0,0 0 1,0 0-1,1 0 0,-1 0 0,0 0 1,0 1-1,0-1 0,0 0 0,0 0 1,0 0-1,0 0 0,0 0 0,0 0 1,1 0-1,-1 0 0,0 0 0,0 1 1,0-1-1,0 0 0,0 0 0,0 0 1,1 0-1,-1 0 0,0 0 0,0 0 1,0 0-1,0 0 0,0 0 0,1 0 1,-1 0-1,0 0 0,0 0 0,0 0 0,0 0 1,0 0-1,1 0 0,-1 0 0,0-1 1,0 1-1,0 0 0,0 0 0,0 0 1,1 0-1,2-4-6803</inkml:trace>
+  <inkml:trace contextRef="#ctx0" brushRef="#br1" timeOffset="14520.47">1842 405 24575,'-5'-1'0,"0"1"0,0 1 0,0-1 0,0 1 0,0 0 0,0 0 0,0 0 0,0 1 0,1-1 0,-1 1 0,0 0 0,-4 4 0,3-2 0,1 1 0,0 0 0,0 0 0,0 1 0,0 0 0,1-1 0,-6 12 0,5-9 0,0 0 0,1 0 0,0 1 0,1 0 0,0-1 0,-3 12 0,6-18 0,-1-1 0,1 1 0,0-1 0,-1 1 0,1-1 0,0 1 0,0 0 0,0-1 0,0 1 0,1-1 0,-1 1 0,0-1 0,0 1 0,1 0 0,-1-1 0,1 0 0,0 1 0,-1-1 0,1 1 0,0-1 0,0 0 0,0 1 0,0-1 0,0 0 0,0 0 0,0 0 0,0 0 0,1 0 0,-1 0 0,0 0 0,1 0 0,-1 0 0,0-1 0,1 1 0,-1 0 0,1-1 0,-1 0 0,1 1 0,0-1 0,-1 0 0,1 0 0,-1 1 0,1-1 0,-1 0 0,4-1 0,-1 1-76,-1-1 1,1 0-1,0 0 0,0 0 0,-1 0 0,1-1 0,0 0 0,-1 1 1,0-1-1,1 0 0,-1-1 0,0 1 0,0 0 0,0-1 1,0 0-1,-1 0 0,4-4 0,9-9-6750</inkml:trace>
+  <inkml:trace contextRef="#ctx0" brushRef="#br1" timeOffset="14914.93">1904 412 24575,'0'2'0,"2"7"0,1 3 0,0 5 0,-1 3 0,-1 1 0,0 1 0,0-2 0,-1-4 0,0-1 0,1-2 0,2 2 0,6-3 0,1-5 0,1-5 0,0-5 0,-1-3 0,-1 0-8191</inkml:trace>
+  <inkml:trace contextRef="#ctx0" brushRef="#br1" timeOffset="15485.24">2010 523 24575,'-2'0'0,"-2"0"0,-1 0 0,-2 0 0,-1 0 0,-1 0 0,0 0 0,-1 0 0,0 0 0,2 0 0,-1 0 0,0 0 0,0 0 0,0 0 0,-1 0 0,2 0-8191</inkml:trace>
+  <inkml:trace contextRef="#ctx0" brushRef="#br1" timeOffset="15928.13">2017 510 24575,'1'0'0,"3"0"0,3 0 0,2 5 0,2 6 0,-2 3 0,0 3 0,-1-1-8191</inkml:trace>
+  <inkml:trace contextRef="#ctx0" brushRef="#br1" timeOffset="16134.88">2085 437 24575,'0'0'-8191</inkml:trace>
+  <inkml:trace contextRef="#ctx0" brushRef="#br1" timeOffset="16817.56">2235 536 24575,'-1'0'0,"0"0"0,0 0 0,1-1 0,-1 1 0,0-1 0,0 1 0,1-1 0,-1 1 0,1-1 0,-1 1 0,0-1 0,1 0 0,-1 1 0,1-1 0,-1 0 0,1 1 0,-1-1 0,1 0 0,0 0 0,-1 1 0,1-1 0,0 0 0,0 0 0,0 0 0,-1 0 0,1 1 0,0-1 0,0 0 0,0 0 0,0 0 0,0 0 0,1 1 0,-1-1 0,0 0 0,1-1 0,7-31 0,-8 31 0,2 0 0,-1 0 0,0 1 0,0-1 0,1 1 0,-1-1 0,0 1 0,1 0 0,0-1 0,-1 1 0,1 0 0,0 0 0,-1 0 0,1 0 0,0 0 0,0 1 0,0-1 0,0 0 0,0 1 0,0 0 0,0-1 0,0 1 0,0 0 0,0 0 0,0 0 0,0 0 0,0 0 0,0 1 0,0-1 0,0 1 0,0-1 0,0 1 0,0 0 0,0-1 0,-1 1 0,1 0 0,0 0 0,2 3 0,0-2 0,-1 0 0,1 0 0,-1 0 0,0 1 0,0 0 0,0 0 0,0 0 0,0 0 0,-1 0 0,1 0 0,-1 1 0,0-1 0,0 1 0,0 0 0,-1-1 0,1 1 0,-1 0 0,2 7 0,-3-7 0,-1-1 0,1 0 0,0 0 0,-1 0 0,0 1 0,0-1 0,0 0 0,0 0 0,0 0 0,-1 0 0,1 0 0,-1-1 0,0 1 0,0 0 0,0-1 0,0 1 0,0-1 0,0 0 0,-1 0 0,-3 3 0,5-4 0,0 0 0,-1-1 0,1 1 0,-1 0 0,1-1 0,-1 1 0,1-1 0,-1 1 0,1-1 0,-1 0 0,1 1 0,-1-1 0,0 0 0,1 0 0,-1 0 0,1 0 0,-1-1 0,0 1 0,1 0 0,-1-1 0,1 1 0,-1-1 0,1 1 0,-1-1 0,1 0 0,-1 1 0,1-1 0,0 0 0,0 0 0,-1 0 0,1 0 0,0 0 0,0-1 0,0 1 0,0 0 0,0-1 0,0 1 0,0 0 0,1-1 0,-1 1 0,-1-3 0,-5-23-1365,5 14-5461</inkml:trace>
+  <inkml:trace contextRef="#ctx0" brushRef="#br1" timeOffset="17655.56">2409 442 24575,'-1'19'0,"1"-13"0,-1-1 0,1 0 0,0 0 0,0 1 0,1-1 0,-1 0 0,4 11 0,-2-21 0,0 0 0,1 0 0,-1 0 0,1 0 0,0 1 0,6-7 0,9 0 0,-18 11 0,1 0 0,-1 0 0,1 0 0,-1 0 0,0 0 0,1 0 0,-1 0 0,1 0 0,-1 0 0,1 0 0,-1 0 0,0 0 0,1 1 0,-1-1 0,1 0 0,-1 0 0,0 1 0,1-1 0,-1 0 0,0 0 0,1 1 0,-1-1 0,0 0 0,1 1 0,-1-1 0,0 1 0,2 4 0,0-1 0,-1 1 0,0 0 0,0 0 0,0-1 0,0 8 0,-1-9 0,0-1 0,0 1 0,0 0 0,1 0 0,-1 0 0,1-1 0,0 1 0,0 0 0,0-1 0,0 1 0,2 2 0,4-1-1365,0-2-5461</inkml:trace>
+  <inkml:trace contextRef="#ctx0" brushRef="#br1" timeOffset="19172.26">534 936 24575,'0'2'0,"0"1"0,0 0 0,0 0 0,0 0 0,1-1 0,-1 1 0,1 0 0,0 0 0,-1-1 0,1 1 0,0-1 0,1 1 0,-1-1 0,0 1 0,1-1 0,1 3 0,-1-4 0,0 0 0,0 0 0,0 0 0,0 0 0,0 0 0,0 0 0,0 0 0,0-1 0,0 1 0,0-1 0,0 1 0,0-1 0,1 0 0,-1 0 0,0 0 0,0 0 0,0-1 0,1 1 0,-1 0 0,0-1 0,3 0 0,-2-1 0,1 1 0,0-1 0,-1 0 0,1 1 0,-1-1 0,0-1 0,1 1 0,3-4 0,-5 3 0,1 1 0,0 0 0,-1 0 0,1 0 0,0 1 0,0-1 0,0 0 0,0 1 0,4-1 0,-6 2 0,0 0 0,0 0 0,0 1 0,0-1 0,0 1 0,-1-1 0,1 1 0,0-1 0,0 1 0,0-1 0,-1 1 0,1-1 0,0 1 0,-1 0 0,1 0 0,-1-1 0,1 1 0,-1 0 0,1 1 0,0-1 0,0 0 0,0 1 0,0-1 0,0 0 0,0 0 0,0 0 0,0 0 0,1 0 0,-1 0 0,0 0 0,3 1 0,-2-2 3,0 1 0,0-1 0,-1 0 0,1 0 0,0 0 0,0 0 0,0-1 0,-1 1 0,1 0 0,0-1 0,0 1 0,-1-1 0,1 1 0,0-1 0,-1 0 0,1 0 0,-1 0 0,1 0 0,-1 0 0,1 0 0,-1 0 0,0-1 0,1 1 0,-1 0 0,0-1 0,0 1 0,0-1 0,0 1 0,0-1 0,0 0 0,-1 1 0,2-4 0,2-5-187,-1-1 0,0 0 0,0 1 1,0-13-1,-2 15-361,1-4-6281</inkml:trace>
+  <inkml:trace contextRef="#ctx0" brushRef="#br1" timeOffset="19918.52">853 942 24575,'8'-1'0,"1"1"0,0-1 0,-1-1 0,1 0 0,-1 0 0,13-6 0,-18 7 0,-1 1 0,0-1 0,1 0 0,-1 0 0,0-1 0,0 1 0,0 0 0,0-1 0,0 1 0,0-1 0,0 0 0,0 1 0,-1-1 0,1 0 0,0 0 0,-1 0 0,0-1 0,0 1 0,1 0 0,-1 0 0,0-1 0,-1 1 0,1 0 0,0-1 0,-1 1 0,1-5 0,-1 6 0,0 0 0,0 0 0,0 1 0,0-1 0,-1 0 0,1 1 0,0-1 0,0 0 0,-1 0 0,1 1 0,0-1 0,-1 0 0,1 1 0,0-1 0,-1 1 0,1-1 0,-1 0 0,1 1 0,-1-1 0,0 1 0,1-1 0,-1 1 0,0 0 0,1-1 0,-1 1 0,0 0 0,1-1 0,-1 1 0,0 0 0,1 0 0,-1-1 0,0 1 0,0 0 0,1 0 0,-1 0 0,0 0 0,0 0 0,1 0 0,-1 0 0,0 1 0,0-1 0,1 0 0,-1 0 0,0 0 0,0 1 0,1-1 0,-1 0 0,0 1 0,1-1 0,-1 1 0,0 0 0,-3 1 0,0 0 0,1 0 0,-1 0 0,1 0 0,0 1 0,0 0 0,-1-1 0,-3 7 0,2-1 0,0 1 0,1 0 0,-5 14 0,7-20 0,1 0 0,0 0 0,1 0 0,-1 0 0,0 0 0,1 0 0,0 0 0,-1 0 0,1 0 0,1 1 0,-1-1 0,0 0 0,1 0 0,-1 0 0,3 4 0,-2-5 0,0-1 0,0 0 0,0 0 0,1 0 0,-1 0 0,0 0 0,1 0 0,-1 0 0,1-1 0,0 1 0,-1 0 0,1-1 0,-1 1 0,1-1 0,2 1 0,30 3 0,-26-3 0,-5-1 8,0 0-1,0 0 1,0 0-1,-1 0 1,1 0-1,0-1 1,0 1-1,0-1 1,0 0-1,0 0 1,0 0-1,-1 0 1,1-1-1,0 1 1,2-2-1,1-2-304,-1 0 0,1 0 0,-1 0 0,8-12 0,-2 3-6529</inkml:trace>
+  <inkml:trace contextRef="#ctx0" brushRef="#br1" timeOffset="20758.31">1537 898 24575,'0'-3'0,"0"0"0,0 0 0,0-1 0,-1 1 0,1 0 0,-1 0 0,0-1 0,0 1 0,0 0 0,0 0 0,-1 0 0,1 0 0,-1 0 0,1 1 0,-1-1 0,0 0 0,0 1 0,0-1 0,-1 1 0,1 0 0,-1 0 0,1 0 0,-1 0 0,0 0 0,-3-2 0,2 3 0,0 0 0,0 0 0,0 0 0,1 0 0,-1 1 0,0-1 0,-1 1 0,1 0 0,0 0 0,0 1 0,0-1 0,0 1 0,1 0 0,-1 0 0,0 0 0,0 0 0,0 1 0,1 0 0,-1 0 0,-5 3 0,4-1 0,1-1 0,-1 1 0,1-1 0,0 1 0,0 0 0,0 1 0,1-1 0,-1 1 0,1-1 0,0 1 0,1 0 0,-1 0 0,1 1 0,0-1 0,0 0 0,1 1 0,-1-1 0,1 1 0,0 6 0,1-8 0,0 1 0,0-1 0,0 0 0,0 0 0,1 0 0,0 1 0,0-1 0,0 0 0,0 0 0,1 0 0,0 0 0,-1-1 0,1 1 0,1 0 0,-1-1 0,1 1 0,-1-1 0,1 0 0,0 0 0,0 0 0,0 0 0,0-1 0,1 1 0,-1-1 0,1 1 0,5 1 0,-6-2 7,0-1-1,0 0 0,-1 0 0,1 0 1,1 0-1,-1 0 0,0-1 1,0 0-1,0 1 0,0-1 1,0 0-1,0 0 0,1-1 0,-1 1 1,0-1-1,0 1 0,0-1 1,3-1-1,0-1-192,-1 0 1,1-1-1,-1 1 0,0-1 1,0 0-1,0 0 1,7-9-1,-2 2-6640</inkml:trace>
+  <inkml:trace contextRef="#ctx0" brushRef="#br1" timeOffset="21518.59">1681 929 24575,'-4'4'0,"1"1"0,-1-1 0,1 1 0,0 0 0,1 1 0,-1-1 0,1 0 0,0 1 0,-2 9 0,4-14 0,0-1 0,0 1 0,0-1 0,1 0 0,-1 1 0,0-1 0,0 0 0,1 1 0,-1-1 0,0 0 0,1 1 0,-1-1 0,0 0 0,1 0 0,-1 1 0,1-1 0,-1 0 0,0 0 0,1 0 0,-1 1 0,1-1 0,-1 0 0,1 0 0,-1 0 0,1 0 0,-1 0 0,0 0 0,1 0 0,-1 0 0,1 0 0,-1 0 0,1 0 0,-1 0 0,0-1 0,1 1 0,-1 0 0,1 0 0,-1 0 0,1 0 0,-1-1 0,0 1 0,1 0 0,-1-1 0,21-9 0,-8-1 0,0-1 0,-13 12 0,1 0 0,-1 1 0,0-1 0,1 0 0,-1 0 0,0 0 0,1 0 0,-1 0 0,0 0 0,1 0 0,-1 0 0,0 1 0,0-1 0,1 0 0,-1 0 0,0 0 0,0 0 0,1 1 0,-1-1 0,0 0 0,0 0 0,1 1 0,-1-1 0,0 0 0,0 1 0,0-1 0,0 0 0,0 0 0,1 1 0,-1-1 0,0 0 0,0 1 0,0-1 0,0 0 0,0 1 0,0-1 0,0 0 0,0 1 0,0-1 0,0 0 0,0 1 0,0-1 0,-1 0 0,1 1 0,0-1 0,0 1-29,0 0 0,0 0 0,1 0 0,-1 0 0,0 0 0,0 0 0,1-1 0,-1 1 0,0 0 0,1 0 0,-1 0 0,1-1 0,-1 1 0,1 0 0,-1 0-1,1-1 1,0 1 0,-1 0 0,1-1 0,0 1 0,0-1 0,-1 1 0,1-1 0,0 1 0,0-1 0,0 0 0,0 1 0,0-1 0,-1 0 0,1 0 0,0 0 0,0 0 0,0 1 0,0-1 0,0 0 0,0 0-1,0-1 1,0 1 0,0 0 0,-1 0 0,1 0 0,0-1 0,0 1 0,0 0 0,0-1 0,1 0 0,6-3-6797</inkml:trace>
+  <inkml:trace contextRef="#ctx0" brushRef="#br1" timeOffset="22106">1818 799 24575,'0'1'0,"0"2"0,0 5 0,0 3 0,2 5 0,1 5 0,-1 1 0,1 1 0,-2-1 0,0-2 0,0-3 0,0-5 0,0-4-8191</inkml:trace>
+  <inkml:trace contextRef="#ctx0" brushRef="#br1" timeOffset="22597.64">1916 747 24575,'13'190'0,"-13"-185"-119,0 16 370,0-21-296,0 1 0,0-1-1,0 1 1,0-1-1,0 1 1,0-1 0,0 1-1,0-1 1,0 0 0,1 1-1,-1-1 1,0 1-1,0-1 1,0 1 0,1-1-1,-1 0 1,0 1 0,0-1-1,1 0 1,-1 1-1,0-1 1,1 0 0,-1 1-1,0-1 1,1 0 0,-1 0-1,1 1 1,-1-1-1,0 0 1,1 0 0,-1 0-1,1 1 1</inkml:trace>
+  <inkml:trace contextRef="#ctx0" brushRef="#br1" timeOffset="22946.9">2035 862 24575,'0'2'0,"0"2"0,0 2 0,0 4 0,0 0 0,0 1 0,0-1 0,0 0 0,0 1 0,0-2 0,0 0 0,0-3-8191</inkml:trace>
+  <inkml:trace contextRef="#ctx0" brushRef="#br1" timeOffset="23200.8">2035 778 24575,'1'-2'0</inkml:trace>
+  <inkml:trace contextRef="#ctx0" brushRef="#br1" timeOffset="24062.1">2134 906 24575,'0'12'0,"-1"-8"0,1-1 0,0 1 0,0 0 0,0-1 0,1 1 0,-1-1 0,1 1 0,1 3 0,-2-7 0,0 1 0,1-1 0,-1 0 0,0 0 0,1 0 0,-1 1 0,0-1 0,1 0 0,-1 0 0,0 0 0,1 0 0,-1 0 0,0 0 0,1 0 0,-1 0 0,1 0 0,-1 0 0,0 0 0,1 0 0,-1 0 0,0 0 0,1 0 0,-1 0 0,1 0 0,-1 0 0,0 0 0,1-1 0,-1 1 0,0 0 0,1 0 0,-1 0 0,0-1 0,0 1 0,1 0 0,-1 0 0,0-1 0,1 1 0,-1 0 0,0-1 0,0 1 0,0 0 0,1-1 0,-1 1 0,0-1 0,13-15 0,-2-2 0,-10 14 0,1 0 0,0 1 0,0-1 0,0 1 0,0-1 0,1 1 0,-1 0 0,1 0 0,0 0 0,0 0 0,0 0 0,0 0 0,1 1 0,-1 0 0,6-3 0,-8 5 0,-1 0 0,1 0 0,0 0 0,-1 1 0,1-1 0,0 0 0,-1 0 0,1 1 0,-1-1 0,1 0 0,0 1 0,-1-1 0,1 1 0,-1-1 0,1 0 0,-1 1 0,1 0 0,-1-1 0,0 1 0,1-1 0,-1 1 0,0-1 0,1 1 0,-1 0 0,0-1 0,0 1 0,1 0 0,-1-1 0,0 1 0,0 0 0,0-1 0,0 1 0,0 0 0,0-1 0,0 1 0,0 0 0,0 0 0,-1 34 0,1-29 0,3 20-1365,-1-20-5461</inkml:trace>
+  <inkml:trace contextRef="#ctx0" brushRef="#br1" timeOffset="25566.63">3542 213 24575,'0'1'0,"2"3"0,1 3 0,0 3 0,-1 1 0,0 3 0,-1 2 0,-1-1 0,0 2 0,0-2 0,0-2 0,0-1 0,0 1 0,0-1 0,1-5 0,2-12 0,1-5-8191</inkml:trace>
+  <inkml:trace contextRef="#ctx0" brushRef="#br1" timeOffset="25948.56">3653 143 24575,'-3'1'0,"-2"1"0,-8 0 0,-5 0 0,-7 3 0,-5 1 0,-4 3 0,3-1 0,3-1 0,1 0 0,3-2 0,5 0 0,1-2 0,4 0-8191</inkml:trace>
+  <inkml:trace contextRef="#ctx0" brushRef="#br1" timeOffset="26631.97">3691 75 24575,'0'285'0,"42"-368"0,-18 47 0,-23 34 0,0 0 0,1 1 0,-1-1 0,0 1 0,1-1 0,0 1 0,-1-1 0,1 1 0,0 0 0,-1 0 0,1 0 0,0 0 0,0 0 0,0 1 0,0-1 0,0 0 0,4 0 0,-5 2 0,0-1 0,0 0 0,0 1 0,0-1 0,-1 1 0,1-1 0,0 1 0,0-1 0,0 1 0,0 0 0,-1 0 0,1-1 0,0 1 0,-1 0 0,1 0 0,-1 0 0,1-1 0,-1 1 0,1 0 0,-1 0 0,0 0 0,1 0 0,-1 1 0,9 29 0,-7-21 0,1 5 0,10 30 0,-13-44 0,1 1 0,-1-1 0,1 1 0,0 0 0,-1-1 0,1 1 0,0-1 0,0 0 0,0 1 0,0-1 0,0 0 0,0 1 0,1-1 0,-1 0 0,0 0 0,1 0 0,-1 0 0,0 0 0,1 0 0,2 0 0,-2-1 0,0 0 0,0-1 0,0 1 0,0 0 0,0-1 0,0 0 0,-1 0 0,1 1 0,0-1 0,0 0 0,0 0 0,-1-1 0,1 1 0,-1 0 0,1 0 0,-1-1 0,3-2 0,25-31 0,-24 29 0,15-21-1365,-2 2-5461</inkml:trace>
+  <inkml:trace contextRef="#ctx0" brushRef="#br1" timeOffset="26948.32">3982 193 24575,'-8'30'0,"7"-29"0,0 1 0,0-1 0,0 1 0,0-1 0,1 1 0,-1 0 0,0-1 0,1 1 0,0 0 0,-1-1 0,1 1 0,0 0 0,0 0 0,0-1 0,0 1 0,0 0 0,0 0 0,0-1 0,1 1 0,-1 0 0,1 0 0,-1-1 0,1 1 0,-1 0 0,1-1 0,0 1 0,0-1 0,0 1 0,0-1 0,0 0 0,0 1 0,3 1 0,2 1 12,0 0 0,0-1 0,0 0 0,0 0 0,1 0 0,-1-1 0,1 0 0,0 0 0,11 1 0,-13-3-111,0 1 0,0-1 0,0 0 0,0 0 0,0 0 0,0-1 0,0 1 0,0-1 0,-1 0 0,1-1 0,0 1 0,0-1 0,-1 0 0,5-3 0,0-1-6727</inkml:trace>
+  <inkml:trace contextRef="#ctx0" brushRef="#br1" timeOffset="28044.01">4363 167 24575,'1'0'0,"0"2"0,1 4 0,-1 4 0,0 2 0,-1 0 0,1 0 0,-1-2 0,0-2-8191</inkml:trace>
+  <inkml:trace contextRef="#ctx0" brushRef="#br1" timeOffset="28266.14">4332 1 24575,'0'0'-8191</inkml:trace>
+  <inkml:trace contextRef="#ctx0" brushRef="#br1" timeOffset="29187.59">4450 143 24575,'-1'16'0,"1"-12"0,-1 0 0,1 1 0,0-1 0,0 0 0,0 0 0,0 0 0,1 0 0,-1 0 0,1 0 0,3 7 0,11-37 0,-11 18 0,1-1 0,0 2 0,0-1 0,10-10 0,-14 17 0,0 0 0,0 0 0,0 0 0,0 0 0,0 0 0,0 1 0,0-1 0,0 0 0,0 1 0,0-1 0,0 1 0,0-1 0,1 1 0,-1-1 0,0 1 0,0 0 0,1 0 0,0 0 0,-1 0 0,0 0 0,0 1 0,0 0 0,0-1 0,0 1 0,0 0 0,0-1 0,0 1 0,0 0 0,-1 0 0,1 0 0,0-1 0,-1 1 0,1 0 0,0 0 0,-1 0 0,1 0 0,-1 1 0,0-1 0,1 0 0,-1 0 0,0 0 0,1 0 0,-1 2 0,10 43-1365,-6-33-5461</inkml:trace>
+  <inkml:trace contextRef="#ctx0" brushRef="#br1" timeOffset="29490.23">4650 124 24575,'1'3'0,"1"2"0,-1 4 0,0 6 0,0 4 0,-1 4 0,1 3 0,1 6 0,1 1 0,-1-3 0,1-3 0,0-4 0,1-6-8191</inkml:trace>
+  <inkml:trace contextRef="#ctx0" brushRef="#br1" timeOffset="30096.32">4682 106 24575,'-1'-5'0,"2"0"0,-1 0 0,0 0 0,1 0 0,0 0 0,0 0 0,3-5 0,-4 10 0,0-1 0,0 0 0,1 1 0,-1-1 0,0 1 0,1-1 0,-1 1 0,0-1 0,1 1 0,-1-1 0,1 1 0,-1 0 0,1-1 0,-1 1 0,1-1 0,-1 1 0,1 0 0,0 0 0,-1-1 0,1 1 0,-1 0 0,1 0 0,0 0 0,0-1 0,1 2 0,-1-1 0,0 0 0,1 1 0,-1-1 0,1 1 0,-1 0 0,0-1 0,0 1 0,1 0 0,-1 0 0,0 0 0,0 0 0,0 0 0,0 0 0,2 2 0,0 2 0,0 0 0,0 0 0,0 1 0,-1-1 0,0 1 0,0 0 0,0-1 0,0 1 0,-1 0 0,0 0 0,-1 0 0,1 0 0,-1 0 0,0 0 0,-1 0 0,1 0 0,-1 0 0,0 0 0,-3 8 0,3-13 3,1 0-1,-1 0 0,0 0 1,1-1-1,-1 1 1,0 0-1,1 0 0,-1-1 1,0 1-1,0 0 1,1-1-1,-1 1 0,0-1 1,0 1-1,0-1 0,0 0 1,0 1-1,0-1 1,0 0-1,0 0 0,0 1 1,0-1-1,0 0 1,0 0-1,-2 0 0,-28-6-401,21 3-629,-1 0-5798</inkml:trace>
+  <inkml:trace contextRef="#ctx0" brushRef="#br1" timeOffset="31141.22">4301 580 24575,'-1'0'0,"1"0"0,-1 0 0,1 0 0,0 0 0,-1 0 0,1 0 0,-1 0 0,1 0 0,-1 0 0,1 1 0,0-1 0,-1 0 0,1 0 0,-1 0 0,1 1 0,0-1 0,-1 0 0,1 1 0,0-1 0,-1 0 0,1 0 0,0 1 0,-1-1 0,1 1 0,0-1 0,0 0 0,-1 1 0,1-1 0,0 1 0,0-1 0,0 1 0,-13 16 0,11-13 0,0 0 0,0 1 0,0-1 0,1 1 0,0-1 0,0 1 0,0-1 0,0 1 0,1 0 0,0 5 0,0-9 0,0-1 0,0 1 0,0 0 0,0 0 0,0-1 0,0 1 0,1 0 0,-1-1 0,0 1 0,1 0 0,-1-1 0,0 1 0,1 0 0,-1-1 0,1 1 0,-1-1 0,0 1 0,1-1 0,0 1 0,-1-1 0,1 1 0,-1-1 0,1 0 0,0 1 0,0 0 0,1-1 0,0 0 0,-1 0 0,1 0 0,0 0 0,0-1 0,-1 1 0,1 0 0,0-1 0,-1 1 0,1-1 0,-1 0 0,1 1 0,-1-1 0,1 0 0,-1 0 0,2-1 0,1-1 0,-1 0 0,0 0 0,0 0 0,0 0 0,0-1 0,-1 1 0,0-1 0,1 0 0,-1 0 0,0 0 0,-1 0 0,2-5 0,11-40 0,-14 46 0,-1 26 0,0 25 0,1-45 0,1-1 0,-1 1 0,0 0 0,1 0 0,0 0 0,0 0 0,0 0 0,0 0 0,0-1 0,0 1 0,1 0 0,1 2 0,-3-5-42,1 1-1,-1-1 0,0 0 1,1 1-1,-1-1 0,0 0 1,1 0-1,-1 1 0,1-1 1,-1 0-1,1 0 0,-1 1 1,0-1-1,1 0 0,-1 0 1,1 0-1,-1 0 0,1 0 1,-1 0-1,1 0 0,-1 0 1,1 0-1,-1 0 0,1 0 1,-1 0-1,1 0 0,-1 0 1,1 0-1,-1 0 0,0-1 1,1 1-1,6-4-6783</inkml:trace>
+  <inkml:trace contextRef="#ctx0" brushRef="#br1" timeOffset="31652.99">4439 586 24575,'0'0'0,"0"-1"0,1 1 0,-1 0 0,1-1 0,-1 1 0,0 0 0,1-1 0,-1 1 0,1 0 0,-1 0 0,1-1 0,-1 1 0,1 0 0,-1 0 0,1 0 0,-1 0 0,1 0 0,0 0 0,-1 0 0,1 0 0,-1 0 0,1 0 0,-1 0 0,1 0 0,-1 0 0,1 0 0,-1 0 0,1 1 0,-1-1 0,1 0 0,-1 0 0,1 1 0,-1-1 0,1 0 0,-1 1 0,1-1 0,-1 0 0,0 1 0,1-1 0,-1 1 0,0-1 0,1 0 0,-1 1 0,0-1 0,1 2 0,15 20 0,-9 5 0,-7-24 0,2-12 0,-2 3 0,2-8 0,1 1 0,0-1 0,1 1 0,6-14 0,-9 23 0,1 0 0,-1 0 0,1 1 0,1-1 0,-1 0 0,0 1 0,1-1 0,0 1 0,-1 0 0,1 0 0,1 0 0,-1 0 0,0 0 0,1 1 0,-1-1 0,1 1 0,4-2 0,4 3-1365,-2 2-5461</inkml:trace>
+  <inkml:trace contextRef="#ctx0" brushRef="#br1" timeOffset="32444.23">4681 485 24575,'-4'1'0,"0"0"0,0 1 0,0-1 0,1 0 0,-1 1 0,1 0 0,-1 0 0,1 0 0,0 0 0,-1 1 0,1-1 0,1 1 0,-1 0 0,0-1 0,0 1 0,1 1 0,0-1 0,0 0 0,0 1 0,0-1 0,0 1 0,1-1 0,-1 1 0,1 0 0,0 0 0,0-1 0,1 1 0,-1 0 0,1 0 0,0 6 0,0-9 0,0-1 0,0 1 0,0-1 0,0 1 0,0-1 0,0 0 0,0 1 0,0-1 0,0 1 0,0-1 0,1 0 0,-1 1 0,0-1 0,0 0 0,1 1 0,-1-1 0,0 0 0,0 1 0,1-1 0,-1 0 0,0 1 0,1-1 0,-1 0 0,0 0 0,1 0 0,-1 1 0,1-1 0,-1 0 0,0 0 0,1 0 0,-1 0 0,1 0 0,-1 0 0,0 1 0,1-1 0,0 0 0,16-10 0,10-20 0,-2-21 0,-24 90 0,0 58 0,0-39 0,-7 60 0,5-111 0,-1 0 0,1-1 0,-1 1 0,-1 0 0,-5 11 0,8-17 0,0 0 0,-1 0 0,1 0 0,0-1 0,-1 1 0,1 0 0,-1 0 0,1-1 0,-1 1 0,1 0 0,-1-1 0,1 1 0,-1 0 0,0-1 0,1 1 0,-1-1 0,0 1 0,0-1 0,1 0 0,-1 1 0,0-1 0,0 0 0,1 1 0,-1-1 0,0 0 0,0 0 0,0 0 0,0 1 0,0-1 0,1 0 0,-1 0 0,0-1 0,0 1 0,0 0 0,0 0 0,0 0 0,1 0 0,-1-1 0,0 1 0,0 0 0,0-1 0,1 1 0,-1-1 0,0 1 0,1-1 0,-1 1 0,0-1 0,1 1 0,-1-1 0,0 0 0,1 1 0,-1-1 0,1 0 0,0 0 0,-1 1 0,1-1 0,-1 0 0,1-1 0,-2-3-105,-1 1 0,2-1 0,-1 0 0,1 0 0,-1 0 0,1 0 0,1 0 0,-1 0 0,1 0 0,0 0 0,0 0 0,1-8 0,-1 5-6721</inkml:trace>
+</inkml:ink>
+</file>
+
+<file path=word/ink/ink16.xml><?xml version="1.0" encoding="utf-8"?>
+<inkml:ink xmlns:inkml="http://www.w3.org/2003/InkML">
+  <inkml:definitions>
+    <inkml:context xml:id="ctx0">
+      <inkml:inkSource xml:id="inkSrc0">
+        <inkml:traceFormat>
+          <inkml:channel name="X" type="integer" min="-2.14748E9" max="2.14748E9" units="cm"/>
+          <inkml:channel name="Y" type="integer" min="-2.14748E9" max="2.14748E9" units="cm"/>
+          <inkml:channel name="F" type="integer" max="32767" units="dev"/>
+        </inkml:traceFormat>
+        <inkml:channelProperties>
+          <inkml:channelProperty channel="X" name="resolution" value="1000" units="1/cm"/>
+          <inkml:channelProperty channel="Y" name="resolution" value="1000" units="1/cm"/>
+          <inkml:channelProperty channel="F" name="resolution" value="0" units="1/dev"/>
+        </inkml:channelProperties>
+      </inkml:inkSource>
+      <inkml:timestamp xml:id="ts0" timeString="2026-07-22T20:14:53.189"/>
+    </inkml:context>
+    <inkml:brush xml:id="br0">
+      <inkml:brushProperty name="width" value="0.025" units="cm"/>
+      <inkml:brushProperty name="height" value="0.025" units="cm"/>
+      <inkml:brushProperty name="color" value="#FFC114"/>
+    </inkml:brush>
+  </inkml:definitions>
+  <inkml:trace contextRef="#ctx0" brushRef="#br0">224 129 24575,'0'1'0,"1"2"0,0 1 0,0 3 0,0 3 0,1 6 0,0 2 0,1 7 0,2 1 0,0-1 0,-1-3 0,-1-5 0,-1-4 0,-1-4-8191</inkml:trace>
+  <inkml:trace contextRef="#ctx0" brushRef="#br0" timeOffset="362.5">309 108 24575,'-2'0'0,"-4"1"0,-4 3 0,-6 1 0,-5 2 0,-5 0 0,-6 2 0,-3-2 0,-3-2 0,2-1 0,5-2 0,6-1 0,6-1 0,7 0-8191</inkml:trace>
+  <inkml:trace contextRef="#ctx0" brushRef="#br0" timeOffset="1249.25">336 78 24575,'1'1'0,"-1"-1"0,1 1 0,0-1 0,0 1 0,0 0 0,0-1 0,-1 1 0,1 0 0,0 0 0,-1 0 0,1-1 0,0 1 0,-1 0 0,1 0 0,-1 0 0,0 0 0,1 0 0,-1 0 0,0 0 0,1 1 0,7 25 0,-8-24 0,18 102 0,-4-11 0,-11-94 0,0-12 0,0 3 0,-1 1 0,1-1 0,8-14 0,-10 22 0,-1 0 0,0 0 0,1 1 0,-1-1 0,1 0 0,-1 0 0,1 1 0,-1-1 0,1 0 0,0 0 0,-1 1 0,1-1 0,0 1 0,-1-1 0,1 1 0,0-1 0,0 1 0,0-1 0,-1 1 0,1 0 0,0-1 0,0 1 0,0 0 0,0 0 0,0 0 0,0 0 0,0 0 0,-1 0 0,1 0 0,0 0 0,0 0 0,0 0 0,0 0 0,0 0 0,0 1 0,0-1 0,-1 0 0,1 1 0,0-1 0,0 1 0,0-1 0,-1 1 0,1-1 0,0 1 0,-1-1 0,1 1 0,0 0 0,18 25 0,-18-23 0,1 0 0,0 0 0,0 0 0,0 0 0,0 0 0,0 0 0,0-1 0,1 1 0,0-1 0,-1 1 0,1-1 0,0 0 0,0 0 0,0 0 0,3 1 0,-4-3 0,-1 0 0,1-1 0,-1 1 0,1 0 0,-1-1 0,1 1 0,-1 0 0,0-1 0,1 0 0,-1 1 0,0-1 0,1 0 0,-1 0 0,0 0 0,0 0 0,0 0 0,0 0 0,0 0 0,0 0 0,0 0 0,1-2 0,20-31 0,-17 26 0,2-4 0,-1 3 0,0 0 0,0 0 0,-1-1 0,0 0 0,-1 0 0,0 0 0,-1-1 0,5-21 0,-8 32 0,0 0 0,0-1 0,0 1 0,0 0 0,0 0 0,1 0 0,-1-1 0,0 1 0,0 0 0,0 0 0,0-1 0,0 1 0,0 0 0,0 0 0,0 0 0,0-1 0,0 1 0,0 0 0,0 0 0,0-1 0,0 1 0,0 0 0,0 0 0,0 0 0,-1-1 0,1 1 0,0 0 0,0 0 0,0 0 0,0-1 0,0 1 0,0 0 0,-1 0 0,1 0 0,0 0 0,0-1 0,0 1 0,0 0 0,-1 0 0,1 0 0,0 0 0,0 0 0,0 0 0,-1 0 0,1-1 0,0 1 0,0 0 0,-1 0 0,1 0 0,0 0 0,0 0 0,-1 0 0,1 0 0,0 0 0,0 0 0,0 0 0,-1 0 0,1 1 0,0-1 0,0 0 0,0 0 0,-1 0 0,1 0 0,0 0 0,0 0 0,-1 1 0,-8 12 0,5-1 0,1-1 0,1 1 0,0 0 0,0 0 0,1 0 0,1 0 0,1 20 0,-1-32 0,0 1 0,0 0 0,0-1 0,1 1 0,-1-1 0,0 1 0,0-1 0,1 1 0,-1-1 0,0 1 0,1-1 0,-1 1 0,0-1 0,1 1 0,-1-1 0,1 1 0,-1-1 0,1 0 0,-1 1 0,1-1 0,-1 0 0,1 1 0,-1-1 0,1 0 0,-1 0 0,1 0 0,0 1 0,-1-1 0,1 0 0,-1 0 0,1 0 0,0 0 0,-1 0 0,1 0 0,-1 0 0,1 0 0,0 0 0,-1-1 0,1 1 0,-1 0 0,1 0 0,-1 0 0,1-1 0,0 1 0,-1 0 0,1-1 0,-1 1 0,1 0 0,-1-1 0,0 1 0,1-1 0,31-23 0,-28 20 0,12-10-1365,-1 1-5461</inkml:trace>
+  <inkml:trace contextRef="#ctx0" brushRef="#br0" timeOffset="1896.75">1000 78 24575,'-1'53'0,"-1"-35"0,1 0 0,1 0 0,1 1 0,0-1 0,2 0 0,6 29 0,-8-46 0,-1 1 0,1-1 0,-1 0 0,1 0 0,-1 1 0,1-1 0,0 0 0,0 0 0,-1 0 0,1 0 0,0 0 0,0 0 0,0 0 0,2 1 0,-2-2 0,-1 0 0,1 1 0,0-1 0,-1 0 0,1 0 0,-1 0 0,1 0 0,0 0 0,-1 0 0,1 0 0,0 0 0,-1 0 0,1 0 0,0 0 0,-1 0 0,1 0 0,-1-1 0,1 1 0,0 0 0,-1 0 0,1-1 0,0 1 0,1-2 0,-1 1 0,1-1 0,0 1 0,-1-1 0,1 0 0,-1 0 0,0 0 0,0 1 0,0-1 0,1 0 0,-2-1 0,1 1 0,0 0 0,0 0 0,0-4 0,8-65 88,3-18-1541,-11 83-5373</inkml:trace>
+  <inkml:trace contextRef="#ctx0" brushRef="#br0" timeOffset="2212.66">1174 70 24575,'2'1'0,"2"2"0,1 2 0,1 5 0,1 5 0,2 4 0,-1 4 0,-1-1 0,-1-2 0,-3-3 0,0-4 0,-5-10 0</inkml:trace>
+  <inkml:trace contextRef="#ctx0" brushRef="#br0" timeOffset="3193.8">1208 88 24575,'0'-2'0,"0"1"0,0 0 0,0-1 0,0 1 0,0 0 0,1-1 0,-1 1 0,1 0 0,-1 0 0,1-1 0,-1 1 0,1 0 0,0 0 0,-1 0 0,1 0 0,0 0 0,0 0 0,0 0 0,0 0 0,0 0 0,0 0 0,2-1 0,0 0 0,0 1 0,0 0 0,0 0 0,0 0 0,0 0 0,0 0 0,0 1 0,1 0 0,5-1 0,-5 1 0,1 0 0,-1 0 0,1 1 0,0-1 0,-1 1 0,1 0 0,-1 1 0,0-1 0,1 1 0,-1 0 0,0 0 0,0 0 0,0 0 0,5 4 0,-7-3 0,0-1 0,0 1 0,0-1 0,-1 1 0,1 0 0,-1 0 0,1-1 0,-1 1 0,0 0 0,1 6 0,-1-8 0,-1 0 0,0 0 0,0 0 0,0 0 0,0 0 0,-1 0 0,1-1 0,0 1 0,0 0 0,0 0 0,-1 0 0,1 0 0,0-1 0,-1 1 0,1 0 0,-1 0 0,1-1 0,-1 1 0,1 0 0,-1-1 0,1 1 0,-1 0 0,0-1 0,1 1 0,-1-1 0,0 1 0,0-1 0,1 1 0,-1-1 0,0 0 0,0 1 0,0-1 0,0 0 0,1 0 0,-1 0 0,0 1 0,0-1 0,0 0 0,0 0 0,0 0 0,0 0 0,1 0 0,-3-1 0,-14 1 0,-19 1 0,63 22 0,-23-17 0,1 0 0,-1 0 0,0 0 0,6 13 0,12 18 0,-21-35 0,0 0 0,1 0 0,-1-1 0,1 1 0,-1 0 0,1-1 0,0 0 0,-1 1 0,1-1 0,0 0 0,0 0 0,0 0 0,0 0 0,3 1 0,-3-2-97,-1 0-1,1 0 1,-1 0-1,1 0 1,-1 0-1,1 0 1,-1 0-1,1-1 1,-1 1-1,1 0 1,-1-1-1,0 1 0,3-2 1,6-4-6729</inkml:trace>
+  <inkml:trace contextRef="#ctx0" brushRef="#br0" timeOffset="3605.63">1453 95 24575,'0'23'0,"1"0"0,1-1 0,0 1 0,2-1 0,8 26 0,-12-47 0,1 0 0,-1 0 0,1 0 0,0 0 0,-1 0 0,1 0 0,0-1 0,0 1 0,0 0 0,0-1 0,0 1 0,0 0 0,0-1 0,0 1 0,0-1 0,0 0 0,0 1 0,0-1 0,0 0 0,0 1 0,0-1 0,0 0 0,1 0 0,-1 0 0,0 0 0,0 0 0,0 0 0,0-1 0,0 1 0,0 0 0,0 0 0,1-1 0,-1 1 0,1-1 0,44-19 0,-36 15 0,4-1-98,-8 2-83,0 1 0,0 1 0,0-1 0,1 1 0,-1 0 0,12-2 0,-13 4-6645</inkml:trace>
+  <inkml:trace contextRef="#ctx0" brushRef="#br0" timeOffset="4333.71">1926 89 24575,'23'-13'0,"21"-14"0,-42 26 0,-1 0 0,1 0 0,-1-1 0,1 1 0,-1 0 0,0-1 0,0 1 0,0-1 0,0 1 0,0-1 0,0 0 0,0 1 0,0-1 0,-1 0 0,1 0 0,-1 1 0,1-1 0,-1 0 0,0 0 0,1 0 0,-1-3 0,-1 4 0,1 0 0,0 1 0,-1-1 0,1 1 0,0-1 0,-1 1 0,1-1 0,-1 0 0,1 1 0,-1 0 0,1-1 0,-1 1 0,0-1 0,1 1 0,-1 0 0,1-1 0,-1 1 0,0 0 0,1-1 0,-1 1 0,0 0 0,1 0 0,-1 0 0,0 0 0,0 0 0,1 0 0,-1 0 0,0 0 0,1 0 0,-1 0 0,0 0 0,1 0 0,-1 0 0,0 1 0,1-1 0,-1 0 0,0 0 0,1 1 0,-1-1 0,0 0 0,0 2 0,-29 13 0,26-11 0,1 0 0,-1 1 0,0 0 0,1-1 0,0 1 0,0 0 0,1 0 0,-1 1 0,1-1 0,0 1 0,0-1 0,1 1 0,0-1 0,0 1 0,0 0 0,1 0 0,0-1 0,0 10 0,1 9 0,2-1 0,0 0 0,8 28 0,-11-48-85,11 32 301,-11-33-276,0-1 0,1 0 0,-1 0 1,0 0-1,1 0 0,-1 0 0,1 0 0,-1 0 0,1 0 1,0 0-1,-1 0 0,1 0 0,0 0 0,0 0 0,-1 0 1,1-1-1,0 1 0,0 0 0,0 0 0,0-1 0,0 1 0,0-1 1,0 1-1,2 0 0</inkml:trace>
+  <inkml:trace contextRef="#ctx0" brushRef="#br0" timeOffset="4588.26">2012 153 24575,'-2'1'0,"-5"2"0,-3 0 0,0 2 0,-2 0 0,-1 0 0,1-2 0,-1 0 0,3-1 0,0-1 0,3-1-8191</inkml:trace>
+  <inkml:trace contextRef="#ctx0" brushRef="#br0" timeOffset="5110.97">2012 184 24575,'6'0'0,"0"0"0,1 1 0,-1-1 0,0 1 0,0 1 0,0-1 0,0 1 0,0 0 0,0 0 0,0 1 0,-1-1 0,1 1 0,-1 1 0,0-1 0,0 1 0,0 0 0,5 5 0,-10-9 0,1 1 0,-1-1 0,0 0 0,0 0 0,0 0 0,0 0 0,1 1 0,-1-1 0,0 0 0,0 0 0,0 0 0,1 0 0,-1 0 0,0 0 0,0 0 0,0 0 0,1 1 0,-1-1 0,0 0 0,0 0 0,1 0 0,-1 0 0,0 0 0,0 0 0,1 0 0,-1-1 0,0 1 0,0 0 0,1 0 0,-1 0 0,0 0 0,0 0 0,0 0 0,1 0 0,-1 0 0,0-1 0,7-10 0,3-21 0,-7 23 0,-3 7-35,15-31 195,-15 32-222,1 0-1,0 0 1,0-1 0,0 1 0,0 0 0,0 0 0,0 1 0,0-1 0,0 0 0,0 0 0,0 0 0,0 1 0,1-1 0,-1 1 0,0-1 0,0 1-1,1-1 1,-1 1 0,0 0 0,1-1 0,-1 1 0,0 0 0,3 0 0,4 1-6764</inkml:trace>
+  <inkml:trace contextRef="#ctx0" brushRef="#br0" timeOffset="5681.72">2256 176 24575,'2'-3'0,"0"1"0,0-1 0,0 1 0,-1-1 0,1 1 0,-1-1 0,0 0 0,0 0 0,0 0 0,1-3 0,4-10 0,-6 15 0,1 0 0,-1 0 0,1 0 0,0 0 0,-1 0 0,1 0 0,0 0 0,-1 0 0,1 0 0,0 0 0,0 1 0,0-1 0,0 0 0,0 0 0,0 1 0,0-1 0,0 1 0,0-1 0,0 1 0,0-1 0,0 1 0,0 0 0,0-1 0,1 1 0,1 0 0,-2 0 0,1 1 0,0-1 0,-1 1 0,1 0 0,-1-1 0,1 1 0,-1 0 0,1 0 0,-1 0 0,0 0 0,1 0 0,-1 0 0,0 1 0,0-1 0,2 2 0,0 2 0,0 0 0,0-1 0,0 1 0,0 0 0,-1 0 0,0 1 0,0-1 0,-1 0 0,1 1 0,0 6 0,-2-10-23,0-1-1,0 1 1,-1 0-1,1 0 1,-1 0-1,1-1 0,-1 1 1,1 0-1,-1 0 1,0-1-1,0 1 1,0-1-1,0 1 1,0-1-1,0 1 1,0-1-1,-1 0 1,1 1-1,0-1 0,-1 0 1,1 0-1,-1 0 1,1 0-1,-1 0 1,0 0-1,1-1 1,-1 1-1,0 0 1,0-1-1,1 1 1,-1-1-1,0 0 0,0 0 1,0 1-1,1-1 1,-1 0-1,0-1 1,0 1-1,0 0 1,0 0-1,1-1 1,-1 1-1,0-1 0,0 0 1,1 1-1,-1-1 1,1 0-1,-1 0 1,0 0-1,1 0 1,0 0-1,-1-1 1,1 1-1,0 0 1,-1-1-1,1 1 0,-1-3 1,-2-2-6803</inkml:trace>
+  <inkml:trace contextRef="#ctx0" brushRef="#br0" timeOffset="6775.53">2410 109 24575,'2'1'0,"0"1"0,0-1 0,0 1 0,0-1 0,-1 1 0,1 0 0,0 0 0,-1 0 0,0 0 0,1 0 0,-1 0 0,0 0 0,0 0 0,0 1 0,0-1 0,0 0 0,-1 1 0,1-1 0,0 4 0,-1-4 0,0-2 0,1-7 0,0-1 0,1 1 0,-1 0 0,1 0 0,1 0 0,-1 0 0,1 1 0,0-1 0,1 1 0,0-1 0,7-8 0,-11 14 0,1 1 0,-1 0 0,0-1 0,1 1 0,-1 0 0,1-1 0,-1 1 0,0 0 0,1 0 0,-1-1 0,1 1 0,-1 0 0,1 0 0,-1 0 0,1 0 0,-1 0 0,0 0 0,1 0 0,-1 0 0,1 0 0,-1 0 0,1 0 0,-1 0 0,1 0 0,-1 0 0,1 0 0,-1 0 0,1 0 0,-1 1 0,0-1 0,1 0 0,9 15 0,1 28 0,-10-37 0,-1-1 0,1-1 0,-1 0 0,1 0 0,0-1 0,-1 1 0,2 0 0,-1-1 0,0 1 0,1-1 0,-1 0 0,4 5 0,1-34 0,-5 14 0,5-32 0,-6 42 0,0 0 0,1 0 0,-1 0 0,1 0 0,0 0 0,-1 0 0,1 0 0,0 0 0,0 0 0,0 1 0,0-1 0,1 0 0,-1 1 0,0-1 0,3-1 0,-3 3 0,0 0 0,0 0 0,-1 0 0,1 0 0,0 0 0,0 1 0,0-1 0,0 0 0,0 1 0,0-1 0,-1 0 0,1 1 0,0-1 0,0 1 0,0-1 0,-1 1 0,1 0 0,0-1 0,-1 1 0,1 0 0,-1-1 0,1 1 0,-1 0 0,1 0 0,-1 0 0,1-1 0,-1 1 0,0 0 0,1 0 0,-1 0 0,0 1 0,12 31 0,-4 37-1365,-7-64-5461</inkml:trace>
+  <inkml:trace contextRef="#ctx0" brushRef="#br0" timeOffset="7622.49">1351 763 24575,'-1'-1'0,"0"0"0,0 0 0,0 0 0,0 0 0,0 0 0,1 0 0,-1 0 0,0 0 0,1-1 0,-1 1 0,1 0 0,-1 0 0,1-1 0,0 1 0,0 0 0,-1-1 0,1-1 0,-1-30 0,0 25 0,1-12 0,-2-12 0,1 0 0,6-46 0,-5 77 0,0 1 0,0-1 0,0 0 0,0 1 0,0-1 0,0 0 0,0 1 0,0-1 0,1 1 0,-1-1 0,0 1 0,0-1 0,0 0 0,1 1 0,-1-1 0,0 1 0,1-1 0,-1 1 0,0-1 0,1 1 0,-1 0 0,1-1 0,-1 1 0,1-1 0,-1 1 0,1 0 0,-1-1 0,1 1 0,-1 0 0,1 0 0,-1-1 0,2 1 0,0 0 0,-1 1 0,0-1 0,0 1 0,1-1 0,-1 1 0,0 0 0,0-1 0,1 1 0,-1 0 0,0 0 0,0 0 0,0 0 0,1 2 0,31 44 0,-30-43 0,13 22-341,0 2 0,-1 0-1,19 54 1,-32-74-6485</inkml:trace>
+  <inkml:trace contextRef="#ctx0" brushRef="#br0" timeOffset="7914.98">1439 689 24575,'0'0'0,"-3"0"0,0 0 0,-3 0 0,-2 0 0,-2 0 0,-1 0 0,1 0 0,1 0 0,1 0 0,0 0 0,2 0 0,1 0-8191</inkml:trace>
+  <inkml:trace contextRef="#ctx0" brushRef="#br0" timeOffset="8310.36">1465 486 24575,'0'1'0,"0"2"0,0 1 0,1 3 0,1 4 0,2 2 0,2 3 0,1 2 0,0 2 0,0 2 0,1 1 0,1-1 0,-2-3 0,0-4 0,-2-4 0,-2-4-8191</inkml:trace>
+  <inkml:trace contextRef="#ctx0" brushRef="#br0" timeOffset="9053.1">1719 592 24575,'-5'0'0,"-1"0"0,1 1 0,0-1 0,0 1 0,0 1 0,0-1 0,0 1 0,0-1 0,0 2 0,0-1 0,1 0 0,-1 1 0,1 0 0,0 0 0,0 0 0,0 1 0,-5 4 0,7-5 0,0-1 0,0 1 0,0 0 0,1-1 0,-1 1 0,1 0 0,0 0 0,0 0 0,0 0 0,0 0 0,0 0 0,1 1 0,-1-1 0,1 0 0,0 0 0,0 0 0,0 1 0,0-1 0,1 0 0,-1 0 0,1 0 0,0 0 0,0 0 0,0 0 0,0 0 0,1 0 0,-1 0 0,1 0 0,2 3 0,-2-3 5,-1-1 0,0 0 0,1 0 0,0 0 0,-1 0 0,1 0 0,0 0 0,0 0 0,0-1 0,0 1 0,0-1 0,1 1 0,-1-1 0,0 0 0,1 0 0,-1 0 0,1 0 0,-1-1 0,1 1 0,-1 0 0,1-1 0,0 0 0,4 0 0,-3 0-98,0-1 0,-1 0 1,1 0-1,0-1 0,0 1 0,-1-1 0,1 0 0,-1 0 1,1 0-1,-1 0 0,0-1 0,0 1 0,0-1 1,0 0-1,3-3 0,0-1-6733</inkml:trace>
+  <inkml:trace contextRef="#ctx0" brushRef="#br0" timeOffset="9847.99">1778 451 24575,'1'0'0,"0"1"0,0-1 0,0 0 0,0 1 0,0 0 0,0-1 0,-1 1 0,1-1 0,0 1 0,0 0 0,-1 0 0,1-1 0,0 1 0,-1 0 0,1 0 0,-1 0 0,1 0 0,-1 0 0,1 0 0,-1 0 0,1 0 0,-1 1 0,8 25 0,-7-25 0,35 205 0,-36-210 0,1-1 0,0 0 0,0 0 0,0 1 0,1-1 0,-1 1 0,1-1 0,2-3 0,-3 4 0,1 1 0,-1 0 0,0 0 0,1 0 0,-1-1 0,1 2 0,-1-1 0,1 0 0,0 0 0,0 0 0,0 1 0,0-1 0,0 1 0,0 0 0,0-1 0,5 0 0,-6 1 0,1 1 0,-1 0 0,0 0 0,1 0 0,-1 0 0,0 1 0,0-1 0,1 0 0,-1 0 0,0 1 0,0-1 0,1 1 0,-1-1 0,0 1 0,0 0 0,0-1 0,0 1 0,0 0 0,0 0 0,0 0 0,1 1 0,13 26 0,-14-26 0,0 1 0,0 0 0,0-1 0,0 1 0,1-1 0,-1 0 0,1 1 0,-1-1 0,1 0 0,0 0 0,0 0 0,4 3 0,-2-4-1365,1-2-5461</inkml:trace>
+  <inkml:trace contextRef="#ctx0" brushRef="#br0" timeOffset="10577.67">2029 675 24575,'0'-5'0,"1"0"0,0 0 0,1-1 0,-1 1 0,1 0 0,5-8 0,3-16 0,-8 25 0,-2-1 0,1 1 0,0-1 0,-1 0 0,0 1 0,0-1 0,0 0 0,-2-8 0,2 12 0,-1 0 0,1 1 0,0-1 0,0 0 0,-1 1 0,1-1 0,0 0 0,-1 1 0,1-1 0,0 1 0,-1-1 0,1 0 0,-1 1 0,1-1 0,-1 1 0,1 0 0,-1-1 0,0 1 0,1-1 0,-1 1 0,0 0 0,1-1 0,-1 1 0,0 0 0,-1 0 0,0 0 0,1 0 0,-1 0 0,1 1 0,-1-1 0,1 1 0,-1-1 0,1 1 0,-1-1 0,1 1 0,-1 0 0,1 0 0,0-1 0,0 1 0,-1 0 0,0 2 0,-1 0 0,1 0 0,0 0 0,0 0 0,0 1 0,0-1 0,1 1 0,-1-1 0,1 1 0,0 0 0,0-1 0,0 1 0,0 0 0,0 5 0,0-3 0,1-1 0,0 1 0,-1 0 0,2 0 0,-1-1 0,1 1 0,0 0 0,2 8 0,-2-12 4,0 1 0,0-1 0,0 0 0,1 0 0,-1 1 0,1-1 0,0 0 0,-1 0 0,1 0 0,0-1 0,0 1 0,0 0 0,0-1 0,1 1 0,-1-1 0,0 0 0,1 0 0,-1 0 0,1 0 0,-1 0 0,1 0 0,-1-1 0,1 1 0,-1-1 0,1 0 0,0 0 0,-1 0 0,1 0 0,3-1 0,-2 1-82,0-1 0,0 0 0,0 0-1,0 0 1,-1-1 0,1 1 0,0-1 0,-1 0 0,1 0-1,-1 0 1,0-1 0,0 1 0,0-1 0,0 1 0,0-1-1,0 0 1,-1 0 0,4-6 0,-1 0-6748</inkml:trace>
+  <inkml:trace contextRef="#ctx0" brushRef="#br0" timeOffset="11559.05">2172 548 24575,'0'0'0,"0"0"0,0 0 0,1 0 0,-1-1 0,0 1 0,0 0 0,0 0 0,1 0 0,-1 0 0,0 0 0,0 0 0,1 0 0,-1 0 0,0 0 0,0 0 0,0 0 0,1 0 0,-1 0 0,0 0 0,0 0 0,1 0 0,-1 0 0,0 0 0,0 0 0,1 0 0,-1 0 0,0 0 0,0 0 0,0 0 0,1 1 0,-1-1 0,0 0 0,0 0 0,0 0 0,1 0 0,-1 0 0,0 1 0,9 11 0,4 18 0,-13-27 0,4 8 0,5 7 0,-3-19 0,1-13 0,-3 6 0,-2 2 0,0 1 0,0-1 0,1 1 0,0-1 0,1 1 0,3-5 0,-6 9 0,0 1 0,-1-1 0,1 0 0,0 1 0,0-1 0,0 1 0,0-1 0,0 1 0,0-1 0,0 1 0,0 0 0,0-1 0,0 1 0,0 0 0,0 0 0,0 0 0,0 0 0,0 0 0,0 0 0,0 0 0,0 0 0,0 0 0,0 0 0,0 0 0,0 1 0,0-1 0,0 0 0,0 1 0,0-1 0,0 1 0,0-1 0,-1 1 0,1 0 0,0-1 0,0 1 0,0 0 0,-1 0 0,1-1 0,0 1 0,-1 0 0,1 0 0,-1 0 0,2 1 0,12 28 0,-10-20 0,16-65 0,-16 41 0,-3 7 0,1 1 0,0-1 0,0 1 0,0 0 0,7-12 0,-8 18 0,-1 0 0,1 0 0,-1-1 0,0 1 0,1 0 0,-1 0 0,1 0 0,-1 0 0,1 0 0,-1 0 0,1-1 0,-1 1 0,1 0 0,-1 0 0,0 0 0,1 0 0,-1 1 0,1-1 0,-1 0 0,1 0 0,-1 0 0,1 0 0,-1 0 0,1 1 0,-1-1 0,0 0 0,1 0 0,-1 1 0,1-1 0,-1 0 0,0 1 0,1-1 0,-1 0 0,0 1 0,0-1 0,1 0 0,-1 1 0,0-1 0,0 1 0,1-1 0,-1 0 0,0 1 0,0-1 0,0 1 0,0 0 0,14 24 0,-13-23 0,12 32-1365,-10-26-5461</inkml:trace>
+  <inkml:trace contextRef="#ctx0" brushRef="#br0" timeOffset="12937.49">2439 485 24575,'1'6'0,"0"0"0,1 0 0,0 0 0,0 0 0,1 0 0,0 0 0,0-1 0,0 1 0,1-1 0,-1 0 0,9 8 0,-12-13 0,0 1 0,0-1 0,1 0 0,-1 0 0,0 0 0,0 0 0,0 0 0,1 0 0,-1 0 0,0 0 0,0 0 0,0 0 0,1 0 0,-1 0 0,0 0 0,0 0 0,0 0 0,1 0 0,-1 0 0,0 0 0,0 0 0,1 0 0,-1 0 0,0 0 0,0 0 0,0-1 0,0 1 0,1 0 0,-1 0 0,0 0 0,0 0 0,0 0 0,0-1 0,1 1 0,-1 0 0,0 0 0,0 0 0,0 0 0,0-1 0,6-12 0,0-14 0,-5-7 0,-1 17 0,5 37 0,1 10 0,-2 0 0,-1 0 0,-2 0 0,-3 53 0,1-82 3,1 1 1,-1-1-1,1 0 0,-1 1 0,0-1 1,1 0-1,-1 1 0,0-1 0,0 0 1,0 0-1,0 0 0,0 0 0,0 0 1,0 0-1,0 0 0,0 0 0,-1 0 1,1 0-1,0 0 0,0-1 0,-1 1 0,1-1 1,-1 1-1,1-1 0,-1 1 0,1-1 1,0 0-1,-1 0 0,1 0 0,-1 0 1,1 0-1,-1 0 0,1 0 0,-1 0 1,1-1-1,-4 0 0,2 1-96,-1-1 0,1 1 1,-1-1-1,1 0 0,0 0 0,-1-1 0,1 1 0,0-1 1,0 1-1,0-1 0,0 0 0,0 0 0,0-1 1,0 1-1,-2-3 0,2-1-6733</inkml:trace>
+</inkml:ink>
+</file>
+
+<file path=word/ink/ink17.xml><?xml version="1.0" encoding="utf-8"?>
+<inkml:ink xmlns:inkml="http://www.w3.org/2003/InkML">
+  <inkml:definitions>
+    <inkml:context xml:id="ctx0">
+      <inkml:inkSource xml:id="inkSrc0">
+        <inkml:traceFormat>
+          <inkml:channel name="X" type="integer" min="-2.14748E9" max="2.14748E9" units="cm"/>
+          <inkml:channel name="Y" type="integer" min="-2.14748E9" max="2.14748E9" units="cm"/>
+          <inkml:channel name="F" type="integer" max="32767" units="dev"/>
+        </inkml:traceFormat>
+        <inkml:channelProperties>
+          <inkml:channelProperty channel="X" name="resolution" value="1000" units="1/cm"/>
+          <inkml:channelProperty channel="Y" name="resolution" value="1000" units="1/cm"/>
+          <inkml:channelProperty channel="F" name="resolution" value="0" units="1/dev"/>
+        </inkml:channelProperties>
+      </inkml:inkSource>
+      <inkml:timestamp xml:id="ts0" timeString="2026-07-22T20:14:21.239"/>
+    </inkml:context>
+    <inkml:brush xml:id="br0">
+      <inkml:brushProperty name="width" value="0.025" units="cm"/>
+      <inkml:brushProperty name="height" value="0.025" units="cm"/>
+      <inkml:brushProperty name="color" value="#E71224"/>
+    </inkml:brush>
+  </inkml:definitions>
+  <inkml:trace contextRef="#ctx0" brushRef="#br0">71 443 24575,'-1'38'0,"-1"-25"0,2-1 0,0 0 0,0 1 0,1-1 0,0 0 0,1 1 0,4 11 0,-6-23 4,0 0-1,0-1 1,1 1-1,-1 0 0,0 0 1,1-1-1,-1 1 1,0 0-1,1 0 0,-1-1 1,1 1-1,-1 0 1,1-1-1,-1 1 1,1-1-1,0 1 0,-1-1 1,1 1-1,0-1 1,-1 1-1,1-1 1,0 0-1,-1 1 0,1-1 1,0 0-1,0 0 1,0 1-1,-1-1 0,1 0 1,0 0-1,0 0 1,0 0-1,-1 0 1,2 0-1,-1-1-71,0 1 1,0-1-1,0 1 1,0-1-1,0 0 1,0 0-1,0 1 1,0-1-1,0 0 1,0 0-1,0 0 1,-1 0-1,1 0 1,0 0-1,-1 0 1,1 0-1,-1 0 1,1 0-1,-1-1 1,1 1-1,-1-2 1,2-7-6759</inkml:trace>
+  <inkml:trace contextRef="#ctx0" brushRef="#br0" timeOffset="300.27">117 484 24575,'-3'1'0,"-2"0"0,-2 3 0,-2 0 0,0 0 0,-1 1 0,-1-1 0,1 0 0,-1-1 0,-1-1 0,0 0 0,2-2 0,3 1-8191</inkml:trace>
+  <inkml:trace contextRef="#ctx0" brushRef="#br0" timeOffset="1282.84">139 324 24575,'12'42'0,"-3"1"0,-1 0 0,5 87 0,-10-139 0,1 0 0,0 0 0,0 0 0,1 0 0,0 1 0,0-1 0,13-14 0,-13 18 0,1 0 0,0 0 0,-1 1 0,1 0 0,12-6 0,-17 9 0,0 1 0,1-1 0,-1 1 0,0 0 0,0-1 0,1 1 0,-1 0 0,0 0 0,0 0 0,1 0 0,-1 0 0,0 0 0,0 0 0,1 1 0,-1-1 0,0 0 0,0 1 0,1-1 0,-1 1 0,0-1 0,0 1 0,0 0 0,0-1 0,0 1 0,0 0 0,0 0 0,0-1 0,0 1 0,0 0 0,-1 0 0,1 0 0,0 0 0,0 0 0,-1 1 0,1-1 0,-1 0 0,1 0 0,-1 0 0,1 0 0,-1 3 0,17 61 0,-17-64 0,1-1 0,-1 1 0,1 0 0,-1-1 0,1 1 0,0-1 0,-1 1 0,1-1 0,0 1 0,-1-1 0,1 0 0,0 1 0,0-1 0,-1 0 0,1 1 0,0-1 0,0 0 0,0 0 0,-1 0 0,1 0 0,0 0 0,0 0 0,0 0 0,-1 0 0,1 0 0,0 0 0,0 0 0,0-1 0,-1 1 0,1 0 0,0-1 0,0 1 0,-1 0 0,1-1 0,0 1 0,-1-1 0,1 1 0,0-1 0,-1 1 0,1-1 0,0 0 0,2-2 0,0 1 0,0-1 0,0 1 0,0-1 0,0 0 0,-1 0 0,3-5 0,6-29 0,-10 35 0,-1-1 0,0 1 0,0 0 0,0 0 0,0-1 0,0 1 0,0 0 0,0-1 0,-1 1 0,1 0 0,-1 0 0,0 0 0,0 0 0,-1-4 0,2 5 0,-1 1 0,1 0 0,0 0 0,0 0 0,0-1 0,0 1 0,0 0 0,-1 0 0,1 0 0,0 0 0,0-1 0,0 1 0,-1 0 0,1 0 0,0 0 0,0 0 0,-1 0 0,1 0 0,0 0 0,0 0 0,-1-1 0,1 1 0,0 0 0,0 0 0,-1 0 0,1 0 0,0 0 0,0 0 0,-1 0 0,1 1 0,0-1 0,0 0 0,0 0 0,-1 0 0,1 0 0,0 0 0,0 0 0,-1 0 0,1 1 0,-7 10 0,1 14 0,5-23 0,1 1 0,0 0 0,0 0 0,0-1 0,0 1 0,0 0 0,0 0 0,1-1 0,0 1 0,-1 0 0,1-1 0,0 1 0,0 0 0,0-1 0,1 1 0,-1-1 0,3 4 0,-3-6 0,0 1 0,-1-1 0,1 1 0,0 0 0,0-1 0,0 0 0,0 1 0,0-1 0,0 1 0,0-1 0,0 0 0,0 0 0,0 1 0,0-1 0,0 0 0,0 0 0,0 0 0,2-1 0,-1 1 0,1-1 0,-1 0 0,1 1 0,-1-1 0,0 0 0,1-1 0,-1 1 0,0 0 0,0-1 0,3-1 0,20-22-1365,-15 13-5461</inkml:trace>
+  <inkml:trace contextRef="#ctx0" brushRef="#br0" timeOffset="2792.5">713 326 24575,'-2'1'0,"-1"0"0,1-1 0,-1 1 0,1 0 0,-1 0 0,1 0 0,0 1 0,-1-1 0,1 0 0,0 1 0,0 0 0,0-1 0,0 1 0,0 0 0,0 0 0,1 0 0,-1 0 0,1 0 0,-1 1 0,1-1 0,0 0 0,0 1 0,0-1 0,0 1 0,0-1 0,0 1 0,1-1 0,-1 5 0,1-6 0,-1 1 0,1-1 0,-1 1 0,1 0 0,0 0 0,0-1 0,0 1 0,0 0 0,0-1 0,0 1 0,0 0 0,1 0 0,-1-1 0,1 1 0,-1 0 0,1-1 0,0 1 0,-1-1 0,1 1 0,0-1 0,0 1 0,0-1 0,0 0 0,0 1 0,0-1 0,1 0 0,-1 0 0,0 0 0,1 0 0,-1 0 0,1 0 0,-1 0 0,1 0 0,-1-1 0,1 1 0,-1 0 0,1-1 0,0 1 0,-1-1 0,1 0 0,0 0 0,0 0 0,-1 0 0,3 0 0,-3 0 0,1-1 0,-1 1 0,0-1 0,0 1 0,0-1 0,0 1 0,1-1 0,-1 0 0,0 0 0,0 0 0,0 0 0,-1 0 0,1 0 0,0 0 0,0 0 0,0 0 0,-1 0 0,1 0 0,0 0 0,-1 0 0,1-1 0,-1 1 0,0 0 0,1 0 0,-1-1 0,0 1 0,0-2 0,5-42 0,-5 41 0,-1-21 0,1 13 0,6 28 0,-6-15-24,3 9 61,0 0 0,1-1-1,6 12 1,-10-19-85,1-1 0,0 1 0,-1-1 0,1 0 0,0 1 0,0-1 0,0 0 0,0 0 0,0 1 0,0-1 0,0 0 0,1 0 0,-1 0 0,0-1 0,1 1 0,-1 0 0,0 0 0,1-1 0,-1 1 0,1-1 0,-1 1 0,1-1 0,-1 1 0,1-1 0,-1 0 0,1 0 0,-1 0 0,1 0 0,-1 0 0,4-1 0,4-2-6778</inkml:trace>
+  <inkml:trace contextRef="#ctx0" brushRef="#br0" timeOffset="3555.21">841 306 24575,'0'0'0,"0"9"0,0 0 0,0 1 0,1-1 0,0 0 0,1 0 0,4 13 0,6-50 0,-11 24 0,0 1 0,0 0 0,0 0 0,1 0 0,-1 0 0,1 0 0,0 0 0,0 0 0,0 0 0,5-4 0,-7 7 0,1 0 0,-1-1 0,1 1 0,-1 0 0,1-1 0,0 1 0,-1 0 0,1 0 0,-1-1 0,1 1 0,0 0 0,-1 0 0,1 0 0,0 0 0,-1 0 0,1 0 0,0 0 0,-1 0 0,1 0 0,0 0 0,-1 0 0,1 1 0,0-1 0,1 1 0,-1 0 0,1 0 0,-1 0 0,0 0 0,1 0 0,-1 1 0,0-1 0,0 0 0,0 1 0,0-1 0,0 1 0,1 2 0,2 5 0,5 7 0,-8-16 0,-1 0 0,0 1 0,1-1 0,-1 0 0,0 0 0,1 0 0,-1 0 0,0 0 0,1 0 0,-1 0 0,1 0 0,-1 0 0,0 0 0,1 0 0,-1 0 0,0 0 0,1 0 0,-1 0 0,0 0 0,1 0 0,-1 0 0,1-1 0,-1 1 0,0 0 0,0 0 0,1 0 0,-1-1 0,0 1 0,1 0 0,-1 0 0,0-1 0,0 1 0,1 0 0,-1-1 0,0 1 0,0 0 0,0-1 0,1 1 0,-1 0 0,0-1 0,0 1 0,0 0 0,0-1 0,0 1 0,0-1 0,16-37 0,-13 30 0,0 0 0,0 1 0,1-1 0,0 1 0,6-10 0,-10 17 1,1-1 0,-1 1-1,0 0 1,0-1 0,0 1-1,0 0 1,1 0 0,-1-1 0,0 1-1,0 0 1,1 0 0,-1-1-1,0 1 1,0 0 0,1 0-1,-1 0 1,0 0 0,1-1-1,-1 1 1,0 0 0,1 0 0,-1 0-1,0 0 1,1 0 0,-1 0-1,0 0 1,1 0 0,-1 0-1,0 0 1,1 0 0,-1 0 0,0 0-1,0 0 1,1 0 0,-1 0-1,0 0 1,1 1 0,-1-1-1,0 0 1,1 0 0,-1 0 0,0 0-1,0 1 1,1-1 0,-1 0-1,0 0 1,0 1 0,1-1-1,-1 0 1,0 0 0,0 1-1,0-1 1,0 0 0,1 1 0,-1-1-1,0 0 1,0 1 0,0-1-1,0 0 1,0 0 0,0 1-1,0-1 1,0 0 0,0 1 0,0 0-1,5 31-247,-4-20-917,2-3-5662</inkml:trace>
+  <inkml:trace contextRef="#ctx0" brushRef="#br0" timeOffset="4251.63">1116 217 24575,'2'1'0,"1"-1"0,0 1 0,0-1 0,0 1 0,-1 0 0,1 0 0,-1 0 0,1 1 0,0-1 0,-1 1 0,0-1 0,1 1 0,-1 0 0,0 0 0,0 0 0,0 0 0,0 0 0,0 0 0,-1 0 0,1 1 0,-1-1 0,1 1 0,-1-1 0,0 1 0,0 0 0,0-1 0,0 1 0,-1 0 0,1 0 0,-1-1 0,1 1 0,-1 5 0,0-5 0,1-1 0,-1 0 0,0 0 0,0 0 0,0 1 0,0-1 0,-1 0 0,1 0 0,0 0 0,-1 0 0,0 1 0,1-1 0,-1 0 0,0 0 0,0 0 0,0 0 0,0-1 0,-1 1 0,1 0 0,0 0 0,-1-1 0,1 1 0,-1-1 0,0 1 0,1-1 0,-1 1 0,0-1 0,0 0 0,0 0 0,0 0 0,0 0 0,0 0 0,0-1 0,0 1 0,0-1 0,0 1 0,-1-1 0,1 0 0,0 0 0,0 0 0,-4 0 0,4 0 0,0 0 0,1-1 0,-1 1 0,1 0 0,-1-1 0,1 1 0,-1-1 0,1 0 0,-1 0 0,1 1 0,-1-1 0,1 0 0,0 0 0,0 0 0,-1 0 0,1-1 0,0 1 0,0 0 0,0 0 0,0-1 0,-1-1 0,1 0 0,0 0 0,0-1 0,0 1 0,0 0 0,0-1 0,1 1 0,-1-1 0,1 1 0,0-7 0,1 0 0,1 0 0,-1 0 0,1 0 0,1 1 0,0-1 0,6-11 0,1 4-1365,-5 10-5461</inkml:trace>
+  <inkml:trace contextRef="#ctx0" brushRef="#br0" timeOffset="4996.33">1248 216 24575,'0'0'0,"0"0"0,0 0 0,-1 0 0,1 0 0,0-1 0,0 1 0,0 0 0,0 0 0,0 0 0,0 0 0,0 0 0,-1 0 0,1-1 0,0 1 0,0 0 0,0 0 0,0 0 0,-1 0 0,1 0 0,0 0 0,0 0 0,0 0 0,0 0 0,-1 0 0,1 0 0,0 0 0,0 0 0,0 0 0,0 0 0,-1 0 0,1 0 0,0 0 0,0 0 0,0 0 0,-1 0 0,1 0 0,0 0 0,0 0 0,0 0 0,0 0 0,-1 1 0,1-1 0,0 0 0,0 0 0,0 0 0,-3 11 0,4 13 0,0-21 0,-1 1 0,1-1 0,0 0 0,0 0 0,0 1 0,1-1 0,-1 0 0,1 0 0,0 0 0,-1-1 0,1 1 0,1 0 0,1 2 0,-3-4 0,0-1 0,-1 1 0,1-1 0,0 1 0,-1-1 0,1 0 0,0 1 0,-1-1 0,1 0 0,0 0 0,0 0 0,-1 1 0,1-1 0,0 0 0,0 0 0,-1 0 0,1 0 0,0 0 0,0 0 0,-1 0 0,1-1 0,0 1 0,0 0 0,1-1 0,0 0 0,-1 0 0,1 0 0,-1 0 0,1-1 0,-1 1 0,0 0 0,0-1 0,0 1 0,1-1 0,-1 1 0,0-1 0,-1 0 0,2-1 0,2-7 0,-1 0 0,-1 0 0,0-1 0,0 1 0,0-1 0,-2 1 0,1-1 0,-1 1 0,-2-15 0,3 33 17,0 0 0,1-1 1,-1 1-1,2-1 0,-1 0 0,7 14 0,-8-20-48,-1 0 0,1 1 0,0-1 0,-1 0 0,1 1 0,0-1 0,0 0 0,0 0 1,0 0-1,0 1 0,0-1 0,0 0 0,0-1 0,0 1 0,1 0 0,-1 0 0,0 0 0,1-1 0,-1 1 0,0 0 0,1-1 0,-1 0 0,1 1 0,-1-1 1,1 0-1,-1 0 0,1 1 0,-1-1 0,1 0 0,-1-1 0,1 1 0,-1 0 0,1 0 0,-1-1 0,1 1 0,-1 0 0,0-1 0,1 0 0,-1 1 0,0-1 0,1 0 1,-1 0-1,0 0 0,0 1 0,0-1 0,1 0 0,0-2 0,7-6-6795</inkml:trace>
+  <inkml:trace contextRef="#ctx0" brushRef="#br0" timeOffset="5636.87">1409 145 24575,'-1'30'0,"0"-19"0,1-1 0,0 1 0,3 21 0,1-31 0,4-8 0,4-10 0,-9 13 0,-1 0 0,1 1 0,0-1 0,0 1 0,0 0 0,0 0 0,1 0 0,6-4 0,-10 6 0,1 1 0,0-1 0,-1 1 0,1 0 0,0-1 0,0 1 0,-1 0 0,1 0 0,0-1 0,0 1 0,0 0 0,-1 0 0,1 0 0,0 0 0,0 0 0,0 0 0,-1 0 0,1 1 0,0-1 0,0 0 0,1 1 0,-1 0 0,0-1 0,0 1 0,-1 0 0,1 0 0,0 0 0,0 0 0,0 0 0,-1 1 0,1-1 0,-1 0 0,1 0 0,-1 0 0,1 1 0,-1-1 0,0 0 0,1 0 0,-1 1 0,0 1 0,1 17 0,1 15 0,-2-34 0,0 0 0,0 1 0,0-1 0,0 0 0,1 1 0,-1-1 0,1 0 0,-1 1 0,1-1 0,-1 0 0,1 0 0,0 0 0,0 1 0,0-1 0,-1 0 0,1 0 0,0 0 0,2 1 0,-2-2 0,-1 0 0,1 0 0,0 0 0,0-1 0,0 1 0,0 0 0,0 0 0,-1 0 0,1-1 0,0 1 0,0 0 0,0-1 0,-1 1 0,1-1 0,0 1 0,-1-1 0,1 1 0,0-1 0,-1 1 0,1-1 0,-1 0 0,1 1 0,-1-1 0,1 0 0,-1 0 0,1 1 0,-1-1 0,0 0 0,1-1 0,12-26 0,2-20-1365,-9 23-5461</inkml:trace>
+  <inkml:trace contextRef="#ctx0" brushRef="#br0" timeOffset="5969.54">1578 0 24575,'-1'32'0,"1"35"0,1-61 0,-1 0 0,1-1 0,0 1 0,1 0 0,0-1 0,-1 1 0,2-1 0,4 10 0,-7-14-2,1-1 0,-1 0-1,0 1 1,0-1-1,0 1 1,1-1 0,-1 0-1,0 1 1,1-1 0,-1 0-1,0 1 1,1-1 0,-1 0-1,0 0 1,1 1-1,-1-1 1,1 0 0,-1 0-1,1 0 1,-1 0 0,0 0-1,1 1 1,-1-1-1,1 0 1,-1 0 0,1 0-1,-1 0 1,0 0 0,1 0-1,-1 0 1,1 0 0,-1-1-1,1 1 1,13-13 202,3-22-1685,-13 25-5341</inkml:trace>
+  <inkml:trace contextRef="#ctx0" brushRef="#br0" timeOffset="6223.47">1607 40 24575,'-1'0'0,"-2"1"0,-4 2 0,-2 2 0,-2-1 0,-1-1 0,0 1 0,1 0 0,1-1 0,1 0 0,1-1 0,1-1 0,2 0-8191</inkml:trace>
+  <inkml:trace contextRef="#ctx0" brushRef="#br0" timeOffset="6921.44">291 824 24575,'1'-2'0,"0"1"0,0-1 0,0 1 0,0-1 0,0 1 0,0-1 0,1 1 0,-1-1 0,1 1 0,-1 0 0,1 0 0,-1 0 0,1 0 0,-1 0 0,1 0 0,0 0 0,0 1 0,-1-1 0,1 1 0,0-1 0,0 1 0,0-1 0,3 1 0,-3 0 0,0 1 0,0 0 0,0-1 0,-1 1 0,1 0 0,0 0 0,0 0 0,-1 0 0,1 0 0,0 0 0,-1 0 0,1 1 0,-1-1 0,0 1 0,1-1 0,-1 1 0,0-1 0,2 3 0,-1 0 0,-1-1 0,1 0 0,-1 0 0,1 1 0,-1-1 0,0 1 0,0-1 0,-1 1 0,1-1 0,-1 8 0,1-9 0,-2 0 0,1 0 0,0-1 0,0 1 0,-1 0 0,1 0 0,-1 0 0,1 0 0,-1 0 0,0 0 0,0-1 0,0 1 0,0 0 0,0-1 0,0 1 0,0-1 0,0 1 0,-1-1 0,1 1 0,-3 1 0,4-3 2,-1 1 1,1-1-1,-1 1 0,1 0 0,-1-1 1,1 1-1,-1-1 0,0 0 0,1 1 0,-1-1 1,0 1-1,0-1 0,1 0 0,-1 0 1,0 1-1,0-1 0,1 0 0,-1 0 0,0 0 1,0 0-1,1 0 0,-1 0 0,0 0 0,0 0 1,1 0-1,-1 0 0,0-1 0,0 1 1,1 0-1,-1 0 0,0-1 0,0 1 0,1 0 1,-1-1-1,0 1 0,1-1 0,-1 1 0,1-1 1,-1 1-1,1-1 0,-1 1 0,1-1 1,-1 0-1,1 1 0,-1-1 0,1 0 0,0 1 1,-1-1-1,1 0 0,0 0 0,0 1 1,-1-1-1,1-1 0,-1-4-250,0 0 1,1 0-1,-1 0 1,1 0-1,1-7 1,1-7-6579</inkml:trace>
+  <inkml:trace contextRef="#ctx0" brushRef="#br0" timeOffset="7555.08">413 758 24575,'33'-20'0,"-22"13"0,0 1 0,-1-1 0,1-1 0,10-10 0,-18 14 0,0 0 0,0 0 0,0 0 0,0 0 0,0-1 0,-1 1 0,0-1 0,0 0 0,0 0 0,-1 1 0,1-1 0,-1 0 0,0 0 0,0-7 0,-1 11 0,1 0 0,-1 0 0,0 0 0,0 0 0,0 0 0,0-1 0,0 1 0,0 0 0,0 0 0,0 0 0,0 0 0,0 0 0,-1-1 0,1 1 0,0 0 0,-1 0 0,1 0 0,-1 0 0,1 0 0,-1 0 0,1 0 0,-1 0 0,0 0 0,0 0 0,1 1 0,-1-1 0,0 0 0,0 0 0,0 1 0,0-1 0,0 0 0,0 1 0,0-1 0,0 1 0,-2-1 0,0 1 0,1 0 0,0 0 0,0 1 0,-1-1 0,1 1 0,0-1 0,0 1 0,0 0 0,0 0 0,-1 0 0,1 0 0,1 0 0,-1 0 0,0 1 0,0-1 0,0 1 0,1-1 0,-3 3 0,2-1 0,1-1 0,-1 1 0,1-1 0,0 1 0,-1 0 0,1 0 0,1 0 0,-1-1 0,0 1 0,1 0 0,-1 0 0,1 0 0,0 0 0,0 0 0,0 0 0,1 4 0,9 51 0,-8-50 0,3 17-227,2-1-1,0 1 1,2-1-1,1-1 1,18 33-1,-25-51-6598</inkml:trace>
+  <inkml:trace contextRef="#ctx0" brushRef="#br0" timeOffset="7935.96">603 804 24575,'-2'0'0,"-5"1"0,-2 1 0,-3 0 0,-4 1 0,-3 1 0,1 1 0,2-2 0,3 1 0,4-2-8191</inkml:trace>
+  <inkml:trace contextRef="#ctx0" brushRef="#br0" timeOffset="8299.61">997 744 24575,'2'-1'0,"0"0"0,2 2 0,2 4 0,0 1 0,-1 3 0,-1 0 0,-1 1 0,-1 0 0,0 1 0,0-1 0,0-1 0,-1-1 0,0-2-8191</inkml:trace>
+  <inkml:trace contextRef="#ctx0" brushRef="#br0" timeOffset="8568.54">938 645 24575,'1'-1'0</inkml:trace>
+  <inkml:trace contextRef="#ctx0" brushRef="#br0" timeOffset="9235.41">1082 710 24575,'2'2'0,"0"0"0,-1 0 0,1 0 0,0 0 0,-1 0 0,1 1 0,-1-1 0,0 1 0,0-1 0,1 4 0,-1-4 0,-1 0 0,1 0 0,0 0 0,0 0 0,-1 0 0,1 0 0,1-1 0,-1 1 0,0 0 0,0-1 0,1 1 0,-1-1 0,0 1 0,1-1 0,0 0 0,2 2 0,-4-3 0,1 0 0,0 0 0,0 0 0,0 0 0,0-1 0,0 1 0,-1 0 0,1-1 0,0 1 0,0-1 0,-1 1 0,1 0 0,0-1 0,-1 0 0,1 1 0,0-1 0,-1 1 0,1-1 0,-1 0 0,1 1 0,-1-1 0,1 0 0,-1 0 0,1-1 0,14-25 0,-11 19 0,-3 6 0,2-4 0,1 1 0,-1-1 0,1 0 0,0 1 0,9-9 0,-12 14 0,0-1 0,-1 0 0,1 1 0,0-1 0,0 1 0,0 0 0,-1-1 0,1 1 0,0 0 0,0-1 0,0 1 0,0 0 0,0 0 0,0 0 0,-1 0 0,1 0 0,0 0 0,0 0 0,0 0 0,1 0 0,0 1 0,-1 0 0,1 0 0,-1-1 0,0 1 0,1 0 0,-1 0 0,0 1 0,0-1 0,0 0 0,0 0 0,0 1 0,0-1 0,0 0 0,0 1 0,1 2 0,4 10-73,-6-12-19,1 1-1,0-1 1,0 1 0,0-1-1,1 1 1,-1-1 0,1 0 0,-1 0-1,1 1 1,0-1 0,0 0-1,0-1 1,3 4 0,2-2-6734</inkml:trace>
+  <inkml:trace contextRef="#ctx0" brushRef="#br0" timeOffset="9842.69">1333 598 24575,'0'-3'0,"1"-1"0,0 0 0,0 1 0,0-1 0,0 1 0,1-1 0,2-5 0,7-15 0,-9 13 0,0-1 0,-1 1 0,0-21 0,-1 29 0,0 0 0,0 0 0,0 0 0,0 0 0,-1 1 0,1-1 0,-1 0 0,0 0 0,0 0 0,0 0 0,0 1 0,0-1 0,-1 1 0,1-1 0,-1 1 0,0-1 0,0 1 0,0 0 0,-4-4 0,5 5 0,0 1 0,1 0 0,-1-1 0,0 1 0,0 0 0,0-1 0,0 1 0,0 0 0,0 0 0,0 0 0,0 0 0,0 0 0,0 0 0,0 0 0,0 0 0,0 1 0,0-1 0,0 0 0,0 0 0,0 1 0,0-1 0,0 1 0,0-1 0,0 1 0,1-1 0,-1 1 0,0-1 0,0 1 0,0 0 0,1 0 0,-1-1 0,1 1 0,-1 0 0,0 0 0,1 0 0,-1 0 0,1-1 0,0 1 0,-1 0 0,1 0 0,-1 2 0,-1 2 0,0 1 0,1-1 0,-1 0 0,1 1 0,0-1 0,0 7 0,2 5 0,0 0 0,1-1 0,1 1 0,1-1 0,10 30 0,8 36 0,-20-57-1365,-2-20-5461</inkml:trace>
+  <inkml:trace contextRef="#ctx0" brushRef="#br0" timeOffset="10191.73">1388 626 24575,'-1'-1'0,"-1"0"0,-1 2 0,-1 1 0,-2 1 0,-1 2 0,-1 1 0,0 0 0,1 0 0,-2 0 0,-1 1 0,1-1-8191</inkml:trace>
+  <inkml:trace contextRef="#ctx0" brushRef="#br0" timeOffset="10825.41">1438 648 24575,'2'-2'0,"-1"1"0,0-1 0,0 0 0,0 0 0,0 0 0,0 0 0,0-1 0,-1 1 0,1 0 0,-1 0 0,1 0 0,-1-5 0,1 4 0,0-5 0,2-1 0,-1 1 0,1 0 0,5-10 0,-8 17 0,0 0 0,1 0 0,-1 0 0,1 0 0,-1 0 0,1 0 0,-1 0 0,1 0 0,-1 0 0,1 0 0,0 0 0,-1 1 0,1-1 0,0 0 0,0 1 0,0-1 0,0 0 0,-1 1 0,1-1 0,0 1 0,0-1 0,0 1 0,0 0 0,0-1 0,0 1 0,0 0 0,1 0 0,-1 0 0,0-1 0,0 1 0,0 0 0,0 1 0,0-1 0,0 0 0,0 0 0,0 0 0,0 1 0,0-1 0,0 0 0,0 1 0,0-1 0,0 1 0,0-1 0,0 1 0,0-1 0,-1 1 0,3 1 0,0 2 0,-1 0 0,1 1 0,0-1 0,-1 0 0,0 1 0,0 0 0,0-1 0,-1 1 0,0 0 0,0 0 0,0 0 0,0 0 0,-1 0 0,0 0 0,0 0 0,0 0 0,0 0 0,-1 0 0,-2 9 0,2-13 3,1 0 0,-1 0 0,1 0-1,-1 0 1,0 0 0,1-1 0,-1 1 0,0 0-1,0 0 1,1-1 0,-1 1 0,0 0-1,0-1 1,0 1 0,0-1 0,0 1 0,0-1-1,0 1 1,0-1 0,0 0 0,0 1 0,0-1-1,0 0 1,0 0 0,0 0 0,0 0-1,-1 0 1,1 0 0,0 0 0,0 0 0,0-1-1,0 1 1,0 0 0,0 0 0,0-1 0,0 1-1,0-1 1,0 1 0,0-1 0,0 1-1,0-1 1,0-1 0,-3 0-168,0-1 0,1 0 0,0 0 0,-1 0 0,1-1 0,1 1 0,-1-1 0,-3-5 0,0-3-6661</inkml:trace>
+  <inkml:trace contextRef="#ctx0" brushRef="#br0" timeOffset="11584.23">498 1129 24575,'-1'14'0,"2"34"0,-1-45 0,0 0 0,1 0 0,-1 0 0,1 0 0,0-1 0,-1 1 0,1 0 0,1 0 0,-1 0 0,0-1 0,3 5 0,-3-7 0,-1 0 0,0 0 0,1 1 0,-1-1 0,1 0 0,-1 0 0,1 0 0,-1 0 0,1 0 0,-1 0 0,0 0 0,1 0 0,-1 0 0,1 0 0,-1-1 0,1 1 0,-1 0 0,0 0 0,1 0 0,-1 0 0,1-1 0,-1 1 0,0 0 0,1 0 0,-1-1 0,0 1 0,1 0 0,-1-1 0,0 1 0,1 0 0,-1-1 0,0 1 0,0 0 0,1-1 0,-1 1 0,0-1 0,0 1 0,0-1 0,0 1 0,0 0 0,1-1 0,8-19 0,-9 20 0,5-13 0,9-18 0,-14 31 0,1-1 0,-1 1 0,1-1 0,-1 1 0,1 0 0,0-1 0,-1 1 0,1-1 0,-1 1 0,1 0 0,0 0 0,-1-1 0,1 1 0,0 0 0,-1 0 0,1 0 0,0 0 0,-1 0 0,1 0 0,0 0 0,0 0 0,-1 0 0,1 0 0,0 0 0,-1 0 0,1 0 0,0 0 0,-1 1 0,1-1 0,0 0 0,-1 1 0,1-1 0,-1 0 0,1 1 0,0-1 0,-1 1 0,1-1 0,-1 1 0,1-1 0,-1 1 0,0-1 0,1 2 0,0-1 0,0 0 0,0 0 0,0 0 0,1 1 0,-1-1 0,0 0 0,1-1 0,-1 1 0,0 0 0,1 0 0,-1 0 0,1-1 0,-1 1 0,1-1 0,-1 1 0,1-1 0,0 0 0,-1 1 0,4-1 0,-3-1 0,0 0 0,-1 0 0,1 0 0,0-1 0,0 1 0,-1 0 0,1-1 0,0 1 0,-1-1 0,1 0 0,-1 0 0,0 1 0,0-1 0,2-4 0,5-8-455,0 0 0,10-28 0,-13 28-6371</inkml:trace>
+  <inkml:trace contextRef="#ctx0" brushRef="#br0" timeOffset="12058.15">740 1087 24575,'8'0'0,"0"0"0,-1-1 0,1 0 0,11-3 0,-17 4 0,-1 0 0,0 0 0,0 0 0,0-1 0,0 1 0,0-1 0,0 1 0,0 0 0,0-1 0,0 1 0,0-1 0,0 0 0,0 1 0,0-1 0,-1 0 0,1 0 0,0 0 0,0 1 0,-1-1 0,1 0 0,0 0 0,-1 0 0,1 0 0,-1 0 0,1 0 0,-1 0 0,0 0 0,1 0 0,-1 0 0,0-1 0,0 1 0,0 0 0,0 0 0,0 0 0,0 0 0,0 0 0,0 0 0,0 0 0,0-1 0,-1 1 0,1 0 0,-1-2 0,1 3 0,0 0 0,0 0 0,0 0 0,-1-1 0,1 1 0,0 0 0,0 0 0,0 0 0,0 0 0,0 0 0,0-1 0,0 1 0,-1 0 0,1 0 0,0 0 0,0 0 0,0 0 0,0 0 0,-1 0 0,1 0 0,0-1 0,0 1 0,0 0 0,0 0 0,-1 0 0,1 0 0,0 0 0,0 0 0,0 0 0,-1 0 0,1 0 0,0 0 0,0 0 0,0 0 0,0 0 0,-1 0 0,1 0 0,0 1 0,0-1 0,0 0 0,0 0 0,-1 0 0,1 0 0,0 0 0,-10 10 0,-4 11 0,13-18 0,-3 3 0,1 0 0,0 0 0,0 1 0,-3 11 0,6-17 0,-1 0 0,1 0 0,0 0 0,0 0 0,0-1 0,0 1 0,0 0 0,0 0 0,0 0 0,0 0 0,0 0 0,0 0 0,1 0 0,-1-1 0,0 1 0,1 0 0,-1 0 0,0 0 0,1 0 0,-1-1 0,1 1 0,-1 0 0,1-1 0,-1 1 0,1 0 0,0-1 0,-1 1 0,1 0 0,0-1 0,0 1 0,-1-1 0,1 0 0,0 1 0,0-1 0,0 1 0,0-1 0,-1 0 0,1 0 0,0 0 0,0 1 0,0-1 0,0 0 0,0 0 0,0 0 0,0 0 0,0-1 0,6 1-136,-1 0-1,0 0 1,1-1-1,-1 0 1,0 0-1,0-1 1,0 0-1,0 0 0,7-3 1,-3-1-6690</inkml:trace>
+  <inkml:trace contextRef="#ctx0" brushRef="#br0" timeOffset="13467.68">1151 1019 24575,'-2'0'0,"1"0"0,-1 0 0,1 0 0,-1 1 0,1-1 0,-1 1 0,1-1 0,-1 1 0,1 0 0,0-1 0,-1 1 0,1 0 0,0 0 0,-2 2 0,-2 1 0,0 0 0,0 1 0,0 0 0,1 0 0,0 0 0,0 0 0,0 1 0,1 0 0,0 0 0,0-1 0,0 2 0,1-1 0,0 0 0,-2 8 0,4-14 0,0 1 0,0-1 0,0 1 0,0 0 0,0-1 0,0 1 0,0-1 0,0 1 0,0 0 0,0-1 0,0 1 0,1-1 0,-1 1 0,0 0 0,0-1 0,1 1 0,-1-1 0,0 1 0,1-1 0,-1 1 0,0-1 0,1 1 0,-1-1 0,1 0 0,-1 1 0,1-1 0,-1 0 0,1 1 0,-1-1 0,1 0 0,-1 1 0,1-1 0,-1 0 0,1 0 0,-1 0 0,1 1 0,0-1 0,-1 0 0,1 0 0,-1 0 0,1 0 0,0 0 0,-1 0 0,1 0 0,-1 0 0,1-1 0,0 1 0,-1 0 0,1 0 0,-1 0 0,1-1 0,-1 1 0,2-1 0,1 0 0,0-1 0,0 1 0,0-1 0,0 0 0,0 0 0,0 0 0,4-4 0,-3 1 0,-1 1 0,0-1 0,-1 0 0,1 0 0,-1 0 0,0 0 0,0 0 0,0-1 0,1-7 0,7-21 0,-10 34 0,1 0 0,-1 0 0,1 0 0,-1 1 0,1-1 0,-1 0 0,0 0 0,1 0 0,-1 1 0,0-1 0,1 0 0,-1 1 0,0-1 0,1 0 0,-1 1 0,0-1 0,1 0 0,-1 1 0,0-1 0,0 0 0,1 1 0,-1-1 0,0 1 0,0-1 0,0 0 0,0 1 0,0-1 0,0 1 0,1-1 0,-1 1 0,0-1 0,0 1 0,-1 0 0,8 20 0,-2 0 0,-1 0 0,-1 0 0,-1 1 0,-1-1 0,-1 1 0,-1-1 0,-1 0 0,-5 23 0,7-42 0,-1 0 0,1 0 0,-1 0 0,0 0 0,1 0 0,-1 0 0,0 0 0,-1-1 0,1 1 0,-1 2 0,1-4 0,1 1 0,-1-1 0,1 0 0,-1 1 0,1-1 0,-1 0 0,1 1 0,-1-1 0,0 0 0,1 1 0,-1-1 0,1 0 0,-1 0 0,0 0 0,1 0 0,-1 0 0,1 0 0,-1 1 0,0-2 0,1 1 0,-1 0 0,0 0 0,-1-1 0,1 1 0,-1-1 0,1 0 0,0 0 0,0 0 0,-1 0 0,1 0 0,0 0 0,0-1 0,0 1 0,0 0 0,0-1 0,1 1 0,-1 0 0,0-1 0,0 1 0,1-1 0,-1 1 0,1-1 0,0 1 0,-1-1 0,1 0 0,0-2 0,-1-3 0,0 0 0,1-1 0,0 1 0,0 0 0,1-1 0,0 1 0,0 0 0,1 0 0,-1 0 0,2 0 0,-1 0 0,1 0 0,0 0 0,0 1 0,1 0 0,0-1 0,0 1 0,1 1 0,5-7 0,5-2 0,-1 1 0,2 0 0,0 1 0,0 1 0,33-16 0,-26 9 0,-20 10 0,-16 9 0,9 1 0,1-1 0,0 1 0,0 0 0,0 0 0,1 1 0,-1-1 0,0 0 0,1 1 0,0 0 0,-1-1 0,1 1 0,0 0 0,0 0 0,1 0 0,-1 1 0,1-1 0,-1 0 0,-1 7 0,1-4 0,1 0 0,-1 0 0,1 0 0,0 1 0,0-1 0,1 0 0,0 0 0,0 0 0,1 1 0,0 6 0,0-12 0,-1 0 0,0-1 0,0 1 0,0 0 0,1 0 0,-1 0 0,0-1 0,1 1 0,-1 0 0,0 0 0,1-1 0,-1 1 0,1 0 0,-1-1 0,1 1 0,0-1 0,-1 1 0,1 0 0,-1-1 0,1 1 0,0-1 0,0 0 0,-1 1 0,1-1 0,0 0 0,0 1 0,-1-1 0,2 0 0,0 0 0,0 0 0,-1 0 0,1-1 0,0 1 0,-1-1 0,1 1 0,-1-1 0,1 1 0,-1-1 0,1 0 0,-1 0 0,1 0 0,0-1 0,4-3 0,0 0 0,0-1 0,-1 1 0,9-13 0,-5 2 0,-1 0 0,-1-1 0,-1 0 0,0 0 0,6-30 0,4-14 0,3 104 0,-18-41-114,-1-1 1,1 1-1,0-1 0,1 1 0,-1-1 1,0 0-1,0 1 0,1-1 0,-1 0 1,0 0-1,3 2 0,1-1-6712</inkml:trace>
+  <inkml:trace contextRef="#ctx0" brushRef="#br0" timeOffset="13942.53">1509 948 24575,'0'-2'0,"-3"1"0,-2 0 0,-2 1 0,-1 1 0,-2 1 0,0 1 0,-1 0 0,-2 1 0,-1 2 0,0 0 0,0 1 0,2-3 0,-1 0 0,1-2 0,1 0-8191</inkml:trace>
+  <inkml:trace contextRef="#ctx0" brushRef="#br0" timeOffset="14686.07">1611 1188 24575,'0'-6'0,"0"0"0,1 0 0,-1 0 0,1 0 0,1 0 0,-1 0 0,4-8 0,-4 12 0,-1 1 0,1 0 0,0-1 0,0 1 0,-1 0 0,1 0 0,0 0 0,0-1 0,0 1 0,0 0 0,0 0 0,1 0 0,-1 0 0,0 1 0,0-1 0,1 0 0,-1 1 0,0-1 0,1 0 0,-1 1 0,1-1 0,-1 1 0,1 0 0,-1 0 0,1-1 0,-1 1 0,1 0 0,-1 0 0,0 0 0,1 1 0,-1-1 0,1 0 0,-1 1 0,1-1 0,1 1 0,-1 0 0,-1 0 0,1-1 0,-1 1 0,1 0 0,-1 0 0,0 0 0,1 0 0,-1 0 0,0 1 0,0-1 0,0 0 0,0 1 0,0-1 0,0 0 0,0 1 0,0-1 0,0 1 0,-1-1 0,1 1 0,-1 0 0,1-1 0,-1 1 0,1 0 0,-1-1 0,0 1 0,0 0 0,0-1 0,0 1 0,0 0 0,0 0 0,-1-1 0,1 1 0,-1 1 0,0 0 0,1 0 0,-1-1 0,0 1 0,0 0 0,0-1 0,0 1 0,0-1 0,-1 1 0,1-1 0,-1 0 0,1 1 0,-1-1 0,0 0 0,0 0 0,0 0 0,0-1 0,0 1 0,-1 0 0,-3 2 0,3-3 7,-1 0 0,1 0 0,0 0 0,0 0 0,-1-1 1,1 1-1,0-1 0,-1 0 0,1 0 0,0 0 0,-1 0 0,1-1 0,0 1 0,-1-1 0,1 0 0,-4-1 0,5 1-57,1 0 1,0-1-1,-1 1 1,1 0-1,-1 0 1,1-1-1,0 1 1,0-1-1,0 1 1,0-1-1,0 0 1,0 1-1,0-1 1,1 0-1,-1 1 1,1-1-1,-1 0 1,1 0-1,-1 0 1,1 0-1,0 1 1,0-1-1,0 0 1,0 0-1,0 0 1,1 0-1,-1 0 1,0 1-1,2-3 1,1-13-6777</inkml:trace>
+  <inkml:trace contextRef="#ctx0" brushRef="#br0" timeOffset="15208.65">1776 1044 24575,'5'9'0,"0"0"0,-1 1 0,0-1 0,-1 1 0,0 0 0,3 19 0,-3-13 0,-3-16 0,0 1 0,0-1 0,0 0 0,0 0 0,0 0 0,0 0 0,0 0 0,0 1 0,0-1 0,1 0 0,-1 0 0,0 0 0,0 0 0,0 0 0,0 0 0,0 1 0,0-1 0,0 0 0,0 0 0,0 0 0,1 0 0,-1 0 0,0 0 0,0 0 0,0 0 0,0 0 0,0 0 0,1 1 0,-1-1 0,0 0 0,0 0 0,0 0 0,0 0 0,0 0 0,1 0 0,-1 0 0,0 0 0,0 0 0,0 0 0,0 0 0,0 0 0,1-1 0,-1 1 0,0 0 0,0 0 0,0 0 0,0 0 0,0 0 0,1 0 0,-1 0 0,0 0 0,0 0 0,11-10 0,9-18 0,-18 26 0,-1-2 0,1 1 0,0 1 0,0-1 0,1 0 0,-1 0 0,0 1 0,1 0 0,0-1 0,-1 1 0,5-2 0,-6 4 0,0 0 0,1 0 0,-1 0 0,0 0 0,1 0 0,-1 0 0,0 0 0,0 1 0,1-1 0,-1 0 0,0 1 0,0-1 0,0 1 0,0 0 0,1-1 0,-1 1 0,0 0 0,0-1 0,0 1 0,0 0 0,-1 0 0,1 0 0,0 0 0,0 0 0,0 0 0,-1 0 0,1 0 0,-1 1 0,1-1 0,0 1 0,2 4-113,-2-4 54,0 0-1,0 0 0,1 0 1,-1 0-1,0-1 0,1 1 1,-1 0-1,1 0 1,-1-1-1,1 1 0,0-1 1,0 0-1,-1 1 0,1-1 1,0 0-1,0 0 1,1 0-1,-1 0 0,0-1 1,4 2-1,-1-2-6766</inkml:trace>
+  <inkml:trace contextRef="#ctx0" brushRef="#br0" timeOffset="15716.94">730 1474 24575,'0'3'0,"2"4"0,0 4 0,0 3 0,-1 4 0,0 1 0,0 1 0,-1-1 0,2-1 0,0-7 0,4-7 0,1-8 0,1-6 0,-2-1-8191</inkml:trace>
+  <inkml:trace contextRef="#ctx0" brushRef="#br0" timeOffset="15953.66">802 1522 24575,'0'-1'0,"-2"0"0,-2 1 0,-1 0 0,-4 2 0,-3 2 0,-2 2 0,-2 0 0,-1 1 0,2-1 0,2-1 0,3-2-8191</inkml:trace>
+  <inkml:trace contextRef="#ctx0" brushRef="#br0" timeOffset="16920.31">833 1337 24575,'3'5'0,"0"0"0,0-1 0,0 1 0,-1 0 0,0 1 0,0-1 0,0 0 0,-1 1 0,1-1 0,-1 8 0,0 58 0,-2-56 0,0 0 0,2 0 0,2 22 0,3-23 0,0-15 0,7-26 0,-3 7 0,20-18 0,-29 36 0,0 1 0,1-1 0,0 0 0,-1 1 0,1-1 0,0 1 0,0-1 0,0 1 0,0 0 0,0 0 0,0 0 0,0 0 0,0 0 0,1 1 0,-1-1 0,0 1 0,1-1 0,2 1 0,-4 0 0,1 1 0,-1 0 0,1-1 0,-1 1 0,0 0 0,1 0 0,-1 0 0,0 0 0,0 0 0,1 0 0,-1 0 0,0 0 0,0 1 0,0-1 0,0 0 0,1 3 0,13 30 0,-4-12 0,-11-21 0,1 0 0,-1 0 0,1 0 0,-1-1 0,1 1 0,-1 0 0,1 0 0,0-1 0,0 1 0,-1 0 0,1-1 0,0 1 0,0-1 0,-1 1 0,1-1 0,0 1 0,0-1 0,0 1 0,0-1 0,0 0 0,0 0 0,0 1 0,0-1 0,0 0 0,0 0 0,0 0 0,0 0 0,0 0 0,1-1 0,0 0 0,1 0 0,-1 0 0,0 0 0,0 0 0,0 0 0,0-1 0,0 1 0,0-1 0,-1 0 0,1 0 0,2-3 0,3-3 0,-1-1 0,-1-1 0,1 1 0,5-15 0,-11 24 0,10-30 0,-10 28 0,1 0 0,-1 1 0,0-1 0,1 0 0,-1 1 0,0-1 0,0 0 0,0 0 0,0 1 0,0-1 0,0 0 0,-1 0 0,1 1 0,0-1 0,-2-1 0,2 3 0,-1 0 0,1 0 0,0 0 0,-1 0 0,1 0 0,-1 0 0,1 1 0,-1-1 0,1 0 0,0 0 0,-1 1 0,1-1 0,-1 0 0,1 0 0,0 1 0,-1-1 0,1 0 0,0 1 0,0-1 0,-1 0 0,1 1 0,0-1 0,0 1 0,-1-1 0,1 1 0,0-1 0,0 0 0,0 1 0,0-1 0,0 1 0,0-1 0,0 1 0,-1-1 0,2 1 0,-8 19 0,5-14 0,1-1 0,0 1 0,0 0 0,0-1 0,1 1 0,0 0 0,0-1 0,1 1 0,-1 0 0,4 10 0,-4-15 3,0-1-1,1 1 0,-1-1 0,1 1 1,-1-1-1,1 0 0,-1 1 1,1-1-1,-1 1 0,1-1 0,0 0 1,-1 0-1,1 1 0,-1-1 1,1 0-1,0 0 0,-1 0 1,1 1-1,0-1 0,-1 0 0,1 0 1,0 0-1,-1 0 0,1 0 1,0 0-1,-1-1 0,1 1 0,0 0 1,-1 0-1,1 0 0,-1-1 1,1 1-1,1-1 0,22-13-596,-19 11-255,7-5-5977</inkml:trace>
+  <inkml:trace contextRef="#ctx0" brushRef="#br0" timeOffset="17458.71">1078 1696 24575,'-2'0'0,"1"-1"0,0 1 0,0-1 0,0 1 0,0 0 0,-1 0 0,1 0 0,0 0 0,0 0 0,-1 0 0,1 0 0,0 0 0,0 0 0,0 0 0,-1 1 0,1-1 0,0 1 0,0-1 0,0 1 0,0-1 0,0 1 0,0-1 0,-1 2 0,-25 16 0,24-14 0,0 0 0,1 0 0,-1 0 0,1 1 0,0 0 0,0-1 0,0 1 0,1 0 0,0 0 0,0 0 0,0-1 0,0 1 0,1 0 0,0 1 0,0-1 0,0 0 0,0 0 0,1 0 0,0-1 0,0 1 0,1 0 0,-1 0 0,1 0 0,0-1 0,0 1 0,0-1 0,4 5 0,-5-7 3,0-2 0,0 1-1,0 0 1,1 0 0,-1 0-1,0 0 1,0-1 0,1 1 0,-1-1-1,0 1 1,1-1 0,-1 1-1,0-1 1,1 0 0,-1 1 0,1-1-1,-1 0 1,0 0 0,1 0-1,-1 0 1,1-1 0,-1 1 0,0 0-1,1 0 1,-1-1 0,1 1-1,-1-1 1,0 1 0,0-1-1,1 0 1,0 0 0,5-4-146,0 0 0,-1 0 0,1 0 0,6-8 1,-6 6-596,2-2-6088</inkml:trace>
+  <inkml:trace contextRef="#ctx0" brushRef="#br0" timeOffset="18153.35">1238 1734 24575,'7'0'0,"-1"0"0,1 0 0,-1 1 0,1-1 0,-1 2 0,1-1 0,6 3 0,-12-4 0,0 1 0,1 0 0,-1 0 0,0 0 0,0-1 0,0 1 0,0 0 0,0 1 0,0-1 0,0 0 0,0 0 0,0 0 0,-1 0 0,1 1 0,0-1 0,-1 0 0,1 1 0,-1-1 0,1 0 0,-1 1 0,0-1 0,1 1 0,-1-1 0,0 1 0,0-1 0,0 0 0,0 1 0,0-1 0,-1 1 0,1-1 0,0 1 0,-1-1 0,1 0 0,-1 1 0,1-1 0,-1 0 0,-1 3 0,0-1 0,1-1 0,-1 1 0,0-1 0,0 0 0,0 0 0,0 0 0,0 0 0,0 0 0,-1 0 0,1 0 0,-1 0 0,1-1 0,-1 0 0,0 1 0,0-1 0,1 0 0,-1 0 0,0-1 0,-5 2 0,2-1 0,-1 0 0,0 0 0,0 0 0,0-1 0,0 0 0,0 0 0,-10-3 0,16 3 0,0 0 0,0-1 0,1 1 0,-1-1 0,0 0 0,1 1 0,-1-1 0,1 1 0,-1-1 0,1 0 0,-1 0 0,1 1 0,-1-1 0,1 0 0,-1 0 0,1 0 0,0 1 0,0-1 0,-1 0 0,1 0 0,0 0 0,0 0 0,0 0 0,0 1 0,0-1 0,0 0 0,0 0 0,0 0 0,1 0 0,-1 0 0,0 1 0,0-1 0,1 0 0,-1 0 0,0 0 0,1 1 0,-1-1 0,1-1 0,17-31 0,8 7-1365,-13 15-5461</inkml:trace>
+  <inkml:trace contextRef="#ctx0" brushRef="#br0" timeOffset="18708.57">1391 1721 24575,'0'8'0,"0"7"0,7-25 0,-5 6 0,0 0 0,0 0 0,0 0 0,1 0 0,0 0 0,-1 1 0,1-1 0,0 1 0,6-5 0,-9 7 0,1 1 0,-1 0 0,1-1 0,-1 1 0,1 0 0,0 0 0,-1-1 0,1 1 0,-1 0 0,1 0 0,0 0 0,-1-1 0,1 1 0,0 0 0,-1 0 0,1 0 0,0 0 0,-1 0 0,1 1 0,0-1 0,-1 0 0,1 0 0,0 0 0,-1 0 0,1 1 0,0-1 0,1 2 0,-1-1 0,0 1 0,0-1 0,0 1 0,0-1 0,0 1 0,0-1 0,0 1 0,0 0 0,0 0 0,-1 0 0,1-1 0,-1 1 0,1 2 0,0-1 0,10 30 0,-11-33 0,1 0 0,-1 1 0,0-1 0,0 0 0,0 0 0,1 1 0,-1-1 0,0 0 0,0 0 0,1 0 0,-1 0 0,0 1 0,0-1 0,1 0 0,-1 0 0,0 0 0,1 0 0,-1 0 0,0 0 0,0 1 0,1-1 0,-1 0 0,0 0 0,1 0 0,-1 0 0,0 0 0,1 0 0,-1-1 0,0 1 0,1 0 0,-1 0 0,13-15 0,-6 0-1365,0 1-5461</inkml:trace>
+  <inkml:trace contextRef="#ctx0" brushRef="#br0" timeOffset="19372.59">1582 1573 24575,'-10'8'0,"-25"24"0,34-32 0,0 1 0,1-1 0,-1 1 0,1-1 0,-1 1 0,1-1 0,-1 1 0,1 0 0,-1-1 0,1 1 0,0 0 0,-1-1 0,1 1 0,0 0 0,-1-1 0,1 1 0,0 0 0,0 0 0,0-1 0,0 1 0,0 0 0,0 0 0,0-1 0,0 1 0,0 0 0,0 0 0,0-1 0,0 1 0,1 0 0,-1 0 0,0-1 0,0 1 0,1 0 0,-1-1 0,1 1 0,-1 0 0,0-1 0,1 1 0,-1-1 0,1 1 0,0-1 0,-1 1 0,1-1 0,-1 1 0,1-1 0,0 1 0,0-1 0,30 9 0,-26-9 0,-1 1 0,0 0 0,0 0 0,1 0 0,-1 1 0,0-1 0,7 5 0,-11-5 0,1-1 0,0 1 0,-1 0 0,1 0 0,0 0 0,-1 0 0,1 0 0,-1 0 0,1 0 0,-1 0 0,0 0 0,1 0 0,-1 0 0,0 1 0,0-1 0,0 0 0,0 0 0,0 0 0,0 0 0,0 0 0,0 0 0,0 1 0,0-1 0,-1 0 0,1 0 0,0 0 0,-1 0 0,1 0 0,-1 0 0,0 0 0,1 0 0,-1 0 0,1 0 0,-1-1 0,-1 3 0,1-1-54,-1 0-1,1 0 0,-1 0 1,1-1-1,-1 1 1,1 0-1,-1 0 0,0-1 1,0 1-1,0-1 1,0 0-1,0 0 0,0 1 1,0-1-1,0 0 0,0-1 1,-1 1-1,1 0 1,0-1-1,-1 1 0,1-1 1,0 0-1,-1 0 1,-3 0-1,-1 0-6771</inkml:trace>
+  <inkml:trace contextRef="#ctx0" brushRef="#br0" timeOffset="20069.5">1684 1628 24575,'0'-1'0,"4"-50"0,-4 50 0,0 0 0,0-1 0,1 1 0,-1 0 0,1 0 0,-1 0 0,1-1 0,-1 1 0,1 0 0,-1 0 0,1 0 0,0 0 0,0 0 0,1-2 0,-1 3 0,0 0 0,-1 0 0,1 0 0,0 0 0,-1 0 0,1 0 0,0 0 0,-1 0 0,1 0 0,0 0 0,-1 0 0,1 0 0,0 1 0,-1-1 0,1 0 0,0 0 0,-1 1 0,1-1 0,-1 1 0,1-1 0,-1 0 0,1 1 0,-1-1 0,1 1 0,-1-1 0,1 1 0,-1-1 0,1 1 0,-1-1 0,1 2 0,1 2 0,0 1 0,0-1 0,0 1 0,-1-1 0,0 1 0,0-1 0,0 1 0,0 0 0,-1-1 0,1 1 0,-1 0 0,-1 0 0,1-1 0,-1 1 0,1 0 0,-1 0 0,-1-1 0,1 1 0,-3 4 0,4-9 3,0 1-1,0-1 0,-1 0 1,1 0-1,0 0 1,-1 1-1,1-1 0,0 0 1,-1 0-1,1 0 0,0 0 1,-1 0-1,1 0 1,0 0-1,-1 0 0,1 0 1,-1 0-1,1 0 0,0 0 1,-1 0-1,1 0 1,0 0-1,-1 0 0,1 0 1,0 0-1,-1 0 0,1 0 1,0-1-1,-1 1 1,1 0-1,0 0 0,-1 0 1,1-1-1,0 1 1,-1 0-1,1 0 0,0-1 1,0 1-1,0 0 0,-1-1 1,1 1-1,0 0 1,0-1-1,0 1 0,0 0 1,-1-1-1,1 1 0,0 0 1,0-1-1,-7-18-1486,5 9-5342</inkml:trace>
+  <inkml:trace contextRef="#ctx0" brushRef="#br0" timeOffset="20386.82">1780 1413 24575,'1'4'0,"1"4"0,3 4 0,1 4 0,0 4 0,0-1 0,-2 1 0,0-2 0,1-3 0,0-4-8191</inkml:trace>
+  <inkml:trace contextRef="#ctx0" brushRef="#br0" timeOffset="20940.95">1891 1575 24575,'6'0'0,"0"0"0,1-1 0,-1 0 0,-1 0 0,1 0 0,0-1 0,0 0 0,0 0 0,8-5 0,-12 6 0,-1 0 0,1 0 0,-1 0 0,1 0 0,-1 0 0,0 0 0,1 0 0,-1-1 0,0 1 0,0-1 0,0 1 0,0-1 0,0 1 0,0-1 0,-1 1 0,1-1 0,0 0 0,-1 1 0,1-1 0,-1 0 0,0 0 0,1 0 0,-1 1 0,0-1 0,0 0 0,0 0 0,-1 0 0,1 1 0,0-1 0,-1 0 0,1 0 0,-1 1 0,1-1 0,-1 0 0,0 1 0,0-1 0,0-1 0,0 2 0,1 0 0,-1 1 0,1-1 0,-1 0 0,1 0 0,-1 1 0,1-1 0,-1 0 0,0 1 0,1-1 0,-1 1 0,0-1 0,1 1 0,-1-1 0,0 1 0,0-1 0,0 1 0,1 0 0,-1 0 0,0-1 0,0 1 0,0 0 0,0 0 0,0 0 0,1 0 0,-1 0 0,0 0 0,0 0 0,0 0 0,0 0 0,0 0 0,0 0 0,1 1 0,-1-1 0,0 0 0,0 1 0,0-1 0,1 0 0,-2 2 0,0-2 0,1 1 0,0 0 0,-1 0 0,1 0 0,0 1 0,0-1 0,-1 0 0,1 0 0,0 1 0,0-1 0,0 1 0,0-1 0,1 1 0,-1-1 0,0 1 0,1-1 0,-1 1 0,1 0 0,-1 2 0,0 14 0,0-9 0,0 0 0,1 0 0,0 0 0,1 0 0,0 1 0,0-1 0,1 0 0,0 0 0,5 15 0,-5-23-36,-1 0 0,0 0 0,1 0 1,-1 0-1,0 0 0,1 0 0,-1 0 0,1-1 0,0 1 0,-1 0 0,1-1 0,-1 1 0,1-1 0,0 0 0,0 1 0,-1-1 0,1 0 1,0 0-1,-1 0 0,1 0 0,0-1 0,-1 1 0,1 0 0,0-1 0,-1 1 0,1-1 0,0 1 0,-1-1 0,1 0 0,-1 0 0,1 0 1,-1 0-1,0 0 0,1 0 0,-1 0 0,0 0 0,2-2 0,4-7-6790</inkml:trace>
+</inkml:ink>
+</file>
+
+<file path=word/ink/ink18.xml><?xml version="1.0" encoding="utf-8"?>
+<inkml:ink xmlns:inkml="http://www.w3.org/2003/InkML">
+  <inkml:definitions>
+    <inkml:context xml:id="ctx0">
+      <inkml:inkSource xml:id="inkSrc0">
+        <inkml:traceFormat>
+          <inkml:channel name="X" type="integer" min="-2.14748E9" max="2.14748E9" units="cm"/>
+          <inkml:channel name="Y" type="integer" min="-2.14748E9" max="2.14748E9" units="cm"/>
+          <inkml:channel name="F" type="integer" max="32767" units="dev"/>
+        </inkml:traceFormat>
+        <inkml:channelProperties>
+          <inkml:channelProperty channel="X" name="resolution" value="1000" units="1/cm"/>
+          <inkml:channelProperty channel="Y" name="resolution" value="1000" units="1/cm"/>
+          <inkml:channelProperty channel="F" name="resolution" value="0" units="1/dev"/>
+        </inkml:channelProperties>
+      </inkml:inkSource>
+      <inkml:timestamp xml:id="ts0" timeString="2026-07-22T20:14:13.775"/>
+    </inkml:context>
+    <inkml:brush xml:id="br0">
+      <inkml:brushProperty name="width" value="0.025" units="cm"/>
+      <inkml:brushProperty name="height" value="0.025" units="cm"/>
+      <inkml:brushProperty name="color" value="#E71224"/>
+    </inkml:brush>
+  </inkml:definitions>
+  <inkml:trace contextRef="#ctx0" brushRef="#br0">189 109 24575,'-12'-1'0,"-1"0"0,0-1 0,-24-7 0,-8-2 0,40 11 0,1-1 0,0 0 0,0 0 0,0 0 0,0 0 0,0-1 0,0 0 0,0 0 0,0 0 0,1 0 0,-1 0 0,-4-4 0,7 4 0,-1 0 0,1 0 0,0 0 0,0 0 0,0 0 0,0-1 0,0 1 0,0 0 0,0 0 0,1-1 0,-1 1 0,1 0 0,-1-1 0,1 1 0,0-1 0,0 1 0,0 0 0,1-1 0,-1 1 0,0-1 0,1 1 0,0 0 0,0-3 0,-1 5 0,0-1 0,0 1 0,0 0 0,0 0 0,0 0 0,0 0 0,0 0 0,1-1 0,-1 1 0,0 0 0,0 0 0,0 0 0,0 0 0,0-1 0,0 1 0,0 0 0,0 0 0,0 0 0,0 0 0,1 0 0,-1 0 0,0 0 0,0-1 0,0 1 0,0 0 0,0 0 0,0 0 0,1 0 0,-1 0 0,0 0 0,0 0 0,0 0 0,0 0 0,0 0 0,1 0 0,-1 0 0,0 0 0,0 0 0,0 0 0,0 0 0,1 0 0,-1 0 0,0 0 0,0 0 0,0 0 0,0 0 0,1 0 0,-1 0 0,0 0 0,0 0 0,0 0 0,0 0 0,0 1 0,1-1 0,8 11 0,4 17 0,-11-20 0,-1 1 0,0-1 0,0 1 0,0 0 0,-2 16 0,0-16 0,1 1 0,0 0 0,3 18 0,3-16 0,2-12 0,-7-1 0,0-1 0,0 1 0,0 0 0,0 0 0,0 0 0,0-1 0,-1 1 0,1-1 0,0 1 0,-1 0 0,1-1 0,-1 1 0,1-4 0,18-133-1365,-17 124-5461</inkml:trace>
+</inkml:ink>
+</file>
+
+<file path=word/ink/ink19.xml><?xml version="1.0" encoding="utf-8"?>
+<inkml:ink xmlns:inkml="http://www.w3.org/2003/InkML">
+  <inkml:definitions>
+    <inkml:context xml:id="ctx0">
+      <inkml:inkSource xml:id="inkSrc0">
+        <inkml:traceFormat>
+          <inkml:channel name="X" type="integer" min="-2.14748E9" max="2.14748E9" units="cm"/>
+          <inkml:channel name="Y" type="integer" min="-2.14748E9" max="2.14748E9" units="cm"/>
+          <inkml:channel name="F" type="integer" max="32767" units="dev"/>
+        </inkml:traceFormat>
+        <inkml:channelProperties>
+          <inkml:channelProperty channel="X" name="resolution" value="1000" units="1/cm"/>
+          <inkml:channelProperty channel="Y" name="resolution" value="1000" units="1/cm"/>
+          <inkml:channelProperty channel="F" name="resolution" value="0" units="1/dev"/>
+        </inkml:channelProperties>
+      </inkml:inkSource>
+      <inkml:timestamp xml:id="ts0" timeString="2026-07-22T20:14:03.843"/>
+    </inkml:context>
+    <inkml:brush xml:id="br0">
+      <inkml:brushProperty name="width" value="0.025" units="cm"/>
+      <inkml:brushProperty name="height" value="0.025" units="cm"/>
+      <inkml:brushProperty name="color" value="#E71224"/>
+    </inkml:brush>
+  </inkml:definitions>
+  <inkml:trace contextRef="#ctx0" brushRef="#br0">0 586 24575,'2'2'0,"0"-1"0,-1 1 0,1-1 0,-1 1 0,1-1 0,-1 1 0,0 0 0,1 0 0,-1 0 0,0 0 0,0 0 0,-1 0 0,2 2 0,1 3 0,12 22 0,-11-21 0,0 0 0,0 0 0,1-1 0,0 1 0,0-1 0,9 10 0,-14-17 0,1 0 0,-1 0 0,0 0 0,0 1 0,1-1 0,-1 0 0,0 0 0,1 0 0,-1 0 0,0 0 0,0 0 0,1 0 0,-1 0 0,0 0 0,0 0 0,1 0 0,-1 0 0,0 0 0,1 0 0,-1 0 0,0 0 0,0 0 0,1-1 0,-1 1 0,0 0 0,0 0 0,1 0 0,-1 0 0,0 0 0,0-1 0,1 1 0,-1 0 0,0 0 0,0 0 0,0-1 0,0 1 0,1 0 0,-1 0 0,0-1 0,0 1 0,0 0 0,0 0 0,0-1 0,0 1 0,0 0 0,0 0 0,0-1 0,0 1 0,0 0 0,0-1 0,0 1 0,0 0 0,0 0 0,0-1 0,0 1 0,3-23 0,-3 20 0,20-147 0,-18 141-1365,1 1-5461</inkml:trace>
+  <inkml:trace contextRef="#ctx0" brushRef="#br0" timeOffset="434.94">212 505 24575,'1'0'0,"1"3"0,2 3 0,1 3 0,3 5 0,0 3 0,0-1 0,-2-1 0,0 0 0,1 1 0,1 1 0,-1-4-8191</inkml:trace>
+  <inkml:trace contextRef="#ctx0" brushRef="#br0" timeOffset="675.44">225 328 24575,'0'0'-8191</inkml:trace>
+  <inkml:trace contextRef="#ctx0" brushRef="#br0" timeOffset="1801.67">403 429 24575,'-2'3'0,"0"0"0,0 0 0,1 1 0,-1-1 0,1 0 0,0 1 0,-1-1 0,2 1 0,-1-1 0,0 1 0,1 0 0,-1-1 0,1 7 0,0-9 0,0 1 0,0 0 0,0-1 0,0 1 0,0 0 0,0-1 0,0 1 0,0 0 0,1-1 0,-1 1 0,1 0 0,-1-1 0,1 1 0,-1-1 0,1 1 0,0-1 0,0 1 0,0-1 0,0 0 0,0 0 0,0 1 0,0-1 0,1 0 0,-1 0 0,0 0 0,1 0 0,-1 0 0,0 0 0,1 0 0,1 0 0,12 1 0,-8-2 0,1 1 0,-1 1 0,0-1 0,0 1 0,11 4 0,-17-5 0,1-1 0,-1 1 0,0 0 0,0 0 0,1 0 0,-1 0 0,0 0 0,0 0 0,0 0 0,0 0 0,0 0 0,0 0 0,0 1 0,0-1 0,-1 0 0,1 1 0,0-1 0,-1 0 0,1 1 0,-1-1 0,1 1 0,-1-1 0,0 1 0,0-1 0,0 1 0,0-1 0,0 1 0,0 0 0,0-1 0,0 1 0,0-1 0,-2 3 0,2-2-39,-1 0 0,0-1 0,0 1 0,0-1 0,0 1 0,-1-1 0,1 0 0,0 1 0,-1-1 0,1 0 0,0 0 0,-1 0 0,0 0 0,1 0 0,-1 0 0,1 0 0,-1-1 0,0 1 0,0-1 0,1 1 0,-1-1 0,0 1 0,0-1 0,0 0 0,0 0 0,1 0 0,-1 0 0,0 0 0,0 0 0,0-1 0,1 1 0,-1-1 0,0 1 0,-3-2 0,-1-2-6787</inkml:trace>
+  <inkml:trace contextRef="#ctx0" brushRef="#br0" timeOffset="2197.43">519 389 24575,'4'1'0,"4"2"0,3 7 0,0 6 0,1 4 0,-3-1-8191</inkml:trace>
+  <inkml:trace contextRef="#ctx0" brushRef="#br0" timeOffset="2419.37">465 245 24575,'0'0'-8191</inkml:trace>
+  <inkml:trace contextRef="#ctx0" brushRef="#br0" timeOffset="3415.98">629 211 24575,'-2'1'0,"2"1"0,-1 0 0,0-1 0,0 1 0,0 0 0,1 0 0,-1 0 0,1 0 0,0-1 0,-1 1 0,1 0 0,0 0 0,0 0 0,0 0 0,0 0 0,1 0 0,-1 2 0,9 34 0,-9-36 0,16 46 0,27 56 0,-38-92 0,-4-11 0,-1-1 0,0 0 0,0 0 0,0 0 0,0 0 0,0 0 0,0 0 0,0 1 0,1-1 0,-1 0 0,0 0 0,0 0 0,0 0 0,0 0 0,0 0 0,1 0 0,-1 0 0,0 0 0,0 0 0,0 0 0,0 0 0,1 0 0,-1 0 0,0 0 0,0 0 0,0 0 0,0 0 0,1 0 0,-1 0 0,0 0 0,0 0 0,0 0 0,0 0 0,1 0 0,-1 0 0,0 0 0,0 0 0,0 0 0,0-1 0,0 1 0,1 0 0,-1 0 0,0 0 0,0 0 0,0 0 0,0 0 0,0-1 0,0 1 0,0 0 0,0 0 0,0 0 0,0 0 0,1-1 0,-1 1 0,0 0 0,0 0 0,0 0 0,0 0 0,0-1 0,0 1 0,0 0 0,0 0 0,0 0 0,0 0 0,0-1 0,-1 1 0,11-25 0,-8 19 0,0-1 0,1 0 0,0 1 0,0-1 0,0 1 0,7-8 0,-10 13 0,1 0 0,0 0 0,0 0 0,0 0 0,0 0 0,0 0 0,0 1 0,0-1 0,0 0 0,1 1 0,-1-1 0,0 1 0,0-1 0,0 1 0,1 0 0,-1-1 0,0 1 0,0 0 0,1 0 0,-1 0 0,0 0 0,1 0 0,-1 0 0,0 0 0,0 1 0,1-1 0,-1 0 0,0 1 0,0-1 0,0 1 0,1-1 0,-1 1 0,0-1 0,0 1 0,0 0 0,0 0 0,0 0 0,0-1 0,0 1 0,0 0 0,-1 0 0,1 0 0,0 0 0,0 1 0,-1-1 0,1 0 0,-1 0 0,1 0 0,0 2 0,2 4 0,-1 0 0,0-1 0,0 1 0,0 0 0,0 0 0,-1 0 0,0 12 0,-1-18 0,1 0 0,-1 1 0,0-1 0,0 0 0,0 0 0,0 1 0,0-1 0,0 0 0,0 1 0,-1-1 0,1 0 0,0 0 0,-1 0 0,1 1 0,-1-1 0,1 0 0,-1 0 0,0 0 0,1 0 0,-1 0 0,0 0 0,0 0 0,0 0 0,1 0 0,-1 0 0,0-1 0,0 1 0,-1 0 0,1 0 0,-1 0 0,0-1 0,1-1 0,-1 1 0,1-1 0,-1 1 0,1-1 0,-1 0 0,1 1 0,-1-1 0,1 0 0,0 0 0,-1 0 0,1 0 0,0 0 0,0 0 0,0 0 0,0-1 0,0 1 0,0 0 0,0-1 0,0 1 0,0 0 0,1-1 0,-2-2 0,-5-10-1365,2 0-5461</inkml:trace>
+  <inkml:trace contextRef="#ctx0" brushRef="#br0" timeOffset="3701.39">860 327 24575,'3'0'0,"3"2"0,2 5 0,2 2 0,-2 1 0,-2 1 0,-2-2-8191</inkml:trace>
+  <inkml:trace contextRef="#ctx0" brushRef="#br0" timeOffset="3892.15">799 191 24575,'0'0'-8191</inkml:trace>
+  <inkml:trace contextRef="#ctx0" brushRef="#br0" timeOffset="4241.26">936 101 24575,'1'0'0,"4"2"0,3 0 0,2 4 0,2 3 0,-1 4 0,3 5 0,1 2 0,-1 2 0,0 2 0,2 1 0,-1-3 0,0-3 0,-3-4-8191</inkml:trace>
+  <inkml:trace contextRef="#ctx0" brushRef="#br0" timeOffset="4527.32">1188 218 24575,'2'3'0,"2"3"0,3 3 0,1 6 0,-1 0 0,-1 1 0,-2-2 0,-2-2-8191</inkml:trace>
+  <inkml:trace contextRef="#ctx0" brushRef="#br0" timeOffset="4701.39">1133 115 24575,'0'0'-8191</inkml:trace>
+  <inkml:trace contextRef="#ctx0" brushRef="#br0" timeOffset="5034.37">1311 34 24575,'3'7'0,"0"4"0,0 3 0,-1 2 0,2 7 0,1 1 0,3 0 0,0-4 0,2-7 0,0-7 0,-2-4-8191</inkml:trace>
+  <inkml:trace contextRef="#ctx0" brushRef="#br0" timeOffset="5335.19">1366 82 24575,'-2'1'0,"-3"4"0,-1 6 0,-2 2 0,0 1 0,0 2 0,0-1 0,1-3-8191</inkml:trace>
+  <inkml:trace contextRef="#ctx0" brushRef="#br0" timeOffset="6051.22">1414 94 24575,'22'14'0,"-20"-12"0,0 0 0,1 0 0,0-1 0,-1 1 0,1 0 0,0-1 0,5 2 0,-7-3 0,0 0 0,0 0 0,0 0 0,-1 0 0,1 0 0,0 0 0,0 0 0,0 0 0,0 0 0,0-1 0,0 1 0,0 0 0,0-1 0,-1 1 0,1-1 0,0 1 0,0-1 0,0 1 0,-1-1 0,1 0 0,0 1 0,-1-1 0,1 0 0,-1 0 0,1 1 0,-1-1 0,1 0 0,-1 0 0,1 0 0,-1 0 0,1 0 0,2-12 0,0 1 0,0-1 0,-1 0 0,-1 0 0,0-24 0,-1 31 0,19 77 0,-9-39 0,-1 1 0,-2 0 0,-1 0 0,-2 1 0,0 33 0,-4-61 0,0 0 0,-1-1 0,0 1 0,0 0 0,0-1 0,-1 1 0,1-1 0,-1 1 0,-5 7 0,6-11 0,0-1 0,0 1 0,0-1 0,0 0 0,0 1 0,-1-1 0,1 0 0,0 0 0,-1 0 0,1 0 0,-1 0 0,1 0 0,-1 0 0,1-1 0,-1 1 0,0 0 0,1-1 0,-1 1 0,0-1 0,0 0 0,1 0 0,-1 1 0,0-1 0,0 0 0,1-1 0,-1 1 0,0 0 0,0 0 0,1-1 0,-1 1 0,0-1 0,1 1 0,-1-1 0,1 0 0,-3-1 0,-10-5-1365,2 0-5461</inkml:trace>
+</inkml:ink>
+</file>
+
 <file path=word/ink/ink2.xml><?xml version="1.0" encoding="utf-8"?>
 <inkml:ink xmlns:inkml="http://www.w3.org/2003/InkML">
   <inkml:definitions>
@@ -4942,6 +8878,92 @@
     </inkml:brush>
   </inkml:definitions>
   <inkml:trace contextRef="#ctx0" brushRef="#br0">2107 721 24575,'-7'1'0,"0"0"0,-1 1 0,1 0 0,0 0 0,0 1 0,1 0 0,-1 0 0,-9 6 0,-16 7 0,-49 16 0,-2-3 0,0-4 0,-2-4 0,0-3 0,-1-4 0,-143 5 0,-447-22 0,607 0 0,1-2 0,1-3 0,0-4 0,-70-20 0,125 28 0,1 0 0,-1-1 0,1 0 0,0-1 0,1 0 0,-1-1 0,1 0 0,1 0 0,-1-1 0,1-1 0,-9-11 0,12 13 0,0-1 0,1 0 0,0 0 0,0 0 0,1-1 0,0 1 0,0-1 0,1 0 0,0 0 0,1-1 0,0 1 0,0-1 0,1 1 0,0-18 0,2 12 0,0-19 0,1 1 0,8-41 0,-8 65 0,0 0 0,1 0 0,0 0 0,0 0 0,1 0 0,0 1 0,0 0 0,1 0 0,0 0 0,1 0 0,0 1 0,0 0 0,7-6 0,8-3 0,0 1 0,0 0 0,2 2 0,-1 1 0,2 1 0,-1 1 0,30-8 0,182-36 0,-82 22 0,553-97 0,-560 115 0,226 8 0,-230 8 0,-132-2 0,0 1 0,1 0 0,-1 1 0,0 0 0,0 0 0,-1 1 0,1 1 0,-1 0 0,1 0 0,-1 0 0,11 9 0,0 1 0,0 2 0,-1 0 0,25 28 0,-38-38 0,-1 0 0,0 0 0,0 1 0,-1 0 0,0 0 0,0 0 0,0 0 0,-1 1 0,0 0 0,-1-1 0,1 1 0,-2 0 0,2 12 0,-2-7 0,-1-1 0,0 1 0,-1 0 0,-1 0 0,0 0 0,0-1 0,-8 22 0,-7 6 0,-1 0 0,-2-1 0,-48 68 0,49-77-21,10-15-427,0 0 0,-15 15 0,11-15-6378</inkml:trace>
+</inkml:ink>
+</file>
+
+<file path=word/ink/ink20.xml><?xml version="1.0" encoding="utf-8"?>
+<inkml:ink xmlns:inkml="http://www.w3.org/2003/InkML">
+  <inkml:definitions>
+    <inkml:context xml:id="ctx0">
+      <inkml:inkSource xml:id="inkSrc0">
+        <inkml:traceFormat>
+          <inkml:channel name="X" type="integer" min="-2.14748E9" max="2.14748E9" units="cm"/>
+          <inkml:channel name="Y" type="integer" min="-2.14748E9" max="2.14748E9" units="cm"/>
+          <inkml:channel name="F" type="integer" max="32767" units="dev"/>
+        </inkml:traceFormat>
+        <inkml:channelProperties>
+          <inkml:channelProperty channel="X" name="resolution" value="1000" units="1/cm"/>
+          <inkml:channelProperty channel="Y" name="resolution" value="1000" units="1/cm"/>
+          <inkml:channelProperty channel="F" name="resolution" value="0" units="1/dev"/>
+        </inkml:channelProperties>
+      </inkml:inkSource>
+      <inkml:timestamp xml:id="ts0" timeString="2026-07-22T20:14:50.986"/>
+    </inkml:context>
+    <inkml:brush xml:id="br0">
+      <inkml:brushProperty name="width" value="0.025" units="cm"/>
+      <inkml:brushProperty name="height" value="0.025" units="cm"/>
+      <inkml:brushProperty name="color" value="#FFC114"/>
+    </inkml:brush>
+  </inkml:definitions>
+  <inkml:trace contextRef="#ctx0" brushRef="#br0">3219 1150 24575,'-2'1'0,"-20"11"0,-1-2 0,0 0 0,-29 7 0,-246 44 0,186-41 0,8-3 0,-164 4 0,-109-22 0,147-2 0,-127 5 0,-367-4 0,693-1 0,0-2 0,0-1 0,0-1 0,1-1 0,1-2 0,-32-15 0,-16-4 0,39 16 0,1-2 0,-52-28 0,76 36 0,2 0 0,-1-1 0,1-1 0,0 0 0,1 0 0,0-1 0,1 0 0,0-1 0,0 0 0,-12-22 0,18 27 0,0 0 0,1 0 0,0-1 0,1 1 0,-1-1 0,1 1 0,0-1 0,1 0 0,0 1 0,0-1 0,0 0 0,1 1 0,0-1 0,0 0 0,0 1 0,4-8 0,-3 6 0,1 0 0,1 1 0,-1 0 0,1 0 0,0 0 0,1 0 0,-1 1 0,1 0 0,1-1 0,-1 2 0,1-1 0,0 1 0,8-6 0,14-6 0,2 2 0,0 0 0,0 2 0,54-15 0,135-22 0,-148 36 0,209-35 0,2 13 0,491-1 0,-28 40 0,-615 4 0,1 6 0,-1 6 0,-1 5 0,-2 6 0,189 70 0,-271-84 0,-2 1 0,0 2 0,-1 2 0,57 37 0,-93-52 0,1-1 0,-2 1 0,1 0 0,-1 1 0,0-1 0,0 1 0,-1 0 0,1 1 0,-2-1 0,1 0 0,-1 1 0,0 0 0,-1 0 0,0 0 0,0 0 0,1 13 0,-2-10 0,0 1 0,-1-1 0,-1 0 0,1 0 0,-2 1 0,0-1 0,0 0 0,-1 0 0,0-1 0,-1 1 0,-8 17 0,6-20 0,1 0 0,-1-1 0,0 0 0,0 0 0,-1 0 0,0-1 0,0 0 0,-1 0 0,0-1 0,0 0 0,0-1 0,0 1 0,-1-2 0,-12 5 0,-1-1 0,-1-1 0,1 0 0,-1-2 0,-42 2 0,-82-2-341,0-6 0,0-7-1,-200-37 1,303 37-6485</inkml:trace>
+  <inkml:trace contextRef="#ctx0" brushRef="#br0" timeOffset="1330.53">2195 510 24575,'2'-15'0,"1"-1"0,0 1 0,2 0 0,-1 1 0,2-1 0,0 1 0,12-21 0,-13 26 0,9-21 0,1 2 0,2 0 0,1 0 0,1 2 0,1 0 0,1 1 0,31-27 0,-46 46 0,11-9 0,1 0 0,0 1 0,38-22 0,-83 49 0,0-1 0,-1-1 0,-40 9 0,59-20 0,17-7 0,17-7 0,32-9 0,43-22 0,-114 65 0,-18 31 0,18-26-1365,10-16-5461</inkml:trace>
+</inkml:ink>
+</file>
+
+<file path=word/ink/ink21.xml><?xml version="1.0" encoding="utf-8"?>
+<inkml:ink xmlns:inkml="http://www.w3.org/2003/InkML">
+  <inkml:definitions>
+    <inkml:context xml:id="ctx0">
+      <inkml:inkSource xml:id="inkSrc0">
+        <inkml:traceFormat>
+          <inkml:channel name="X" type="integer" min="-2.14748E9" max="2.14748E9" units="cm"/>
+          <inkml:channel name="Y" type="integer" min="-2.14748E9" max="2.14748E9" units="cm"/>
+          <inkml:channel name="F" type="integer" max="32767" units="dev"/>
+        </inkml:traceFormat>
+        <inkml:channelProperties>
+          <inkml:channelProperty channel="X" name="resolution" value="1000" units="1/cm"/>
+          <inkml:channelProperty channel="Y" name="resolution" value="1000" units="1/cm"/>
+          <inkml:channelProperty channel="F" name="resolution" value="0" units="1/dev"/>
+        </inkml:channelProperties>
+      </inkml:inkSource>
+      <inkml:timestamp xml:id="ts0" timeString="2026-07-22T20:14:00.592"/>
+    </inkml:context>
+    <inkml:brush xml:id="br0">
+      <inkml:brushProperty name="width" value="0.025" units="cm"/>
+      <inkml:brushProperty name="height" value="0.025" units="cm"/>
+      <inkml:brushProperty name="color" value="#E71224"/>
+    </inkml:brush>
+  </inkml:definitions>
+  <inkml:trace contextRef="#ctx0" brushRef="#br0">240 2123 24575,'-5'0'0,"-1"-1"0,1 0 0,0-1 0,-1 1 0,1-1 0,0 0 0,0 0 0,0-1 0,0 0 0,0 0 0,1 0 0,-7-6 0,-50-48 0,59 55 0,-6-7 0,0-1 0,1 1 0,0-1 0,0 0 0,1-1 0,-8-19 0,5 6 0,2 0 0,-6-29 0,11 44 0,-3-14 0,1 0 0,1 0 0,-1-34 0,4 35 0,0-6 0,5-37 0,-3 55 0,0 0 0,0 0 0,1 1 0,0-1 0,1 1 0,0 0 0,8-12 0,-6 9 0,2 2 0,-1-1 0,1 1 0,1 0 0,0 1 0,10-9 0,-11 12 0,-1 1 0,1 1 0,0-1 0,0 1 0,1 0 0,-1 1 0,1 0 0,-1 1 0,14-3 0,62-12 0,-34 6 0,0 1 0,1 3 0,61 0 0,-70 7 0,0 0 0,63 7 0,-91-5 0,-1 1 0,0 0 0,0 1 0,0 0 0,0 1 0,-1 1 0,1 0 0,19 13 0,13 11 0,-33-23 0,1 0 0,-1 1 0,-1 1 0,0 0 0,0 1 0,-1 0 0,0 0 0,-1 1 0,15 21 0,-14-13 0,0 1 0,-1 0 0,-2 0 0,9 31 0,-12-30 0,0 0 0,-1 0 0,-1 0 0,-1 0 0,-1 1 0,-1-1 0,-1 0 0,-1 1 0,0-1 0,-2-1 0,0 1 0,-2 0 0,0-1 0,-1-1 0,-1 1 0,-1-1 0,0-1 0,-20 25 0,25-36 0,-12 16 0,-33 34 0,43-50 0,-1 0 0,-1-1 0,1 0 0,-1 0 0,0-1 0,0 0 0,0 0 0,-12 3 0,-12 2 0,0-1 0,0-1 0,-1-2 0,0-1 0,0-2 0,-42-2 0,36 0 0,28 0 0,1 0 0,-1-1 0,0 0 0,0-1 0,0-1 0,1 0 0,-1 0 0,1-1 0,-1 0 0,1-1 0,-13-6 0,7-1 30,-1 0 0,2-1 0,-19-17 0,29 24-165,1-1 0,-1-1 0,1 1 0,0-1 0,1 1 0,-1-2 0,1 1 0,1 0 0,-1-1 0,-4-14 0,6 12-6691</inkml:trace>
+  <inkml:trace contextRef="#ctx0" brushRef="#br0" timeOffset="1932.99">554 1324 24575,'1'-8'0,"-1"0"0,1 1 0,1-1 0,0 1 0,0-1 0,0 1 0,1 0 0,0-1 0,0 2 0,5-9 0,7-8 0,27-32 0,-14 19 0,4-5 0,1 2 0,2 1 0,1 2 0,2 1 0,2 2 0,50-32 0,-37 30 0,18-11 0,83-71 0,-132 97 0,-2 0 0,0-1 0,-1 0 0,-1-2 0,-1 0 0,-2-1 0,23-45 0,-14 14 0,19-62 0,-36 94 0,0-1 0,-2 0 0,-1-1 0,-1 1 0,-1-36 0,-1 60 0,-1-1 0,0 1 0,0-1 0,0 1 0,0 0 0,0-1 0,0 1 0,0-1 0,0 1 0,0-1 0,0 1 0,0 0 0,0-1 0,0 1 0,0-1 0,-1 1 0,1 0 0,0-1 0,0 1 0,0-1 0,-1 1 0,1 0 0,0-1 0,0 1 0,-1 0 0,1 0 0,0-1 0,-1 1 0,1 0 0,0-1 0,-1 1 0,1 0 0,0 0 0,-1 0 0,1 0 0,-1-1 0,-13 12 0,-17 32 0,26-36 0,-42 52 0,58-68 0,26-27 0,-27 20 0,0-2 0,9-22 0,5-10 0,-24 50 0,1 0 0,-1 0 0,0 0 0,1 0 0,-1 0 0,0 1 0,1-1 0,-1 0 0,0 0 0,1 0 0,-1 1 0,0-1 0,0 0 0,1 0 0,-1 0 0,0 1 0,0-1 0,0 0 0,1 1 0,-1-1 0,0 0 0,0 0 0,0 1 0,0-1 0,0 0 0,1 1 0,-1-1 0,0 0 0,0 1 0,0-1 0,0 0 0,0 1 0,0-1 0,0 0 0,0 1 0,0-1 0,0 0 0,-1 1 0,7 24 0,-5-20 0,6 20 0,0-2 0,2 1 0,1-1 0,15 27 0,-23-47-170,-1 0-1,1-1 0,0 0 1,0 1-1,0-1 0,0 0 1,5 4-1,5 2-6655</inkml:trace>
+</inkml:ink>
+</file>
+
+<file path=word/ink/ink22.xml><?xml version="1.0" encoding="utf-8"?>
+<inkml:ink xmlns:inkml="http://www.w3.org/2003/InkML">
+  <inkml:definitions>
+    <inkml:context xml:id="ctx0">
+      <inkml:inkSource xml:id="inkSrc0">
+        <inkml:traceFormat>
+          <inkml:channel name="X" type="integer" min="-2.14748E9" max="2.14748E9" units="cm"/>
+          <inkml:channel name="Y" type="integer" min="-2.14748E9" max="2.14748E9" units="cm"/>
+          <inkml:channel name="F" type="integer" max="32767" units="dev"/>
+        </inkml:traceFormat>
+        <inkml:channelProperties>
+          <inkml:channelProperty channel="X" name="resolution" value="1000" units="1/cm"/>
+          <inkml:channelProperty channel="Y" name="resolution" value="1000" units="1/cm"/>
+          <inkml:channelProperty channel="F" name="resolution" value="0" units="1/dev"/>
+        </inkml:channelProperties>
+      </inkml:inkSource>
+      <inkml:timestamp xml:id="ts0" timeString="2026-07-22T20:18:23.181"/>
+    </inkml:context>
+    <inkml:brush xml:id="br0">
+      <inkml:brushProperty name="width" value="0.025" units="cm"/>
+      <inkml:brushProperty name="height" value="0.025" units="cm"/>
+      <inkml:brushProperty name="color" value="#FFC114"/>
+    </inkml:brush>
+  </inkml:definitions>
+  <inkml:trace contextRef="#ctx0" brushRef="#br0">1896 455 24575,'-4'2'0,"0"0"0,0 0 0,0 0 0,0 0 0,0-1 0,-1 0 0,1 0 0,0 0 0,-1 0 0,-7-1 0,-8 3 0,16-2 0,-91 18 0,0-4 0,-150 4 0,-621-21 0,832 1 0,1-1 0,0-2 0,0-1 0,0-1 0,0-2 0,-34-14 0,46 14 0,1 0 0,0-2 0,1 0 0,0-1 0,0-1 0,1-1 0,1 0 0,0-2 0,1 0 0,-18-22 0,30 31 0,0 1 0,1-1 0,0-1 0,0 1 0,0 0 0,1-1 0,0 1 0,0-1 0,1 0 0,-1 0 0,2 0 0,-1 0 0,1 1 0,0-1 0,0 0 0,1 0 0,0 0 0,0 0 0,1 0 0,-1 1 0,2-1 0,-1 1 0,1-1 0,0 1 0,0 0 0,0 0 0,1 0 0,0 1 0,0-1 0,1 1 0,0 0 0,0 0 0,0 0 0,0 1 0,1 0 0,-1 0 0,8-4 0,18-4 0,0 0 0,1 2 0,0 2 0,1 0 0,35-2 0,0-2 0,22 1 0,0 3 0,171 7 0,-118 4 0,38-5 0,167 5 0,-336-2 0,0 1 0,0 0 0,0 1 0,0 1 0,0 0 0,0 0 0,-1 1 0,0 1 0,0-1 0,-1 2 0,1 0 0,-1 0 0,-1 1 0,0 0 0,12 13 0,-7-5 0,0 0 0,-2 1 0,0 0 0,0 1 0,-2 1 0,0-1 0,-2 2 0,9 24 0,-14-33 0,0 0 0,0 1 0,-1-1 0,-1 1 0,0 0 0,0 0 0,-1-1 0,-1 1 0,0 0 0,-4 16 0,4-23 0,0 1 0,-1-1 0,0 0 0,0 0 0,-1 0 0,1 0 0,-1-1 0,0 1 0,0-1 0,-1 1 0,1-1 0,-1 0 0,0 0 0,0-1 0,0 1 0,-1-1 0,1 0 0,-1 0 0,0 0 0,0-1 0,0 0 0,0 0 0,0 0 0,-6 1 0,-35 3-1365,27-6-5461</inkml:trace>
 </inkml:ink>
 </file>
 
@@ -5005,11 +9027,11 @@
   <inkml:trace contextRef="#ctx0" brushRef="#br0" timeOffset="3005.94">1009 206 24575,'1'-4'0,"-1"1"0,1 0 0,0 0 0,0 0 0,0 0 0,0 0 0,0 0 0,1 0 0,-1 1 0,1-1 0,0 0 0,0 1 0,0 0 0,0-1 0,0 1 0,1 0 0,-1 0 0,1 0 0,-1 0 0,1 0 0,-1 1 0,1-1 0,0 1 0,0 0 0,0 0 0,0 0 0,0 0 0,0 0 0,0 0 0,5 1 0,-4-1 0,-1 0 0,0 1 0,1-1 0,-1 1 0,1 0 0,-1 0 0,0 0 0,1 1 0,-1-1 0,0 1 0,1 0 0,-1 0 0,0 0 0,0 0 0,1 0 0,-1 1 0,0 0 0,-1-1 0,1 1 0,0 0 0,0 0 0,-1 1 0,1-1 0,-1 0 0,0 1 0,0 0 0,0-1 0,3 6 0,-3 0 0,0 1 0,0-1 0,-1 1 0,0 0 0,0 0 0,-1 0 0,0-1 0,-1 1 0,0 0 0,0 0 0,-1-1 0,0 1 0,-1-1 0,0 1 0,0-1 0,-1 0 0,-5 9 0,7-15 5,0 0-1,1-1 0,-1 1 0,0-1 1,0 0-1,0 1 0,0-1 0,-1 0 1,1 0-1,0-1 0,0 1 1,-1 0-1,1-1 0,0 1 0,-1-1 1,1 0-1,0 0 0,-1 0 1,1 0-1,0 0 0,-1 0 0,1-1 1,0 1-1,-1-1 0,1 1 0,0-1 1,-3-1-1,-3-1-190,1 0 1,0 0-1,0-1 0,0 0 1,0 0-1,1 0 1,-7-6-1,5 2-6640</inkml:trace>
   <inkml:trace contextRef="#ctx0" brushRef="#br0" timeOffset="3696.86">1256 277 24575,'1'-1'0,"-1"1"0,0 0 0,0-1 0,1 1 0,-1 0 0,0-1 0,1 1 0,-1 0 0,1 0 0,-1-1 0,0 1 0,1 0 0,-1 0 0,1 0 0,-1-1 0,0 1 0,1 0 0,-1 0 0,1 0 0,-1 0 0,1 0 0,-1 0 0,1 0 0,-1 0 0,0 0 0,1 0 0,-1 0 0,1 0 0,-1 1 0,1-1 0,-1 0 0,0 0 0,2 1 0,8 14 0,-1 22 0,-9-37 0,2 3 0,2-8 0,9-24 0,14-26 0,-25 51 0,0 0 0,0 0 0,1 0 0,0 1 0,-1-1 0,1 1 0,0 0 0,1-1 0,4-2 0,-7 5-105,1 0 0,0 1 0,0-1 0,-1 1 0,1-1 0,0 1 0,0 0 0,0 0 0,0 0 0,-1 0 0,1 0 0,2 1 0,1-1-6721</inkml:trace>
   <inkml:trace contextRef="#ctx0" brushRef="#br0" timeOffset="3984.68">1433 199 24575,'0'2'0,"0"4"0,0 2 0,0 3 0,0 4 0,0 2 0,0-2 0,0-1 0,0-3 0,0-5 0,0-5 0</inkml:trace>
-  <inkml:trace contextRef="#ctx0" brushRef="#br0" timeOffset="4193.73">1433 133 24575</inkml:trace>
+  <inkml:trace contextRef="#ctx0" brushRef="#br0" timeOffset="4193.72">1433 133 24575</inkml:trace>
   <inkml:trace contextRef="#ctx0" brushRef="#br0" timeOffset="4746.81">1529 214 24575,'1'3'0,"1"1"0,-1 0 0,0 0 0,0 0 0,0 0 0,0 0 0,-1 0 0,0 8 0,1-1 0,0-5 0,-1-2 0,1 0 0,-1 0 0,1 1 0,0-1 0,0 0 0,3 5 0,-4-8 0,0-1 0,0 0 0,1 0 0,-1 0 0,0 0 0,0 1 0,0-1 0,0 0 0,1 0 0,-1 0 0,0 0 0,0 0 0,0 0 0,0 0 0,1 1 0,-1-1 0,0 0 0,0 0 0,1 0 0,-1 0 0,0 0 0,0 0 0,0 0 0,1 0 0,-1 0 0,0 0 0,0 0 0,0 0 0,1 0 0,-1 0 0,0-1 0,0 1 0,1 0 0,-1 0 0,0 0 0,0 0 0,0 0 0,0 0 0,1 0 0,-1-1 0,0 1 0,0 0 0,14-20 0,0-12-248,18-62-1,-26 75-619,1-2-5958</inkml:trace>
   <inkml:trace contextRef="#ctx0" brushRef="#br0" timeOffset="5507.21">1739 150 24575,'-2'1'0,"0"0"0,0-1 0,0 1 0,0 0 0,0 0 0,0 0 0,0 0 0,0 0 0,0 0 0,1 1 0,-1-1 0,1 1 0,-1-1 0,1 1 0,-1 0 0,1-1 0,0 1 0,0 0 0,0 0 0,-2 3 0,-16 41 0,13-1 0,5-43 0,1 0 0,0 0 0,0 0 0,0 0 0,0 0 0,0 0 0,0 0 0,0-1 0,1 1 0,-1 0 0,1 0 0,-1 0 0,1 0 0,0-1 0,0 1 0,0 0 0,0-1 0,0 1 0,0-1 0,0 1 0,2 1 0,-2-3 0,0 0 0,0 0 0,0 0 0,0 1 0,0-1 0,0 0 0,0 0 0,0-1 0,0 1 0,-1 0 0,1 0 0,0 0 0,0-1 0,0 1 0,0 0 0,0-1 0,0 1 0,0-1 0,0 1 0,-1-1 0,1 1 0,0-1 0,0 0 0,-1 1 0,1-1 0,0 0 0,-1 0 0,1 1 0,-1-1 0,2-2 0,16-27 0,-17 28 0,4-10 0,-1-1 0,0 1 0,-1-1 0,4-21 0,-5 23 0,-4 36 0,2 1 0,5 46 0,-5-71 0,0 0 0,0-1 0,0 1 0,0 0 0,0 0 0,0 0 0,1-1 0,-1 1 0,0 0 0,1-1 0,-1 1 0,0 0 0,1-1 0,-1 1 0,1 0 0,-1-1 0,1 1 0,-1-1 0,1 1 0,-1 0 0,1-1 0,0 0 0,-1 1 0,1-1 0,0 1 0,-1-1 0,2 1 0,-1-1 0,1-1 0,-1 1 0,0 0 0,0 0 0,1 0 0,-1-1 0,0 1 0,0 0 0,1-1 0,-1 0 0,0 1 0,0-1 0,0 1 0,2-3 0,5-4 0,0 0 0,0-1 0,7-9 0,-10 12 0,7-8-1365,0 2-5461</inkml:trace>
   <inkml:trace contextRef="#ctx0" brushRef="#br0" timeOffset="5992.92">1934 91 24575,'-10'31'0,"2"-8"0,6-16 0,0-1 0,1 1 0,0-1 0,1 1 0,0 0 0,-1-1 0,2 1 0,-1 0 0,3 7 0,-3-14 0,0 1 0,1 0 0,-1-1 0,1 1 0,-1-1 0,1 1 0,-1-1 0,1 0 0,-1 1 0,1-1 0,-1 1 0,1-1 0,0 0 0,-1 0 0,1 1 0,-1-1 0,1 0 0,0 0 0,-1 0 0,1 0 0,0 1 0,-1-1 0,1 0 0,0 0 0,0 0 0,-1-1 0,1 1 0,0 0 0,-1 0 0,1 0 0,-1 0 0,1-1 0,0 1 0,-1 0 0,1-1 0,0 1 0,-1 0 0,1-1 0,-1 1 0,2-1 0,0-1 0,1 0 0,-1 1 0,0-1 0,1 0 0,-1 0 0,0 0 0,0-1 0,2-2 0,1-7-1365,0 1-5461</inkml:trace>
-  <inkml:trace contextRef="#ctx0" brushRef="#br0" timeOffset="6247.47">1951 155 24575,'-3'2'0,"-2"0"0,-4 1 0,-1 1 0,-1-1 0,0-1 0,1-1 0,1 0 0,1 0 0,-1-1 0,1 3 0,1 0-8191</inkml:trace>
+  <inkml:trace contextRef="#ctx0" brushRef="#br0" timeOffset="6247.46">1951 155 24575,'-3'2'0,"-2"0"0,-4 1 0,-1 1 0,-1-1 0,0-1 0,1-1 0,1 0 0,1 0 0,-1-1 0,1 3 0,1 0-8191</inkml:trace>
   <inkml:trace contextRef="#ctx0" brushRef="#br0" timeOffset="7240.18">2058 190 24575,'18'-20'0,"10"-13"0,-28 32 0,1 0 0,-1 1 0,1-1 0,-1 0 0,0 0 0,1 0 0,-1 0 0,0 0 0,1 0 0,-1 0 0,0 0 0,0 1 0,0-1 0,0 0 0,0 0 0,0 0 0,0 0 0,0 0 0,0 0 0,-1 0 0,1 0 0,0 0 0,-1 0 0,1 0 0,0 0 0,-1 1 0,1-1 0,-1 0 0,1 0 0,-1 1 0,0-1 0,1 0 0,-1 0 0,-1 0 0,1 0 0,1 1 0,-1 0 0,1-1 0,-1 1 0,1 0 0,-1-1 0,1 1 0,-1 0 0,0 0 0,1 0 0,-1-1 0,0 1 0,1 0 0,-1 0 0,0 0 0,1 0 0,-1 0 0,0 0 0,1 0 0,-1 1 0,0-1 0,1 0 0,-1 0 0,1 0 0,-1 1 0,0-1 0,0 1 0,-15 16 0,-4 24 0,19-37 6,0 0-1,0 0 1,0 1-1,0-1 0,1 0 1,0 1-1,0-1 1,0 0-1,1 1 1,-1-1-1,1 0 1,0 0-1,0 1 0,1-1 1,-1 0-1,1 0 1,0 0-1,0-1 1,0 1-1,0 0 1,6 5-1,-6-6-55,0-1 1,1 0-1,0 0 1,-1 0-1,1-1 1,0 1-1,0 0 1,0-1-1,0 0 1,0 0-1,0 0 1,0 0-1,0 0 1,0-1-1,1 1 1,-1-1-1,0 0 1,0 0-1,1 0 1,-1 0-1,0-1 1,0 1-1,1-1 1,-1 0-1,0 0 1,0 0-1,0 0 1,0-1-1,3-1 1,3-2-6777</inkml:trace>
   <inkml:trace contextRef="#ctx0" brushRef="#br0" timeOffset="7754.6">2447 1 24575,'2'2'0,"0"2"0,0 4 0,-1 6 0,0 5 0,0 4 0,-1 6 0,1 0 0,-1 0 0,0-3 0,-1-3 0,1-4 0,1-5 0,2-6 0</inkml:trace>
   <inkml:trace contextRef="#ctx0" brushRef="#br0" timeOffset="8252.34">2518 128 24575,'-1'0'0,"1"0"0,-1 0 0,0 0 0,0 0 0,1 0 0,-1 0 0,0 0 0,0 0 0,1 0 0,-1 0 0,0 1 0,1-1 0,-1 0 0,0 0 0,1 1 0,-1-1 0,0 0 0,1 1 0,-1-1 0,0 1 0,1-1 0,-1 1 0,0 0 0,-16 13 0,16-13 0,1 0 0,-1-1 0,1 1 0,-1 0 0,1 0 0,0 0 0,-1-1 0,1 1 0,0 0 0,-1 0 0,1 0 0,0 0 0,0 0 0,0-1 0,0 1 0,0 0 0,0 0 0,0 0 0,0 0 0,0 0 0,0 0 0,1 0 0,-1-1 0,0 1 0,1 0 0,-1 0 0,0 0 0,1-1 0,-1 1 0,1 0 0,-1 0 0,1-1 0,0 1 0,-1 0 0,1-1 0,0 1 0,-1-1 0,1 1 0,1 0 0,40 25 0,-26-17 0,-14-7-136,0-1-1,1 1 1,-1-1-1,1 0 1,-1 0-1,1 0 1,-1 0-1,1 0 0,3 0 1,0 0-6690</inkml:trace>
@@ -5024,7 +9046,7 @@
   <inkml:trace contextRef="#ctx0" brushRef="#br0" timeOffset="14081.65">2621 557 24575,'0'4'0,"0"5"0,0 5 0,-1 9 0,0 2 0,0 1 0,0-1 0,1-4 0,-1-4 0,3-6 0,2-5 0,2-6 0,2-4 0,2-3 0,-1-4 0,-1 1-8191</inkml:trace>
   <inkml:trace contextRef="#ctx0" brushRef="#br0" timeOffset="14308.03">2675 605 24575,'-4'1'0,"-4"1"0,-2 0 0,-4 1 0,-2 1 0,-5 0 0,1 0 0,1-1 0,2 0 0,2-2 0,4 0-8191</inkml:trace>
   <inkml:trace contextRef="#ctx0" brushRef="#br0" timeOffset="15246.5">2688 622 24575,'33'1'0,"33"0"0,-60-2 0,-1 1 0,1-1 0,-1 0 0,0 0 0,0-1 0,1 0 0,-1 0 0,0 0 0,6-3 0,-9 3 0,-1 0 0,1-1 0,0 1 0,0 0 0,-1 0 0,1-1 0,-1 1 0,0-1 0,0 0 0,0 1 0,0-1 0,0 0 0,-1 1 0,1-1 0,-1 0 0,0 0 0,1 1 0,-1-1 0,0 0 0,-1 0 0,1 0 0,-1 1 0,1-1 0,-1 0 0,-2-4 0,3 5 0,0 1 0,-1-1 0,1 1 0,-1-1 0,1 1 0,-1-1 0,0 1 0,1-1 0,-1 1 0,0 0 0,0 0 0,0-1 0,0 1 0,0 0 0,0 0 0,-1 0 0,1 0 0,0 0 0,0 0 0,-1 1 0,1-1 0,-1 0 0,1 1 0,0-1 0,-1 0 0,0 1 0,1 0 0,-1-1 0,1 1 0,-1 0 0,1 0 0,-1 0 0,1 0 0,-1 0 0,0 0 0,1 1 0,-1-1 0,1 0 0,-1 1 0,1-1 0,-1 1 0,1 0 0,0-1 0,-1 1 0,1 0 0,0 0 0,-2 1 0,-5 4 0,1 1 0,0 0 0,1 0 0,-1 1 0,1 0 0,1 0 0,-1 0 0,2 1 0,-1-1 0,1 1 0,0 0 0,1 1 0,0-1 0,0 1 0,1-1 0,0 1 0,1 0 0,0 19 0,1-28 4,1 1-1,-1 0 1,0 0-1,1-1 1,0 1-1,-1 0 1,1-1-1,0 1 1,0-1-1,0 1 1,0-1 0,0 1-1,0-1 1,0 0-1,1 1 1,-1-1-1,0 0 1,1 0-1,-1 0 1,1 0-1,0 0 1,-1 0-1,1-1 1,-1 1-1,1 0 1,0-1-1,0 1 1,-1-1-1,1 0 1,0 0-1,0 1 1,-1-1-1,3-1 1,6 2-301,-1-2 0,1 1 0,-1-1 0,19-5 0,-12 2-6529</inkml:trace>
-  <inkml:trace contextRef="#ctx0" brushRef="#br0" timeOffset="16092.36">2999 601 24575,'-3'0'0,"1"1"0,-1 0 0,0-1 0,1 1 0,-1 0 0,1 0 0,-1 1 0,1-1 0,0 0 0,-1 1 0,1-1 0,0 1 0,0 0 0,0 0 0,0 0 0,0 0 0,1 0 0,-1 0 0,1 1 0,-1-1 0,1 0 0,0 1 0,0-1 0,0 1 0,0 0 0,0-1 0,0 1 0,1-1 0,-1 1 0,1 5 0,0-7 0,0 1 0,0 0 0,0-1 0,0 1 0,0-1 0,0 1 0,0 0 0,0-1 0,1 1 0,-1-1 0,1 1 0,-1-1 0,1 1 0,0-1 0,0 1 0,0-1 0,-1 0 0,1 1 0,0-1 0,3 2 0,-3-2 0,1 0 0,0 0 0,-1-1 0,1 1 0,0-1 0,0 0 0,0 1 0,0-1 0,-1 0 0,1 0 0,0 0 0,0 0 0,0 0 0,0-1 0,-1 1 0,1 0 0,0-1 0,0 0 0,-1 1 0,1-1 0,0 0 0,-1 0 0,3-1 0,1-1 0,0-1 0,-1 1 0,1-1 0,-1 0 0,0 0 0,0 0 0,0-1 0,-1 1 0,1-1 0,-1 0 0,0 0 0,-1 0 0,4-9 0,1-4 0,-1-1 0,7-32 0,-9 32 0,-1 0 0,0 0 0,-1 0 0,-2-37 0,-3 60 0,0 0 0,0 0 0,1 1 0,-1-1 0,1 0 0,-2 6 0,-8 27 0,1 1 0,2 0 0,2 1 0,-4 47 0,11-85-2,0-1-1,0 1 1,0 0 0,0 0-1,0-1 1,0 1-1,0 0 1,0-1-1,0 1 1,0 0-1,0 0 1,0-1 0,1 1-1,-1 0 1,0-1-1,0 1 1,1 0-1,-1-1 1,0 1 0,1-1-1,-1 1 1,1 0-1,-1-1 1,1 1-1,-1-1 1,1 1-1,-1-1 1,1 0 0,0 1-1,-1-1 1,1 1-1,0-1 1,1 0 18,0 1 1,0-1 0,0 0 0,0 0-1,0 0 1,0-1 0,0 1-1,0 0 1,0-1 0,0 1-1,3-2 1,3-2-265,-1 1 1,0-1-1,0 0 1,0-1-1,8-5 1,-9 3-6579</inkml:trace>
+  <inkml:trace contextRef="#ctx0" brushRef="#br0" timeOffset="16092.35">2999 601 24575,'-3'0'0,"1"1"0,-1 0 0,0-1 0,1 1 0,-1 0 0,1 0 0,-1 1 0,1-1 0,0 0 0,-1 1 0,1-1 0,0 1 0,0 0 0,0 0 0,0 0 0,0 0 0,1 0 0,-1 0 0,1 1 0,-1-1 0,1 0 0,0 1 0,0-1 0,0 1 0,0 0 0,0-1 0,0 1 0,1-1 0,-1 1 0,1 5 0,0-7 0,0 1 0,0 0 0,0-1 0,0 1 0,0-1 0,0 1 0,0 0 0,0-1 0,1 1 0,-1-1 0,1 1 0,-1-1 0,1 1 0,0-1 0,0 1 0,0-1 0,-1 0 0,1 1 0,0-1 0,3 2 0,-3-2 0,1 0 0,0 0 0,-1-1 0,1 1 0,0-1 0,0 0 0,0 1 0,0-1 0,-1 0 0,1 0 0,0 0 0,0 0 0,0 0 0,0-1 0,-1 1 0,1 0 0,0-1 0,0 0 0,-1 1 0,1-1 0,0 0 0,-1 0 0,3-1 0,1-1 0,0-1 0,-1 1 0,1-1 0,-1 0 0,0 0 0,0 0 0,0-1 0,-1 1 0,1-1 0,-1 0 0,0 0 0,-1 0 0,4-9 0,1-4 0,-1-1 0,7-32 0,-9 32 0,-1 0 0,0 0 0,-1 0 0,-2-37 0,-3 60 0,0 0 0,0 0 0,1 1 0,-1-1 0,1 0 0,-2 6 0,-8 27 0,1 1 0,2 0 0,2 1 0,-4 47 0,11-85-2,0-1-1,0 1 1,0 0 0,0 0-1,0-1 1,0 1-1,0 0 1,0-1-1,0 1 1,0 0-1,0 0 1,0-1 0,1 1-1,-1 0 1,0-1-1,0 1 1,1 0-1,-1-1 1,0 1 0,1-1-1,-1 1 1,1 0-1,-1-1 1,1 1-1,-1-1 1,1 1-1,-1-1 1,1 0 0,0 1-1,-1-1 1,1 1-1,0-1 1,1 0 18,0 1 1,0-1 0,0 0 0,0 0-1,0 0 1,0-1 0,0 1-1,0 0 1,0-1 0,0 1-1,3-2 1,3-2-265,-1 1 1,0-1-1,0 0 1,0-1-1,8-5 1,-9 3-6579</inkml:trace>
 </inkml:ink>
 </file>
 
@@ -5137,7 +9159,7 @@
     </inkml:brush>
   </inkml:definitions>
   <inkml:trace contextRef="#ctx0" brushRef="#br0">725 396 24575,'42'84'0,"-41"-84"0,-1 1 0,0-1 0,1 1 0,-1 0 0,0-1 0,1 0 0,-1 1 0,1-1 0,-1 1 0,1-1 0,-1 0 0,1 1 0,-1-1 0,1 0 0,-1 1 0,1-1 0,0 0 0,-1 0 0,1 0 0,0 1 0,-1-1 0,1 0 0,-1 0 0,1 0 0,0 0 0,-1 0 0,1 0 0,0 0 0,0-1 0,16-13 0,8-31 0,-22 39 0,-1 1 0,1 0 0,0-1 0,0 1 0,1 1 0,-1-1 0,1 1 0,0-1 0,0 1 0,0 0 0,9-6 0,-11 9 0,0 0 0,0 1 0,-1-1 0,1 0 0,0 1 0,0-1 0,0 1 0,0 0 0,0-1 0,0 1 0,0 0 0,0 0 0,0 0 0,-1 1 0,1-1 0,0 0 0,0 1 0,0-1 0,0 1 0,0-1 0,-1 1 0,1 0 0,0 0 0,0 0 0,-1 0 0,1 0 0,-1 0 0,1 1 0,-1-1 0,0 0 0,1 1 0,-1-1 0,0 1 0,0 0 0,0-1 0,1 3 0,34 67-1365,-27-57-5461</inkml:trace>
-  <inkml:trace contextRef="#ctx0" brushRef="#br0" timeOffset="797.34">1021 390 24575,'0'-3'0,"0"0"0,0-1 0,0 1 0,0-1 0,0 0 0,1 1 0,-1-1 0,1 1 0,0-1 0,2-4 0,-2 7 0,0 0 0,0 0 0,1-1 0,-1 1 0,0 0 0,1 0 0,-1 1 0,1-1 0,-1 0 0,1 0 0,-1 1 0,1-1 0,0 1 0,-1-1 0,1 1 0,0 0 0,-1 0 0,1 0 0,0 0 0,0 0 0,-1 0 0,3 0 0,0 0 0,-1 0 0,1 0 0,-1 1 0,1-1 0,-1 1 0,1 0 0,-1-1 0,1 2 0,-1-1 0,0 0 0,1 1 0,-1-1 0,0 1 0,0 0 0,0 0 0,0 0 0,-1 1 0,1-1 0,0 1 0,-1-1 0,3 5 0,-2-2 0,-1-1 0,0 1 0,0-1 0,-1 1 0,1 0 0,-1 0 0,0-1 0,0 1 0,-1 0 0,1 0 0,-1 0 0,0 0 0,-1 0 0,1 0 0,-2 6 0,2-10 0,-1 0 0,1 0 0,0 0 0,0 1 0,-1-1 0,1 0 0,-1 0 0,1 0 0,-1 0 0,1 0 0,-1 0 0,0 0 0,1 0 0,-1 0 0,0 0 0,0 0 0,0 0 0,0 0 0,0 0 0,0-1 0,0 1 0,0 0 0,0-1 0,-2 2 0,1-2 0,-1 0 0,1 0 0,0 1 0,0-1 0,0-1 0,-1 1 0,1 0 0,0 0 0,0-1 0,0 1 0,-1-1 0,-2-1 0,-1-1 0,0 0 0,1 0 0,0 0 0,-1 0 0,1-1 0,1 0 0,-1 0 0,0 0 0,-4-6 0,6 4-170,0 1-1,0-1 0,1-1 1,0 1-1,0 0 0,0 0 1,-1-14-1,2 10-6655</inkml:trace>
+  <inkml:trace contextRef="#ctx0" brushRef="#br0" timeOffset="797.33">1021 390 24575,'0'-3'0,"0"0"0,0-1 0,0 1 0,0-1 0,0 0 0,1 1 0,-1-1 0,1 1 0,0-1 0,2-4 0,-2 7 0,0 0 0,0 0 0,1-1 0,-1 1 0,0 0 0,1 0 0,-1 1 0,1-1 0,-1 0 0,1 0 0,-1 1 0,1-1 0,0 1 0,-1-1 0,1 1 0,0 0 0,-1 0 0,1 0 0,0 0 0,0 0 0,-1 0 0,3 0 0,0 0 0,-1 0 0,1 0 0,-1 1 0,1-1 0,-1 1 0,1 0 0,-1-1 0,1 2 0,-1-1 0,0 0 0,1 1 0,-1-1 0,0 1 0,0 0 0,0 0 0,0 0 0,-1 1 0,1-1 0,0 1 0,-1-1 0,3 5 0,-2-2 0,-1-1 0,0 1 0,0-1 0,-1 1 0,1 0 0,-1 0 0,0-1 0,0 1 0,-1 0 0,1 0 0,-1 0 0,0 0 0,-1 0 0,1 0 0,-2 6 0,2-10 0,-1 0 0,1 0 0,0 0 0,0 1 0,-1-1 0,1 0 0,-1 0 0,1 0 0,-1 0 0,1 0 0,-1 0 0,0 0 0,1 0 0,-1 0 0,0 0 0,0 0 0,0 0 0,0 0 0,0 0 0,0-1 0,0 1 0,0 0 0,0-1 0,-2 2 0,1-2 0,-1 0 0,1 0 0,0 1 0,0-1 0,0-1 0,-1 1 0,1 0 0,0 0 0,0-1 0,0 1 0,-1-1 0,-2-1 0,-1-1 0,0 0 0,1 0 0,0 0 0,-1 0 0,1-1 0,1 0 0,-1 0 0,0 0 0,-4-6 0,6 4-170,0 1-1,0-1 0,1-1 1,0 1-1,0 0 0,0 0 1,-1-14-1,2 10-6655</inkml:trace>
   <inkml:trace contextRef="#ctx0" brushRef="#br0" timeOffset="1787.62">1124 796 24575,'5'6'0,"-1"1"0,0 0 0,0 0 0,-1 0 0,0 0 0,0 1 0,0-1 0,-1 1 0,2 14 0,3 9 0,-2-12 0,-4-13 0,1 0 0,-1 0 0,1 0 0,0 0 0,0 0 0,1-1 0,6 11 0,1-55 0,-8 35 0,0-1 0,0 1 0,1-1 0,-1 1 0,1 0 0,0 0 0,0 0 0,1 0 0,-1 1 0,1 0 0,0-1 0,0 1 0,0 0 0,0 1 0,1-1 0,7-3 0,-9 5 0,-1 0 0,1 0 0,-1 0 0,1 1 0,0-1 0,-1 1 0,1-1 0,0 1 0,-1 0 0,1 0 0,0 0 0,0 1 0,-1-1 0,1 1 0,0-1 0,-1 1 0,1 0 0,-1 0 0,1 0 0,-1 0 0,1 0 0,-1 1 0,0-1 0,1 1 0,-1-1 0,0 1 0,0 0 0,0 0 0,-1 0 0,1 0 0,0 0 0,1 3 0,-2-3 0,1 1 0,-1-1 0,0 0 0,0 0 0,0 1 0,-1-1 0,1 0 0,-1 1 0,1-1 0,-1 1 0,0-1 0,1 1 0,-2-1 0,1 1 0,0-1 0,0 1 0,-1-1 0,1 1 0,-1-1 0,0 0 0,1 1 0,-1-1 0,-1 0 0,1 1 0,0-1 0,0 0 0,-1 0 0,1 0 0,-1 0 0,0 0 0,1-1 0,-1 1 0,0 0 0,0-1 0,-4 3 0,1-1 0,0 1 0,-1-1 0,0 0 0,0 0 0,1-1 0,-2 1 0,1-1 0,0-1 0,0 1 0,-1-1 0,1 0 0,-12 0 0,16-2 5,0 1-1,0-1 1,1 0-1,-1 1 0,0-1 1,1 0-1,-1 0 1,1 0-1,-1-1 1,1 1-1,0 0 0,-1 0 1,1-1-1,0 1 1,0-1-1,0 1 1,0-1-1,0 1 1,0-1-1,0 0 0,1 0 1,-1 1-1,0-1 1,1 0-1,0 0 1,-1-3-1,-5-50-1489,6 44-5341</inkml:trace>
   <inkml:trace contextRef="#ctx0" brushRef="#br0" timeOffset="2617.33">1433 874 24575,'4'1'0,"1"0"0,-1 0 0,1 1 0,-1-1 0,0 1 0,0 0 0,0 0 0,0 1 0,0-1 0,0 1 0,0 0 0,-1 0 0,1 0 0,-1 0 0,4 6 0,0-2 0,-5-8 0,-3-5 11,1 0 0,0 0 0,0-1 0,1 1 0,-1 0 0,1 0-1,1 0 1,-1 0 0,1 0 0,3-6 0,-5 9-70,1 1-1,1-1 1,-1 1-1,0-1 1,0 1 0,1 0-1,0 0 1,-1 0-1,1-1 1,0 1 0,0 1-1,0-1 1,0 0-1,0 0 1,1 1 0,-1-1-1,0 1 1,1 0-1,-1 0 1,1 0 0,-1 0-1,1 0 1,0 1-1,4-2 1,1 2-6767</inkml:trace>
   <inkml:trace contextRef="#ctx0" brushRef="#br0" timeOffset="3265.92">1644 862 24575,'0'-3'0,"0"-1"0,0 1 0,0-1 0,1 1 0,-1 0 0,1-1 0,0 1 0,0 0 0,0-1 0,0 1 0,1 0 0,-1 0 0,1 0 0,0 0 0,0 0 0,3-3 0,-4 4 0,1 1 0,0 0 0,0 0 0,0 0 0,0 0 0,0 0 0,0 1 0,0-1 0,0 1 0,0-1 0,0 1 0,1-1 0,-1 1 0,0 0 0,0 0 0,0 0 0,1 1 0,-1-1 0,0 0 0,0 1 0,0-1 0,0 1 0,0 0 0,0 0 0,0 0 0,0 0 0,2 1 0,0 1 0,1-1 0,-1 1 0,0 0 0,0 1 0,0-1 0,0 1 0,-1-1 0,0 1 0,1 0 0,-1 0 0,-1 1 0,1-1 0,-1 1 0,1-1 0,-1 1 0,2 8 0,-3-10 0,-1-1 0,1 0 0,-1 1 0,1-1 0,-1 0 0,0 1 0,0-1 0,-1 0 0,1 1 0,0-1 0,-1 0 0,1 1 0,-1-1 0,0 0 0,0 0 0,0 0 0,0 1 0,0-1 0,0 0 0,0 0 0,-1 0 0,1-1 0,-1 1 0,1 0 0,-1-1 0,0 1 0,0-1 0,0 1 0,0-1 0,0 0 0,0 1 0,0-1 0,0 0 0,0-1 0,0 1 0,-1 0 0,-3 0 0,2 0 6,0 0 0,1 0 0,-1 0 0,0 0 0,0-1 0,1 0 0,-1 0 0,0 0 0,0 0 0,0-1 0,0 1 0,1-1 0,-1 0 0,0 0 0,1 0 0,-1-1 0,1 1 0,-1-1 0,-3-2 0,4 2-77,1-1 1,-1 0-1,1 1 0,0-1 0,0 0 1,0 0-1,0 0 0,0-1 1,1 1-1,-1 0 0,1 0 0,0-1 1,0 1-1,0-1 0,1 1 1,-1-1-1,1 0 0,0 1 0,0-1 1,0-4-1,1-9-6755</inkml:trace>

</xml_diff>

<commit_message>
learned chisel in foundry
</commit_message>
<xml_diff>
--- a/3 - Foundry.docx
+++ b/3 - Foundry.docx
@@ -1533,9 +1533,6 @@
         <w:t xml:space="preserve"> </w:t>
       </w:r>
       <w:r>
-        <w:rPr>
-          <w:color w:val="39BAE6"/>
-        </w:rPr>
         <w:t>solidity</w:t>
       </w:r>
       <w:r>
@@ -1561,9 +1558,6 @@
       <w:pPr>
         <w:pStyle w:val="codesnippet"/>
         <w:framePr w:wrap="notBeside"/>
-        <w:rPr>
-          <w:color w:val="BFBDB6"/>
-        </w:rPr>
       </w:pPr>
     </w:p>
     <w:p>
@@ -1611,9 +1605,6 @@
         <w:t xml:space="preserve"> </w:t>
       </w:r>
       <w:r>
-        <w:rPr>
-          <w:color w:val="5FEF3B"/>
-        </w:rPr>
         <w:t>"forge-std/Script.sol"</w:t>
       </w:r>
       <w:r>
@@ -1668,9 +1659,6 @@
         <w:t xml:space="preserve"> </w:t>
       </w:r>
       <w:r>
-        <w:rPr>
-          <w:color w:val="5FEF3B"/>
-        </w:rPr>
         <w:t>"../src/SimpleStorage.sol"</w:t>
       </w:r>
       <w:r>
@@ -1684,9 +1672,6 @@
       <w:pPr>
         <w:pStyle w:val="codesnippet"/>
         <w:framePr w:wrap="notBeside"/>
-        <w:rPr>
-          <w:color w:val="BFBDB6"/>
-        </w:rPr>
       </w:pPr>
     </w:p>
     <w:p>
@@ -1710,9 +1695,6 @@
         <w:t xml:space="preserve"> </w:t>
       </w:r>
       <w:r>
-        <w:rPr>
-          <w:color w:val="FFD664"/>
-        </w:rPr>
         <w:t>DeploySimpleStorage</w:t>
       </w:r>
       <w:r>
@@ -1734,9 +1716,6 @@
         <w:t xml:space="preserve"> </w:t>
       </w:r>
       <w:r>
-        <w:rPr>
-          <w:color w:val="FFD664"/>
-        </w:rPr>
         <w:t>Script</w:t>
       </w:r>
       <w:r>
@@ -1761,9 +1740,6 @@
         <w:t xml:space="preserve">    </w:t>
       </w:r>
       <w:r>
-        <w:rPr>
-          <w:color w:val="FFB289"/>
-        </w:rPr>
         <w:t>function</w:t>
       </w:r>
       <w:r>
@@ -1785,9 +1761,6 @@
         <w:t xml:space="preserve">() </w:t>
       </w:r>
       <w:r>
-        <w:rPr>
-          <w:color w:val="FFB289"/>
-        </w:rPr>
         <w:t>external</w:t>
       </w:r>
       <w:r>
@@ -1825,14 +1798,8 @@
       <w:pPr>
         <w:pStyle w:val="codesnippet"/>
         <w:framePr w:wrap="notBeside"/>
-        <w:rPr>
-          <w:color w:val="BFBDB6"/>
-        </w:rPr>
-      </w:pPr>
-      <w:r>
-        <w:rPr>
-          <w:color w:val="BFBDB6"/>
-        </w:rPr>
+      </w:pPr>
+      <w:r>
         <w:t>        vm</w:t>
       </w:r>
       <w:r>
@@ -1848,9 +1815,6 @@
         <w:t>startBroadcast</w:t>
       </w:r>
       <w:r>
-        <w:rPr>
-          <w:color w:val="BFBDB6"/>
-        </w:rPr>
         <w:t>();</w:t>
       </w:r>
     </w:p>
@@ -1858,14 +1822,8 @@
       <w:pPr>
         <w:pStyle w:val="codesnippet"/>
         <w:framePr w:wrap="notBeside"/>
-        <w:rPr>
-          <w:color w:val="BFBDB6"/>
-        </w:rPr>
-      </w:pPr>
-      <w:r>
-        <w:rPr>
-          <w:color w:val="BFBDB6"/>
-        </w:rPr>
+      </w:pPr>
+      <w:r>
         <w:t xml:space="preserve">        SimpleStorage simpleStorage </w:t>
       </w:r>
       <w:r>
@@ -1875,9 +1833,6 @@
         <w:t>=</w:t>
       </w:r>
       <w:r>
-        <w:rPr>
-          <w:color w:val="BFBDB6"/>
-        </w:rPr>
         <w:t xml:space="preserve"> </w:t>
       </w:r>
       <w:r>
@@ -1887,9 +1842,6 @@
         <w:t>new</w:t>
       </w:r>
       <w:r>
-        <w:rPr>
-          <w:color w:val="BFBDB6"/>
-        </w:rPr>
         <w:t xml:space="preserve"> </w:t>
       </w:r>
       <w:r>
@@ -1899,9 +1851,6 @@
         <w:t>SimpleStorage</w:t>
       </w:r>
       <w:r>
-        <w:rPr>
-          <w:color w:val="BFBDB6"/>
-        </w:rPr>
         <w:t>();</w:t>
       </w:r>
     </w:p>
@@ -1909,14 +1858,8 @@
       <w:pPr>
         <w:pStyle w:val="codesnippet"/>
         <w:framePr w:wrap="notBeside"/>
-        <w:rPr>
-          <w:color w:val="BFBDB6"/>
-        </w:rPr>
-      </w:pPr>
-      <w:r>
-        <w:rPr>
-          <w:color w:val="BFBDB6"/>
-        </w:rPr>
+      </w:pPr>
+      <w:r>
         <w:t>        vm</w:t>
       </w:r>
       <w:r>
@@ -1932,9 +1875,6 @@
         <w:t>stopBroadcast</w:t>
       </w:r>
       <w:r>
-        <w:rPr>
-          <w:color w:val="BFBDB6"/>
-        </w:rPr>
         <w:t>();</w:t>
       </w:r>
     </w:p>
@@ -1942,14 +1882,8 @@
       <w:pPr>
         <w:pStyle w:val="codesnippet"/>
         <w:framePr w:wrap="notBeside"/>
-        <w:rPr>
-          <w:color w:val="BFBDB6"/>
-        </w:rPr>
-      </w:pPr>
-      <w:r>
-        <w:rPr>
-          <w:color w:val="BFBDB6"/>
-        </w:rPr>
+      </w:pPr>
+      <w:r>
         <w:t xml:space="preserve">        </w:t>
       </w:r>
       <w:r>
@@ -1959,9 +1893,6 @@
         <w:t>return</w:t>
       </w:r>
       <w:r>
-        <w:rPr>
-          <w:color w:val="BFBDB6"/>
-        </w:rPr>
         <w:t xml:space="preserve"> simpleStorage;</w:t>
       </w:r>
     </w:p>
@@ -1969,14 +1900,8 @@
       <w:pPr>
         <w:pStyle w:val="codesnippet"/>
         <w:framePr w:wrap="notBeside"/>
-        <w:rPr>
-          <w:color w:val="BFBDB6"/>
-        </w:rPr>
-      </w:pPr>
-      <w:r>
-        <w:rPr>
-          <w:color w:val="BFBDB6"/>
-        </w:rPr>
+      </w:pPr>
+      <w:r>
         <w:t>    }</w:t>
       </w:r>
     </w:p>
@@ -1984,14 +1909,8 @@
       <w:pPr>
         <w:pStyle w:val="codesnippet"/>
         <w:framePr w:wrap="notBeside"/>
-        <w:rPr>
-          <w:color w:val="BFBDB6"/>
-        </w:rPr>
-      </w:pPr>
-      <w:r>
-        <w:rPr>
-          <w:color w:val="BFBDB6"/>
-        </w:rPr>
+      </w:pPr>
+      <w:r>
         <w:t>}</w:t>
       </w:r>
     </w:p>
@@ -2159,6 +2078,7 @@
         <w:pStyle w:val="bashsnippet"/>
       </w:pPr>
       <w:r>
+        <w:lastRenderedPageBreak/>
         <w:t>0: contract SimpleStorage 0x5b73C5498c1E3b4dbA84de0F1833c4a029d90519</w:t>
       </w:r>
     </w:p>
@@ -2172,7 +2092,6 @@
         <w:pStyle w:val="bashsnippet"/>
       </w:pPr>
       <w:r>
-        <w:lastRenderedPageBreak/>
         <w:t>## Setting up 1 EVM.</w:t>
       </w:r>
     </w:p>
@@ -2455,6 +2374,7 @@
     </w:p>
     <w:p>
       <w:r>
+        <w:lastRenderedPageBreak/>
         <w:t>You start Anvil:</w:t>
       </w:r>
     </w:p>
@@ -2466,7 +2386,6 @@
         </w:numPr>
       </w:pPr>
       <w:r>
-        <w:lastRenderedPageBreak/>
         <w:t xml:space="preserve">Anvil creates a </w:t>
       </w:r>
       <w:r>
@@ -2891,12 +2810,12 @@
     </w:p>
     <w:p>
       <w:r>
+        <w:lastRenderedPageBreak/>
         <w:t>As we know transactions have a nonce that show the # of Txs from an acc. If I run anvil, deploy, hit ctrl + c and re-run anvil and deploy the nonce in both runs will be 0x0 because these are deployed on 2 different blockchains!</w:t>
       </w:r>
     </w:p>
     <w:p>
       <w:r>
-        <w:lastRenderedPageBreak/>
         <w:t>The first run Tx in broadcast:</w:t>
       </w:r>
     </w:p>
@@ -3248,6 +3167,7 @@
         <w:pStyle w:val="bashsnippet"/>
       </w:pPr>
       <w:r>
+        <w:lastRenderedPageBreak/>
         <w:t>&lt;/&gt; bash</w:t>
       </w:r>
     </w:p>
@@ -3271,7 +3191,6 @@
         <w:rPr>
           <w:color w:val="EE0000"/>
         </w:rPr>
-        <w:lastRenderedPageBreak/>
         <w:t>Interact with the deployed contract</w:t>
       </w:r>
     </w:p>
@@ -3585,6 +3504,7 @@
     </w:p>
     <w:p>
       <w:r>
+        <w:lastRenderedPageBreak/>
         <w:t>The template:</w:t>
       </w:r>
     </w:p>
@@ -5046,6 +4966,7 @@
           <w:b/>
           <w:bCs/>
         </w:rPr>
+        <w:lastRenderedPageBreak/>
         <w:t>Staging tests</w:t>
       </w:r>
       <w:r>
@@ -5445,6 +5366,7 @@
         <w:jc w:val="center"/>
       </w:pPr>
       <w:r>
+        <w:lastRenderedPageBreak/>
         <mc:AlternateContent>
           <mc:Choice Requires="wpi">
             <w:drawing>
@@ -5544,7 +5466,6 @@
         <w:rPr>
           <w:color w:val="EE0000"/>
         </w:rPr>
-        <w:lastRenderedPageBreak/>
         <w:t>For better modular programming and syncing between deployment script and tests we do something like this:</w:t>
       </w:r>
     </w:p>
@@ -6748,6 +6669,7 @@
         <w:pStyle w:val="Heading1"/>
       </w:pPr>
       <w:r>
+        <w:lastRenderedPageBreak/>
         <w:t>Mock</w:t>
       </w:r>
     </w:p>
@@ -6778,11 +6700,7 @@
     </w:p>
     <w:p>
       <w:r>
-        <w:t xml:space="preserve">Now to find the chainID and use the already deployed contract from that chain is easy. The question is how do we deal with the mock in our own local anvil? Simple we deploy a mock </w:t>
-      </w:r>
-      <w:r>
-        <w:lastRenderedPageBreak/>
-        <w:t>PriceConverter contract in our anvil using a helperconfig script like this:</w:t>
+        <w:t>Now to find the chainID and use the already deployed contract from that chain is easy. The question is how do we deal with the mock in our own local anvil? Simple we deploy a mock PriceConverter contract in our anvil using a helperconfig script like this:</w:t>
       </w:r>
       <w:r>
         <w:t xml:space="preserve"> (why a script? Because we want to use the </w:t>
@@ -9069,7 +8987,6 @@
           <w:szCs w:val="20"/>
           <w14:ligatures w14:val="none"/>
         </w:rPr>
-        <w:lastRenderedPageBreak/>
         <w:t xml:space="preserve">        </w:t>
       </w:r>
       <w:r>
@@ -10244,6 +10161,7 @@
           <w:szCs w:val="20"/>
           <w14:ligatures w14:val="none"/>
         </w:rPr>
+        <w:lastRenderedPageBreak/>
         <w:t>import</w:t>
       </w:r>
       <w:r>
@@ -10766,7 +10684,6 @@
           <w:szCs w:val="20"/>
           <w14:ligatures w14:val="none"/>
         </w:rPr>
-        <w:lastRenderedPageBreak/>
         <w:t xml:space="preserve">        </w:t>
       </w:r>
       <w:r>
@@ -11440,6 +11357,7 @@
     </w:p>
     <w:p>
       <w:r>
+        <w:lastRenderedPageBreak/>
         <w:t xml:space="preserve">  </w:t>
       </w:r>
       <w:hyperlink r:id="rId59" w:tgtFrame="_blank" w:history="1">
@@ -11802,7 +11720,6 @@
           <w:szCs w:val="20"/>
           <w14:ligatures w14:val="none"/>
         </w:rPr>
-        <w:lastRenderedPageBreak/>
         <w:t>        crowdFund</w:t>
       </w:r>
       <w:r>
@@ -12155,6 +12072,14 @@
       </w:r>
     </w:p>
     <w:p>
+      <w:pPr>
+        <w:pStyle w:val="Heading1"/>
+      </w:pPr>
+      <w:r>
+        <w:t>Summary so far</w:t>
+      </w:r>
+    </w:p>
+    <w:p>
       <w:r>
         <w:t>a summary of how foundry works so far:</w:t>
       </w:r>
@@ -12162,7 +12087,7 @@
     <w:p>
       <w:r>
         <w:drawing>
-          <wp:inline distT="0" distB="0" distL="0" distR="0" wp14:anchorId="618B31FB" wp14:editId="5FA5EA2B">
+          <wp:inline distT="0" distB="0" distL="0" distR="0" wp14:anchorId="618B31FB" wp14:editId="7B39AD74">
             <wp:extent cx="5943600" cy="2700655"/>
             <wp:effectExtent l="0" t="0" r="0" b="4445"/>
             <wp:docPr id="74043256" name="Picture 1"/>
@@ -12211,9 +12136,283 @@
         </w:drawing>
       </w:r>
     </w:p>
+    <w:p>
+      <w:pPr>
+        <w:pStyle w:val="Heading1"/>
+      </w:pPr>
+      <w:r>
+        <w:t>Chisel</w:t>
+      </w:r>
+    </w:p>
+    <w:p>
+      <w:r>
+        <w:t>Instead of jumping to remix to test small code. You can use chisel like this:</w:t>
+      </w:r>
+    </w:p>
+    <w:p>
+      <w:pPr>
+        <w:pStyle w:val="bashsnippet"/>
+      </w:pPr>
+      <w:r>
+        <w:t>&lt;/&gt; bash</w:t>
+      </w:r>
+    </w:p>
+    <w:p>
+      <w:pPr>
+        <w:pStyle w:val="bashsnippet"/>
+      </w:pPr>
+      <w:r>
+        <w:lastRenderedPageBreak/>
+        <w:t>Chisel</w:t>
+      </w:r>
+    </w:p>
+    <w:p>
+      <w:pPr>
+        <w:pStyle w:val="Heading1"/>
+      </w:pPr>
+      <w:r>
+        <w:t>How to make the methods cheaper</w:t>
+      </w:r>
+    </w:p>
+    <w:p>
+      <w:r>
+        <w:t>Run the following command in your terminal:</w:t>
+      </w:r>
+    </w:p>
+    <w:p>
+      <w:pPr>
+        <w:pStyle w:val="bashsnippet"/>
+      </w:pPr>
+      <w:r>
+        <w:t>forge snapshot --mt testWithdrawFromASingleFunder</w:t>
+      </w:r>
+    </w:p>
+    <w:p>
+      <w:r>
+        <w:t>You'll see that a new file appeared in your project root folder: .gas-snapshot. When you open it you'll find the following:</w:t>
+      </w:r>
+    </w:p>
+    <w:p>
+      <w:pPr>
+        <w:pStyle w:val="codesnippet"/>
+        <w:framePr w:wrap="notBeside"/>
+      </w:pPr>
+      <w:r>
+        <w:t>FundMeTest:testWithdrawFromASingleFunder() (gas: 84824)</w:t>
+      </w:r>
+    </w:p>
+    <w:p>
+      <w:r>
+        <w:t>To test how much a line of code costs gas we can do this:</w:t>
+      </w:r>
+    </w:p>
+    <w:p>
+      <w:r>
+        <w:t>At the top of your FundMeTest contract define the following variable:</w:t>
+      </w:r>
+    </w:p>
+    <w:p>
+      <w:pPr>
+        <w:pStyle w:val="codesnippet"/>
+        <w:framePr w:wrap="notBeside"/>
+      </w:pPr>
+      <w:r>
+        <w:t>uint256 constant GAS_PRICE = 1;</w:t>
+      </w:r>
+      <w:r>
+        <w:t xml:space="preserve"> //go fetch this from etherscan</w:t>
+      </w:r>
+    </w:p>
     <w:p/>
+    <w:p>
+      <w:r>
+        <w:t>and we can have the cost of each function:</w:t>
+      </w:r>
+    </w:p>
+    <w:p>
+      <w:pPr>
+        <w:pStyle w:val="codesnippet"/>
+        <w:framePr w:wrap="notBeside"/>
+      </w:pPr>
+      <w:r>
+        <w:t xml:space="preserve">    </w:t>
+      </w:r>
+      <w:proofErr w:type="spellStart"/>
+      <w:r>
+        <w:t>vm.txGasPrice</w:t>
+      </w:r>
+      <w:proofErr w:type="spellEnd"/>
+      <w:r>
+        <w:t xml:space="preserve">(2 </w:t>
+      </w:r>
+      <w:proofErr w:type="spellStart"/>
+      <w:r>
+        <w:t>gwei</w:t>
+      </w:r>
+      <w:proofErr w:type="spellEnd"/>
+      <w:r>
+        <w:t>);</w:t>
+      </w:r>
+    </w:p>
+    <w:p>
+      <w:pPr>
+        <w:pStyle w:val="codesnippet"/>
+        <w:framePr w:wrap="notBeside"/>
+      </w:pPr>
+      <w:r>
+        <w:t xml:space="preserve">    </w:t>
+      </w:r>
+    </w:p>
+    <w:p>
+      <w:pPr>
+        <w:pStyle w:val="codesnippet"/>
+        <w:framePr w:wrap="notBeside"/>
+      </w:pPr>
+      <w:r>
+        <w:t xml:space="preserve">    uint256 </w:t>
+      </w:r>
+      <w:proofErr w:type="spellStart"/>
+      <w:r>
+        <w:t>gasStart</w:t>
+      </w:r>
+      <w:proofErr w:type="spellEnd"/>
+      <w:r>
+        <w:t xml:space="preserve"> = </w:t>
+      </w:r>
+      <w:proofErr w:type="spellStart"/>
+      <w:r>
+        <w:t>gasleft</w:t>
+      </w:r>
+      <w:proofErr w:type="spellEnd"/>
+      <w:r>
+        <w:t>();</w:t>
+      </w:r>
+    </w:p>
+    <w:p>
+      <w:pPr>
+        <w:pStyle w:val="codesnippet"/>
+        <w:framePr w:wrap="notBeside"/>
+      </w:pPr>
+      <w:r>
+        <w:t xml:space="preserve">    </w:t>
+      </w:r>
+      <w:proofErr w:type="spellStart"/>
+      <w:r>
+        <w:t>myContract.doStuff</w:t>
+      </w:r>
+      <w:proofErr w:type="spellEnd"/>
+      <w:r>
+        <w:t>();</w:t>
+      </w:r>
+    </w:p>
+    <w:p>
+      <w:pPr>
+        <w:pStyle w:val="codesnippet"/>
+        <w:framePr w:wrap="notBeside"/>
+      </w:pPr>
+      <w:r>
+        <w:t xml:space="preserve">    uint256 </w:t>
+      </w:r>
+      <w:proofErr w:type="spellStart"/>
+      <w:r>
+        <w:t>gasEnd</w:t>
+      </w:r>
+      <w:proofErr w:type="spellEnd"/>
+      <w:r>
+        <w:t xml:space="preserve"> = </w:t>
+      </w:r>
+      <w:proofErr w:type="spellStart"/>
+      <w:r>
+        <w:t>gasleft</w:t>
+      </w:r>
+      <w:proofErr w:type="spellEnd"/>
+      <w:r>
+        <w:t>();</w:t>
+      </w:r>
+    </w:p>
+    <w:p>
+      <w:pPr>
+        <w:pStyle w:val="codesnippet"/>
+        <w:framePr w:wrap="notBeside"/>
+      </w:pPr>
+      <w:r>
+        <w:t xml:space="preserve">    </w:t>
+      </w:r>
+    </w:p>
+    <w:p>
+      <w:pPr>
+        <w:pStyle w:val="codesnippet"/>
+        <w:framePr w:wrap="notBeside"/>
+      </w:pPr>
+      <w:r>
+        <w:t xml:space="preserve">    uint256 </w:t>
+      </w:r>
+      <w:proofErr w:type="spellStart"/>
+      <w:r>
+        <w:t>gasCost</w:t>
+      </w:r>
+      <w:proofErr w:type="spellEnd"/>
+      <w:r>
+        <w:t xml:space="preserve"> = (</w:t>
+      </w:r>
+      <w:proofErr w:type="spellStart"/>
+      <w:r>
+        <w:t>gasStart</w:t>
+      </w:r>
+      <w:proofErr w:type="spellEnd"/>
+      <w:r>
+        <w:t xml:space="preserve"> - </w:t>
+      </w:r>
+      <w:proofErr w:type="spellStart"/>
+      <w:r>
+        <w:t>gasEnd</w:t>
+      </w:r>
+      <w:proofErr w:type="spellEnd"/>
+      <w:r>
+        <w:t xml:space="preserve">) * </w:t>
+      </w:r>
+      <w:proofErr w:type="spellStart"/>
+      <w:r>
+        <w:t>tx.gasprice</w:t>
+      </w:r>
+      <w:proofErr w:type="spellEnd"/>
+      <w:r>
+        <w:t>;</w:t>
+      </w:r>
+    </w:p>
     <w:p/>
-    <w:p/>
+    <w:p>
+      <w:r>
+        <w:t>you can use this command to inspect storage Layout, abi , etc:</w:t>
+      </w:r>
+    </w:p>
+    <w:p>
+      <w:pPr>
+        <w:pStyle w:val="bashsnippet"/>
+      </w:pPr>
+      <w:r>
+        <w:t>&lt;/&gt; bash</w:t>
+      </w:r>
+    </w:p>
+    <w:p>
+      <w:pPr>
+        <w:pStyle w:val="bashsnippet"/>
+      </w:pPr>
+      <w:r>
+        <w:t>forge inspect CrowdFund storageLayout</w:t>
+      </w:r>
+    </w:p>
+    <w:p>
+      <w:pPr>
+        <w:pStyle w:val="bashsnippet"/>
+      </w:pPr>
+      <w:r>
+        <w:t xml:space="preserve">forge inspect CrowdFund </w:t>
+      </w:r>
+      <w:r>
+        <w:t>abi</w:t>
+      </w:r>
+    </w:p>
     <w:p/>
     <w:sectPr>
       <w:pgSz w:w="12240" w:h="15840"/>
@@ -13663,7 +13862,6 @@
   <w:style w:type="character" w:default="1" w:styleId="DefaultParagraphFont">
     <w:name w:val="Default Paragraph Font"/>
     <w:uiPriority w:val="1"/>
-    <w:semiHidden/>
     <w:unhideWhenUsed/>
   </w:style>
   <w:style w:type="table" w:default="1" w:styleId="TableNormal">
@@ -13693,7 +13891,7 @@
     <w:link w:val="codesnippetChar"/>
     <w:autoRedefine/>
     <w:qFormat/>
-    <w:rsid w:val="001F35E5"/>
+    <w:rsid w:val="001E6376"/>
     <w:pPr>
       <w:framePr w:wrap="notBeside" w:vAnchor="text" w:hAnchor="text" w:y="1"/>
       <w:shd w:val="clear" w:color="auto" w:fill="040E48"/>
@@ -13701,17 +13899,20 @@
     </w:pPr>
     <w:rPr>
       <w:rFonts w:ascii="Consolas" w:hAnsi="Consolas"/>
-      <w:sz w:val="16"/>
+      <w:sz w:val="20"/>
+      <w:szCs w:val="28"/>
     </w:rPr>
   </w:style>
   <w:style w:type="character" w:customStyle="1" w:styleId="codesnippetChar">
     <w:name w:val="code snippet Char"/>
     <w:basedOn w:val="DefaultParagraphFont"/>
     <w:link w:val="codesnippet"/>
-    <w:rsid w:val="001F35E5"/>
+    <w:rsid w:val="001E6376"/>
     <w:rPr>
       <w:rFonts w:ascii="Consolas" w:hAnsi="Consolas"/>
-      <w:sz w:val="16"/>
+      <w:noProof/>
+      <w:sz w:val="20"/>
+      <w:szCs w:val="28"/>
       <w:shd w:val="clear" w:color="auto" w:fill="040E48"/>
     </w:rPr>
   </w:style>
@@ -13808,8 +14009,10 @@
     <w:rsid w:val="00D73D66"/>
     <w:rPr>
       <w:rFonts w:ascii="Ubuntu Mono" w:hAnsi="Ubuntu Mono"/>
+      <w:noProof/>
       <w:color w:val="1F3864" w:themeColor="accent1" w:themeShade="80"/>
       <w:sz w:val="20"/>
+      <w:szCs w:val="28"/>
       <w:shd w:val="clear" w:color="auto" w:fill="FFF2CC" w:themeFill="accent4" w:themeFillTint="33"/>
     </w:rPr>
   </w:style>

</xml_diff>

<commit_message>
Learned NatSpec, new Uniswap concepts
</commit_message>
<xml_diff>
--- a/3 - Foundry.docx
+++ b/3 - Foundry.docx
@@ -132,7 +132,7 @@
           <w:r>
             <w:fldChar w:fldCharType="separate"/>
           </w:r>
-          <w:hyperlink w:anchor="_Toc237025154" w:history="1">
+          <w:hyperlink w:anchor="_Toc237171244" w:history="1">
             <w:r>
               <w:rPr>
                 <w:rStyle w:val="Hyperlink"/>
@@ -155,7 +155,7 @@
               <w:rPr>
                 <w:webHidden/>
               </w:rPr>
-              <w:instrText xml:space="preserve"> PAGEREF _Toc237025154 \h </w:instrText>
+              <w:instrText xml:space="preserve"> PAGEREF _Toc237171244 \h </w:instrText>
             </w:r>
             <w:r>
               <w:rPr>
@@ -192,7 +192,7 @@
               <w:rFonts w:asciiTheme="minorHAnsi" w:eastAsiaTheme="minorEastAsia" w:hAnsiTheme="minorHAnsi" w:cstheme="minorBidi"/>
             </w:rPr>
           </w:pPr>
-          <w:hyperlink w:anchor="_Toc237025155" w:history="1">
+          <w:hyperlink w:anchor="_Toc237171245" w:history="1">
             <w:r>
               <w:rPr>
                 <w:rStyle w:val="Hyperlink"/>
@@ -215,7 +215,7 @@
               <w:rPr>
                 <w:webHidden/>
               </w:rPr>
-              <w:instrText xml:space="preserve"> PAGEREF _Toc237025155 \h </w:instrText>
+              <w:instrText xml:space="preserve"> PAGEREF _Toc237171245 \h </w:instrText>
             </w:r>
             <w:r>
               <w:rPr>
@@ -252,7 +252,7 @@
               <w:rFonts w:asciiTheme="minorHAnsi" w:eastAsiaTheme="minorEastAsia" w:hAnsiTheme="minorHAnsi" w:cstheme="minorBidi"/>
             </w:rPr>
           </w:pPr>
-          <w:hyperlink w:anchor="_Toc237025156" w:history="1">
+          <w:hyperlink w:anchor="_Toc237171246" w:history="1">
             <w:r>
               <w:rPr>
                 <w:rStyle w:val="Hyperlink"/>
@@ -275,7 +275,7 @@
               <w:rPr>
                 <w:webHidden/>
               </w:rPr>
-              <w:instrText xml:space="preserve"> PAGEREF _Toc237025156 \h </w:instrText>
+              <w:instrText xml:space="preserve"> PAGEREF _Toc237171246 \h </w:instrText>
             </w:r>
             <w:r>
               <w:rPr>
@@ -312,7 +312,7 @@
               <w:rFonts w:asciiTheme="minorHAnsi" w:eastAsiaTheme="minorEastAsia" w:hAnsiTheme="minorHAnsi" w:cstheme="minorBidi"/>
             </w:rPr>
           </w:pPr>
-          <w:hyperlink w:anchor="_Toc237025157" w:history="1">
+          <w:hyperlink w:anchor="_Toc237171247" w:history="1">
             <w:r>
               <w:rPr>
                 <w:rStyle w:val="Hyperlink"/>
@@ -335,7 +335,7 @@
               <w:rPr>
                 <w:webHidden/>
               </w:rPr>
-              <w:instrText xml:space="preserve"> PAGEREF _Toc237025157 \h </w:instrText>
+              <w:instrText xml:space="preserve"> PAGEREF _Toc237171247 \h </w:instrText>
             </w:r>
             <w:r>
               <w:rPr>
@@ -372,7 +372,7 @@
               <w:rFonts w:asciiTheme="minorHAnsi" w:eastAsiaTheme="minorEastAsia" w:hAnsiTheme="minorHAnsi" w:cstheme="minorBidi"/>
             </w:rPr>
           </w:pPr>
-          <w:hyperlink w:anchor="_Toc237025158" w:history="1">
+          <w:hyperlink w:anchor="_Toc237171248" w:history="1">
             <w:r>
               <w:rPr>
                 <w:rStyle w:val="Hyperlink"/>
@@ -395,7 +395,7 @@
               <w:rPr>
                 <w:webHidden/>
               </w:rPr>
-              <w:instrText xml:space="preserve"> PAGEREF _Toc237025158 \h </w:instrText>
+              <w:instrText xml:space="preserve"> PAGEREF _Toc237171248 \h </w:instrText>
             </w:r>
             <w:r>
               <w:rPr>
@@ -432,7 +432,7 @@
               <w:rFonts w:asciiTheme="minorHAnsi" w:eastAsiaTheme="minorEastAsia" w:hAnsiTheme="minorHAnsi" w:cstheme="minorBidi"/>
             </w:rPr>
           </w:pPr>
-          <w:hyperlink w:anchor="_Toc237025159" w:history="1">
+          <w:hyperlink w:anchor="_Toc237171249" w:history="1">
             <w:r>
               <w:rPr>
                 <w:rStyle w:val="Hyperlink"/>
@@ -455,7 +455,7 @@
               <w:rPr>
                 <w:webHidden/>
               </w:rPr>
-              <w:instrText xml:space="preserve"> PAGEREF _Toc237025159 \h </w:instrText>
+              <w:instrText xml:space="preserve"> PAGEREF _Toc237171249 \h </w:instrText>
             </w:r>
             <w:r>
               <w:rPr>
@@ -492,7 +492,7 @@
               <w:rFonts w:asciiTheme="minorHAnsi" w:eastAsiaTheme="minorEastAsia" w:hAnsiTheme="minorHAnsi" w:cstheme="minorBidi"/>
             </w:rPr>
           </w:pPr>
-          <w:hyperlink w:anchor="_Toc237025160" w:history="1">
+          <w:hyperlink w:anchor="_Toc237171250" w:history="1">
             <w:r>
               <w:rPr>
                 <w:rStyle w:val="Hyperlink"/>
@@ -515,7 +515,7 @@
               <w:rPr>
                 <w:webHidden/>
               </w:rPr>
-              <w:instrText xml:space="preserve"> PAGEREF _Toc237025160 \h </w:instrText>
+              <w:instrText xml:space="preserve"> PAGEREF _Toc237171250 \h </w:instrText>
             </w:r>
             <w:r>
               <w:rPr>
@@ -552,7 +552,7 @@
               <w:rFonts w:asciiTheme="minorHAnsi" w:eastAsiaTheme="minorEastAsia" w:hAnsiTheme="minorHAnsi" w:cstheme="minorBidi"/>
             </w:rPr>
           </w:pPr>
-          <w:hyperlink w:anchor="_Toc237025161" w:history="1">
+          <w:hyperlink w:anchor="_Toc237171251" w:history="1">
             <w:r>
               <w:rPr>
                 <w:rStyle w:val="Hyperlink"/>
@@ -575,7 +575,7 @@
               <w:rPr>
                 <w:webHidden/>
               </w:rPr>
-              <w:instrText xml:space="preserve"> PAGEREF _Toc237025161 \h </w:instrText>
+              <w:instrText xml:space="preserve"> PAGEREF _Toc237171251 \h </w:instrText>
             </w:r>
             <w:r>
               <w:rPr>
@@ -612,7 +612,7 @@
               <w:rFonts w:asciiTheme="minorHAnsi" w:eastAsiaTheme="minorEastAsia" w:hAnsiTheme="minorHAnsi" w:cstheme="minorBidi"/>
             </w:rPr>
           </w:pPr>
-          <w:hyperlink w:anchor="_Toc237025162" w:history="1">
+          <w:hyperlink w:anchor="_Toc237171252" w:history="1">
             <w:r>
               <w:rPr>
                 <w:rStyle w:val="Hyperlink"/>
@@ -635,7 +635,7 @@
               <w:rPr>
                 <w:webHidden/>
               </w:rPr>
-              <w:instrText xml:space="preserve"> PAGEREF _Toc237025162 \h </w:instrText>
+              <w:instrText xml:space="preserve"> PAGEREF _Toc237171252 \h </w:instrText>
             </w:r>
             <w:r>
               <w:rPr>
@@ -672,7 +672,7 @@
               <w:rFonts w:asciiTheme="minorHAnsi" w:eastAsiaTheme="minorEastAsia" w:hAnsiTheme="minorHAnsi" w:cstheme="minorBidi"/>
             </w:rPr>
           </w:pPr>
-          <w:hyperlink w:anchor="_Toc237025163" w:history="1">
+          <w:hyperlink w:anchor="_Toc237171253" w:history="1">
             <w:r>
               <w:rPr>
                 <w:rStyle w:val="Hyperlink"/>
@@ -695,7 +695,7 @@
               <w:rPr>
                 <w:webHidden/>
               </w:rPr>
-              <w:instrText xml:space="preserve"> PAGEREF _Toc237025163 \h </w:instrText>
+              <w:instrText xml:space="preserve"> PAGEREF _Toc237171253 \h </w:instrText>
             </w:r>
             <w:r>
               <w:rPr>
@@ -732,7 +732,7 @@
               <w:rFonts w:asciiTheme="minorHAnsi" w:eastAsiaTheme="minorEastAsia" w:hAnsiTheme="minorHAnsi" w:cstheme="minorBidi"/>
             </w:rPr>
           </w:pPr>
-          <w:hyperlink w:anchor="_Toc237025164" w:history="1">
+          <w:hyperlink w:anchor="_Toc237171254" w:history="1">
             <w:r>
               <w:rPr>
                 <w:rStyle w:val="Hyperlink"/>
@@ -755,7 +755,7 @@
               <w:rPr>
                 <w:webHidden/>
               </w:rPr>
-              <w:instrText xml:space="preserve"> PAGEREF _Toc237025164 \h </w:instrText>
+              <w:instrText xml:space="preserve"> PAGEREF _Toc237171254 \h </w:instrText>
             </w:r>
             <w:r>
               <w:rPr>
@@ -792,7 +792,7 @@
               <w:rFonts w:asciiTheme="minorHAnsi" w:eastAsiaTheme="minorEastAsia" w:hAnsiTheme="minorHAnsi" w:cstheme="minorBidi"/>
             </w:rPr>
           </w:pPr>
-          <w:hyperlink w:anchor="_Toc237025165" w:history="1">
+          <w:hyperlink w:anchor="_Toc237171255" w:history="1">
             <w:r>
               <w:rPr>
                 <w:rStyle w:val="Hyperlink"/>
@@ -817,7 +817,7 @@
               <w:rPr>
                 <w:webHidden/>
               </w:rPr>
-              <w:instrText xml:space="preserve"> PAGEREF _Toc237025165 \h </w:instrText>
+              <w:instrText xml:space="preserve"> PAGEREF _Toc237171255 \h </w:instrText>
             </w:r>
             <w:r>
               <w:rPr>
@@ -854,7 +854,7 @@
               <w:rFonts w:asciiTheme="minorHAnsi" w:eastAsiaTheme="minorEastAsia" w:hAnsiTheme="minorHAnsi" w:cstheme="minorBidi"/>
             </w:rPr>
           </w:pPr>
-          <w:hyperlink w:anchor="_Toc237025166" w:history="1">
+          <w:hyperlink w:anchor="_Toc237171256" w:history="1">
             <w:r>
               <w:rPr>
                 <w:rStyle w:val="Hyperlink"/>
@@ -877,7 +877,7 @@
               <w:rPr>
                 <w:webHidden/>
               </w:rPr>
-              <w:instrText xml:space="preserve"> PAGEREF _Toc237025166 \h </w:instrText>
+              <w:instrText xml:space="preserve"> PAGEREF _Toc237171256 \h </w:instrText>
             </w:r>
             <w:r>
               <w:rPr>
@@ -914,7 +914,7 @@
               <w:rFonts w:asciiTheme="minorHAnsi" w:eastAsiaTheme="minorEastAsia" w:hAnsiTheme="minorHAnsi" w:cstheme="minorBidi"/>
             </w:rPr>
           </w:pPr>
-          <w:hyperlink w:anchor="_Toc237025167" w:history="1">
+          <w:hyperlink w:anchor="_Toc237171257" w:history="1">
             <w:r>
               <w:rPr>
                 <w:rStyle w:val="Hyperlink"/>
@@ -937,7 +937,7 @@
               <w:rPr>
                 <w:webHidden/>
               </w:rPr>
-              <w:instrText xml:space="preserve"> PAGEREF _Toc237025167 \h </w:instrText>
+              <w:instrText xml:space="preserve"> PAGEREF _Toc237171257 \h </w:instrText>
             </w:r>
             <w:r>
               <w:rPr>
@@ -974,7 +974,7 @@
               <w:rFonts w:asciiTheme="minorHAnsi" w:eastAsiaTheme="minorEastAsia" w:hAnsiTheme="minorHAnsi" w:cstheme="minorBidi"/>
             </w:rPr>
           </w:pPr>
-          <w:hyperlink w:anchor="_Toc237025168" w:history="1">
+          <w:hyperlink w:anchor="_Toc237171258" w:history="1">
             <w:r>
               <w:rPr>
                 <w:rStyle w:val="Hyperlink"/>
@@ -997,7 +997,7 @@
               <w:rPr>
                 <w:webHidden/>
               </w:rPr>
-              <w:instrText xml:space="preserve"> PAGEREF _Toc237025168 \h </w:instrText>
+              <w:instrText xml:space="preserve"> PAGEREF _Toc237171258 \h </w:instrText>
             </w:r>
             <w:r>
               <w:rPr>
@@ -1034,7 +1034,7 @@
               <w:rFonts w:asciiTheme="minorHAnsi" w:eastAsiaTheme="minorEastAsia" w:hAnsiTheme="minorHAnsi" w:cstheme="minorBidi"/>
             </w:rPr>
           </w:pPr>
-          <w:hyperlink w:anchor="_Toc237025169" w:history="1">
+          <w:hyperlink w:anchor="_Toc237171259" w:history="1">
             <w:r>
               <w:rPr>
                 <w:rStyle w:val="Hyperlink"/>
@@ -1057,7 +1057,7 @@
               <w:rPr>
                 <w:webHidden/>
               </w:rPr>
-              <w:instrText xml:space="preserve"> PAGEREF _Toc237025169 \h </w:instrText>
+              <w:instrText xml:space="preserve"> PAGEREF _Toc237171259 \h </w:instrText>
             </w:r>
             <w:r>
               <w:rPr>
@@ -1094,7 +1094,7 @@
               <w:rFonts w:asciiTheme="minorHAnsi" w:eastAsiaTheme="minorEastAsia" w:hAnsiTheme="minorHAnsi" w:cstheme="minorBidi"/>
             </w:rPr>
           </w:pPr>
-          <w:hyperlink w:anchor="_Toc237025170" w:history="1">
+          <w:hyperlink w:anchor="_Toc237171260" w:history="1">
             <w:r>
               <w:rPr>
                 <w:rStyle w:val="Hyperlink"/>
@@ -1118,7 +1118,7 @@
               <w:rPr>
                 <w:webHidden/>
               </w:rPr>
-              <w:instrText xml:space="preserve"> PAGEREF _Toc237025170 \h </w:instrText>
+              <w:instrText xml:space="preserve"> PAGEREF _Toc237171260 \h </w:instrText>
             </w:r>
             <w:r>
               <w:rPr>
@@ -1155,7 +1155,7 @@
               <w:rFonts w:asciiTheme="minorHAnsi" w:eastAsiaTheme="minorEastAsia" w:hAnsiTheme="minorHAnsi" w:cstheme="minorBidi"/>
             </w:rPr>
           </w:pPr>
-          <w:hyperlink w:anchor="_Toc237025171" w:history="1">
+          <w:hyperlink w:anchor="_Toc237171261" w:history="1">
             <w:r>
               <w:rPr>
                 <w:rStyle w:val="Hyperlink"/>
@@ -1183,7 +1183,7 @@
               <w:rPr>
                 <w:webHidden/>
               </w:rPr>
-              <w:instrText xml:space="preserve"> PAGEREF _Toc237025171 \h </w:instrText>
+              <w:instrText xml:space="preserve"> PAGEREF _Toc237171261 \h </w:instrText>
             </w:r>
             <w:r>
               <w:rPr>
@@ -1220,7 +1220,7 @@
               <w:rFonts w:asciiTheme="minorHAnsi" w:eastAsiaTheme="minorEastAsia" w:hAnsiTheme="minorHAnsi" w:cstheme="minorBidi"/>
             </w:rPr>
           </w:pPr>
-          <w:hyperlink w:anchor="_Toc237025172" w:history="1">
+          <w:hyperlink w:anchor="_Toc237171262" w:history="1">
             <w:r>
               <w:rPr>
                 <w:rStyle w:val="Hyperlink"/>
@@ -1259,7 +1259,7 @@
               <w:rPr>
                 <w:webHidden/>
               </w:rPr>
-              <w:instrText xml:space="preserve"> PAGEREF _Toc237025172 \h </w:instrText>
+              <w:instrText xml:space="preserve"> PAGEREF _Toc237171262 \h </w:instrText>
             </w:r>
             <w:r>
               <w:rPr>
@@ -1287,6 +1287,66 @@
           </w:hyperlink>
         </w:p>
         <w:p>
+          <w:pPr>
+            <w:pStyle w:val="TOC1"/>
+            <w:tabs>
+              <w:tab w:val="right" w:leader="dot" w:pos="9350"/>
+            </w:tabs>
+            <w:rPr>
+              <w:rFonts w:asciiTheme="minorHAnsi" w:eastAsiaTheme="minorEastAsia" w:hAnsiTheme="minorHAnsi" w:cstheme="minorBidi"/>
+            </w:rPr>
+          </w:pPr>
+          <w:hyperlink w:anchor="_Toc237171263" w:history="1">
+            <w:r>
+              <w:rPr>
+                <w:rStyle w:val="Hyperlink"/>
+              </w:rPr>
+              <w:t>NatSpec</w:t>
+            </w:r>
+            <w:r>
+              <w:rPr>
+                <w:webHidden/>
+              </w:rPr>
+              <w:tab/>
+            </w:r>
+            <w:r>
+              <w:rPr>
+                <w:webHidden/>
+              </w:rPr>
+              <w:fldChar w:fldCharType="begin"/>
+            </w:r>
+            <w:r>
+              <w:rPr>
+                <w:webHidden/>
+              </w:rPr>
+              <w:instrText xml:space="preserve"> PAGEREF _Toc237171263 \h </w:instrText>
+            </w:r>
+            <w:r>
+              <w:rPr>
+                <w:webHidden/>
+              </w:rPr>
+            </w:r>
+            <w:r>
+              <w:rPr>
+                <w:webHidden/>
+              </w:rPr>
+              <w:fldChar w:fldCharType="separate"/>
+            </w:r>
+            <w:r>
+              <w:rPr>
+                <w:webHidden/>
+              </w:rPr>
+              <w:t>28</w:t>
+            </w:r>
+            <w:r>
+              <w:rPr>
+                <w:webHidden/>
+              </w:rPr>
+              <w:fldChar w:fldCharType="end"/>
+            </w:r>
+          </w:hyperlink>
+        </w:p>
+        <w:p>
           <w:r>
             <w:rPr>
               <w:b/>
@@ -1399,7 +1459,7 @@
     <w:p>
       <w:r>
         <w:drawing>
-          <wp:inline distT="0" distB="0" distL="0" distR="0" wp14:anchorId="63CD0934" wp14:editId="7A019935">
+          <wp:inline distT="0" distB="0" distL="0" distR="0" wp14:anchorId="63CD0934" wp14:editId="7C562BAA">
             <wp:extent cx="5943600" cy="2700655"/>
             <wp:effectExtent l="0" t="0" r="0" b="4445"/>
             <wp:docPr id="74043256" name="Picture 1"/>
@@ -1521,7 +1581,7 @@
           <w:color w:val="EE0000"/>
         </w:rPr>
       </w:pPr>
-      <w:bookmarkStart w:id="0" w:name="_Toc237025154"/>
+      <w:bookmarkStart w:id="0" w:name="_Toc237171244"/>
       <w:r>
         <w:rPr>
           <w:color w:val="EE0000"/>
@@ -2437,7 +2497,7 @@
           <w:color w:val="EE0000"/>
         </w:rPr>
       </w:pPr>
-      <w:bookmarkStart w:id="1" w:name="_Toc237025155"/>
+      <w:bookmarkStart w:id="1" w:name="_Toc237171245"/>
       <w:r>
         <w:rPr>
           <w:color w:val="EE0000"/>
@@ -2852,7 +2912,7 @@
           <w:color w:val="EE0000"/>
         </w:rPr>
       </w:pPr>
-      <w:bookmarkStart w:id="2" w:name="_Toc237025156"/>
+      <w:bookmarkStart w:id="2" w:name="_Toc237171246"/>
       <w:r>
         <w:rPr>
           <w:color w:val="EE0000"/>
@@ -4551,7 +4611,7 @@
       <w:pPr>
         <w:pStyle w:val="Heading1"/>
       </w:pPr>
-      <w:bookmarkStart w:id="3" w:name="_Toc237025157"/>
+      <w:bookmarkStart w:id="3" w:name="_Toc237171247"/>
       <w:r>
         <w:t>Interact with the deployed contract</w:t>
       </w:r>
@@ -4561,7 +4621,7 @@
       <w:pPr>
         <w:pStyle w:val="Heading3"/>
       </w:pPr>
-      <w:bookmarkStart w:id="4" w:name="_Toc237025158"/>
+      <w:bookmarkStart w:id="4" w:name="_Toc237171248"/>
       <w:r>
         <w:t>Using cast</w:t>
       </w:r>
@@ -4861,7 +4921,7 @@
           <w:color w:val="EE0000"/>
         </w:rPr>
       </w:pPr>
-      <w:bookmarkStart w:id="5" w:name="_Toc237025159"/>
+      <w:bookmarkStart w:id="5" w:name="_Toc237171249"/>
       <w:r>
         <w:rPr>
           <w:color w:val="EE0000"/>
@@ -8041,7 +8101,7 @@
       <w:pPr>
         <w:pStyle w:val="Heading2"/>
       </w:pPr>
-      <w:bookmarkStart w:id="6" w:name="_Toc237025160"/>
+      <w:bookmarkStart w:id="6" w:name="_Toc237171250"/>
       <w:r>
         <w:lastRenderedPageBreak/>
         <w:t>Mock</w:t>
@@ -12637,7 +12697,7 @@
       <w:pPr>
         <w:pStyle w:val="Heading2"/>
       </w:pPr>
-      <w:bookmarkStart w:id="7" w:name="_Toc237025161"/>
+      <w:bookmarkStart w:id="7" w:name="_Toc237171251"/>
       <w:r>
         <w:t>Test CheatCodes</w:t>
       </w:r>
@@ -12708,7 +12768,7 @@
           <w:color w:val="EE0000"/>
         </w:rPr>
       </w:pPr>
-      <w:bookmarkStart w:id="8" w:name="_Toc237025162"/>
+      <w:bookmarkStart w:id="8" w:name="_Toc237171252"/>
       <w:r>
         <w:rPr>
           <w:color w:val="EE0000"/>
@@ -13457,7 +13517,7 @@
           <w:color w:val="EE0000"/>
         </w:rPr>
       </w:pPr>
-      <w:bookmarkStart w:id="9" w:name="_Toc237025163"/>
+      <w:bookmarkStart w:id="9" w:name="_Toc237171253"/>
       <w:r>
         <w:rPr>
           <w:color w:val="EE0000"/>
@@ -13501,10 +13561,7 @@
         <w:t>.</w:t>
       </w:r>
       <w:r>
-        <w:t xml:space="preserve"> </w:t>
-      </w:r>
-      <w:r>
-        <w:t xml:space="preserve">Once you call it, block.timestamp will reflect that new value for </w:t>
+        <w:t xml:space="preserve"> Once you call it, block.timestamp will reflect that new value for </w:t>
       </w:r>
       <w:r>
         <w:rPr>
@@ -13521,7 +13578,7 @@
       <w:pPr>
         <w:pStyle w:val="Heading2"/>
       </w:pPr>
-      <w:bookmarkStart w:id="10" w:name="_Toc237025164"/>
+      <w:bookmarkStart w:id="10" w:name="_Toc237171254"/>
       <w:r>
         <w:t>Test Types</w:t>
       </w:r>
@@ -13625,7 +13682,7 @@
           <w:color w:val="EE0000"/>
         </w:rPr>
       </w:pPr>
-      <w:bookmarkStart w:id="11" w:name="_Toc237025165"/>
+      <w:bookmarkStart w:id="11" w:name="_Toc237171255"/>
       <w:r>
         <w:rPr>
           <w:b/>
@@ -14860,7 +14917,7 @@
       <w:pPr>
         <w:pStyle w:val="Heading1"/>
       </w:pPr>
-      <w:bookmarkStart w:id="12" w:name="_Toc237025166"/>
+      <w:bookmarkStart w:id="12" w:name="_Toc237171256"/>
       <w:r>
         <w:t>Chisel</w:t>
       </w:r>
@@ -14891,7 +14948,7 @@
       <w:pPr>
         <w:pStyle w:val="Heading1"/>
       </w:pPr>
-      <w:bookmarkStart w:id="13" w:name="_Toc237025167"/>
+      <w:bookmarkStart w:id="13" w:name="_Toc237171257"/>
       <w:r>
         <w:t>How to make the methods cheaper</w:t>
       </w:r>
@@ -17567,7 +17624,7 @@
           <w:color w:val="EE0000"/>
         </w:rPr>
       </w:pPr>
-      <w:bookmarkStart w:id="14" w:name="_Toc237025168"/>
+      <w:bookmarkStart w:id="14" w:name="_Toc237171258"/>
       <w:r>
         <w:rPr>
           <w:color w:val="EE0000"/>
@@ -17629,7 +17686,7 @@
       <w:pPr>
         <w:pStyle w:val="Heading1"/>
       </w:pPr>
-      <w:bookmarkStart w:id="15" w:name="_Toc237025169"/>
+      <w:bookmarkStart w:id="15" w:name="_Toc237171259"/>
       <w:r>
         <w:t>Random Numbers (Chainlink.VRF)</w:t>
       </w:r>
@@ -17664,7 +17721,7 @@
           <w:color w:val="EE0000"/>
         </w:rPr>
       </w:pPr>
-      <w:bookmarkStart w:id="16" w:name="_Toc237025170"/>
+      <w:bookmarkStart w:id="16" w:name="_Toc237171260"/>
       <w:r>
         <w:rPr>
           <w:rFonts w:eastAsia="Times New Roman"/>
@@ -17689,7 +17746,7 @@
           <w14:ligatures w14:val="none"/>
         </w:rPr>
       </w:pPr>
-      <w:bookmarkStart w:id="17" w:name="_Toc237025171"/>
+      <w:bookmarkStart w:id="17" w:name="_Toc237171261"/>
       <w:r>
         <w:rPr>
           <w:rFonts w:eastAsia="Times New Roman" w:cs="Times New Roman"/>
@@ -18678,7 +18735,7 @@
           <w14:ligatures w14:val="none"/>
         </w:rPr>
       </w:pPr>
-      <w:bookmarkStart w:id="18" w:name="_Toc237025172"/>
+      <w:bookmarkStart w:id="18" w:name="_Toc237171262"/>
       <w:r>
         <w:rPr>
           <w:rFonts w:eastAsia="Times New Roman" w:cs="Times New Roman"/>
@@ -19300,7 +19357,446 @@
         <w:t>This is nice for one-off scripts with a couple of params, but gets unwieldy with many arguments or non-primitive types.</w:t>
       </w:r>
     </w:p>
+    <w:p>
+      <w:pPr>
+        <w:pStyle w:val="Heading1"/>
+      </w:pPr>
+      <w:bookmarkStart w:id="19" w:name="_Toc237171263"/>
+      <w:r>
+        <w:lastRenderedPageBreak/>
+        <w:t>NatSpec</w:t>
+      </w:r>
+      <w:bookmarkEnd w:id="19"/>
+    </w:p>
+    <w:p>
+      <w:pPr>
+        <w:spacing w:before="100" w:beforeAutospacing="1" w:after="100" w:afterAutospacing="1" w:line="240" w:lineRule="auto"/>
+        <w:rPr>
+          <w:rFonts w:eastAsia="Times New Roman" w:cs="Times New Roman"/>
+          <w:b/>
+          <w:bCs/>
+          <w:noProof w:val="0"/>
+          <w:color w:val="EE0000"/>
+          <w:kern w:val="0"/>
+          <w14:ligatures w14:val="none"/>
+        </w:rPr>
+      </w:pPr>
+      <w:proofErr w:type="spellStart"/>
+      <w:r>
+        <w:rPr>
+          <w:rFonts w:eastAsia="Times New Roman" w:cs="Times New Roman"/>
+          <w:b/>
+          <w:bCs/>
+          <w:noProof w:val="0"/>
+          <w:color w:val="EE0000"/>
+          <w:kern w:val="0"/>
+          <w14:ligatures w14:val="none"/>
+        </w:rPr>
+        <w:t>NatSpec</w:t>
+      </w:r>
+      <w:proofErr w:type="spellEnd"/>
+      <w:r>
+        <w:rPr>
+          <w:rFonts w:eastAsia="Times New Roman" w:cs="Times New Roman"/>
+          <w:b/>
+          <w:bCs/>
+          <w:noProof w:val="0"/>
+          <w:color w:val="EE0000"/>
+          <w:kern w:val="0"/>
+          <w14:ligatures w14:val="none"/>
+        </w:rPr>
+        <w:t xml:space="preserve"> means Ethereum Natural Language Specification. It is Solidity’s standardized documentation syntax.</w:t>
+      </w:r>
+    </w:p>
+    <w:p>
+      <w:pPr>
+        <w:spacing w:before="100" w:beforeAutospacing="1" w:after="100" w:afterAutospacing="1" w:line="240" w:lineRule="auto"/>
+        <w:rPr>
+          <w:rFonts w:eastAsia="Times New Roman" w:cs="Times New Roman"/>
+          <w:noProof w:val="0"/>
+          <w:kern w:val="0"/>
+          <w14:ligatures w14:val="none"/>
+        </w:rPr>
+      </w:pPr>
+      <w:r>
+        <w:rPr>
+          <w:rFonts w:eastAsia="Times New Roman" w:cs="Times New Roman"/>
+          <w:noProof w:val="0"/>
+          <w:kern w:val="0"/>
+          <w14:ligatures w14:val="none"/>
+        </w:rPr>
+        <w:t>It uses triple-slash comments:</w:t>
+      </w:r>
+    </w:p>
+    <w:p>
+      <w:pPr>
+        <w:pStyle w:val="codesnippet"/>
+        <w:framePr w:wrap="notBeside"/>
+      </w:pPr>
+      <w:r>
+        <w:t>/// @notice Deposits liquidity into the SPD/USD Pair.</w:t>
+      </w:r>
+    </w:p>
+    <w:p>
+      <w:pPr>
+        <w:pStyle w:val="codesnippet"/>
+        <w:framePr w:wrap="notBeside"/>
+      </w:pPr>
+      <w:r>
+        <w:t xml:space="preserve">/// @param </w:t>
+      </w:r>
+      <w:proofErr w:type="spellStart"/>
+      <w:r>
+        <w:t>spdAmount</w:t>
+      </w:r>
+      <w:proofErr w:type="spellEnd"/>
+      <w:r>
+        <w:t xml:space="preserve"> Exact SPD amount deposited.</w:t>
+      </w:r>
+    </w:p>
+    <w:p>
+      <w:pPr>
+        <w:pStyle w:val="codesnippet"/>
+        <w:framePr w:wrap="notBeside"/>
+      </w:pPr>
+      <w:r>
+        <w:t xml:space="preserve">/// @param </w:t>
+      </w:r>
+      <w:proofErr w:type="spellStart"/>
+      <w:r>
+        <w:t>minShares</w:t>
+      </w:r>
+      <w:proofErr w:type="spellEnd"/>
+      <w:r>
+        <w:t xml:space="preserve"> Minimum acceptable LP shares.</w:t>
+      </w:r>
+    </w:p>
+    <w:p>
+      <w:pPr>
+        <w:pStyle w:val="codesnippet"/>
+        <w:framePr w:wrap="notBeside"/>
+      </w:pPr>
+      <w:r>
+        <w:t>/// @return shares LP shares minted to the caller.</w:t>
+      </w:r>
+    </w:p>
+    <w:p>
+      <w:pPr>
+        <w:pStyle w:val="codesnippet"/>
+        <w:framePr w:wrap="notBeside"/>
+      </w:pPr>
+      <w:r>
+        <w:t xml:space="preserve">function </w:t>
+      </w:r>
+      <w:proofErr w:type="spellStart"/>
+      <w:r>
+        <w:t>addLiquidity</w:t>
+      </w:r>
+      <w:proofErr w:type="spellEnd"/>
+      <w:r>
+        <w:t>(</w:t>
+      </w:r>
+    </w:p>
+    <w:p>
+      <w:pPr>
+        <w:pStyle w:val="codesnippet"/>
+        <w:framePr w:wrap="notBeside"/>
+      </w:pPr>
+      <w:r>
+        <w:t xml:space="preserve">    uint256 </w:t>
+      </w:r>
+      <w:proofErr w:type="spellStart"/>
+      <w:r>
+        <w:t>spdAmount</w:t>
+      </w:r>
+      <w:proofErr w:type="spellEnd"/>
+      <w:r>
+        <w:t>,</w:t>
+      </w:r>
+    </w:p>
+    <w:p>
+      <w:pPr>
+        <w:pStyle w:val="codesnippet"/>
+        <w:framePr w:wrap="notBeside"/>
+      </w:pPr>
+      <w:r>
+        <w:t xml:space="preserve">    uint256 </w:t>
+      </w:r>
+      <w:proofErr w:type="spellStart"/>
+      <w:r>
+        <w:t>minShares</w:t>
+      </w:r>
+      <w:proofErr w:type="spellEnd"/>
+    </w:p>
+    <w:p>
+      <w:pPr>
+        <w:pStyle w:val="codesnippet"/>
+        <w:framePr w:wrap="notBeside"/>
+      </w:pPr>
+      <w:r>
+        <w:t>) external returns (uint256 shares);</w:t>
+      </w:r>
+    </w:p>
+    <w:p>
+      <w:pPr>
+        <w:spacing w:before="100" w:beforeAutospacing="1" w:after="100" w:afterAutospacing="1" w:line="240" w:lineRule="auto"/>
+        <w:rPr>
+          <w:rFonts w:eastAsia="Times New Roman" w:cs="Times New Roman"/>
+          <w:noProof w:val="0"/>
+          <w:kern w:val="0"/>
+          <w14:ligatures w14:val="none"/>
+        </w:rPr>
+      </w:pPr>
+      <w:r>
+        <w:rPr>
+          <w:rFonts w:eastAsia="Times New Roman" w:cs="Times New Roman"/>
+          <w:noProof w:val="0"/>
+          <w:kern w:val="0"/>
+          <w14:ligatures w14:val="none"/>
+        </w:rPr>
+        <w:t>Common tags include:</w:t>
+      </w:r>
+    </w:p>
+    <w:p>
+      <w:pPr>
+        <w:pStyle w:val="codesnippet"/>
+        <w:framePr w:wrap="notBeside"/>
+      </w:pPr>
+      <w:r>
+        <w:rPr>
+          <w:rFonts w:ascii="Courier New" w:hAnsi="Courier New" w:cs="Courier New"/>
+          <w:szCs w:val="20"/>
+        </w:rPr>
+        <w:t>@title</w:t>
+      </w:r>
+      <w:r>
+        <w:t xml:space="preserve"> — contract or library title.</w:t>
+      </w:r>
+    </w:p>
+    <w:p>
+      <w:pPr>
+        <w:pStyle w:val="codesnippet"/>
+        <w:framePr w:wrap="notBeside"/>
+      </w:pPr>
+      <w:r>
+        <w:rPr>
+          <w:rFonts w:ascii="Courier New" w:hAnsi="Courier New" w:cs="Courier New"/>
+          <w:szCs w:val="20"/>
+        </w:rPr>
+        <w:t>@notice</w:t>
+      </w:r>
+      <w:r>
+        <w:t xml:space="preserve"> — user-facing explanation.</w:t>
+      </w:r>
+    </w:p>
+    <w:p>
+      <w:pPr>
+        <w:pStyle w:val="codesnippet"/>
+        <w:framePr w:wrap="notBeside"/>
+      </w:pPr>
+      <w:r>
+        <w:rPr>
+          <w:rFonts w:ascii="Courier New" w:hAnsi="Courier New" w:cs="Courier New"/>
+          <w:szCs w:val="20"/>
+        </w:rPr>
+        <w:t>@dev</w:t>
+      </w:r>
+      <w:r>
+        <w:t xml:space="preserve"> — technical information for developers.</w:t>
+      </w:r>
+    </w:p>
+    <w:p>
+      <w:pPr>
+        <w:pStyle w:val="codesnippet"/>
+        <w:framePr w:wrap="notBeside"/>
+      </w:pPr>
+      <w:r>
+        <w:rPr>
+          <w:rFonts w:ascii="Courier New" w:hAnsi="Courier New" w:cs="Courier New"/>
+          <w:szCs w:val="20"/>
+        </w:rPr>
+        <w:t>@param name</w:t>
+      </w:r>
+      <w:r>
+        <w:t xml:space="preserve"> — describes one parameter.</w:t>
+      </w:r>
+    </w:p>
+    <w:p>
+      <w:pPr>
+        <w:pStyle w:val="codesnippet"/>
+        <w:framePr w:wrap="notBeside"/>
+      </w:pPr>
+      <w:r>
+        <w:rPr>
+          <w:rFonts w:ascii="Courier New" w:hAnsi="Courier New" w:cs="Courier New"/>
+          <w:szCs w:val="20"/>
+        </w:rPr>
+        <w:t>@return name</w:t>
+      </w:r>
+      <w:r>
+        <w:t xml:space="preserve"> — describes a return value.</w:t>
+      </w:r>
+    </w:p>
+    <w:p>
+      <w:pPr>
+        <w:pStyle w:val="codesnippet"/>
+        <w:framePr w:wrap="notBeside"/>
+      </w:pPr>
+      <w:r>
+        <w:rPr>
+          <w:rFonts w:ascii="Courier New" w:hAnsi="Courier New" w:cs="Courier New"/>
+          <w:szCs w:val="20"/>
+        </w:rPr>
+        <w:t xml:space="preserve">@inheritdoc </w:t>
+      </w:r>
+      <w:proofErr w:type="spellStart"/>
+      <w:r>
+        <w:rPr>
+          <w:rFonts w:ascii="Courier New" w:hAnsi="Courier New" w:cs="Courier New"/>
+          <w:szCs w:val="20"/>
+        </w:rPr>
+        <w:t>InterfaceName</w:t>
+      </w:r>
+      <w:proofErr w:type="spellEnd"/>
+      <w:r>
+        <w:t xml:space="preserve"> — inherits documentation from an interface or parent.</w:t>
+      </w:r>
+    </w:p>
+    <w:p>
+      <w:pPr>
+        <w:pStyle w:val="codesnippet"/>
+        <w:framePr w:wrap="notBeside"/>
+      </w:pPr>
+      <w:r>
+        <w:rPr>
+          <w:rFonts w:ascii="Courier New" w:hAnsi="Courier New" w:cs="Courier New"/>
+          <w:szCs w:val="20"/>
+        </w:rPr>
+        <w:t>@custom:name</w:t>
+      </w:r>
+      <w:r>
+        <w:t xml:space="preserve"> — custom metadata such as security notes.</w:t>
+      </w:r>
+    </w:p>
+    <w:p>
+      <w:pPr>
+        <w:spacing w:before="100" w:beforeAutospacing="1" w:after="100" w:afterAutospacing="1" w:line="240" w:lineRule="auto"/>
+        <w:rPr>
+          <w:rFonts w:eastAsia="Times New Roman" w:cs="Times New Roman"/>
+          <w:noProof w:val="0"/>
+          <w:kern w:val="0"/>
+          <w14:ligatures w14:val="none"/>
+        </w:rPr>
+      </w:pPr>
+      <w:r>
+        <w:rPr>
+          <w:rFonts w:eastAsia="Times New Roman" w:cs="Times New Roman"/>
+          <w:noProof w:val="0"/>
+          <w:kern w:val="0"/>
+          <w14:ligatures w14:val="none"/>
+        </w:rPr>
+        <w:t>For example:</w:t>
+      </w:r>
+    </w:p>
+    <w:p>
+      <w:pPr>
+        <w:pStyle w:val="codesnippet"/>
+        <w:framePr w:wrap="notBeside"/>
+      </w:pPr>
+      <w:r>
+        <w:t>/// @notice Burns LP shares and returns both underlying assets.</w:t>
+      </w:r>
+    </w:p>
+    <w:p>
+      <w:pPr>
+        <w:pStyle w:val="codesnippet"/>
+        <w:framePr w:wrap="notBeside"/>
+      </w:pPr>
+      <w:r>
+        <w:t>/// @dev The LP tokens must already be transferred to the Pair.</w:t>
+      </w:r>
+    </w:p>
+    <w:p>
+      <w:pPr>
+        <w:pStyle w:val="codesnippet"/>
+        <w:framePr w:wrap="notBeside"/>
+      </w:pPr>
+      <w:r>
+        <w:t>/// @param to Recipient of the underlying tokens.</w:t>
+      </w:r>
+    </w:p>
+    <w:p>
+      <w:pPr>
+        <w:pStyle w:val="codesnippet"/>
+        <w:framePr w:wrap="notBeside"/>
+      </w:pPr>
+      <w:r>
+        <w:t>/// @return amount0 SPD returned.</w:t>
+      </w:r>
+    </w:p>
+    <w:p>
+      <w:pPr>
+        <w:pStyle w:val="codesnippet"/>
+        <w:framePr w:wrap="notBeside"/>
+      </w:pPr>
+      <w:r>
+        <w:t>/// @return amount1 USD returned.</w:t>
+      </w:r>
+    </w:p>
+    <w:p>
+      <w:pPr>
+        <w:pStyle w:val="codesnippet"/>
+        <w:framePr w:wrap="notBeside"/>
+      </w:pPr>
+      <w:r>
+        <w:t>function burn(</w:t>
+      </w:r>
+    </w:p>
+    <w:p>
+      <w:pPr>
+        <w:pStyle w:val="codesnippet"/>
+        <w:framePr w:wrap="notBeside"/>
+      </w:pPr>
+      <w:r>
+        <w:t xml:space="preserve">    address to</w:t>
+      </w:r>
+    </w:p>
+    <w:p>
+      <w:pPr>
+        <w:pStyle w:val="codesnippet"/>
+        <w:framePr w:wrap="notBeside"/>
+      </w:pPr>
+      <w:r>
+        <w:t>) external returns (uint256 amount0, uint256 amount1);</w:t>
+      </w:r>
+    </w:p>
     <w:p/>
+    <w:p>
+      <w:r>
+        <w:t>Running</w:t>
+      </w:r>
+    </w:p>
+    <w:p>
+      <w:pPr>
+        <w:pStyle w:val="bashsnippet"/>
+      </w:pPr>
+      <w:r>
+        <w:t>&lt;/&gt; bash</w:t>
+      </w:r>
+    </w:p>
+    <w:p>
+      <w:pPr>
+        <w:pStyle w:val="bashsnippet"/>
+      </w:pPr>
+      <w:r>
+        <w:t>Forge doc</w:t>
+      </w:r>
+    </w:p>
+    <w:p>
+      <w:r>
+        <w:t>Will create .md files explaining the code based on the comments</w:t>
+      </w:r>
+    </w:p>
     <w:sectPr>
       <w:pgSz w:w="12240" w:h="15840"/>
       <w:pgMar w:top="1440" w:right="1440" w:bottom="1440" w:left="1440" w:header="720" w:footer="720" w:gutter="0"/>
@@ -19827,9 +20323,9 @@
     </w:lvl>
   </w:abstractNum>
   <w:abstractNum w:abstractNumId="4" w15:restartNumberingAfterBreak="0">
-    <w:nsid w:val="47F70B09"/>
+    <w:nsid w:val="30F84436"/>
     <w:multiLevelType w:val="multilevel"/>
-    <w:tmpl w:val="0F0EFFFA"/>
+    <w:tmpl w:val="0518D51A"/>
     <w:lvl w:ilvl="0">
       <w:start w:val="1"/>
       <w:numFmt w:val="bullet"/>
@@ -19976,6 +20472,155 @@
     </w:lvl>
   </w:abstractNum>
   <w:abstractNum w:abstractNumId="5" w15:restartNumberingAfterBreak="0">
+    <w:nsid w:val="47F70B09"/>
+    <w:multiLevelType w:val="multilevel"/>
+    <w:tmpl w:val="0F0EFFFA"/>
+    <w:lvl w:ilvl="0">
+      <w:start w:val="1"/>
+      <w:numFmt w:val="bullet"/>
+      <w:lvlText w:val=""/>
+      <w:lvlJc w:val="left"/>
+      <w:pPr>
+        <w:tabs>
+          <w:tab w:val="num" w:pos="720"/>
+        </w:tabs>
+        <w:ind w:left="720" w:hanging="360"/>
+      </w:pPr>
+      <w:rPr>
+        <w:rFonts w:ascii="Symbol" w:hAnsi="Symbol" w:hint="default"/>
+        <w:sz w:val="20"/>
+      </w:rPr>
+    </w:lvl>
+    <w:lvl w:ilvl="1" w:tentative="1">
+      <w:start w:val="1"/>
+      <w:numFmt w:val="bullet"/>
+      <w:lvlText w:val="o"/>
+      <w:lvlJc w:val="left"/>
+      <w:pPr>
+        <w:tabs>
+          <w:tab w:val="num" w:pos="1440"/>
+        </w:tabs>
+        <w:ind w:left="1440" w:hanging="360"/>
+      </w:pPr>
+      <w:rPr>
+        <w:rFonts w:ascii="Courier New" w:hAnsi="Courier New" w:hint="default"/>
+        <w:sz w:val="20"/>
+      </w:rPr>
+    </w:lvl>
+    <w:lvl w:ilvl="2" w:tentative="1">
+      <w:start w:val="1"/>
+      <w:numFmt w:val="bullet"/>
+      <w:lvlText w:val=""/>
+      <w:lvlJc w:val="left"/>
+      <w:pPr>
+        <w:tabs>
+          <w:tab w:val="num" w:pos="2160"/>
+        </w:tabs>
+        <w:ind w:left="2160" w:hanging="360"/>
+      </w:pPr>
+      <w:rPr>
+        <w:rFonts w:ascii="Wingdings" w:hAnsi="Wingdings" w:hint="default"/>
+        <w:sz w:val="20"/>
+      </w:rPr>
+    </w:lvl>
+    <w:lvl w:ilvl="3" w:tentative="1">
+      <w:start w:val="1"/>
+      <w:numFmt w:val="bullet"/>
+      <w:lvlText w:val=""/>
+      <w:lvlJc w:val="left"/>
+      <w:pPr>
+        <w:tabs>
+          <w:tab w:val="num" w:pos="2880"/>
+        </w:tabs>
+        <w:ind w:left="2880" w:hanging="360"/>
+      </w:pPr>
+      <w:rPr>
+        <w:rFonts w:ascii="Wingdings" w:hAnsi="Wingdings" w:hint="default"/>
+        <w:sz w:val="20"/>
+      </w:rPr>
+    </w:lvl>
+    <w:lvl w:ilvl="4" w:tentative="1">
+      <w:start w:val="1"/>
+      <w:numFmt w:val="bullet"/>
+      <w:lvlText w:val=""/>
+      <w:lvlJc w:val="left"/>
+      <w:pPr>
+        <w:tabs>
+          <w:tab w:val="num" w:pos="3600"/>
+        </w:tabs>
+        <w:ind w:left="3600" w:hanging="360"/>
+      </w:pPr>
+      <w:rPr>
+        <w:rFonts w:ascii="Wingdings" w:hAnsi="Wingdings" w:hint="default"/>
+        <w:sz w:val="20"/>
+      </w:rPr>
+    </w:lvl>
+    <w:lvl w:ilvl="5" w:tentative="1">
+      <w:start w:val="1"/>
+      <w:numFmt w:val="bullet"/>
+      <w:lvlText w:val=""/>
+      <w:lvlJc w:val="left"/>
+      <w:pPr>
+        <w:tabs>
+          <w:tab w:val="num" w:pos="4320"/>
+        </w:tabs>
+        <w:ind w:left="4320" w:hanging="360"/>
+      </w:pPr>
+      <w:rPr>
+        <w:rFonts w:ascii="Wingdings" w:hAnsi="Wingdings" w:hint="default"/>
+        <w:sz w:val="20"/>
+      </w:rPr>
+    </w:lvl>
+    <w:lvl w:ilvl="6" w:tentative="1">
+      <w:start w:val="1"/>
+      <w:numFmt w:val="bullet"/>
+      <w:lvlText w:val=""/>
+      <w:lvlJc w:val="left"/>
+      <w:pPr>
+        <w:tabs>
+          <w:tab w:val="num" w:pos="5040"/>
+        </w:tabs>
+        <w:ind w:left="5040" w:hanging="360"/>
+      </w:pPr>
+      <w:rPr>
+        <w:rFonts w:ascii="Wingdings" w:hAnsi="Wingdings" w:hint="default"/>
+        <w:sz w:val="20"/>
+      </w:rPr>
+    </w:lvl>
+    <w:lvl w:ilvl="7" w:tentative="1">
+      <w:start w:val="1"/>
+      <w:numFmt w:val="bullet"/>
+      <w:lvlText w:val=""/>
+      <w:lvlJc w:val="left"/>
+      <w:pPr>
+        <w:tabs>
+          <w:tab w:val="num" w:pos="5760"/>
+        </w:tabs>
+        <w:ind w:left="5760" w:hanging="360"/>
+      </w:pPr>
+      <w:rPr>
+        <w:rFonts w:ascii="Wingdings" w:hAnsi="Wingdings" w:hint="default"/>
+        <w:sz w:val="20"/>
+      </w:rPr>
+    </w:lvl>
+    <w:lvl w:ilvl="8" w:tentative="1">
+      <w:start w:val="1"/>
+      <w:numFmt w:val="bullet"/>
+      <w:lvlText w:val=""/>
+      <w:lvlJc w:val="left"/>
+      <w:pPr>
+        <w:tabs>
+          <w:tab w:val="num" w:pos="6480"/>
+        </w:tabs>
+        <w:ind w:left="6480" w:hanging="360"/>
+      </w:pPr>
+      <w:rPr>
+        <w:rFonts w:ascii="Wingdings" w:hAnsi="Wingdings" w:hint="default"/>
+        <w:sz w:val="20"/>
+      </w:rPr>
+    </w:lvl>
+  </w:abstractNum>
+  <w:abstractNum w:abstractNumId="6" w15:restartNumberingAfterBreak="0">
     <w:nsid w:val="50922595"/>
     <w:multiLevelType w:val="multilevel"/>
     <w:tmpl w:val="E1949F10"/>
@@ -20124,7 +20769,7 @@
       </w:rPr>
     </w:lvl>
   </w:abstractNum>
-  <w:abstractNum w:abstractNumId="6" w15:restartNumberingAfterBreak="0">
+  <w:abstractNum w:abstractNumId="7" w15:restartNumberingAfterBreak="0">
     <w:nsid w:val="54D83D05"/>
     <w:multiLevelType w:val="multilevel"/>
     <w:tmpl w:val="70749336"/>
@@ -20273,7 +20918,7 @@
       </w:rPr>
     </w:lvl>
   </w:abstractNum>
-  <w:abstractNum w:abstractNumId="7" w15:restartNumberingAfterBreak="0">
+  <w:abstractNum w:abstractNumId="8" w15:restartNumberingAfterBreak="0">
     <w:nsid w:val="6E2E22BE"/>
     <w:multiLevelType w:val="multilevel"/>
     <w:tmpl w:val="F58CC7FC"/>
@@ -20435,19 +21080,22 @@
     <w:abstractNumId w:val="1"/>
   </w:num>
   <w:num w:numId="5" w16cid:durableId="1820610177">
-    <w:abstractNumId w:val="5"/>
+    <w:abstractNumId w:val="6"/>
   </w:num>
   <w:num w:numId="6" w16cid:durableId="1812088439">
-    <w:abstractNumId w:val="4"/>
+    <w:abstractNumId w:val="5"/>
   </w:num>
   <w:num w:numId="7" w16cid:durableId="2031950070">
     <w:abstractNumId w:val="2"/>
   </w:num>
   <w:num w:numId="8" w16cid:durableId="1397777742">
+    <w:abstractNumId w:val="8"/>
+  </w:num>
+  <w:num w:numId="9" w16cid:durableId="2037272982">
     <w:abstractNumId w:val="7"/>
   </w:num>
-  <w:num w:numId="9" w16cid:durableId="2037272982">
-    <w:abstractNumId w:val="6"/>
+  <w:num w:numId="10" w16cid:durableId="1759448491">
+    <w:abstractNumId w:val="4"/>
   </w:num>
 </w:numbering>
 </file>
@@ -21052,6 +21700,7 @@
   <w:style w:type="character" w:default="1" w:styleId="DefaultParagraphFont">
     <w:name w:val="Default Paragraph Font"/>
     <w:uiPriority w:val="1"/>
+    <w:semiHidden/>
     <w:unhideWhenUsed/>
   </w:style>
   <w:style w:type="table" w:default="1" w:styleId="TableNormal">

</xml_diff>